<commit_message>
Staking tables: add Total rows; rename Rewards; split qty/value cols
- Position table: new Total row summing Closing Value (USD); other
  qty columns blank (different assets aren't sum-comparable).
- Rewards table renamed from "Rewards & lifecycle" → "Rewards".
- Rewards table restructured: each combined qty/fiat cell is split
  into two columns (Claimed (period) / Claimed Value (USD) /
  Claimable (period end) / Claimable Value (USD)) so the USD column
  has an explicit header.
- Rewards Total row sums the two USD columns.

Co-Authored-By: Claude Opus 4.7 <noreply@anthropic.com>
</commit_message>
<xml_diff>
--- a/mockup/monthly_client_statement/sample-statements/Custody_Detailed_sample.docx
+++ b/mockup/monthly_client_statement/sample-statements/Custody_Detailed_sample.docx
@@ -4619,6 +4619,215 @@
           </w:p>
         </w:tc>
       </w:tr>
+      <w:tr>
+        <w:tc>
+          <w:tcPr>
+            <w:tcW w:type="dxa" w:w="794"/>
+            <w:shd w:val="clear" w:color="auto" w:fill="E5EBF1"/>
+            <w:tcBorders>
+              <w:bottom w:val="single" w:sz="4" w:color="D0D5DD"/>
+            </w:tcBorders>
+            <w:vAlign w:val="center"/>
+          </w:tcPr>
+          <w:p>
+            <w:pPr>
+              <w:spacing w:before="40" w:after="40"/>
+            </w:pPr>
+            <w:r>
+              <w:rPr>
+                <w:rFonts w:ascii="Arial" w:hAnsi="Arial"/>
+                <w:rFonts w:ascii="Arial" w:hAnsi="Arial" w:cs="Arial"/>
+                <w:b/>
+                <w:i w:val="0"/>
+                <w:color w:val="0A2342"/>
+                <w:sz w:val="16"/>
+              </w:rPr>
+              <w:t>Total</w:t>
+            </w:r>
+          </w:p>
+        </w:tc>
+        <w:tc>
+          <w:tcPr>
+            <w:tcW w:type="dxa" w:w="1020"/>
+            <w:shd w:val="clear" w:color="auto" w:fill="E5EBF1"/>
+            <w:tcBorders>
+              <w:bottom w:val="single" w:sz="4" w:color="D0D5DD"/>
+            </w:tcBorders>
+            <w:vAlign w:val="center"/>
+          </w:tcPr>
+          <w:p>
+            <w:pPr>
+              <w:spacing w:before="40" w:after="40"/>
+            </w:pPr>
+            <w:r>
+              <w:rPr>
+                <w:rFonts w:ascii="Arial" w:hAnsi="Arial"/>
+                <w:rFonts w:ascii="Arial" w:hAnsi="Arial" w:cs="Arial"/>
+                <w:b/>
+                <w:i w:val="0"/>
+                <w:color w:val="0A2342"/>
+                <w:sz w:val="16"/>
+              </w:rPr>
+            </w:r>
+          </w:p>
+        </w:tc>
+        <w:tc>
+          <w:tcPr>
+            <w:tcW w:type="dxa" w:w="1814"/>
+            <w:shd w:val="clear" w:color="auto" w:fill="E5EBF1"/>
+            <w:tcBorders>
+              <w:bottom w:val="single" w:sz="4" w:color="D0D5DD"/>
+            </w:tcBorders>
+            <w:vAlign w:val="center"/>
+          </w:tcPr>
+          <w:p>
+            <w:pPr>
+              <w:spacing w:before="40" w:after="40"/>
+            </w:pPr>
+            <w:r>
+              <w:rPr>
+                <w:rFonts w:ascii="Arial" w:hAnsi="Arial"/>
+                <w:rFonts w:ascii="Arial" w:hAnsi="Arial" w:cs="Arial"/>
+                <w:b/>
+                <w:i w:val="0"/>
+                <w:color w:val="0A2342"/>
+                <w:sz w:val="16"/>
+              </w:rPr>
+            </w:r>
+          </w:p>
+        </w:tc>
+        <w:tc>
+          <w:tcPr>
+            <w:tcW w:type="dxa" w:w="1247"/>
+            <w:shd w:val="clear" w:color="auto" w:fill="E5EBF1"/>
+            <w:tcBorders>
+              <w:bottom w:val="single" w:sz="4" w:color="D0D5DD"/>
+            </w:tcBorders>
+            <w:vAlign w:val="center"/>
+          </w:tcPr>
+          <w:p>
+            <w:pPr>
+              <w:spacing w:before="40" w:after="40"/>
+              <w:jc w:val="right"/>
+            </w:pPr>
+            <w:r>
+              <w:rPr>
+                <w:rFonts w:ascii="Arial" w:hAnsi="Arial"/>
+                <w:rFonts w:ascii="Arial" w:hAnsi="Arial" w:cs="Arial"/>
+                <w:b/>
+                <w:i w:val="0"/>
+                <w:color w:val="0A2342"/>
+                <w:sz w:val="16"/>
+              </w:rPr>
+            </w:r>
+          </w:p>
+        </w:tc>
+        <w:tc>
+          <w:tcPr>
+            <w:tcW w:type="dxa" w:w="1247"/>
+            <w:shd w:val="clear" w:color="auto" w:fill="E5EBF1"/>
+            <w:tcBorders>
+              <w:bottom w:val="single" w:sz="4" w:color="D0D5DD"/>
+            </w:tcBorders>
+            <w:vAlign w:val="center"/>
+          </w:tcPr>
+          <w:p>
+            <w:pPr>
+              <w:spacing w:before="40" w:after="40"/>
+              <w:jc w:val="right"/>
+            </w:pPr>
+            <w:r>
+              <w:rPr>
+                <w:rFonts w:ascii="Arial" w:hAnsi="Arial"/>
+                <w:rFonts w:ascii="Arial" w:hAnsi="Arial" w:cs="Arial"/>
+                <w:b/>
+                <w:i w:val="0"/>
+                <w:color w:val="0A2342"/>
+                <w:sz w:val="16"/>
+              </w:rPr>
+            </w:r>
+          </w:p>
+        </w:tc>
+        <w:tc>
+          <w:tcPr>
+            <w:tcW w:type="dxa" w:w="1134"/>
+            <w:shd w:val="clear" w:color="auto" w:fill="E5EBF1"/>
+            <w:tcBorders>
+              <w:bottom w:val="single" w:sz="4" w:color="D0D5DD"/>
+            </w:tcBorders>
+            <w:vAlign w:val="center"/>
+          </w:tcPr>
+          <w:p>
+            <w:pPr>
+              <w:spacing w:before="40" w:after="40"/>
+              <w:jc w:val="right"/>
+            </w:pPr>
+            <w:r>
+              <w:rPr>
+                <w:rFonts w:ascii="Arial" w:hAnsi="Arial"/>
+                <w:rFonts w:ascii="Arial" w:hAnsi="Arial" w:cs="Arial"/>
+                <w:b/>
+                <w:i w:val="0"/>
+                <w:color w:val="0A2342"/>
+                <w:sz w:val="16"/>
+              </w:rPr>
+            </w:r>
+          </w:p>
+        </w:tc>
+        <w:tc>
+          <w:tcPr>
+            <w:tcW w:type="dxa" w:w="1247"/>
+            <w:shd w:val="clear" w:color="auto" w:fill="E5EBF1"/>
+            <w:tcBorders>
+              <w:bottom w:val="single" w:sz="4" w:color="D0D5DD"/>
+            </w:tcBorders>
+            <w:vAlign w:val="center"/>
+          </w:tcPr>
+          <w:p>
+            <w:pPr>
+              <w:spacing w:before="40" w:after="40"/>
+              <w:jc w:val="right"/>
+            </w:pPr>
+            <w:r>
+              <w:rPr>
+                <w:rFonts w:ascii="Arial" w:hAnsi="Arial"/>
+                <w:rFonts w:ascii="Arial" w:hAnsi="Arial" w:cs="Arial"/>
+                <w:b/>
+                <w:i w:val="0"/>
+                <w:color w:val="0A2342"/>
+                <w:sz w:val="16"/>
+              </w:rPr>
+            </w:r>
+          </w:p>
+        </w:tc>
+        <w:tc>
+          <w:tcPr>
+            <w:tcW w:type="dxa" w:w="1361"/>
+            <w:shd w:val="clear" w:color="auto" w:fill="E5EBF1"/>
+            <w:tcBorders>
+              <w:bottom w:val="single" w:sz="4" w:color="D0D5DD"/>
+            </w:tcBorders>
+            <w:vAlign w:val="center"/>
+          </w:tcPr>
+          <w:p>
+            <w:pPr>
+              <w:spacing w:before="40" w:after="40"/>
+              <w:jc w:val="right"/>
+            </w:pPr>
+            <w:r>
+              <w:rPr>
+                <w:rFonts w:ascii="Arial" w:hAnsi="Arial"/>
+                <w:rFonts w:ascii="Arial" w:hAnsi="Arial" w:cs="Arial"/>
+                <w:b/>
+                <w:i w:val="0"/>
+                <w:color w:val="0A2342"/>
+                <w:sz w:val="16"/>
+              </w:rPr>
+              <w:t>$226,000.00</w:t>
+            </w:r>
+          </w:p>
+        </w:tc>
+      </w:tr>
     </w:tbl>
     <w:p>
       <w:pPr>
@@ -4633,7 +4842,7 @@
           <w:color w:val="0F2A4D"/>
           <w:sz w:val="20"/>
         </w:rPr>
-        <w:t>Rewards &amp; lifecycle</w:t>
+        <w:t>Rewards</w:t>
       </w:r>
     </w:p>
     <w:tbl>
@@ -4644,10 +4853,12 @@
         <w:tblLook w:firstColumn="1" w:firstRow="1" w:lastColumn="0" w:lastRow="0" w:noHBand="0" w:noVBand="1" w:val="04A0"/>
       </w:tblPr>
       <w:tblGrid>
-        <w:gridCol w:w="1020"/>
-        <w:gridCol w:w="3175"/>
-        <w:gridCol w:w="2835"/>
-        <w:gridCol w:w="2835"/>
+        <w:gridCol w:w="907"/>
+        <w:gridCol w:w="2268"/>
+        <w:gridCol w:w="1701"/>
+        <w:gridCol w:w="1587"/>
+        <w:gridCol w:w="1701"/>
+        <w:gridCol w:w="1587"/>
       </w:tblGrid>
       <w:tr>
         <w:trPr>
@@ -4655,7 +4866,7 @@
         </w:trPr>
         <w:tc>
           <w:tcPr>
-            <w:tcW w:type="dxa" w:w="1020"/>
+            <w:tcW w:type="dxa" w:w="907"/>
             <w:shd w:val="clear" w:color="auto" w:fill="0A2342"/>
             <w:tcBorders>
               <w:top w:val="nil"/>
@@ -4690,7 +4901,7 @@
         </w:tc>
         <w:tc>
           <w:tcPr>
-            <w:tcW w:type="dxa" w:w="3175"/>
+            <w:tcW w:type="dxa" w:w="2268"/>
             <w:shd w:val="clear" w:color="auto" w:fill="0A2342"/>
             <w:tcBorders>
               <w:top w:val="nil"/>
@@ -4725,7 +4936,7 @@
         </w:tc>
         <w:tc>
           <w:tcPr>
-            <w:tcW w:type="dxa" w:w="2835"/>
+            <w:tcW w:type="dxa" w:w="1701"/>
             <w:shd w:val="clear" w:color="auto" w:fill="0A2342"/>
             <w:tcBorders>
               <w:top w:val="nil"/>
@@ -4755,13 +4966,13 @@
                 <w:color w:val="FFFFFF"/>
                 <w:sz w:val="17"/>
               </w:rPr>
-              <w:t>Rewards Claimed (period)</w:t>
-            </w:r>
-          </w:p>
-        </w:tc>
-        <w:tc>
-          <w:tcPr>
-            <w:tcW w:type="dxa" w:w="2835"/>
+              <w:t>Claimed (period)</w:t>
+            </w:r>
+          </w:p>
+        </w:tc>
+        <w:tc>
+          <w:tcPr>
+            <w:tcW w:type="dxa" w:w="1587"/>
             <w:shd w:val="clear" w:color="auto" w:fill="0A2342"/>
             <w:tcBorders>
               <w:top w:val="nil"/>
@@ -4791,7 +5002,79 @@
                 <w:color w:val="FFFFFF"/>
                 <w:sz w:val="17"/>
               </w:rPr>
-              <w:t>Rewards Claimable (at period end)</w:t>
+              <w:t>Claimed Value (USD)</w:t>
+            </w:r>
+          </w:p>
+        </w:tc>
+        <w:tc>
+          <w:tcPr>
+            <w:tcW w:type="dxa" w:w="1701"/>
+            <w:shd w:val="clear" w:color="auto" w:fill="0A2342"/>
+            <w:tcBorders>
+              <w:top w:val="nil"/>
+            </w:tcBorders>
+            <w:tcBorders>
+              <w:bottom w:val="nil"/>
+            </w:tcBorders>
+            <w:tcBorders>
+              <w:left w:val="nil"/>
+            </w:tcBorders>
+            <w:tcBorders>
+              <w:right w:val="nil"/>
+            </w:tcBorders>
+            <w:vAlign w:val="center"/>
+          </w:tcPr>
+          <w:p>
+            <w:pPr>
+              <w:spacing w:before="0" w:after="0"/>
+              <w:jc w:val="right"/>
+            </w:pPr>
+            <w:r>
+              <w:rPr>
+                <w:rFonts w:ascii="Arial" w:hAnsi="Arial"/>
+                <w:rFonts w:ascii="Arial" w:hAnsi="Arial" w:cs="Arial"/>
+                <w:b/>
+                <w:i w:val="0"/>
+                <w:color w:val="FFFFFF"/>
+                <w:sz w:val="17"/>
+              </w:rPr>
+              <w:t>Claimable (period end)</w:t>
+            </w:r>
+          </w:p>
+        </w:tc>
+        <w:tc>
+          <w:tcPr>
+            <w:tcW w:type="dxa" w:w="1587"/>
+            <w:shd w:val="clear" w:color="auto" w:fill="0A2342"/>
+            <w:tcBorders>
+              <w:top w:val="nil"/>
+            </w:tcBorders>
+            <w:tcBorders>
+              <w:bottom w:val="nil"/>
+            </w:tcBorders>
+            <w:tcBorders>
+              <w:left w:val="nil"/>
+            </w:tcBorders>
+            <w:tcBorders>
+              <w:right w:val="nil"/>
+            </w:tcBorders>
+            <w:vAlign w:val="center"/>
+          </w:tcPr>
+          <w:p>
+            <w:pPr>
+              <w:spacing w:before="0" w:after="0"/>
+              <w:jc w:val="right"/>
+            </w:pPr>
+            <w:r>
+              <w:rPr>
+                <w:rFonts w:ascii="Arial" w:hAnsi="Arial"/>
+                <w:rFonts w:ascii="Arial" w:hAnsi="Arial" w:cs="Arial"/>
+                <w:b/>
+                <w:i w:val="0"/>
+                <w:color w:val="FFFFFF"/>
+                <w:sz w:val="17"/>
+              </w:rPr>
+              <w:t>Claimable Value (USD)</w:t>
             </w:r>
           </w:p>
         </w:tc>
@@ -4799,7 +5082,7 @@
       <w:tr>
         <w:tc>
           <w:tcPr>
-            <w:tcW w:type="dxa" w:w="1020"/>
+            <w:tcW w:type="dxa" w:w="907"/>
             <w:tcBorders>
               <w:bottom w:val="single" w:sz="4" w:color="D0D5DD"/>
             </w:tcBorders>
@@ -4824,7 +5107,7 @@
         </w:tc>
         <w:tc>
           <w:tcPr>
-            <w:tcW w:type="dxa" w:w="3175"/>
+            <w:tcW w:type="dxa" w:w="2268"/>
             <w:tcBorders>
               <w:bottom w:val="single" w:sz="4" w:color="D0D5DD"/>
             </w:tcBorders>
@@ -4849,7 +5132,7 @@
         </w:tc>
         <w:tc>
           <w:tcPr>
-            <w:tcW w:type="dxa" w:w="2835"/>
+            <w:tcW w:type="dxa" w:w="1701"/>
             <w:tcBorders>
               <w:bottom w:val="single" w:sz="4" w:color="D0D5DD"/>
             </w:tcBorders>
@@ -4870,14 +5153,38 @@
                 <w:sz w:val="16"/>
               </w:rPr>
               <w:t>0.8420 ETH</w:t>
-              <w:br/>
+            </w:r>
+          </w:p>
+        </w:tc>
+        <w:tc>
+          <w:tcPr>
+            <w:tcW w:type="dxa" w:w="1587"/>
+            <w:tcBorders>
+              <w:bottom w:val="single" w:sz="4" w:color="D0D5DD"/>
+            </w:tcBorders>
+            <w:vAlign w:val="center"/>
+          </w:tcPr>
+          <w:p>
+            <w:pPr>
+              <w:spacing w:before="40" w:after="40"/>
+              <w:jc w:val="right"/>
+            </w:pPr>
+            <w:r>
+              <w:rPr>
+                <w:rFonts w:ascii="Arial" w:hAnsi="Arial"/>
+                <w:rFonts w:ascii="Arial" w:hAnsi="Arial" w:cs="Arial"/>
+                <w:b w:val="0"/>
+                <w:i w:val="0"/>
+                <w:color w:val="4A5568"/>
+                <w:sz w:val="16"/>
+              </w:rPr>
               <w:t>$1,902.92</w:t>
             </w:r>
           </w:p>
         </w:tc>
         <w:tc>
           <w:tcPr>
-            <w:tcW w:type="dxa" w:w="2835"/>
+            <w:tcW w:type="dxa" w:w="1701"/>
             <w:tcBorders>
               <w:bottom w:val="single" w:sz="4" w:color="D0D5DD"/>
             </w:tcBorders>
@@ -4898,7 +5205,190 @@
                 <w:sz w:val="16"/>
               </w:rPr>
               <w:t>0.0210 ETH</w:t>
-              <w:br/>
+            </w:r>
+          </w:p>
+        </w:tc>
+        <w:tc>
+          <w:tcPr>
+            <w:tcW w:type="dxa" w:w="1587"/>
+            <w:tcBorders>
+              <w:bottom w:val="single" w:sz="4" w:color="D0D5DD"/>
+            </w:tcBorders>
+            <w:vAlign w:val="center"/>
+          </w:tcPr>
+          <w:p>
+            <w:pPr>
+              <w:spacing w:before="40" w:after="40"/>
+              <w:jc w:val="right"/>
+            </w:pPr>
+            <w:r>
+              <w:rPr>
+                <w:rFonts w:ascii="Arial" w:hAnsi="Arial"/>
+                <w:rFonts w:ascii="Arial" w:hAnsi="Arial" w:cs="Arial"/>
+                <w:b w:val="0"/>
+                <w:i w:val="0"/>
+                <w:color w:val="4A5568"/>
+                <w:sz w:val="16"/>
+              </w:rPr>
+              <w:t>$47.46</w:t>
+            </w:r>
+          </w:p>
+        </w:tc>
+      </w:tr>
+      <w:tr>
+        <w:tc>
+          <w:tcPr>
+            <w:tcW w:type="dxa" w:w="907"/>
+            <w:shd w:val="clear" w:color="auto" w:fill="E5EBF1"/>
+            <w:tcBorders>
+              <w:bottom w:val="single" w:sz="4" w:color="D0D5DD"/>
+            </w:tcBorders>
+            <w:vAlign w:val="center"/>
+          </w:tcPr>
+          <w:p>
+            <w:pPr>
+              <w:spacing w:before="40" w:after="40"/>
+            </w:pPr>
+            <w:r>
+              <w:rPr>
+                <w:rFonts w:ascii="Arial" w:hAnsi="Arial"/>
+                <w:rFonts w:ascii="Arial" w:hAnsi="Arial" w:cs="Arial"/>
+                <w:b/>
+                <w:i w:val="0"/>
+                <w:color w:val="0A2342"/>
+                <w:sz w:val="16"/>
+              </w:rPr>
+              <w:t>Total</w:t>
+            </w:r>
+          </w:p>
+        </w:tc>
+        <w:tc>
+          <w:tcPr>
+            <w:tcW w:type="dxa" w:w="2268"/>
+            <w:shd w:val="clear" w:color="auto" w:fill="E5EBF1"/>
+            <w:tcBorders>
+              <w:bottom w:val="single" w:sz="4" w:color="D0D5DD"/>
+            </w:tcBorders>
+            <w:vAlign w:val="center"/>
+          </w:tcPr>
+          <w:p>
+            <w:pPr>
+              <w:spacing w:before="40" w:after="40"/>
+            </w:pPr>
+            <w:r>
+              <w:rPr>
+                <w:rFonts w:ascii="Arial" w:hAnsi="Arial"/>
+                <w:rFonts w:ascii="Arial" w:hAnsi="Arial" w:cs="Arial"/>
+                <w:b/>
+                <w:i w:val="0"/>
+                <w:color w:val="0A2342"/>
+                <w:sz w:val="16"/>
+              </w:rPr>
+            </w:r>
+          </w:p>
+        </w:tc>
+        <w:tc>
+          <w:tcPr>
+            <w:tcW w:type="dxa" w:w="1701"/>
+            <w:shd w:val="clear" w:color="auto" w:fill="E5EBF1"/>
+            <w:tcBorders>
+              <w:bottom w:val="single" w:sz="4" w:color="D0D5DD"/>
+            </w:tcBorders>
+            <w:vAlign w:val="center"/>
+          </w:tcPr>
+          <w:p>
+            <w:pPr>
+              <w:spacing w:before="40" w:after="40"/>
+              <w:jc w:val="right"/>
+            </w:pPr>
+            <w:r>
+              <w:rPr>
+                <w:rFonts w:ascii="Arial" w:hAnsi="Arial"/>
+                <w:rFonts w:ascii="Arial" w:hAnsi="Arial" w:cs="Arial"/>
+                <w:b/>
+                <w:i w:val="0"/>
+                <w:color w:val="0A2342"/>
+                <w:sz w:val="16"/>
+              </w:rPr>
+            </w:r>
+          </w:p>
+        </w:tc>
+        <w:tc>
+          <w:tcPr>
+            <w:tcW w:type="dxa" w:w="1587"/>
+            <w:shd w:val="clear" w:color="auto" w:fill="E5EBF1"/>
+            <w:tcBorders>
+              <w:bottom w:val="single" w:sz="4" w:color="D0D5DD"/>
+            </w:tcBorders>
+            <w:vAlign w:val="center"/>
+          </w:tcPr>
+          <w:p>
+            <w:pPr>
+              <w:spacing w:before="40" w:after="40"/>
+              <w:jc w:val="right"/>
+            </w:pPr>
+            <w:r>
+              <w:rPr>
+                <w:rFonts w:ascii="Arial" w:hAnsi="Arial"/>
+                <w:rFonts w:ascii="Arial" w:hAnsi="Arial" w:cs="Arial"/>
+                <w:b/>
+                <w:i w:val="0"/>
+                <w:color w:val="0A2342"/>
+                <w:sz w:val="16"/>
+              </w:rPr>
+              <w:t>$1,902.92</w:t>
+            </w:r>
+          </w:p>
+        </w:tc>
+        <w:tc>
+          <w:tcPr>
+            <w:tcW w:type="dxa" w:w="1701"/>
+            <w:shd w:val="clear" w:color="auto" w:fill="E5EBF1"/>
+            <w:tcBorders>
+              <w:bottom w:val="single" w:sz="4" w:color="D0D5DD"/>
+            </w:tcBorders>
+            <w:vAlign w:val="center"/>
+          </w:tcPr>
+          <w:p>
+            <w:pPr>
+              <w:spacing w:before="40" w:after="40"/>
+              <w:jc w:val="right"/>
+            </w:pPr>
+            <w:r>
+              <w:rPr>
+                <w:rFonts w:ascii="Arial" w:hAnsi="Arial"/>
+                <w:rFonts w:ascii="Arial" w:hAnsi="Arial" w:cs="Arial"/>
+                <w:b/>
+                <w:i w:val="0"/>
+                <w:color w:val="0A2342"/>
+                <w:sz w:val="16"/>
+              </w:rPr>
+            </w:r>
+          </w:p>
+        </w:tc>
+        <w:tc>
+          <w:tcPr>
+            <w:tcW w:type="dxa" w:w="1587"/>
+            <w:shd w:val="clear" w:color="auto" w:fill="E5EBF1"/>
+            <w:tcBorders>
+              <w:bottom w:val="single" w:sz="4" w:color="D0D5DD"/>
+            </w:tcBorders>
+            <w:vAlign w:val="center"/>
+          </w:tcPr>
+          <w:p>
+            <w:pPr>
+              <w:spacing w:before="40" w:after="40"/>
+              <w:jc w:val="right"/>
+            </w:pPr>
+            <w:r>
+              <w:rPr>
+                <w:rFonts w:ascii="Arial" w:hAnsi="Arial"/>
+                <w:rFonts w:ascii="Arial" w:hAnsi="Arial" w:cs="Arial"/>
+                <w:b/>
+                <w:i w:val="0"/>
+                <w:color w:val="0A2342"/>
+                <w:sz w:val="16"/>
+              </w:rPr>
               <w:t>$47.46</w:t>
             </w:r>
           </w:p>
@@ -15492,6 +15982,215 @@
           </w:p>
         </w:tc>
       </w:tr>
+      <w:tr>
+        <w:tc>
+          <w:tcPr>
+            <w:tcW w:type="dxa" w:w="794"/>
+            <w:shd w:val="clear" w:color="auto" w:fill="E5EBF1"/>
+            <w:tcBorders>
+              <w:bottom w:val="single" w:sz="4" w:color="D0D5DD"/>
+            </w:tcBorders>
+            <w:vAlign w:val="center"/>
+          </w:tcPr>
+          <w:p>
+            <w:pPr>
+              <w:spacing w:before="40" w:after="40"/>
+            </w:pPr>
+            <w:r>
+              <w:rPr>
+                <w:rFonts w:ascii="Arial" w:hAnsi="Arial"/>
+                <w:rFonts w:ascii="Arial" w:hAnsi="Arial" w:cs="Arial"/>
+                <w:b/>
+                <w:i w:val="0"/>
+                <w:color w:val="0A2342"/>
+                <w:sz w:val="16"/>
+              </w:rPr>
+              <w:t>Total</w:t>
+            </w:r>
+          </w:p>
+        </w:tc>
+        <w:tc>
+          <w:tcPr>
+            <w:tcW w:type="dxa" w:w="1020"/>
+            <w:shd w:val="clear" w:color="auto" w:fill="E5EBF1"/>
+            <w:tcBorders>
+              <w:bottom w:val="single" w:sz="4" w:color="D0D5DD"/>
+            </w:tcBorders>
+            <w:vAlign w:val="center"/>
+          </w:tcPr>
+          <w:p>
+            <w:pPr>
+              <w:spacing w:before="40" w:after="40"/>
+            </w:pPr>
+            <w:r>
+              <w:rPr>
+                <w:rFonts w:ascii="Arial" w:hAnsi="Arial"/>
+                <w:rFonts w:ascii="Arial" w:hAnsi="Arial" w:cs="Arial"/>
+                <w:b/>
+                <w:i w:val="0"/>
+                <w:color w:val="0A2342"/>
+                <w:sz w:val="16"/>
+              </w:rPr>
+            </w:r>
+          </w:p>
+        </w:tc>
+        <w:tc>
+          <w:tcPr>
+            <w:tcW w:type="dxa" w:w="1814"/>
+            <w:shd w:val="clear" w:color="auto" w:fill="E5EBF1"/>
+            <w:tcBorders>
+              <w:bottom w:val="single" w:sz="4" w:color="D0D5DD"/>
+            </w:tcBorders>
+            <w:vAlign w:val="center"/>
+          </w:tcPr>
+          <w:p>
+            <w:pPr>
+              <w:spacing w:before="40" w:after="40"/>
+            </w:pPr>
+            <w:r>
+              <w:rPr>
+                <w:rFonts w:ascii="Arial" w:hAnsi="Arial"/>
+                <w:rFonts w:ascii="Arial" w:hAnsi="Arial" w:cs="Arial"/>
+                <w:b/>
+                <w:i w:val="0"/>
+                <w:color w:val="0A2342"/>
+                <w:sz w:val="16"/>
+              </w:rPr>
+            </w:r>
+          </w:p>
+        </w:tc>
+        <w:tc>
+          <w:tcPr>
+            <w:tcW w:type="dxa" w:w="1247"/>
+            <w:shd w:val="clear" w:color="auto" w:fill="E5EBF1"/>
+            <w:tcBorders>
+              <w:bottom w:val="single" w:sz="4" w:color="D0D5DD"/>
+            </w:tcBorders>
+            <w:vAlign w:val="center"/>
+          </w:tcPr>
+          <w:p>
+            <w:pPr>
+              <w:spacing w:before="40" w:after="40"/>
+              <w:jc w:val="right"/>
+            </w:pPr>
+            <w:r>
+              <w:rPr>
+                <w:rFonts w:ascii="Arial" w:hAnsi="Arial"/>
+                <w:rFonts w:ascii="Arial" w:hAnsi="Arial" w:cs="Arial"/>
+                <w:b/>
+                <w:i w:val="0"/>
+                <w:color w:val="0A2342"/>
+                <w:sz w:val="16"/>
+              </w:rPr>
+            </w:r>
+          </w:p>
+        </w:tc>
+        <w:tc>
+          <w:tcPr>
+            <w:tcW w:type="dxa" w:w="1247"/>
+            <w:shd w:val="clear" w:color="auto" w:fill="E5EBF1"/>
+            <w:tcBorders>
+              <w:bottom w:val="single" w:sz="4" w:color="D0D5DD"/>
+            </w:tcBorders>
+            <w:vAlign w:val="center"/>
+          </w:tcPr>
+          <w:p>
+            <w:pPr>
+              <w:spacing w:before="40" w:after="40"/>
+              <w:jc w:val="right"/>
+            </w:pPr>
+            <w:r>
+              <w:rPr>
+                <w:rFonts w:ascii="Arial" w:hAnsi="Arial"/>
+                <w:rFonts w:ascii="Arial" w:hAnsi="Arial" w:cs="Arial"/>
+                <w:b/>
+                <w:i w:val="0"/>
+                <w:color w:val="0A2342"/>
+                <w:sz w:val="16"/>
+              </w:rPr>
+            </w:r>
+          </w:p>
+        </w:tc>
+        <w:tc>
+          <w:tcPr>
+            <w:tcW w:type="dxa" w:w="1134"/>
+            <w:shd w:val="clear" w:color="auto" w:fill="E5EBF1"/>
+            <w:tcBorders>
+              <w:bottom w:val="single" w:sz="4" w:color="D0D5DD"/>
+            </w:tcBorders>
+            <w:vAlign w:val="center"/>
+          </w:tcPr>
+          <w:p>
+            <w:pPr>
+              <w:spacing w:before="40" w:after="40"/>
+              <w:jc w:val="right"/>
+            </w:pPr>
+            <w:r>
+              <w:rPr>
+                <w:rFonts w:ascii="Arial" w:hAnsi="Arial"/>
+                <w:rFonts w:ascii="Arial" w:hAnsi="Arial" w:cs="Arial"/>
+                <w:b/>
+                <w:i w:val="0"/>
+                <w:color w:val="0A2342"/>
+                <w:sz w:val="16"/>
+              </w:rPr>
+            </w:r>
+          </w:p>
+        </w:tc>
+        <w:tc>
+          <w:tcPr>
+            <w:tcW w:type="dxa" w:w="1247"/>
+            <w:shd w:val="clear" w:color="auto" w:fill="E5EBF1"/>
+            <w:tcBorders>
+              <w:bottom w:val="single" w:sz="4" w:color="D0D5DD"/>
+            </w:tcBorders>
+            <w:vAlign w:val="center"/>
+          </w:tcPr>
+          <w:p>
+            <w:pPr>
+              <w:spacing w:before="40" w:after="40"/>
+              <w:jc w:val="right"/>
+            </w:pPr>
+            <w:r>
+              <w:rPr>
+                <w:rFonts w:ascii="Arial" w:hAnsi="Arial"/>
+                <w:rFonts w:ascii="Arial" w:hAnsi="Arial" w:cs="Arial"/>
+                <w:b/>
+                <w:i w:val="0"/>
+                <w:color w:val="0A2342"/>
+                <w:sz w:val="16"/>
+              </w:rPr>
+            </w:r>
+          </w:p>
+        </w:tc>
+        <w:tc>
+          <w:tcPr>
+            <w:tcW w:type="dxa" w:w="1361"/>
+            <w:shd w:val="clear" w:color="auto" w:fill="E5EBF1"/>
+            <w:tcBorders>
+              <w:bottom w:val="single" w:sz="4" w:color="D0D5DD"/>
+            </w:tcBorders>
+            <w:vAlign w:val="center"/>
+          </w:tcPr>
+          <w:p>
+            <w:pPr>
+              <w:spacing w:before="40" w:after="40"/>
+              <w:jc w:val="right"/>
+            </w:pPr>
+            <w:r>
+              <w:rPr>
+                <w:rFonts w:ascii="Arial" w:hAnsi="Arial"/>
+                <w:rFonts w:ascii="Arial" w:hAnsi="Arial" w:cs="Arial"/>
+                <w:b/>
+                <w:i w:val="0"/>
+                <w:color w:val="0A2342"/>
+                <w:sz w:val="16"/>
+              </w:rPr>
+              <w:t>$226,000.00</w:t>
+            </w:r>
+          </w:p>
+        </w:tc>
+      </w:tr>
     </w:tbl>
     <w:p>
       <w:pPr>
@@ -15506,7 +16205,7 @@
           <w:color w:val="0F2A4D"/>
           <w:sz w:val="20"/>
         </w:rPr>
-        <w:t>Rewards &amp; lifecycle</w:t>
+        <w:t>Rewards</w:t>
       </w:r>
     </w:p>
     <w:tbl>
@@ -15517,10 +16216,12 @@
         <w:tblLook w:firstColumn="1" w:firstRow="1" w:lastColumn="0" w:lastRow="0" w:noHBand="0" w:noVBand="1" w:val="04A0"/>
       </w:tblPr>
       <w:tblGrid>
-        <w:gridCol w:w="1020"/>
-        <w:gridCol w:w="3175"/>
-        <w:gridCol w:w="2835"/>
-        <w:gridCol w:w="2835"/>
+        <w:gridCol w:w="907"/>
+        <w:gridCol w:w="2268"/>
+        <w:gridCol w:w="1701"/>
+        <w:gridCol w:w="1587"/>
+        <w:gridCol w:w="1701"/>
+        <w:gridCol w:w="1587"/>
       </w:tblGrid>
       <w:tr>
         <w:trPr>
@@ -15528,7 +16229,7 @@
         </w:trPr>
         <w:tc>
           <w:tcPr>
-            <w:tcW w:type="dxa" w:w="1020"/>
+            <w:tcW w:type="dxa" w:w="907"/>
             <w:shd w:val="clear" w:color="auto" w:fill="0A2342"/>
             <w:tcBorders>
               <w:top w:val="nil"/>
@@ -15563,7 +16264,7 @@
         </w:tc>
         <w:tc>
           <w:tcPr>
-            <w:tcW w:type="dxa" w:w="3175"/>
+            <w:tcW w:type="dxa" w:w="2268"/>
             <w:shd w:val="clear" w:color="auto" w:fill="0A2342"/>
             <w:tcBorders>
               <w:top w:val="nil"/>
@@ -15598,7 +16299,7 @@
         </w:tc>
         <w:tc>
           <w:tcPr>
-            <w:tcW w:type="dxa" w:w="2835"/>
+            <w:tcW w:type="dxa" w:w="1701"/>
             <w:shd w:val="clear" w:color="auto" w:fill="0A2342"/>
             <w:tcBorders>
               <w:top w:val="nil"/>
@@ -15628,13 +16329,13 @@
                 <w:color w:val="FFFFFF"/>
                 <w:sz w:val="17"/>
               </w:rPr>
-              <w:t>Rewards Claimed (period)</w:t>
-            </w:r>
-          </w:p>
-        </w:tc>
-        <w:tc>
-          <w:tcPr>
-            <w:tcW w:type="dxa" w:w="2835"/>
+              <w:t>Claimed (period)</w:t>
+            </w:r>
+          </w:p>
+        </w:tc>
+        <w:tc>
+          <w:tcPr>
+            <w:tcW w:type="dxa" w:w="1587"/>
             <w:shd w:val="clear" w:color="auto" w:fill="0A2342"/>
             <w:tcBorders>
               <w:top w:val="nil"/>
@@ -15664,7 +16365,79 @@
                 <w:color w:val="FFFFFF"/>
                 <w:sz w:val="17"/>
               </w:rPr>
-              <w:t>Rewards Claimable (at period end)</w:t>
+              <w:t>Claimed Value (USD)</w:t>
+            </w:r>
+          </w:p>
+        </w:tc>
+        <w:tc>
+          <w:tcPr>
+            <w:tcW w:type="dxa" w:w="1701"/>
+            <w:shd w:val="clear" w:color="auto" w:fill="0A2342"/>
+            <w:tcBorders>
+              <w:top w:val="nil"/>
+            </w:tcBorders>
+            <w:tcBorders>
+              <w:bottom w:val="nil"/>
+            </w:tcBorders>
+            <w:tcBorders>
+              <w:left w:val="nil"/>
+            </w:tcBorders>
+            <w:tcBorders>
+              <w:right w:val="nil"/>
+            </w:tcBorders>
+            <w:vAlign w:val="center"/>
+          </w:tcPr>
+          <w:p>
+            <w:pPr>
+              <w:spacing w:before="0" w:after="0"/>
+              <w:jc w:val="right"/>
+            </w:pPr>
+            <w:r>
+              <w:rPr>
+                <w:rFonts w:ascii="Arial" w:hAnsi="Arial"/>
+                <w:rFonts w:ascii="Arial" w:hAnsi="Arial" w:cs="Arial"/>
+                <w:b/>
+                <w:i w:val="0"/>
+                <w:color w:val="FFFFFF"/>
+                <w:sz w:val="17"/>
+              </w:rPr>
+              <w:t>Claimable (period end)</w:t>
+            </w:r>
+          </w:p>
+        </w:tc>
+        <w:tc>
+          <w:tcPr>
+            <w:tcW w:type="dxa" w:w="1587"/>
+            <w:shd w:val="clear" w:color="auto" w:fill="0A2342"/>
+            <w:tcBorders>
+              <w:top w:val="nil"/>
+            </w:tcBorders>
+            <w:tcBorders>
+              <w:bottom w:val="nil"/>
+            </w:tcBorders>
+            <w:tcBorders>
+              <w:left w:val="nil"/>
+            </w:tcBorders>
+            <w:tcBorders>
+              <w:right w:val="nil"/>
+            </w:tcBorders>
+            <w:vAlign w:val="center"/>
+          </w:tcPr>
+          <w:p>
+            <w:pPr>
+              <w:spacing w:before="0" w:after="0"/>
+              <w:jc w:val="right"/>
+            </w:pPr>
+            <w:r>
+              <w:rPr>
+                <w:rFonts w:ascii="Arial" w:hAnsi="Arial"/>
+                <w:rFonts w:ascii="Arial" w:hAnsi="Arial" w:cs="Arial"/>
+                <w:b/>
+                <w:i w:val="0"/>
+                <w:color w:val="FFFFFF"/>
+                <w:sz w:val="17"/>
+              </w:rPr>
+              <w:t>Claimable Value (USD)</w:t>
             </w:r>
           </w:p>
         </w:tc>
@@ -15672,7 +16445,7 @@
       <w:tr>
         <w:tc>
           <w:tcPr>
-            <w:tcW w:type="dxa" w:w="1020"/>
+            <w:tcW w:type="dxa" w:w="907"/>
             <w:tcBorders>
               <w:bottom w:val="single" w:sz="4" w:color="D0D5DD"/>
             </w:tcBorders>
@@ -15697,7 +16470,7 @@
         </w:tc>
         <w:tc>
           <w:tcPr>
-            <w:tcW w:type="dxa" w:w="3175"/>
+            <w:tcW w:type="dxa" w:w="2268"/>
             <w:tcBorders>
               <w:bottom w:val="single" w:sz="4" w:color="D0D5DD"/>
             </w:tcBorders>
@@ -15722,7 +16495,7 @@
         </w:tc>
         <w:tc>
           <w:tcPr>
-            <w:tcW w:type="dxa" w:w="2835"/>
+            <w:tcW w:type="dxa" w:w="1701"/>
             <w:tcBorders>
               <w:bottom w:val="single" w:sz="4" w:color="D0D5DD"/>
             </w:tcBorders>
@@ -15743,14 +16516,38 @@
                 <w:sz w:val="16"/>
               </w:rPr>
               <w:t>0.8420 ETH</w:t>
-              <w:br/>
+            </w:r>
+          </w:p>
+        </w:tc>
+        <w:tc>
+          <w:tcPr>
+            <w:tcW w:type="dxa" w:w="1587"/>
+            <w:tcBorders>
+              <w:bottom w:val="single" w:sz="4" w:color="D0D5DD"/>
+            </w:tcBorders>
+            <w:vAlign w:val="center"/>
+          </w:tcPr>
+          <w:p>
+            <w:pPr>
+              <w:spacing w:before="40" w:after="40"/>
+              <w:jc w:val="right"/>
+            </w:pPr>
+            <w:r>
+              <w:rPr>
+                <w:rFonts w:ascii="Arial" w:hAnsi="Arial"/>
+                <w:rFonts w:ascii="Arial" w:hAnsi="Arial" w:cs="Arial"/>
+                <w:b w:val="0"/>
+                <w:i w:val="0"/>
+                <w:color w:val="4A5568"/>
+                <w:sz w:val="16"/>
+              </w:rPr>
               <w:t>$1,902.92</w:t>
             </w:r>
           </w:p>
         </w:tc>
         <w:tc>
           <w:tcPr>
-            <w:tcW w:type="dxa" w:w="2835"/>
+            <w:tcW w:type="dxa" w:w="1701"/>
             <w:tcBorders>
               <w:bottom w:val="single" w:sz="4" w:color="D0D5DD"/>
             </w:tcBorders>
@@ -15771,7 +16568,190 @@
                 <w:sz w:val="16"/>
               </w:rPr>
               <w:t>0.0210 ETH</w:t>
-              <w:br/>
+            </w:r>
+          </w:p>
+        </w:tc>
+        <w:tc>
+          <w:tcPr>
+            <w:tcW w:type="dxa" w:w="1587"/>
+            <w:tcBorders>
+              <w:bottom w:val="single" w:sz="4" w:color="D0D5DD"/>
+            </w:tcBorders>
+            <w:vAlign w:val="center"/>
+          </w:tcPr>
+          <w:p>
+            <w:pPr>
+              <w:spacing w:before="40" w:after="40"/>
+              <w:jc w:val="right"/>
+            </w:pPr>
+            <w:r>
+              <w:rPr>
+                <w:rFonts w:ascii="Arial" w:hAnsi="Arial"/>
+                <w:rFonts w:ascii="Arial" w:hAnsi="Arial" w:cs="Arial"/>
+                <w:b w:val="0"/>
+                <w:i w:val="0"/>
+                <w:color w:val="4A5568"/>
+                <w:sz w:val="16"/>
+              </w:rPr>
+              <w:t>$47.46</w:t>
+            </w:r>
+          </w:p>
+        </w:tc>
+      </w:tr>
+      <w:tr>
+        <w:tc>
+          <w:tcPr>
+            <w:tcW w:type="dxa" w:w="907"/>
+            <w:shd w:val="clear" w:color="auto" w:fill="E5EBF1"/>
+            <w:tcBorders>
+              <w:bottom w:val="single" w:sz="4" w:color="D0D5DD"/>
+            </w:tcBorders>
+            <w:vAlign w:val="center"/>
+          </w:tcPr>
+          <w:p>
+            <w:pPr>
+              <w:spacing w:before="40" w:after="40"/>
+            </w:pPr>
+            <w:r>
+              <w:rPr>
+                <w:rFonts w:ascii="Arial" w:hAnsi="Arial"/>
+                <w:rFonts w:ascii="Arial" w:hAnsi="Arial" w:cs="Arial"/>
+                <w:b/>
+                <w:i w:val="0"/>
+                <w:color w:val="0A2342"/>
+                <w:sz w:val="16"/>
+              </w:rPr>
+              <w:t>Total</w:t>
+            </w:r>
+          </w:p>
+        </w:tc>
+        <w:tc>
+          <w:tcPr>
+            <w:tcW w:type="dxa" w:w="2268"/>
+            <w:shd w:val="clear" w:color="auto" w:fill="E5EBF1"/>
+            <w:tcBorders>
+              <w:bottom w:val="single" w:sz="4" w:color="D0D5DD"/>
+            </w:tcBorders>
+            <w:vAlign w:val="center"/>
+          </w:tcPr>
+          <w:p>
+            <w:pPr>
+              <w:spacing w:before="40" w:after="40"/>
+            </w:pPr>
+            <w:r>
+              <w:rPr>
+                <w:rFonts w:ascii="Arial" w:hAnsi="Arial"/>
+                <w:rFonts w:ascii="Arial" w:hAnsi="Arial" w:cs="Arial"/>
+                <w:b/>
+                <w:i w:val="0"/>
+                <w:color w:val="0A2342"/>
+                <w:sz w:val="16"/>
+              </w:rPr>
+            </w:r>
+          </w:p>
+        </w:tc>
+        <w:tc>
+          <w:tcPr>
+            <w:tcW w:type="dxa" w:w="1701"/>
+            <w:shd w:val="clear" w:color="auto" w:fill="E5EBF1"/>
+            <w:tcBorders>
+              <w:bottom w:val="single" w:sz="4" w:color="D0D5DD"/>
+            </w:tcBorders>
+            <w:vAlign w:val="center"/>
+          </w:tcPr>
+          <w:p>
+            <w:pPr>
+              <w:spacing w:before="40" w:after="40"/>
+              <w:jc w:val="right"/>
+            </w:pPr>
+            <w:r>
+              <w:rPr>
+                <w:rFonts w:ascii="Arial" w:hAnsi="Arial"/>
+                <w:rFonts w:ascii="Arial" w:hAnsi="Arial" w:cs="Arial"/>
+                <w:b/>
+                <w:i w:val="0"/>
+                <w:color w:val="0A2342"/>
+                <w:sz w:val="16"/>
+              </w:rPr>
+            </w:r>
+          </w:p>
+        </w:tc>
+        <w:tc>
+          <w:tcPr>
+            <w:tcW w:type="dxa" w:w="1587"/>
+            <w:shd w:val="clear" w:color="auto" w:fill="E5EBF1"/>
+            <w:tcBorders>
+              <w:bottom w:val="single" w:sz="4" w:color="D0D5DD"/>
+            </w:tcBorders>
+            <w:vAlign w:val="center"/>
+          </w:tcPr>
+          <w:p>
+            <w:pPr>
+              <w:spacing w:before="40" w:after="40"/>
+              <w:jc w:val="right"/>
+            </w:pPr>
+            <w:r>
+              <w:rPr>
+                <w:rFonts w:ascii="Arial" w:hAnsi="Arial"/>
+                <w:rFonts w:ascii="Arial" w:hAnsi="Arial" w:cs="Arial"/>
+                <w:b/>
+                <w:i w:val="0"/>
+                <w:color w:val="0A2342"/>
+                <w:sz w:val="16"/>
+              </w:rPr>
+              <w:t>$1,902.92</w:t>
+            </w:r>
+          </w:p>
+        </w:tc>
+        <w:tc>
+          <w:tcPr>
+            <w:tcW w:type="dxa" w:w="1701"/>
+            <w:shd w:val="clear" w:color="auto" w:fill="E5EBF1"/>
+            <w:tcBorders>
+              <w:bottom w:val="single" w:sz="4" w:color="D0D5DD"/>
+            </w:tcBorders>
+            <w:vAlign w:val="center"/>
+          </w:tcPr>
+          <w:p>
+            <w:pPr>
+              <w:spacing w:before="40" w:after="40"/>
+              <w:jc w:val="right"/>
+            </w:pPr>
+            <w:r>
+              <w:rPr>
+                <w:rFonts w:ascii="Arial" w:hAnsi="Arial"/>
+                <w:rFonts w:ascii="Arial" w:hAnsi="Arial" w:cs="Arial"/>
+                <w:b/>
+                <w:i w:val="0"/>
+                <w:color w:val="0A2342"/>
+                <w:sz w:val="16"/>
+              </w:rPr>
+            </w:r>
+          </w:p>
+        </w:tc>
+        <w:tc>
+          <w:tcPr>
+            <w:tcW w:type="dxa" w:w="1587"/>
+            <w:shd w:val="clear" w:color="auto" w:fill="E5EBF1"/>
+            <w:tcBorders>
+              <w:bottom w:val="single" w:sz="4" w:color="D0D5DD"/>
+            </w:tcBorders>
+            <w:vAlign w:val="center"/>
+          </w:tcPr>
+          <w:p>
+            <w:pPr>
+              <w:spacing w:before="40" w:after="40"/>
+              <w:jc w:val="right"/>
+            </w:pPr>
+            <w:r>
+              <w:rPr>
+                <w:rFonts w:ascii="Arial" w:hAnsi="Arial"/>
+                <w:rFonts w:ascii="Arial" w:hAnsi="Arial" w:cs="Arial"/>
+                <w:b/>
+                <w:i w:val="0"/>
+                <w:color w:val="0A2342"/>
+                <w:sz w:val="16"/>
+              </w:rPr>
               <w:t>$47.46</w:t>
             </w:r>
           </w:p>

</xml_diff>

<commit_message>
Samples: replace blockchain hash with internal Transaction ID
- Replaced all on-chain hash strings (0x..., bc1q..., TRX...) in the
  Transactions / Staking transactions / Settlement Movements tables
  with internal Wyyyymmdd-XXXX IDs (e.g. W20260401-4NH8). Same ID is
  shared by paired entries (Claiming Rewards + Validator Commission;
  OTC Settlement-In + Settlement-Out for the same trade).
- Column header: "Hash / Ref" → "Transaction ID".

Co-Authored-By: Claude Opus 4.7 <noreply@anthropic.com>
</commit_message>
<xml_diff>
--- a/mockup/monthly_client_statement/sample-statements/Custody_Detailed_sample.docx
+++ b/mockup/monthly_client_statement/sample-statements/Custody_Detailed_sample.docx
@@ -7267,7 +7267,7 @@
                 <w:color w:val="FFFFFF"/>
                 <w:sz w:val="17"/>
               </w:rPr>
-              <w:t>Hash / Ref</w:t>
+              <w:t>Transaction ID</w:t>
             </w:r>
           </w:p>
         </w:tc>
@@ -7473,7 +7473,7 @@
                 <w:color w:val="4A5568"/>
                 <w:sz w:val="15"/>
               </w:rPr>
-              <w:t>0x4f12...c8a3</w:t>
+              <w:t>W20260401-4NH8</w:t>
             </w:r>
           </w:p>
         </w:tc>
@@ -7687,7 +7687,7 @@
                 <w:color w:val="4A5568"/>
                 <w:sz w:val="15"/>
               </w:rPr>
-              <w:t>0x9b27...d014</w:t>
+              <w:t>W20260409-6BV3</w:t>
               <w:br/>
               <w:t>OTC Trade #T-204602</w:t>
             </w:r>
@@ -7895,7 +7895,7 @@
                 <w:color w:val="4A5568"/>
                 <w:sz w:val="15"/>
               </w:rPr>
-              <w:t>0x771a...e0d3</w:t>
+              <w:t>W20260413-8XK1</w:t>
               <w:br/>
               <w:t>OTC Trade #T-204602</w:t>
             </w:r>
@@ -8111,7 +8111,7 @@
                 <w:color w:val="4A5568"/>
                 <w:sz w:val="15"/>
               </w:rPr>
-              <w:t>bc1q...m9zd</w:t>
+              <w:t>W20260422-3JT5</w:t>
             </w:r>
           </w:p>
         </w:tc>
@@ -8317,7 +8317,7 @@
                 <w:color w:val="4A5568"/>
                 <w:sz w:val="15"/>
               </w:rPr>
-              <w:t>bc1q...nf02</w:t>
+              <w:t>W20260422-9CW7</w:t>
             </w:r>
           </w:p>
         </w:tc>
@@ -8531,7 +8531,7 @@
                 <w:color w:val="4A5568"/>
                 <w:sz w:val="15"/>
               </w:rPr>
-              <w:t>bc1q...p9wq</w:t>
+              <w:t>W20260423-2RP4</w:t>
             </w:r>
           </w:p>
         </w:tc>
@@ -8737,7 +8737,7 @@
                 <w:color w:val="4A5568"/>
                 <w:sz w:val="15"/>
               </w:rPr>
-              <w:t>bc1q...t44k</w:t>
+              <w:t>W20260423-7QY9</w:t>
             </w:r>
           </w:p>
         </w:tc>
@@ -8951,7 +8951,7 @@
                 <w:color w:val="4A5568"/>
                 <w:sz w:val="15"/>
               </w:rPr>
-              <w:t>0xe88b...1c40</w:t>
+              <w:t>W20260424-5MK2</w:t>
               <w:br/>
               <w:t>OTC Trade #T-204687</w:t>
             </w:r>
@@ -10318,7 +10318,7 @@
                 <w:color w:val="FFFFFF"/>
                 <w:sz w:val="17"/>
               </w:rPr>
-              <w:t>Hash / Ref</w:t>
+              <w:t>Transaction ID</w:t>
             </w:r>
           </w:p>
         </w:tc>
@@ -10524,7 +10524,7 @@
                 <w:color w:val="4A5568"/>
                 <w:sz w:val="15"/>
               </w:rPr>
-              <w:t>0x2a55...09bd</w:t>
+              <w:t>W20260415-8NF3</w:t>
               <w:br/>
               <w:t>Top-up from Markets Settlement</w:t>
             </w:r>
@@ -12706,7 +12706,7 @@
                 <w:color w:val="FFFFFF"/>
                 <w:sz w:val="17"/>
               </w:rPr>
-              <w:t>Hash / Ref</w:t>
+              <w:t>Transaction ID</w:t>
             </w:r>
           </w:p>
         </w:tc>
@@ -12912,7 +12912,7 @@
                 <w:color w:val="4A5568"/>
                 <w:sz w:val="15"/>
               </w:rPr>
-              <w:t>TRX...8e1a</w:t>
+              <w:t>W20260401-1DH6</w:t>
             </w:r>
           </w:p>
         </w:tc>
@@ -13126,7 +13126,7 @@
                 <w:color w:val="4A5568"/>
                 <w:sz w:val="15"/>
               </w:rPr>
-              <w:t>TRX...3334</w:t>
+              <w:t>W20260402-3FG2</w:t>
               <w:br/>
               <w:t>OTC Trade #T-204598</w:t>
             </w:r>
@@ -13334,7 +13334,7 @@
                 <w:color w:val="4A5568"/>
                 <w:sz w:val="15"/>
               </w:rPr>
-              <w:t>0x9b27...e2c1</w:t>
+              <w:t>W20260413-6LQ8</w:t>
             </w:r>
           </w:p>
         </w:tc>
@@ -13548,7 +13548,7 @@
                 <w:color w:val="4A5568"/>
                 <w:sz w:val="15"/>
               </w:rPr>
-              <w:t>TRX...4hxz</w:t>
+              <w:t>W20260413-9PT5</w:t>
             </w:r>
           </w:p>
         </w:tc>
@@ -13754,7 +13754,7 @@
                 <w:color w:val="4A5568"/>
                 <w:sz w:val="15"/>
               </w:rPr>
-              <w:t>TRX...4j9y</w:t>
+              <w:t>W20260415-4VR1</w:t>
               <w:br/>
               <w:t>OTC Trade #T-204603</w:t>
             </w:r>
@@ -13970,7 +13970,7 @@
                 <w:color w:val="4A5568"/>
                 <w:sz w:val="15"/>
               </w:rPr>
-              <w:t>0xdkkn...1900</w:t>
+              <w:t>W20260420-7HX4</w:t>
             </w:r>
           </w:p>
         </w:tc>
@@ -14176,7 +14176,7 @@
                 <w:color w:val="4A5568"/>
                 <w:sz w:val="15"/>
               </w:rPr>
-              <w:t>0x4jve...20e3</w:t>
+              <w:t>W20260420-2KW9</w:t>
               <w:br/>
               <w:t>OTC Trade #T-204614</w:t>
             </w:r>
@@ -14392,7 +14392,7 @@
                 <w:color w:val="4A5568"/>
                 <w:sz w:val="15"/>
               </w:rPr>
-              <w:t>bc1q...p7zg</w:t>
+              <w:t>W20260422-5GN3</w:t>
             </w:r>
           </w:p>
         </w:tc>
@@ -14598,7 +14598,7 @@
                 <w:color w:val="4A5568"/>
                 <w:sz w:val="15"/>
               </w:rPr>
-              <w:t>bc1q...kfw1</w:t>
+              <w:t>W20260422-8LY6</w:t>
             </w:r>
           </w:p>
         </w:tc>
@@ -14812,7 +14812,7 @@
                 <w:color w:val="4A5568"/>
                 <w:sz w:val="15"/>
               </w:rPr>
-              <w:t>TRX...4mg3</w:t>
+              <w:t>W20260428-3RM7</w:t>
               <w:br/>
               <w:t>OTC Trade #T-204661</w:t>
             </w:r>
@@ -17075,7 +17075,7 @@
                 <w:color w:val="FFFFFF"/>
                 <w:sz w:val="17"/>
               </w:rPr>
-              <w:t>Hash / Ref</w:t>
+              <w:t>Transaction ID</w:t>
             </w:r>
           </w:p>
         </w:tc>
@@ -17281,7 +17281,7 @@
                 <w:color w:val="4A5568"/>
                 <w:sz w:val="16"/>
               </w:rPr>
-              <w:t>0x7e44...d910</w:t>
+              <w:t>W20260407-9KX2</w:t>
             </w:r>
           </w:p>
         </w:tc>
@@ -17495,7 +17495,7 @@
                 <w:color w:val="4A5568"/>
                 <w:sz w:val="16"/>
               </w:rPr>
-              <w:t>0x7e44...d910</w:t>
+              <w:t>W20260407-9KX2</w:t>
             </w:r>
           </w:p>
         </w:tc>
@@ -17701,7 +17701,7 @@
                 <w:color w:val="4A5568"/>
                 <w:sz w:val="16"/>
               </w:rPr>
-              <w:t>0x83a1...b227</w:t>
+              <w:t>W20260414-2HM7</w:t>
             </w:r>
           </w:p>
         </w:tc>
@@ -17915,7 +17915,7 @@
                 <w:color w:val="4A5568"/>
                 <w:sz w:val="16"/>
               </w:rPr>
-              <w:t>0x83a1...b227</w:t>
+              <w:t>W20260414-2HM7</w:t>
             </w:r>
           </w:p>
         </w:tc>
@@ -18121,7 +18121,7 @@
                 <w:color w:val="4A5568"/>
                 <w:sz w:val="16"/>
               </w:rPr>
-              <w:t>0xc502...4f0e</w:t>
+              <w:t>W20260421-7QR4</w:t>
             </w:r>
           </w:p>
         </w:tc>
@@ -18335,7 +18335,7 @@
                 <w:color w:val="4A5568"/>
                 <w:sz w:val="16"/>
               </w:rPr>
-              <w:t>0xc502...4f0e</w:t>
+              <w:t>W20260421-7QR4</w:t>
             </w:r>
           </w:p>
         </w:tc>
@@ -18541,7 +18541,7 @@
                 <w:color w:val="4A5568"/>
                 <w:sz w:val="16"/>
               </w:rPr>
-              <w:t>0xd17a...8c0b</w:t>
+              <w:t>W20260428-5LP9</w:t>
             </w:r>
           </w:p>
         </w:tc>
@@ -18755,7 +18755,7 @@
                 <w:color w:val="4A5568"/>
                 <w:sz w:val="16"/>
               </w:rPr>
-              <w:t>0xd17a...8c0b</w:t>
+              <w:t>W20260428-5LP9</w:t>
             </w:r>
           </w:p>
         </w:tc>
@@ -19303,7 +19303,7 @@
                 <w:color w:val="FFFFFF"/>
                 <w:sz w:val="17"/>
               </w:rPr>
-              <w:t>Hash / Ref</w:t>
+              <w:t>Transaction ID</w:t>
             </w:r>
           </w:p>
         </w:tc>
@@ -19552,7 +19552,7 @@
                 <w:color w:val="4A5568"/>
                 <w:sz w:val="15"/>
               </w:rPr>
-              <w:t>0x9b27...e2c1</w:t>
+              <w:t>W20260413-6LQ8</w:t>
             </w:r>
           </w:p>
         </w:tc>
@@ -19792,7 +19792,7 @@
                 <w:color w:val="4A5568"/>
                 <w:sz w:val="15"/>
               </w:rPr>
-              <w:t>0xdkkn...1900</w:t>
+              <w:t>W20260420-7HX4</w:t>
             </w:r>
           </w:p>
         </w:tc>
@@ -20032,7 +20032,7 @@
                 <w:color w:val="4A5568"/>
                 <w:sz w:val="15"/>
               </w:rPr>
-              <w:t>bc1q...m9zd</w:t>
+              <w:t>W20260422-3JT5</w:t>
             </w:r>
           </w:p>
         </w:tc>

</xml_diff>

<commit_message>
Per-vault Opening/Closing balances: add Total row
Total row sums Closing Value (USD) per vault; other qty columns
blank (different assets aren't sum-comparable).

Co-Authored-By: Claude Opus 4.7 <noreply@anthropic.com>
</commit_message>
<xml_diff>
--- a/mockup/monthly_client_statement/sample-statements/Custody_Detailed_sample.docx
+++ b/mockup/monthly_client_statement/sample-statements/Custody_Detailed_sample.docx
@@ -6949,6 +6949,164 @@
           </w:p>
         </w:tc>
       </w:tr>
+      <w:tr>
+        <w:tc>
+          <w:tcPr>
+            <w:tcW w:type="dxa" w:w="907"/>
+            <w:shd w:val="clear" w:color="auto" w:fill="E5EBF1"/>
+            <w:tcBorders>
+              <w:bottom w:val="single" w:sz="4" w:color="D0D5DD"/>
+            </w:tcBorders>
+            <w:vAlign w:val="center"/>
+          </w:tcPr>
+          <w:p>
+            <w:pPr>
+              <w:spacing w:before="40" w:after="40"/>
+            </w:pPr>
+            <w:r>
+              <w:rPr>
+                <w:rFonts w:ascii="Arial" w:hAnsi="Arial"/>
+                <w:rFonts w:ascii="Arial" w:hAnsi="Arial" w:cs="Arial"/>
+                <w:b/>
+                <w:i w:val="0"/>
+                <w:color w:val="0A2342"/>
+                <w:sz w:val="16"/>
+              </w:rPr>
+              <w:t>Total</w:t>
+            </w:r>
+          </w:p>
+        </w:tc>
+        <w:tc>
+          <w:tcPr>
+            <w:tcW w:type="dxa" w:w="1701"/>
+            <w:shd w:val="clear" w:color="auto" w:fill="E5EBF1"/>
+            <w:tcBorders>
+              <w:bottom w:val="single" w:sz="4" w:color="D0D5DD"/>
+            </w:tcBorders>
+            <w:vAlign w:val="center"/>
+          </w:tcPr>
+          <w:p>
+            <w:pPr>
+              <w:spacing w:before="40" w:after="40"/>
+            </w:pPr>
+            <w:r>
+              <w:rPr>
+                <w:rFonts w:ascii="Arial" w:hAnsi="Arial"/>
+                <w:rFonts w:ascii="Arial" w:hAnsi="Arial" w:cs="Arial"/>
+                <w:b/>
+                <w:i w:val="0"/>
+                <w:color w:val="0A2342"/>
+                <w:sz w:val="16"/>
+              </w:rPr>
+            </w:r>
+          </w:p>
+        </w:tc>
+        <w:tc>
+          <w:tcPr>
+            <w:tcW w:type="dxa" w:w="1814"/>
+            <w:shd w:val="clear" w:color="auto" w:fill="E5EBF1"/>
+            <w:tcBorders>
+              <w:bottom w:val="single" w:sz="4" w:color="D0D5DD"/>
+            </w:tcBorders>
+            <w:vAlign w:val="center"/>
+          </w:tcPr>
+          <w:p>
+            <w:pPr>
+              <w:spacing w:before="40" w:after="40"/>
+              <w:jc w:val="right"/>
+            </w:pPr>
+            <w:r>
+              <w:rPr>
+                <w:rFonts w:ascii="Arial" w:hAnsi="Arial"/>
+                <w:rFonts w:ascii="Arial" w:hAnsi="Arial" w:cs="Arial"/>
+                <w:b/>
+                <w:i w:val="0"/>
+                <w:color w:val="0A2342"/>
+                <w:sz w:val="16"/>
+              </w:rPr>
+            </w:r>
+          </w:p>
+        </w:tc>
+        <w:tc>
+          <w:tcPr>
+            <w:tcW w:type="dxa" w:w="1814"/>
+            <w:shd w:val="clear" w:color="auto" w:fill="E5EBF1"/>
+            <w:tcBorders>
+              <w:bottom w:val="single" w:sz="4" w:color="D0D5DD"/>
+            </w:tcBorders>
+            <w:vAlign w:val="center"/>
+          </w:tcPr>
+          <w:p>
+            <w:pPr>
+              <w:spacing w:before="40" w:after="40"/>
+              <w:jc w:val="right"/>
+            </w:pPr>
+            <w:r>
+              <w:rPr>
+                <w:rFonts w:ascii="Arial" w:hAnsi="Arial"/>
+                <w:rFonts w:ascii="Arial" w:hAnsi="Arial" w:cs="Arial"/>
+                <w:b/>
+                <w:i w:val="0"/>
+                <w:color w:val="0A2342"/>
+                <w:sz w:val="16"/>
+              </w:rPr>
+            </w:r>
+          </w:p>
+        </w:tc>
+        <w:tc>
+          <w:tcPr>
+            <w:tcW w:type="dxa" w:w="1587"/>
+            <w:shd w:val="clear" w:color="auto" w:fill="E5EBF1"/>
+            <w:tcBorders>
+              <w:bottom w:val="single" w:sz="4" w:color="D0D5DD"/>
+            </w:tcBorders>
+            <w:vAlign w:val="center"/>
+          </w:tcPr>
+          <w:p>
+            <w:pPr>
+              <w:spacing w:before="40" w:after="40"/>
+              <w:jc w:val="right"/>
+            </w:pPr>
+            <w:r>
+              <w:rPr>
+                <w:rFonts w:ascii="Arial" w:hAnsi="Arial"/>
+                <w:rFonts w:ascii="Arial" w:hAnsi="Arial" w:cs="Arial"/>
+                <w:b/>
+                <w:i w:val="0"/>
+                <w:color w:val="0A2342"/>
+                <w:sz w:val="16"/>
+              </w:rPr>
+            </w:r>
+          </w:p>
+        </w:tc>
+        <w:tc>
+          <w:tcPr>
+            <w:tcW w:type="dxa" w:w="2041"/>
+            <w:shd w:val="clear" w:color="auto" w:fill="E5EBF1"/>
+            <w:tcBorders>
+              <w:bottom w:val="single" w:sz="4" w:color="D0D5DD"/>
+            </w:tcBorders>
+            <w:vAlign w:val="center"/>
+          </w:tcPr>
+          <w:p>
+            <w:pPr>
+              <w:spacing w:before="40" w:after="40"/>
+              <w:jc w:val="right"/>
+            </w:pPr>
+            <w:r>
+              <w:rPr>
+                <w:rFonts w:ascii="Arial" w:hAnsi="Arial"/>
+                <w:rFonts w:ascii="Arial" w:hAnsi="Arial" w:cs="Arial"/>
+                <w:b/>
+                <w:i w:val="0"/>
+                <w:color w:val="0A2342"/>
+                <w:sz w:val="16"/>
+              </w:rPr>
+              <w:t>$463,713.98</w:t>
+            </w:r>
+          </w:p>
+        </w:tc>
+      </w:tr>
     </w:tbl>
     <w:p>
       <w:pPr>
@@ -10000,6 +10158,164 @@
           </w:p>
         </w:tc>
       </w:tr>
+      <w:tr>
+        <w:tc>
+          <w:tcPr>
+            <w:tcW w:type="dxa" w:w="907"/>
+            <w:shd w:val="clear" w:color="auto" w:fill="E5EBF1"/>
+            <w:tcBorders>
+              <w:bottom w:val="single" w:sz="4" w:color="D0D5DD"/>
+            </w:tcBorders>
+            <w:vAlign w:val="center"/>
+          </w:tcPr>
+          <w:p>
+            <w:pPr>
+              <w:spacing w:before="40" w:after="40"/>
+            </w:pPr>
+            <w:r>
+              <w:rPr>
+                <w:rFonts w:ascii="Arial" w:hAnsi="Arial"/>
+                <w:rFonts w:ascii="Arial" w:hAnsi="Arial" w:cs="Arial"/>
+                <w:b/>
+                <w:i w:val="0"/>
+                <w:color w:val="0A2342"/>
+                <w:sz w:val="16"/>
+              </w:rPr>
+              <w:t>Total</w:t>
+            </w:r>
+          </w:p>
+        </w:tc>
+        <w:tc>
+          <w:tcPr>
+            <w:tcW w:type="dxa" w:w="1701"/>
+            <w:shd w:val="clear" w:color="auto" w:fill="E5EBF1"/>
+            <w:tcBorders>
+              <w:bottom w:val="single" w:sz="4" w:color="D0D5DD"/>
+            </w:tcBorders>
+            <w:vAlign w:val="center"/>
+          </w:tcPr>
+          <w:p>
+            <w:pPr>
+              <w:spacing w:before="40" w:after="40"/>
+            </w:pPr>
+            <w:r>
+              <w:rPr>
+                <w:rFonts w:ascii="Arial" w:hAnsi="Arial"/>
+                <w:rFonts w:ascii="Arial" w:hAnsi="Arial" w:cs="Arial"/>
+                <w:b/>
+                <w:i w:val="0"/>
+                <w:color w:val="0A2342"/>
+                <w:sz w:val="16"/>
+              </w:rPr>
+            </w:r>
+          </w:p>
+        </w:tc>
+        <w:tc>
+          <w:tcPr>
+            <w:tcW w:type="dxa" w:w="1814"/>
+            <w:shd w:val="clear" w:color="auto" w:fill="E5EBF1"/>
+            <w:tcBorders>
+              <w:bottom w:val="single" w:sz="4" w:color="D0D5DD"/>
+            </w:tcBorders>
+            <w:vAlign w:val="center"/>
+          </w:tcPr>
+          <w:p>
+            <w:pPr>
+              <w:spacing w:before="40" w:after="40"/>
+              <w:jc w:val="right"/>
+            </w:pPr>
+            <w:r>
+              <w:rPr>
+                <w:rFonts w:ascii="Arial" w:hAnsi="Arial"/>
+                <w:rFonts w:ascii="Arial" w:hAnsi="Arial" w:cs="Arial"/>
+                <w:b/>
+                <w:i w:val="0"/>
+                <w:color w:val="0A2342"/>
+                <w:sz w:val="16"/>
+              </w:rPr>
+            </w:r>
+          </w:p>
+        </w:tc>
+        <w:tc>
+          <w:tcPr>
+            <w:tcW w:type="dxa" w:w="1814"/>
+            <w:shd w:val="clear" w:color="auto" w:fill="E5EBF1"/>
+            <w:tcBorders>
+              <w:bottom w:val="single" w:sz="4" w:color="D0D5DD"/>
+            </w:tcBorders>
+            <w:vAlign w:val="center"/>
+          </w:tcPr>
+          <w:p>
+            <w:pPr>
+              <w:spacing w:before="40" w:after="40"/>
+              <w:jc w:val="right"/>
+            </w:pPr>
+            <w:r>
+              <w:rPr>
+                <w:rFonts w:ascii="Arial" w:hAnsi="Arial"/>
+                <w:rFonts w:ascii="Arial" w:hAnsi="Arial" w:cs="Arial"/>
+                <w:b/>
+                <w:i w:val="0"/>
+                <w:color w:val="0A2342"/>
+                <w:sz w:val="16"/>
+              </w:rPr>
+            </w:r>
+          </w:p>
+        </w:tc>
+        <w:tc>
+          <w:tcPr>
+            <w:tcW w:type="dxa" w:w="1587"/>
+            <w:shd w:val="clear" w:color="auto" w:fill="E5EBF1"/>
+            <w:tcBorders>
+              <w:bottom w:val="single" w:sz="4" w:color="D0D5DD"/>
+            </w:tcBorders>
+            <w:vAlign w:val="center"/>
+          </w:tcPr>
+          <w:p>
+            <w:pPr>
+              <w:spacing w:before="40" w:after="40"/>
+              <w:jc w:val="right"/>
+            </w:pPr>
+            <w:r>
+              <w:rPr>
+                <w:rFonts w:ascii="Arial" w:hAnsi="Arial"/>
+                <w:rFonts w:ascii="Arial" w:hAnsi="Arial" w:cs="Arial"/>
+                <w:b/>
+                <w:i w:val="0"/>
+                <w:color w:val="0A2342"/>
+                <w:sz w:val="16"/>
+              </w:rPr>
+            </w:r>
+          </w:p>
+        </w:tc>
+        <w:tc>
+          <w:tcPr>
+            <w:tcW w:type="dxa" w:w="2041"/>
+            <w:shd w:val="clear" w:color="auto" w:fill="E5EBF1"/>
+            <w:tcBorders>
+              <w:bottom w:val="single" w:sz="4" w:color="D0D5DD"/>
+            </w:tcBorders>
+            <w:vAlign w:val="center"/>
+          </w:tcPr>
+          <w:p>
+            <w:pPr>
+              <w:spacing w:before="40" w:after="40"/>
+              <w:jc w:val="right"/>
+            </w:pPr>
+            <w:r>
+              <w:rPr>
+                <w:rFonts w:ascii="Arial" w:hAnsi="Arial"/>
+                <w:rFonts w:ascii="Arial" w:hAnsi="Arial" w:cs="Arial"/>
+                <w:b/>
+                <w:i w:val="0"/>
+                <w:color w:val="0A2342"/>
+                <w:sz w:val="16"/>
+              </w:rPr>
+              <w:t>$5.14</w:t>
+            </w:r>
+          </w:p>
+        </w:tc>
+      </w:tr>
     </w:tbl>
     <w:p>
       <w:pPr>
@@ -12384,6 +12700,164 @@
                 <w:sz w:val="16"/>
               </w:rPr>
               <w:t>$557.69</w:t>
+            </w:r>
+          </w:p>
+        </w:tc>
+      </w:tr>
+      <w:tr>
+        <w:tc>
+          <w:tcPr>
+            <w:tcW w:type="dxa" w:w="907"/>
+            <w:shd w:val="clear" w:color="auto" w:fill="E5EBF1"/>
+            <w:tcBorders>
+              <w:bottom w:val="single" w:sz="4" w:color="D0D5DD"/>
+            </w:tcBorders>
+            <w:vAlign w:val="center"/>
+          </w:tcPr>
+          <w:p>
+            <w:pPr>
+              <w:spacing w:before="40" w:after="40"/>
+            </w:pPr>
+            <w:r>
+              <w:rPr>
+                <w:rFonts w:ascii="Arial" w:hAnsi="Arial"/>
+                <w:rFonts w:ascii="Arial" w:hAnsi="Arial" w:cs="Arial"/>
+                <w:b/>
+                <w:i w:val="0"/>
+                <w:color w:val="0A2342"/>
+                <w:sz w:val="16"/>
+              </w:rPr>
+              <w:t>Total</w:t>
+            </w:r>
+          </w:p>
+        </w:tc>
+        <w:tc>
+          <w:tcPr>
+            <w:tcW w:type="dxa" w:w="1701"/>
+            <w:shd w:val="clear" w:color="auto" w:fill="E5EBF1"/>
+            <w:tcBorders>
+              <w:bottom w:val="single" w:sz="4" w:color="D0D5DD"/>
+            </w:tcBorders>
+            <w:vAlign w:val="center"/>
+          </w:tcPr>
+          <w:p>
+            <w:pPr>
+              <w:spacing w:before="40" w:after="40"/>
+            </w:pPr>
+            <w:r>
+              <w:rPr>
+                <w:rFonts w:ascii="Arial" w:hAnsi="Arial"/>
+                <w:rFonts w:ascii="Arial" w:hAnsi="Arial" w:cs="Arial"/>
+                <w:b/>
+                <w:i w:val="0"/>
+                <w:color w:val="0A2342"/>
+                <w:sz w:val="16"/>
+              </w:rPr>
+            </w:r>
+          </w:p>
+        </w:tc>
+        <w:tc>
+          <w:tcPr>
+            <w:tcW w:type="dxa" w:w="1814"/>
+            <w:shd w:val="clear" w:color="auto" w:fill="E5EBF1"/>
+            <w:tcBorders>
+              <w:bottom w:val="single" w:sz="4" w:color="D0D5DD"/>
+            </w:tcBorders>
+            <w:vAlign w:val="center"/>
+          </w:tcPr>
+          <w:p>
+            <w:pPr>
+              <w:spacing w:before="40" w:after="40"/>
+              <w:jc w:val="right"/>
+            </w:pPr>
+            <w:r>
+              <w:rPr>
+                <w:rFonts w:ascii="Arial" w:hAnsi="Arial"/>
+                <w:rFonts w:ascii="Arial" w:hAnsi="Arial" w:cs="Arial"/>
+                <w:b/>
+                <w:i w:val="0"/>
+                <w:color w:val="0A2342"/>
+                <w:sz w:val="16"/>
+              </w:rPr>
+            </w:r>
+          </w:p>
+        </w:tc>
+        <w:tc>
+          <w:tcPr>
+            <w:tcW w:type="dxa" w:w="1814"/>
+            <w:shd w:val="clear" w:color="auto" w:fill="E5EBF1"/>
+            <w:tcBorders>
+              <w:bottom w:val="single" w:sz="4" w:color="D0D5DD"/>
+            </w:tcBorders>
+            <w:vAlign w:val="center"/>
+          </w:tcPr>
+          <w:p>
+            <w:pPr>
+              <w:spacing w:before="40" w:after="40"/>
+              <w:jc w:val="right"/>
+            </w:pPr>
+            <w:r>
+              <w:rPr>
+                <w:rFonts w:ascii="Arial" w:hAnsi="Arial"/>
+                <w:rFonts w:ascii="Arial" w:hAnsi="Arial" w:cs="Arial"/>
+                <w:b/>
+                <w:i w:val="0"/>
+                <w:color w:val="0A2342"/>
+                <w:sz w:val="16"/>
+              </w:rPr>
+            </w:r>
+          </w:p>
+        </w:tc>
+        <w:tc>
+          <w:tcPr>
+            <w:tcW w:type="dxa" w:w="1587"/>
+            <w:shd w:val="clear" w:color="auto" w:fill="E5EBF1"/>
+            <w:tcBorders>
+              <w:bottom w:val="single" w:sz="4" w:color="D0D5DD"/>
+            </w:tcBorders>
+            <w:vAlign w:val="center"/>
+          </w:tcPr>
+          <w:p>
+            <w:pPr>
+              <w:spacing w:before="40" w:after="40"/>
+              <w:jc w:val="right"/>
+            </w:pPr>
+            <w:r>
+              <w:rPr>
+                <w:rFonts w:ascii="Arial" w:hAnsi="Arial"/>
+                <w:rFonts w:ascii="Arial" w:hAnsi="Arial" w:cs="Arial"/>
+                <w:b/>
+                <w:i w:val="0"/>
+                <w:color w:val="0A2342"/>
+                <w:sz w:val="16"/>
+              </w:rPr>
+            </w:r>
+          </w:p>
+        </w:tc>
+        <w:tc>
+          <w:tcPr>
+            <w:tcW w:type="dxa" w:w="2041"/>
+            <w:shd w:val="clear" w:color="auto" w:fill="E5EBF1"/>
+            <w:tcBorders>
+              <w:bottom w:val="single" w:sz="4" w:color="D0D5DD"/>
+            </w:tcBorders>
+            <w:vAlign w:val="center"/>
+          </w:tcPr>
+          <w:p>
+            <w:pPr>
+              <w:spacing w:before="40" w:after="40"/>
+              <w:jc w:val="right"/>
+            </w:pPr>
+            <w:r>
+              <w:rPr>
+                <w:rFonts w:ascii="Arial" w:hAnsi="Arial"/>
+                <w:rFonts w:ascii="Arial" w:hAnsi="Arial" w:cs="Arial"/>
+                <w:b/>
+                <w:i w:val="0"/>
+                <w:color w:val="0A2342"/>
+                <w:sz w:val="16"/>
+              </w:rPr>
+              <w:t>$295,143.94</w:t>
             </w:r>
           </w:p>
         </w:tc>

</xml_diff>

<commit_message>
Transaction ID column: drop OTC trade sub-line
Co-Authored-By: Claude Opus 4.7 <noreply@anthropic.com>
</commit_message>
<xml_diff>
--- a/mockup/monthly_client_statement/sample-statements/Custody_Detailed_sample.docx
+++ b/mockup/monthly_client_statement/sample-statements/Custody_Detailed_sample.docx
@@ -7846,8 +7846,6 @@
                 <w:sz w:val="15"/>
               </w:rPr>
               <w:t>W20260409-6BV3</w:t>
-              <w:br/>
-              <w:t>OTC Trade #T-204602</w:t>
             </w:r>
           </w:p>
         </w:tc>
@@ -8054,8 +8052,6 @@
                 <w:sz w:val="15"/>
               </w:rPr>
               <w:t>W20260413-8XK1</w:t>
-              <w:br/>
-              <w:t>OTC Trade #T-204602</w:t>
             </w:r>
           </w:p>
         </w:tc>
@@ -9110,8 +9106,6 @@
                 <w:sz w:val="15"/>
               </w:rPr>
               <w:t>W20260424-5MK2</w:t>
-              <w:br/>
-              <w:t>OTC Trade #T-204687</w:t>
             </w:r>
           </w:p>
         </w:tc>
@@ -10841,8 +10835,6 @@
                 <w:sz w:val="15"/>
               </w:rPr>
               <w:t>W20260415-8NF3</w:t>
-              <w:br/>
-              <w:t>Top-up from Markets Settlement</w:t>
             </w:r>
           </w:p>
         </w:tc>
@@ -13601,8 +13593,6 @@
                 <w:sz w:val="15"/>
               </w:rPr>
               <w:t>W20260402-3FG2</w:t>
-              <w:br/>
-              <w:t>OTC Trade #T-204598</w:t>
             </w:r>
           </w:p>
         </w:tc>
@@ -14229,8 +14219,6 @@
                 <w:sz w:val="15"/>
               </w:rPr>
               <w:t>W20260415-4VR1</w:t>
-              <w:br/>
-              <w:t>OTC Trade #T-204603</w:t>
             </w:r>
           </w:p>
         </w:tc>
@@ -14651,8 +14639,6 @@
                 <w:sz w:val="15"/>
               </w:rPr>
               <w:t>W20260420-2KW9</w:t>
-              <w:br/>
-              <w:t>OTC Trade #T-204614</w:t>
             </w:r>
           </w:p>
         </w:tc>
@@ -15287,8 +15273,6 @@
                 <w:sz w:val="15"/>
               </w:rPr>
               <w:t>W20260428-3RM7</w:t>
-              <w:br/>
-              <w:t>OTC Trade #T-204661</w:t>
             </w:r>
           </w:p>
         </w:tc>

</xml_diff>

<commit_message>
Staking txns: add Stake/Unstake examples; drop Validator Commission
Co-Authored-By: Claude Opus 4.7 <noreply@anthropic.com>
</commit_message>
<xml_diff>
--- a/mockup/monthly_client_statement/sample-statements/Custody_Detailed_sample.docx
+++ b/mockup/monthly_client_statement/sample-statements/Custody_Detailed_sample.docx
@@ -17560,7 +17560,7 @@
                 <w:color w:val="4A5568"/>
                 <w:sz w:val="16"/>
               </w:rPr>
-              <w:t>2026-04-07 00:00 UTC</w:t>
+              <w:t>2026-04-03 09:12 UTC</w:t>
             </w:r>
           </w:p>
         </w:tc>
@@ -17585,7 +17585,7 @@
                 <w:color w:val="4A5568"/>
                 <w:sz w:val="16"/>
               </w:rPr>
-              <w:t>Claiming Rewards</w:t>
+              <w:t>Stake</w:t>
             </w:r>
           </w:p>
         </w:tc>
@@ -17661,7 +17661,7 @@
                 <w:color w:val="4A5568"/>
                 <w:sz w:val="16"/>
               </w:rPr>
-              <w:t>0.2110</w:t>
+              <w:t>10.0000</w:t>
             </w:r>
           </w:p>
         </w:tc>
@@ -17687,7 +17687,7 @@
                 <w:color w:val="15803D"/>
                 <w:sz w:val="16"/>
               </w:rPr>
-              <w:t>$476.86</w:t>
+              <w:t>$22,610.00</w:t>
             </w:r>
           </w:p>
         </w:tc>
@@ -17739,7 +17739,7 @@
                 <w:color w:val="4A5568"/>
                 <w:sz w:val="16"/>
               </w:rPr>
-              <w:t>W20260407-9KX2</w:t>
+              <w:t>W20260403-1ST6</w:t>
             </w:r>
           </w:p>
         </w:tc>
@@ -17793,7 +17793,7 @@
                 <w:color w:val="4A5568"/>
                 <w:sz w:val="16"/>
               </w:rPr>
-              <w:t>Validator Commission</w:t>
+              <w:t>Claiming Rewards</w:t>
             </w:r>
           </w:p>
         </w:tc>
@@ -17872,7 +17872,7 @@
                 <w:color w:val="4A5568"/>
                 <w:sz w:val="16"/>
               </w:rPr>
-              <w:t>-0.0020</w:t>
+              <w:t>0.2110</w:t>
             </w:r>
           </w:p>
         </w:tc>
@@ -17896,10 +17896,430 @@
                 <w:rFonts w:ascii="Arial" w:hAnsi="Arial" w:cs="Arial"/>
                 <w:b w:val="0"/>
                 <w:i w:val="0"/>
+                <w:color w:val="15803D"/>
+                <w:sz w:val="16"/>
+              </w:rPr>
+              <w:t>$476.86</w:t>
+            </w:r>
+          </w:p>
+        </w:tc>
+        <w:tc>
+          <w:tcPr>
+            <w:tcW w:type="dxa" w:w="1701"/>
+            <w:shd w:val="clear" w:color="auto" w:fill="F5F7FA"/>
+            <w:tcBorders>
+              <w:bottom w:val="single" w:sz="4" w:color="D0D5DD"/>
+            </w:tcBorders>
+            <w:vAlign w:val="center"/>
+          </w:tcPr>
+          <w:p>
+            <w:pPr>
+              <w:spacing w:before="40" w:after="40"/>
+              <w:jc w:val="right"/>
+            </w:pPr>
+            <w:r>
+              <w:rPr>
+                <w:rFonts w:ascii="Arial" w:hAnsi="Arial"/>
+                <w:rFonts w:ascii="Arial" w:hAnsi="Arial" w:cs="Arial"/>
+                <w:b w:val="0"/>
+                <w:i w:val="0"/>
+                <w:color w:val="4A5568"/>
+                <w:sz w:val="16"/>
+              </w:rPr>
+              <w:t>Kiln validator pool</w:t>
+            </w:r>
+          </w:p>
+        </w:tc>
+        <w:tc>
+          <w:tcPr>
+            <w:tcW w:type="dxa" w:w="1361"/>
+            <w:shd w:val="clear" w:color="auto" w:fill="F5F7FA"/>
+            <w:tcBorders>
+              <w:bottom w:val="single" w:sz="4" w:color="D0D5DD"/>
+            </w:tcBorders>
+            <w:vAlign w:val="center"/>
+          </w:tcPr>
+          <w:p>
+            <w:pPr>
+              <w:spacing w:before="40" w:after="40"/>
+              <w:jc w:val="right"/>
+            </w:pPr>
+            <w:r>
+              <w:rPr>
+                <w:rFonts w:ascii="Arial" w:hAnsi="Arial"/>
+                <w:rFonts w:ascii="Arial" w:hAnsi="Arial" w:cs="Arial"/>
+                <w:b w:val="0"/>
+                <w:i w:val="0"/>
+                <w:color w:val="4A5568"/>
+                <w:sz w:val="16"/>
+              </w:rPr>
+              <w:t>W20260407-9KX2</w:t>
+            </w:r>
+          </w:p>
+        </w:tc>
+      </w:tr>
+      <w:tr>
+        <w:tc>
+          <w:tcPr>
+            <w:tcW w:type="dxa" w:w="1474"/>
+            <w:tcBorders>
+              <w:bottom w:val="single" w:sz="4" w:color="D0D5DD"/>
+            </w:tcBorders>
+            <w:vAlign w:val="center"/>
+          </w:tcPr>
+          <w:p>
+            <w:pPr>
+              <w:spacing w:before="40" w:after="40"/>
+            </w:pPr>
+            <w:r>
+              <w:rPr>
+                <w:rFonts w:ascii="Arial" w:hAnsi="Arial"/>
+                <w:rFonts w:ascii="Arial" w:hAnsi="Arial" w:cs="Arial"/>
+                <w:b w:val="0"/>
+                <w:i w:val="0"/>
+                <w:color w:val="4A5568"/>
+                <w:sz w:val="16"/>
+              </w:rPr>
+              <w:t>2026-04-14 00:00 UTC</w:t>
+            </w:r>
+          </w:p>
+        </w:tc>
+        <w:tc>
+          <w:tcPr>
+            <w:tcW w:type="dxa" w:w="1701"/>
+            <w:tcBorders>
+              <w:bottom w:val="single" w:sz="4" w:color="D0D5DD"/>
+            </w:tcBorders>
+            <w:vAlign w:val="center"/>
+          </w:tcPr>
+          <w:p>
+            <w:pPr>
+              <w:spacing w:before="40" w:after="40"/>
+            </w:pPr>
+            <w:r>
+              <w:rPr>
+                <w:rFonts w:ascii="Arial" w:hAnsi="Arial"/>
+                <w:rFonts w:ascii="Arial" w:hAnsi="Arial" w:cs="Arial"/>
+                <w:b w:val="0"/>
+                <w:i w:val="0"/>
+                <w:color w:val="4A5568"/>
+                <w:sz w:val="16"/>
+              </w:rPr>
+              <w:t>Claiming Rewards</w:t>
+            </w:r>
+          </w:p>
+        </w:tc>
+        <w:tc>
+          <w:tcPr>
+            <w:tcW w:type="dxa" w:w="680"/>
+            <w:tcBorders>
+              <w:bottom w:val="single" w:sz="4" w:color="D0D5DD"/>
+            </w:tcBorders>
+            <w:vAlign w:val="center"/>
+          </w:tcPr>
+          <w:p>
+            <w:pPr>
+              <w:spacing w:before="40" w:after="40"/>
+            </w:pPr>
+            <w:r>
+              <w:rPr>
+                <w:rFonts w:ascii="Arial" w:hAnsi="Arial"/>
+                <w:rFonts w:ascii="Arial" w:hAnsi="Arial" w:cs="Arial"/>
+                <w:b w:val="0"/>
+                <w:i w:val="0"/>
+                <w:color w:val="4A5568"/>
+                <w:sz w:val="16"/>
+              </w:rPr>
+              <w:t>ETH</w:t>
+            </w:r>
+          </w:p>
+        </w:tc>
+        <w:tc>
+          <w:tcPr>
+            <w:tcW w:type="dxa" w:w="1020"/>
+            <w:tcBorders>
+              <w:bottom w:val="single" w:sz="4" w:color="D0D5DD"/>
+            </w:tcBorders>
+            <w:vAlign w:val="center"/>
+          </w:tcPr>
+          <w:p>
+            <w:pPr>
+              <w:spacing w:before="40" w:after="40"/>
+            </w:pPr>
+            <w:r>
+              <w:rPr>
+                <w:rFonts w:ascii="Arial" w:hAnsi="Arial"/>
+                <w:rFonts w:ascii="Arial" w:hAnsi="Arial" w:cs="Arial"/>
+                <w:b w:val="0"/>
+                <w:i w:val="0"/>
+                <w:color w:val="4A5568"/>
+                <w:sz w:val="16"/>
+              </w:rPr>
+              <w:t>Ethereum</w:t>
+            </w:r>
+          </w:p>
+        </w:tc>
+        <w:tc>
+          <w:tcPr>
+            <w:tcW w:type="dxa" w:w="1247"/>
+            <w:tcBorders>
+              <w:bottom w:val="single" w:sz="4" w:color="D0D5DD"/>
+            </w:tcBorders>
+            <w:vAlign w:val="center"/>
+          </w:tcPr>
+          <w:p>
+            <w:pPr>
+              <w:spacing w:before="40" w:after="40"/>
+              <w:jc w:val="right"/>
+            </w:pPr>
+            <w:r>
+              <w:rPr>
+                <w:rFonts w:ascii="Arial" w:hAnsi="Arial"/>
+                <w:rFonts w:ascii="Arial" w:hAnsi="Arial" w:cs="Arial"/>
+                <w:b w:val="0"/>
+                <w:i w:val="0"/>
+                <w:color w:val="4A5568"/>
+                <w:sz w:val="16"/>
+              </w:rPr>
+              <w:t>0.2110</w:t>
+            </w:r>
+          </w:p>
+        </w:tc>
+        <w:tc>
+          <w:tcPr>
+            <w:tcW w:type="dxa" w:w="1247"/>
+            <w:tcBorders>
+              <w:bottom w:val="single" w:sz="4" w:color="D0D5DD"/>
+            </w:tcBorders>
+            <w:vAlign w:val="center"/>
+          </w:tcPr>
+          <w:p>
+            <w:pPr>
+              <w:spacing w:before="40" w:after="40"/>
+              <w:jc w:val="right"/>
+            </w:pPr>
+            <w:r>
+              <w:rPr>
+                <w:rFonts w:ascii="Arial" w:hAnsi="Arial"/>
+                <w:rFonts w:ascii="Arial" w:hAnsi="Arial" w:cs="Arial"/>
+                <w:b w:val="0"/>
+                <w:i w:val="0"/>
+                <w:color w:val="15803D"/>
+                <w:sz w:val="16"/>
+              </w:rPr>
+              <w:t>$476.86</w:t>
+            </w:r>
+          </w:p>
+        </w:tc>
+        <w:tc>
+          <w:tcPr>
+            <w:tcW w:type="dxa" w:w="1701"/>
+            <w:tcBorders>
+              <w:bottom w:val="single" w:sz="4" w:color="D0D5DD"/>
+            </w:tcBorders>
+            <w:vAlign w:val="center"/>
+          </w:tcPr>
+          <w:p>
+            <w:pPr>
+              <w:spacing w:before="40" w:after="40"/>
+              <w:jc w:val="right"/>
+            </w:pPr>
+            <w:r>
+              <w:rPr>
+                <w:rFonts w:ascii="Arial" w:hAnsi="Arial"/>
+                <w:rFonts w:ascii="Arial" w:hAnsi="Arial" w:cs="Arial"/>
+                <w:b w:val="0"/>
+                <w:i w:val="0"/>
+                <w:color w:val="4A5568"/>
+                <w:sz w:val="16"/>
+              </w:rPr>
+              <w:t>Kiln validator pool</w:t>
+            </w:r>
+          </w:p>
+        </w:tc>
+        <w:tc>
+          <w:tcPr>
+            <w:tcW w:type="dxa" w:w="1361"/>
+            <w:tcBorders>
+              <w:bottom w:val="single" w:sz="4" w:color="D0D5DD"/>
+            </w:tcBorders>
+            <w:vAlign w:val="center"/>
+          </w:tcPr>
+          <w:p>
+            <w:pPr>
+              <w:spacing w:before="40" w:after="40"/>
+              <w:jc w:val="right"/>
+            </w:pPr>
+            <w:r>
+              <w:rPr>
+                <w:rFonts w:ascii="Arial" w:hAnsi="Arial"/>
+                <w:rFonts w:ascii="Arial" w:hAnsi="Arial" w:cs="Arial"/>
+                <w:b w:val="0"/>
+                <w:i w:val="0"/>
+                <w:color w:val="4A5568"/>
+                <w:sz w:val="16"/>
+              </w:rPr>
+              <w:t>W20260414-2HM7</w:t>
+            </w:r>
+          </w:p>
+        </w:tc>
+      </w:tr>
+      <w:tr>
+        <w:tc>
+          <w:tcPr>
+            <w:tcW w:type="dxa" w:w="1474"/>
+            <w:shd w:val="clear" w:color="auto" w:fill="F5F7FA"/>
+            <w:tcBorders>
+              <w:bottom w:val="single" w:sz="4" w:color="D0D5DD"/>
+            </w:tcBorders>
+            <w:vAlign w:val="center"/>
+          </w:tcPr>
+          <w:p>
+            <w:pPr>
+              <w:spacing w:before="40" w:after="40"/>
+            </w:pPr>
+            <w:r>
+              <w:rPr>
+                <w:rFonts w:ascii="Arial" w:hAnsi="Arial"/>
+                <w:rFonts w:ascii="Arial" w:hAnsi="Arial" w:cs="Arial"/>
+                <w:b w:val="0"/>
+                <w:i w:val="0"/>
+                <w:color w:val="4A5568"/>
+                <w:sz w:val="16"/>
+              </w:rPr>
+              <w:t>2026-04-20 11:38 UTC</w:t>
+            </w:r>
+          </w:p>
+        </w:tc>
+        <w:tc>
+          <w:tcPr>
+            <w:tcW w:type="dxa" w:w="1701"/>
+            <w:shd w:val="clear" w:color="auto" w:fill="F5F7FA"/>
+            <w:tcBorders>
+              <w:bottom w:val="single" w:sz="4" w:color="D0D5DD"/>
+            </w:tcBorders>
+            <w:vAlign w:val="center"/>
+          </w:tcPr>
+          <w:p>
+            <w:pPr>
+              <w:spacing w:before="40" w:after="40"/>
+            </w:pPr>
+            <w:r>
+              <w:rPr>
+                <w:rFonts w:ascii="Arial" w:hAnsi="Arial"/>
+                <w:rFonts w:ascii="Arial" w:hAnsi="Arial" w:cs="Arial"/>
+                <w:b w:val="0"/>
+                <w:i w:val="0"/>
+                <w:color w:val="4A5568"/>
+                <w:sz w:val="16"/>
+              </w:rPr>
+              <w:t>Unstake</w:t>
+            </w:r>
+          </w:p>
+        </w:tc>
+        <w:tc>
+          <w:tcPr>
+            <w:tcW w:type="dxa" w:w="680"/>
+            <w:shd w:val="clear" w:color="auto" w:fill="F5F7FA"/>
+            <w:tcBorders>
+              <w:bottom w:val="single" w:sz="4" w:color="D0D5DD"/>
+            </w:tcBorders>
+            <w:vAlign w:val="center"/>
+          </w:tcPr>
+          <w:p>
+            <w:pPr>
+              <w:spacing w:before="40" w:after="40"/>
+            </w:pPr>
+            <w:r>
+              <w:rPr>
+                <w:rFonts w:ascii="Arial" w:hAnsi="Arial"/>
+                <w:rFonts w:ascii="Arial" w:hAnsi="Arial" w:cs="Arial"/>
+                <w:b w:val="0"/>
+                <w:i w:val="0"/>
+                <w:color w:val="4A5568"/>
+                <w:sz w:val="16"/>
+              </w:rPr>
+              <w:t>ETH</w:t>
+            </w:r>
+          </w:p>
+        </w:tc>
+        <w:tc>
+          <w:tcPr>
+            <w:tcW w:type="dxa" w:w="1020"/>
+            <w:shd w:val="clear" w:color="auto" w:fill="F5F7FA"/>
+            <w:tcBorders>
+              <w:bottom w:val="single" w:sz="4" w:color="D0D5DD"/>
+            </w:tcBorders>
+            <w:vAlign w:val="center"/>
+          </w:tcPr>
+          <w:p>
+            <w:pPr>
+              <w:spacing w:before="40" w:after="40"/>
+            </w:pPr>
+            <w:r>
+              <w:rPr>
+                <w:rFonts w:ascii="Arial" w:hAnsi="Arial"/>
+                <w:rFonts w:ascii="Arial" w:hAnsi="Arial" w:cs="Arial"/>
+                <w:b w:val="0"/>
+                <w:i w:val="0"/>
+                <w:color w:val="4A5568"/>
+                <w:sz w:val="16"/>
+              </w:rPr>
+              <w:t>Ethereum</w:t>
+            </w:r>
+          </w:p>
+        </w:tc>
+        <w:tc>
+          <w:tcPr>
+            <w:tcW w:type="dxa" w:w="1247"/>
+            <w:shd w:val="clear" w:color="auto" w:fill="F5F7FA"/>
+            <w:tcBorders>
+              <w:bottom w:val="single" w:sz="4" w:color="D0D5DD"/>
+            </w:tcBorders>
+            <w:vAlign w:val="center"/>
+          </w:tcPr>
+          <w:p>
+            <w:pPr>
+              <w:spacing w:before="40" w:after="40"/>
+              <w:jc w:val="right"/>
+            </w:pPr>
+            <w:r>
+              <w:rPr>
+                <w:rFonts w:ascii="Arial" w:hAnsi="Arial"/>
+                <w:rFonts w:ascii="Arial" w:hAnsi="Arial" w:cs="Arial"/>
+                <w:b w:val="0"/>
+                <w:i w:val="0"/>
+                <w:color w:val="4A5568"/>
+                <w:sz w:val="16"/>
+              </w:rPr>
+              <w:t>-10.0000</w:t>
+            </w:r>
+          </w:p>
+        </w:tc>
+        <w:tc>
+          <w:tcPr>
+            <w:tcW w:type="dxa" w:w="1247"/>
+            <w:shd w:val="clear" w:color="auto" w:fill="F5F7FA"/>
+            <w:tcBorders>
+              <w:bottom w:val="single" w:sz="4" w:color="D0D5DD"/>
+            </w:tcBorders>
+            <w:vAlign w:val="center"/>
+          </w:tcPr>
+          <w:p>
+            <w:pPr>
+              <w:spacing w:before="40" w:after="40"/>
+              <w:jc w:val="right"/>
+            </w:pPr>
+            <w:r>
+              <w:rPr>
+                <w:rFonts w:ascii="Arial" w:hAnsi="Arial"/>
+                <w:rFonts w:ascii="Arial" w:hAnsi="Arial" w:cs="Arial"/>
+                <w:b w:val="0"/>
+                <w:i w:val="0"/>
                 <w:color w:val="B91C1C"/>
                 <w:sz w:val="16"/>
               </w:rPr>
-              <w:t>-$4.52</w:t>
+              <w:t>-$22,610.00</w:t>
             </w:r>
           </w:p>
         </w:tc>
@@ -17953,7 +18373,7 @@
                 <w:color w:val="4A5568"/>
                 <w:sz w:val="16"/>
               </w:rPr>
-              <w:t>W20260407-9KX2</w:t>
+              <w:t>W20260420-4UN3</w:t>
             </w:r>
           </w:p>
         </w:tc>
@@ -17980,7 +18400,7 @@
                 <w:color w:val="4A5568"/>
                 <w:sz w:val="16"/>
               </w:rPr>
-              <w:t>2026-04-14 00:00 UTC</w:t>
+              <w:t>2026-04-21 00:00 UTC</w:t>
             </w:r>
           </w:p>
         </w:tc>
@@ -18159,7 +18579,7 @@
                 <w:color w:val="4A5568"/>
                 <w:sz w:val="16"/>
               </w:rPr>
-              <w:t>W20260414-2HM7</w:t>
+              <w:t>W20260421-7QR4</w:t>
             </w:r>
           </w:p>
         </w:tc>
@@ -18187,7 +18607,7 @@
                 <w:color w:val="4A5568"/>
                 <w:sz w:val="16"/>
               </w:rPr>
-              <w:t>2026-04-14 00:00 UTC</w:t>
+              <w:t>2026-04-28 00:00 UTC</w:t>
             </w:r>
           </w:p>
         </w:tc>
@@ -18213,7 +18633,7 @@
                 <w:color w:val="4A5568"/>
                 <w:sz w:val="16"/>
               </w:rPr>
-              <w:t>Validator Commission</w:t>
+              <w:t>Claiming Rewards</w:t>
             </w:r>
           </w:p>
         </w:tc>
@@ -18292,7 +18712,7 @@
                 <w:color w:val="4A5568"/>
                 <w:sz w:val="16"/>
               </w:rPr>
-              <w:t>-0.0020</w:t>
+              <w:t>0.2090</w:t>
             </w:r>
           </w:p>
         </w:tc>
@@ -18316,10 +18736,10 @@
                 <w:rFonts w:ascii="Arial" w:hAnsi="Arial" w:cs="Arial"/>
                 <w:b w:val="0"/>
                 <w:i w:val="0"/>
-                <w:color w:val="B91C1C"/>
+                <w:color w:val="15803D"/>
                 <w:sz w:val="16"/>
               </w:rPr>
-              <w:t>-$4.52</w:t>
+              <w:t>$472.34</w:t>
             </w:r>
           </w:p>
         </w:tc>
@@ -18373,7 +18793,7 @@
                 <w:color w:val="4A5568"/>
                 <w:sz w:val="16"/>
               </w:rPr>
-              <w:t>W20260414-2HM7</w:t>
+              <w:t>W20260428-5LP9</w:t>
             </w:r>
           </w:p>
         </w:tc>
@@ -18382,846 +18802,6 @@
         <w:tc>
           <w:tcPr>
             <w:tcW w:type="dxa" w:w="1474"/>
-            <w:tcBorders>
-              <w:bottom w:val="single" w:sz="4" w:color="D0D5DD"/>
-            </w:tcBorders>
-            <w:vAlign w:val="center"/>
-          </w:tcPr>
-          <w:p>
-            <w:pPr>
-              <w:spacing w:before="40" w:after="40"/>
-            </w:pPr>
-            <w:r>
-              <w:rPr>
-                <w:rFonts w:ascii="Arial" w:hAnsi="Arial"/>
-                <w:rFonts w:ascii="Arial" w:hAnsi="Arial" w:cs="Arial"/>
-                <w:b w:val="0"/>
-                <w:i w:val="0"/>
-                <w:color w:val="4A5568"/>
-                <w:sz w:val="16"/>
-              </w:rPr>
-              <w:t>2026-04-21 00:00 UTC</w:t>
-            </w:r>
-          </w:p>
-        </w:tc>
-        <w:tc>
-          <w:tcPr>
-            <w:tcW w:type="dxa" w:w="1701"/>
-            <w:tcBorders>
-              <w:bottom w:val="single" w:sz="4" w:color="D0D5DD"/>
-            </w:tcBorders>
-            <w:vAlign w:val="center"/>
-          </w:tcPr>
-          <w:p>
-            <w:pPr>
-              <w:spacing w:before="40" w:after="40"/>
-            </w:pPr>
-            <w:r>
-              <w:rPr>
-                <w:rFonts w:ascii="Arial" w:hAnsi="Arial"/>
-                <w:rFonts w:ascii="Arial" w:hAnsi="Arial" w:cs="Arial"/>
-                <w:b w:val="0"/>
-                <w:i w:val="0"/>
-                <w:color w:val="4A5568"/>
-                <w:sz w:val="16"/>
-              </w:rPr>
-              <w:t>Claiming Rewards</w:t>
-            </w:r>
-          </w:p>
-        </w:tc>
-        <w:tc>
-          <w:tcPr>
-            <w:tcW w:type="dxa" w:w="680"/>
-            <w:tcBorders>
-              <w:bottom w:val="single" w:sz="4" w:color="D0D5DD"/>
-            </w:tcBorders>
-            <w:vAlign w:val="center"/>
-          </w:tcPr>
-          <w:p>
-            <w:pPr>
-              <w:spacing w:before="40" w:after="40"/>
-            </w:pPr>
-            <w:r>
-              <w:rPr>
-                <w:rFonts w:ascii="Arial" w:hAnsi="Arial"/>
-                <w:rFonts w:ascii="Arial" w:hAnsi="Arial" w:cs="Arial"/>
-                <w:b w:val="0"/>
-                <w:i w:val="0"/>
-                <w:color w:val="4A5568"/>
-                <w:sz w:val="16"/>
-              </w:rPr>
-              <w:t>ETH</w:t>
-            </w:r>
-          </w:p>
-        </w:tc>
-        <w:tc>
-          <w:tcPr>
-            <w:tcW w:type="dxa" w:w="1020"/>
-            <w:tcBorders>
-              <w:bottom w:val="single" w:sz="4" w:color="D0D5DD"/>
-            </w:tcBorders>
-            <w:vAlign w:val="center"/>
-          </w:tcPr>
-          <w:p>
-            <w:pPr>
-              <w:spacing w:before="40" w:after="40"/>
-            </w:pPr>
-            <w:r>
-              <w:rPr>
-                <w:rFonts w:ascii="Arial" w:hAnsi="Arial"/>
-                <w:rFonts w:ascii="Arial" w:hAnsi="Arial" w:cs="Arial"/>
-                <w:b w:val="0"/>
-                <w:i w:val="0"/>
-                <w:color w:val="4A5568"/>
-                <w:sz w:val="16"/>
-              </w:rPr>
-              <w:t>Ethereum</w:t>
-            </w:r>
-          </w:p>
-        </w:tc>
-        <w:tc>
-          <w:tcPr>
-            <w:tcW w:type="dxa" w:w="1247"/>
-            <w:tcBorders>
-              <w:bottom w:val="single" w:sz="4" w:color="D0D5DD"/>
-            </w:tcBorders>
-            <w:vAlign w:val="center"/>
-          </w:tcPr>
-          <w:p>
-            <w:pPr>
-              <w:spacing w:before="40" w:after="40"/>
-              <w:jc w:val="right"/>
-            </w:pPr>
-            <w:r>
-              <w:rPr>
-                <w:rFonts w:ascii="Arial" w:hAnsi="Arial"/>
-                <w:rFonts w:ascii="Arial" w:hAnsi="Arial" w:cs="Arial"/>
-                <w:b w:val="0"/>
-                <w:i w:val="0"/>
-                <w:color w:val="4A5568"/>
-                <w:sz w:val="16"/>
-              </w:rPr>
-              <w:t>0.2110</w:t>
-            </w:r>
-          </w:p>
-        </w:tc>
-        <w:tc>
-          <w:tcPr>
-            <w:tcW w:type="dxa" w:w="1247"/>
-            <w:tcBorders>
-              <w:bottom w:val="single" w:sz="4" w:color="D0D5DD"/>
-            </w:tcBorders>
-            <w:vAlign w:val="center"/>
-          </w:tcPr>
-          <w:p>
-            <w:pPr>
-              <w:spacing w:before="40" w:after="40"/>
-              <w:jc w:val="right"/>
-            </w:pPr>
-            <w:r>
-              <w:rPr>
-                <w:rFonts w:ascii="Arial" w:hAnsi="Arial"/>
-                <w:rFonts w:ascii="Arial" w:hAnsi="Arial" w:cs="Arial"/>
-                <w:b w:val="0"/>
-                <w:i w:val="0"/>
-                <w:color w:val="15803D"/>
-                <w:sz w:val="16"/>
-              </w:rPr>
-              <w:t>$476.86</w:t>
-            </w:r>
-          </w:p>
-        </w:tc>
-        <w:tc>
-          <w:tcPr>
-            <w:tcW w:type="dxa" w:w="1701"/>
-            <w:tcBorders>
-              <w:bottom w:val="single" w:sz="4" w:color="D0D5DD"/>
-            </w:tcBorders>
-            <w:vAlign w:val="center"/>
-          </w:tcPr>
-          <w:p>
-            <w:pPr>
-              <w:spacing w:before="40" w:after="40"/>
-              <w:jc w:val="right"/>
-            </w:pPr>
-            <w:r>
-              <w:rPr>
-                <w:rFonts w:ascii="Arial" w:hAnsi="Arial"/>
-                <w:rFonts w:ascii="Arial" w:hAnsi="Arial" w:cs="Arial"/>
-                <w:b w:val="0"/>
-                <w:i w:val="0"/>
-                <w:color w:val="4A5568"/>
-                <w:sz w:val="16"/>
-              </w:rPr>
-              <w:t>Kiln validator pool</w:t>
-            </w:r>
-          </w:p>
-        </w:tc>
-        <w:tc>
-          <w:tcPr>
-            <w:tcW w:type="dxa" w:w="1361"/>
-            <w:tcBorders>
-              <w:bottom w:val="single" w:sz="4" w:color="D0D5DD"/>
-            </w:tcBorders>
-            <w:vAlign w:val="center"/>
-          </w:tcPr>
-          <w:p>
-            <w:pPr>
-              <w:spacing w:before="40" w:after="40"/>
-              <w:jc w:val="right"/>
-            </w:pPr>
-            <w:r>
-              <w:rPr>
-                <w:rFonts w:ascii="Arial" w:hAnsi="Arial"/>
-                <w:rFonts w:ascii="Arial" w:hAnsi="Arial" w:cs="Arial"/>
-                <w:b w:val="0"/>
-                <w:i w:val="0"/>
-                <w:color w:val="4A5568"/>
-                <w:sz w:val="16"/>
-              </w:rPr>
-              <w:t>W20260421-7QR4</w:t>
-            </w:r>
-          </w:p>
-        </w:tc>
-      </w:tr>
-      <w:tr>
-        <w:tc>
-          <w:tcPr>
-            <w:tcW w:type="dxa" w:w="1474"/>
-            <w:shd w:val="clear" w:color="auto" w:fill="F5F7FA"/>
-            <w:tcBorders>
-              <w:bottom w:val="single" w:sz="4" w:color="D0D5DD"/>
-            </w:tcBorders>
-            <w:vAlign w:val="center"/>
-          </w:tcPr>
-          <w:p>
-            <w:pPr>
-              <w:spacing w:before="40" w:after="40"/>
-            </w:pPr>
-            <w:r>
-              <w:rPr>
-                <w:rFonts w:ascii="Arial" w:hAnsi="Arial"/>
-                <w:rFonts w:ascii="Arial" w:hAnsi="Arial" w:cs="Arial"/>
-                <w:b w:val="0"/>
-                <w:i w:val="0"/>
-                <w:color w:val="4A5568"/>
-                <w:sz w:val="16"/>
-              </w:rPr>
-              <w:t>2026-04-21 00:00 UTC</w:t>
-            </w:r>
-          </w:p>
-        </w:tc>
-        <w:tc>
-          <w:tcPr>
-            <w:tcW w:type="dxa" w:w="1701"/>
-            <w:shd w:val="clear" w:color="auto" w:fill="F5F7FA"/>
-            <w:tcBorders>
-              <w:bottom w:val="single" w:sz="4" w:color="D0D5DD"/>
-            </w:tcBorders>
-            <w:vAlign w:val="center"/>
-          </w:tcPr>
-          <w:p>
-            <w:pPr>
-              <w:spacing w:before="40" w:after="40"/>
-            </w:pPr>
-            <w:r>
-              <w:rPr>
-                <w:rFonts w:ascii="Arial" w:hAnsi="Arial"/>
-                <w:rFonts w:ascii="Arial" w:hAnsi="Arial" w:cs="Arial"/>
-                <w:b w:val="0"/>
-                <w:i w:val="0"/>
-                <w:color w:val="4A5568"/>
-                <w:sz w:val="16"/>
-              </w:rPr>
-              <w:t>Validator Commission</w:t>
-            </w:r>
-          </w:p>
-        </w:tc>
-        <w:tc>
-          <w:tcPr>
-            <w:tcW w:type="dxa" w:w="680"/>
-            <w:shd w:val="clear" w:color="auto" w:fill="F5F7FA"/>
-            <w:tcBorders>
-              <w:bottom w:val="single" w:sz="4" w:color="D0D5DD"/>
-            </w:tcBorders>
-            <w:vAlign w:val="center"/>
-          </w:tcPr>
-          <w:p>
-            <w:pPr>
-              <w:spacing w:before="40" w:after="40"/>
-            </w:pPr>
-            <w:r>
-              <w:rPr>
-                <w:rFonts w:ascii="Arial" w:hAnsi="Arial"/>
-                <w:rFonts w:ascii="Arial" w:hAnsi="Arial" w:cs="Arial"/>
-                <w:b w:val="0"/>
-                <w:i w:val="0"/>
-                <w:color w:val="4A5568"/>
-                <w:sz w:val="16"/>
-              </w:rPr>
-              <w:t>ETH</w:t>
-            </w:r>
-          </w:p>
-        </w:tc>
-        <w:tc>
-          <w:tcPr>
-            <w:tcW w:type="dxa" w:w="1020"/>
-            <w:shd w:val="clear" w:color="auto" w:fill="F5F7FA"/>
-            <w:tcBorders>
-              <w:bottom w:val="single" w:sz="4" w:color="D0D5DD"/>
-            </w:tcBorders>
-            <w:vAlign w:val="center"/>
-          </w:tcPr>
-          <w:p>
-            <w:pPr>
-              <w:spacing w:before="40" w:after="40"/>
-            </w:pPr>
-            <w:r>
-              <w:rPr>
-                <w:rFonts w:ascii="Arial" w:hAnsi="Arial"/>
-                <w:rFonts w:ascii="Arial" w:hAnsi="Arial" w:cs="Arial"/>
-                <w:b w:val="0"/>
-                <w:i w:val="0"/>
-                <w:color w:val="4A5568"/>
-                <w:sz w:val="16"/>
-              </w:rPr>
-              <w:t>Ethereum</w:t>
-            </w:r>
-          </w:p>
-        </w:tc>
-        <w:tc>
-          <w:tcPr>
-            <w:tcW w:type="dxa" w:w="1247"/>
-            <w:shd w:val="clear" w:color="auto" w:fill="F5F7FA"/>
-            <w:tcBorders>
-              <w:bottom w:val="single" w:sz="4" w:color="D0D5DD"/>
-            </w:tcBorders>
-            <w:vAlign w:val="center"/>
-          </w:tcPr>
-          <w:p>
-            <w:pPr>
-              <w:spacing w:before="40" w:after="40"/>
-              <w:jc w:val="right"/>
-            </w:pPr>
-            <w:r>
-              <w:rPr>
-                <w:rFonts w:ascii="Arial" w:hAnsi="Arial"/>
-                <w:rFonts w:ascii="Arial" w:hAnsi="Arial" w:cs="Arial"/>
-                <w:b w:val="0"/>
-                <w:i w:val="0"/>
-                <w:color w:val="4A5568"/>
-                <w:sz w:val="16"/>
-              </w:rPr>
-              <w:t>-0.0020</w:t>
-            </w:r>
-          </w:p>
-        </w:tc>
-        <w:tc>
-          <w:tcPr>
-            <w:tcW w:type="dxa" w:w="1247"/>
-            <w:shd w:val="clear" w:color="auto" w:fill="F5F7FA"/>
-            <w:tcBorders>
-              <w:bottom w:val="single" w:sz="4" w:color="D0D5DD"/>
-            </w:tcBorders>
-            <w:vAlign w:val="center"/>
-          </w:tcPr>
-          <w:p>
-            <w:pPr>
-              <w:spacing w:before="40" w:after="40"/>
-              <w:jc w:val="right"/>
-            </w:pPr>
-            <w:r>
-              <w:rPr>
-                <w:rFonts w:ascii="Arial" w:hAnsi="Arial"/>
-                <w:rFonts w:ascii="Arial" w:hAnsi="Arial" w:cs="Arial"/>
-                <w:b w:val="0"/>
-                <w:i w:val="0"/>
-                <w:color w:val="B91C1C"/>
-                <w:sz w:val="16"/>
-              </w:rPr>
-              <w:t>-$4.52</w:t>
-            </w:r>
-          </w:p>
-        </w:tc>
-        <w:tc>
-          <w:tcPr>
-            <w:tcW w:type="dxa" w:w="1701"/>
-            <w:shd w:val="clear" w:color="auto" w:fill="F5F7FA"/>
-            <w:tcBorders>
-              <w:bottom w:val="single" w:sz="4" w:color="D0D5DD"/>
-            </w:tcBorders>
-            <w:vAlign w:val="center"/>
-          </w:tcPr>
-          <w:p>
-            <w:pPr>
-              <w:spacing w:before="40" w:after="40"/>
-              <w:jc w:val="right"/>
-            </w:pPr>
-            <w:r>
-              <w:rPr>
-                <w:rFonts w:ascii="Arial" w:hAnsi="Arial"/>
-                <w:rFonts w:ascii="Arial" w:hAnsi="Arial" w:cs="Arial"/>
-                <w:b w:val="0"/>
-                <w:i w:val="0"/>
-                <w:color w:val="4A5568"/>
-                <w:sz w:val="16"/>
-              </w:rPr>
-              <w:t>Kiln validator pool</w:t>
-            </w:r>
-          </w:p>
-        </w:tc>
-        <w:tc>
-          <w:tcPr>
-            <w:tcW w:type="dxa" w:w="1361"/>
-            <w:shd w:val="clear" w:color="auto" w:fill="F5F7FA"/>
-            <w:tcBorders>
-              <w:bottom w:val="single" w:sz="4" w:color="D0D5DD"/>
-            </w:tcBorders>
-            <w:vAlign w:val="center"/>
-          </w:tcPr>
-          <w:p>
-            <w:pPr>
-              <w:spacing w:before="40" w:after="40"/>
-              <w:jc w:val="right"/>
-            </w:pPr>
-            <w:r>
-              <w:rPr>
-                <w:rFonts w:ascii="Arial" w:hAnsi="Arial"/>
-                <w:rFonts w:ascii="Arial" w:hAnsi="Arial" w:cs="Arial"/>
-                <w:b w:val="0"/>
-                <w:i w:val="0"/>
-                <w:color w:val="4A5568"/>
-                <w:sz w:val="16"/>
-              </w:rPr>
-              <w:t>W20260421-7QR4</w:t>
-            </w:r>
-          </w:p>
-        </w:tc>
-      </w:tr>
-      <w:tr>
-        <w:tc>
-          <w:tcPr>
-            <w:tcW w:type="dxa" w:w="1474"/>
-            <w:tcBorders>
-              <w:bottom w:val="single" w:sz="4" w:color="D0D5DD"/>
-            </w:tcBorders>
-            <w:vAlign w:val="center"/>
-          </w:tcPr>
-          <w:p>
-            <w:pPr>
-              <w:spacing w:before="40" w:after="40"/>
-            </w:pPr>
-            <w:r>
-              <w:rPr>
-                <w:rFonts w:ascii="Arial" w:hAnsi="Arial"/>
-                <w:rFonts w:ascii="Arial" w:hAnsi="Arial" w:cs="Arial"/>
-                <w:b w:val="0"/>
-                <w:i w:val="0"/>
-                <w:color w:val="4A5568"/>
-                <w:sz w:val="16"/>
-              </w:rPr>
-              <w:t>2026-04-28 00:00 UTC</w:t>
-            </w:r>
-          </w:p>
-        </w:tc>
-        <w:tc>
-          <w:tcPr>
-            <w:tcW w:type="dxa" w:w="1701"/>
-            <w:tcBorders>
-              <w:bottom w:val="single" w:sz="4" w:color="D0D5DD"/>
-            </w:tcBorders>
-            <w:vAlign w:val="center"/>
-          </w:tcPr>
-          <w:p>
-            <w:pPr>
-              <w:spacing w:before="40" w:after="40"/>
-            </w:pPr>
-            <w:r>
-              <w:rPr>
-                <w:rFonts w:ascii="Arial" w:hAnsi="Arial"/>
-                <w:rFonts w:ascii="Arial" w:hAnsi="Arial" w:cs="Arial"/>
-                <w:b w:val="0"/>
-                <w:i w:val="0"/>
-                <w:color w:val="4A5568"/>
-                <w:sz w:val="16"/>
-              </w:rPr>
-              <w:t>Claiming Rewards</w:t>
-            </w:r>
-          </w:p>
-        </w:tc>
-        <w:tc>
-          <w:tcPr>
-            <w:tcW w:type="dxa" w:w="680"/>
-            <w:tcBorders>
-              <w:bottom w:val="single" w:sz="4" w:color="D0D5DD"/>
-            </w:tcBorders>
-            <w:vAlign w:val="center"/>
-          </w:tcPr>
-          <w:p>
-            <w:pPr>
-              <w:spacing w:before="40" w:after="40"/>
-            </w:pPr>
-            <w:r>
-              <w:rPr>
-                <w:rFonts w:ascii="Arial" w:hAnsi="Arial"/>
-                <w:rFonts w:ascii="Arial" w:hAnsi="Arial" w:cs="Arial"/>
-                <w:b w:val="0"/>
-                <w:i w:val="0"/>
-                <w:color w:val="4A5568"/>
-                <w:sz w:val="16"/>
-              </w:rPr>
-              <w:t>ETH</w:t>
-            </w:r>
-          </w:p>
-        </w:tc>
-        <w:tc>
-          <w:tcPr>
-            <w:tcW w:type="dxa" w:w="1020"/>
-            <w:tcBorders>
-              <w:bottom w:val="single" w:sz="4" w:color="D0D5DD"/>
-            </w:tcBorders>
-            <w:vAlign w:val="center"/>
-          </w:tcPr>
-          <w:p>
-            <w:pPr>
-              <w:spacing w:before="40" w:after="40"/>
-            </w:pPr>
-            <w:r>
-              <w:rPr>
-                <w:rFonts w:ascii="Arial" w:hAnsi="Arial"/>
-                <w:rFonts w:ascii="Arial" w:hAnsi="Arial" w:cs="Arial"/>
-                <w:b w:val="0"/>
-                <w:i w:val="0"/>
-                <w:color w:val="4A5568"/>
-                <w:sz w:val="16"/>
-              </w:rPr>
-              <w:t>Ethereum</w:t>
-            </w:r>
-          </w:p>
-        </w:tc>
-        <w:tc>
-          <w:tcPr>
-            <w:tcW w:type="dxa" w:w="1247"/>
-            <w:tcBorders>
-              <w:bottom w:val="single" w:sz="4" w:color="D0D5DD"/>
-            </w:tcBorders>
-            <w:vAlign w:val="center"/>
-          </w:tcPr>
-          <w:p>
-            <w:pPr>
-              <w:spacing w:before="40" w:after="40"/>
-              <w:jc w:val="right"/>
-            </w:pPr>
-            <w:r>
-              <w:rPr>
-                <w:rFonts w:ascii="Arial" w:hAnsi="Arial"/>
-                <w:rFonts w:ascii="Arial" w:hAnsi="Arial" w:cs="Arial"/>
-                <w:b w:val="0"/>
-                <w:i w:val="0"/>
-                <w:color w:val="4A5568"/>
-                <w:sz w:val="16"/>
-              </w:rPr>
-              <w:t>0.2090</w:t>
-            </w:r>
-          </w:p>
-        </w:tc>
-        <w:tc>
-          <w:tcPr>
-            <w:tcW w:type="dxa" w:w="1247"/>
-            <w:tcBorders>
-              <w:bottom w:val="single" w:sz="4" w:color="D0D5DD"/>
-            </w:tcBorders>
-            <w:vAlign w:val="center"/>
-          </w:tcPr>
-          <w:p>
-            <w:pPr>
-              <w:spacing w:before="40" w:after="40"/>
-              <w:jc w:val="right"/>
-            </w:pPr>
-            <w:r>
-              <w:rPr>
-                <w:rFonts w:ascii="Arial" w:hAnsi="Arial"/>
-                <w:rFonts w:ascii="Arial" w:hAnsi="Arial" w:cs="Arial"/>
-                <w:b w:val="0"/>
-                <w:i w:val="0"/>
-                <w:color w:val="15803D"/>
-                <w:sz w:val="16"/>
-              </w:rPr>
-              <w:t>$472.34</w:t>
-            </w:r>
-          </w:p>
-        </w:tc>
-        <w:tc>
-          <w:tcPr>
-            <w:tcW w:type="dxa" w:w="1701"/>
-            <w:tcBorders>
-              <w:bottom w:val="single" w:sz="4" w:color="D0D5DD"/>
-            </w:tcBorders>
-            <w:vAlign w:val="center"/>
-          </w:tcPr>
-          <w:p>
-            <w:pPr>
-              <w:spacing w:before="40" w:after="40"/>
-              <w:jc w:val="right"/>
-            </w:pPr>
-            <w:r>
-              <w:rPr>
-                <w:rFonts w:ascii="Arial" w:hAnsi="Arial"/>
-                <w:rFonts w:ascii="Arial" w:hAnsi="Arial" w:cs="Arial"/>
-                <w:b w:val="0"/>
-                <w:i w:val="0"/>
-                <w:color w:val="4A5568"/>
-                <w:sz w:val="16"/>
-              </w:rPr>
-              <w:t>Kiln validator pool</w:t>
-            </w:r>
-          </w:p>
-        </w:tc>
-        <w:tc>
-          <w:tcPr>
-            <w:tcW w:type="dxa" w:w="1361"/>
-            <w:tcBorders>
-              <w:bottom w:val="single" w:sz="4" w:color="D0D5DD"/>
-            </w:tcBorders>
-            <w:vAlign w:val="center"/>
-          </w:tcPr>
-          <w:p>
-            <w:pPr>
-              <w:spacing w:before="40" w:after="40"/>
-              <w:jc w:val="right"/>
-            </w:pPr>
-            <w:r>
-              <w:rPr>
-                <w:rFonts w:ascii="Arial" w:hAnsi="Arial"/>
-                <w:rFonts w:ascii="Arial" w:hAnsi="Arial" w:cs="Arial"/>
-                <w:b w:val="0"/>
-                <w:i w:val="0"/>
-                <w:color w:val="4A5568"/>
-                <w:sz w:val="16"/>
-              </w:rPr>
-              <w:t>W20260428-5LP9</w:t>
-            </w:r>
-          </w:p>
-        </w:tc>
-      </w:tr>
-      <w:tr>
-        <w:tc>
-          <w:tcPr>
-            <w:tcW w:type="dxa" w:w="1474"/>
-            <w:shd w:val="clear" w:color="auto" w:fill="F5F7FA"/>
-            <w:tcBorders>
-              <w:bottom w:val="single" w:sz="4" w:color="D0D5DD"/>
-            </w:tcBorders>
-            <w:vAlign w:val="center"/>
-          </w:tcPr>
-          <w:p>
-            <w:pPr>
-              <w:spacing w:before="40" w:after="40"/>
-            </w:pPr>
-            <w:r>
-              <w:rPr>
-                <w:rFonts w:ascii="Arial" w:hAnsi="Arial"/>
-                <w:rFonts w:ascii="Arial" w:hAnsi="Arial" w:cs="Arial"/>
-                <w:b w:val="0"/>
-                <w:i w:val="0"/>
-                <w:color w:val="4A5568"/>
-                <w:sz w:val="16"/>
-              </w:rPr>
-              <w:t>2026-04-28 00:00 UTC</w:t>
-            </w:r>
-          </w:p>
-        </w:tc>
-        <w:tc>
-          <w:tcPr>
-            <w:tcW w:type="dxa" w:w="1701"/>
-            <w:shd w:val="clear" w:color="auto" w:fill="F5F7FA"/>
-            <w:tcBorders>
-              <w:bottom w:val="single" w:sz="4" w:color="D0D5DD"/>
-            </w:tcBorders>
-            <w:vAlign w:val="center"/>
-          </w:tcPr>
-          <w:p>
-            <w:pPr>
-              <w:spacing w:before="40" w:after="40"/>
-            </w:pPr>
-            <w:r>
-              <w:rPr>
-                <w:rFonts w:ascii="Arial" w:hAnsi="Arial"/>
-                <w:rFonts w:ascii="Arial" w:hAnsi="Arial" w:cs="Arial"/>
-                <w:b w:val="0"/>
-                <w:i w:val="0"/>
-                <w:color w:val="4A5568"/>
-                <w:sz w:val="16"/>
-              </w:rPr>
-              <w:t>Validator Commission</w:t>
-            </w:r>
-          </w:p>
-        </w:tc>
-        <w:tc>
-          <w:tcPr>
-            <w:tcW w:type="dxa" w:w="680"/>
-            <w:shd w:val="clear" w:color="auto" w:fill="F5F7FA"/>
-            <w:tcBorders>
-              <w:bottom w:val="single" w:sz="4" w:color="D0D5DD"/>
-            </w:tcBorders>
-            <w:vAlign w:val="center"/>
-          </w:tcPr>
-          <w:p>
-            <w:pPr>
-              <w:spacing w:before="40" w:after="40"/>
-            </w:pPr>
-            <w:r>
-              <w:rPr>
-                <w:rFonts w:ascii="Arial" w:hAnsi="Arial"/>
-                <w:rFonts w:ascii="Arial" w:hAnsi="Arial" w:cs="Arial"/>
-                <w:b w:val="0"/>
-                <w:i w:val="0"/>
-                <w:color w:val="4A5568"/>
-                <w:sz w:val="16"/>
-              </w:rPr>
-              <w:t>ETH</w:t>
-            </w:r>
-          </w:p>
-        </w:tc>
-        <w:tc>
-          <w:tcPr>
-            <w:tcW w:type="dxa" w:w="1020"/>
-            <w:shd w:val="clear" w:color="auto" w:fill="F5F7FA"/>
-            <w:tcBorders>
-              <w:bottom w:val="single" w:sz="4" w:color="D0D5DD"/>
-            </w:tcBorders>
-            <w:vAlign w:val="center"/>
-          </w:tcPr>
-          <w:p>
-            <w:pPr>
-              <w:spacing w:before="40" w:after="40"/>
-            </w:pPr>
-            <w:r>
-              <w:rPr>
-                <w:rFonts w:ascii="Arial" w:hAnsi="Arial"/>
-                <w:rFonts w:ascii="Arial" w:hAnsi="Arial" w:cs="Arial"/>
-                <w:b w:val="0"/>
-                <w:i w:val="0"/>
-                <w:color w:val="4A5568"/>
-                <w:sz w:val="16"/>
-              </w:rPr>
-              <w:t>Ethereum</w:t>
-            </w:r>
-          </w:p>
-        </w:tc>
-        <w:tc>
-          <w:tcPr>
-            <w:tcW w:type="dxa" w:w="1247"/>
-            <w:shd w:val="clear" w:color="auto" w:fill="F5F7FA"/>
-            <w:tcBorders>
-              <w:bottom w:val="single" w:sz="4" w:color="D0D5DD"/>
-            </w:tcBorders>
-            <w:vAlign w:val="center"/>
-          </w:tcPr>
-          <w:p>
-            <w:pPr>
-              <w:spacing w:before="40" w:after="40"/>
-              <w:jc w:val="right"/>
-            </w:pPr>
-            <w:r>
-              <w:rPr>
-                <w:rFonts w:ascii="Arial" w:hAnsi="Arial"/>
-                <w:rFonts w:ascii="Arial" w:hAnsi="Arial" w:cs="Arial"/>
-                <w:b w:val="0"/>
-                <w:i w:val="0"/>
-                <w:color w:val="4A5568"/>
-                <w:sz w:val="16"/>
-              </w:rPr>
-              <w:t>-0.0020</w:t>
-            </w:r>
-          </w:p>
-        </w:tc>
-        <w:tc>
-          <w:tcPr>
-            <w:tcW w:type="dxa" w:w="1247"/>
-            <w:shd w:val="clear" w:color="auto" w:fill="F5F7FA"/>
-            <w:tcBorders>
-              <w:bottom w:val="single" w:sz="4" w:color="D0D5DD"/>
-            </w:tcBorders>
-            <w:vAlign w:val="center"/>
-          </w:tcPr>
-          <w:p>
-            <w:pPr>
-              <w:spacing w:before="40" w:after="40"/>
-              <w:jc w:val="right"/>
-            </w:pPr>
-            <w:r>
-              <w:rPr>
-                <w:rFonts w:ascii="Arial" w:hAnsi="Arial"/>
-                <w:rFonts w:ascii="Arial" w:hAnsi="Arial" w:cs="Arial"/>
-                <w:b w:val="0"/>
-                <w:i w:val="0"/>
-                <w:color w:val="B91C1C"/>
-                <w:sz w:val="16"/>
-              </w:rPr>
-              <w:t>-$4.52</w:t>
-            </w:r>
-          </w:p>
-        </w:tc>
-        <w:tc>
-          <w:tcPr>
-            <w:tcW w:type="dxa" w:w="1701"/>
-            <w:shd w:val="clear" w:color="auto" w:fill="F5F7FA"/>
-            <w:tcBorders>
-              <w:bottom w:val="single" w:sz="4" w:color="D0D5DD"/>
-            </w:tcBorders>
-            <w:vAlign w:val="center"/>
-          </w:tcPr>
-          <w:p>
-            <w:pPr>
-              <w:spacing w:before="40" w:after="40"/>
-              <w:jc w:val="right"/>
-            </w:pPr>
-            <w:r>
-              <w:rPr>
-                <w:rFonts w:ascii="Arial" w:hAnsi="Arial"/>
-                <w:rFonts w:ascii="Arial" w:hAnsi="Arial" w:cs="Arial"/>
-                <w:b w:val="0"/>
-                <w:i w:val="0"/>
-                <w:color w:val="4A5568"/>
-                <w:sz w:val="16"/>
-              </w:rPr>
-              <w:t>Kiln validator pool</w:t>
-            </w:r>
-          </w:p>
-        </w:tc>
-        <w:tc>
-          <w:tcPr>
-            <w:tcW w:type="dxa" w:w="1361"/>
-            <w:shd w:val="clear" w:color="auto" w:fill="F5F7FA"/>
-            <w:tcBorders>
-              <w:bottom w:val="single" w:sz="4" w:color="D0D5DD"/>
-            </w:tcBorders>
-            <w:vAlign w:val="center"/>
-          </w:tcPr>
-          <w:p>
-            <w:pPr>
-              <w:spacing w:before="40" w:after="40"/>
-              <w:jc w:val="right"/>
-            </w:pPr>
-            <w:r>
-              <w:rPr>
-                <w:rFonts w:ascii="Arial" w:hAnsi="Arial"/>
-                <w:rFonts w:ascii="Arial" w:hAnsi="Arial" w:cs="Arial"/>
-                <w:b w:val="0"/>
-                <w:i w:val="0"/>
-                <w:color w:val="4A5568"/>
-                <w:sz w:val="16"/>
-              </w:rPr>
-              <w:t>W20260428-5LP9</w:t>
-            </w:r>
-          </w:p>
-        </w:tc>
-      </w:tr>
-      <w:tr>
-        <w:tc>
-          <w:tcPr>
-            <w:tcW w:type="dxa" w:w="1474"/>
             <w:shd w:val="clear" w:color="auto" w:fill="E5EBF1"/>
             <w:tcBorders>
               <w:bottom w:val="single" w:sz="4" w:color="D0D5DD"/>
@@ -19241,7 +18821,7 @@
                 <w:color w:val="0A2342"/>
                 <w:sz w:val="16"/>
               </w:rPr>
-              <w:t>Net (8 txns)</w:t>
+              <w:t>Net (6 txns)</w:t>
             </w:r>
           </w:p>
         </w:tc>
@@ -19343,7 +18923,7 @@
                 <w:color w:val="0A2342"/>
                 <w:sz w:val="16"/>
               </w:rPr>
-              <w:t>0.8340</w:t>
+              <w:t>0.8420</w:t>
             </w:r>
           </w:p>
         </w:tc>
@@ -19370,7 +18950,7 @@
                 <w:color w:val="0A2342"/>
                 <w:sz w:val="16"/>
               </w:rPr>
-              <w:t>$1,884.84</w:t>
+              <w:t>$1,902.92</w:t>
             </w:r>
           </w:p>
         </w:tc>

</xml_diff>

<commit_message>
Disclaimer is now per-custodian
DISCLAIMERS dict in generator keyed by custodian (Hex Trust MENA FZE,
Hex Trust Singapore Pte Ltd, HT Markets (SVG) Ltd, + _default fallback).
Disclaimer header now reads 'Disclaimer — <Custodian>:' and the body
is the entity-specific text. Compliance owns the actual wording per
entity; current text is a placeholder per-jurisdiction draft.

Co-Authored-By: Claude Opus 4.7 <noreply@anthropic.com>
</commit_message>
<xml_diff>
--- a/mockup/monthly_client_statement/sample-statements/Custody_Detailed_sample.docx
+++ b/mockup/monthly_client_statement/sample-statements/Custody_Detailed_sample.docx
@@ -21239,7 +21239,7 @@
           <w:color w:val="0A2342"/>
           <w:sz w:val="18"/>
         </w:rPr>
-        <w:t>Disclaimer:</w:t>
+        <w:t>Disclaimer — Hex Trust MENA FZE:</w:t>
       </w:r>
     </w:p>
     <w:p>
@@ -21255,7 +21255,7 @@
           <w:color w:val="0A2342"/>
           <w:sz w:val="18"/>
         </w:rPr>
-        <w:t>The client must review the information in the monthly statement and give Hex Trust written notice of any suspected error or omission as soon as reasonably possible (in any event, no later than 7 days of accessing / receiving the statement). Hex Trust will not be liable with respect to any error or omission in the monthly statement (including any reliance on any such error or omission) unless the client has timely objected in writing as aforementioned, unless such error or omission is the result of Hex Trust's bad faith or willful default.</w:t>
+        <w:t>The client must review the information in the monthly statement and give Hex Trust MENA FZE written notice of any suspected error or omission as soon as reasonably possible (in any event, no later than 7 days of accessing / receiving the statement). Hex Trust MENA FZE will not be liable with respect to any error or omission in the monthly statement (including any reliance on any such error or omission) unless the client has timely objected in writing as aforementioned, unless such error or omission is the result of Hex Trust MENA FZE's bad faith or willful default. Hex Trust MENA FZE is regulated by the Virtual Assets Regulatory Authority (VARA), Dubai.</w:t>
       </w:r>
     </w:p>
     <w:sectPr>

</xml_diff>

<commit_message>
Transactions Fees column: show qty only, drop fiat parenthetical
Co-Authored-By: Claude Opus 4.7 <noreply@anthropic.com>
</commit_message>
<xml_diff>
--- a/mockup/monthly_client_statement/sample-statements/Custody_Detailed_sample.docx
+++ b/mockup/monthly_client_statement/sample-statements/Custody_Detailed_sample.docx
@@ -8025,7 +8025,7 @@
                 <w:color w:val="4A5568"/>
                 <w:sz w:val="15"/>
               </w:rPr>
-              <w:t>0.00007965 ETH ($0.18)</w:t>
+              <w:t>0.00008 ETH</w:t>
             </w:r>
           </w:p>
         </w:tc>
@@ -8865,7 +8865,7 @@
                 <w:color w:val="4A5568"/>
                 <w:sz w:val="15"/>
               </w:rPr>
-              <w:t>0.00000830 BTC ($0.06)</w:t>
+              <w:t>0.0000083 BTC</w:t>
             </w:r>
           </w:p>
         </w:tc>
@@ -13565,7 +13565,7 @@
                 <w:color w:val="4A5568"/>
                 <w:sz w:val="15"/>
               </w:rPr>
-              <w:t>6.42850000 TRX ($2.10)</w:t>
+              <w:t>6.4285 TRX</w:t>
             </w:r>
           </w:p>
         </w:tc>
@@ -13985,7 +13985,7 @@
                 <w:color w:val="4A5568"/>
                 <w:sz w:val="15"/>
               </w:rPr>
-              <w:t>13.02850000 TRX ($4.25)</w:t>
+              <w:t>13.0285 TRX</w:t>
             </w:r>
           </w:p>
         </w:tc>
@@ -14192,7 +14192,7 @@
                 <w:color w:val="4A5568"/>
                 <w:sz w:val="15"/>
               </w:rPr>
-              <w:t>13.02850000 TRX ($4.25)</w:t>
+              <w:t>13.0285 TRX</w:t>
             </w:r>
           </w:p>
         </w:tc>
@@ -14612,7 +14612,7 @@
                 <w:color w:val="4A5568"/>
                 <w:sz w:val="15"/>
               </w:rPr>
-              <w:t>0.00015301 ETH ($0.35)</w:t>
+              <w:t>0.000153 ETH</w:t>
             </w:r>
           </w:p>
         </w:tc>
@@ -15032,7 +15032,7 @@
                 <w:color w:val="4A5568"/>
                 <w:sz w:val="15"/>
               </w:rPr>
-              <w:t>0.00003995 BTC ($3.05)</w:t>
+              <w:t>0.00003995 BTC</w:t>
             </w:r>
           </w:p>
         </w:tc>
@@ -15245,7 +15245,7 @@
                 <w:color w:val="4A5568"/>
                 <w:sz w:val="15"/>
               </w:rPr>
-              <w:t>13.02850000 TRX ($4.25)</w:t>
+              <w:t>13.0285 TRX</w:t>
             </w:r>
           </w:p>
         </w:tc>

</xml_diff>

<commit_message>
Client Information: drop Statement Period row (already in chrome)
Co-Authored-By: Claude Opus 4.7 <noreply@anthropic.com>
</commit_message>
<xml_diff>
--- a/mockup/monthly_client_statement/sample-statements/Custody_Detailed_sample.docx
+++ b/mockup/monthly_client_statement/sample-statements/Custody_Detailed_sample.docx
@@ -480,67 +480,13 @@
                 <w:color w:val="0A2342"/>
                 <w:sz w:val="18"/>
               </w:rPr>
-              <w:t>Statement Period</w:t>
+              <w:t>Reporting Currency</w:t>
             </w:r>
           </w:p>
         </w:tc>
         <w:tc>
           <w:tcPr>
             <w:tcW w:type="dxa" w:w="6746"/>
-            <w:tcBorders>
-              <w:bottom w:val="single" w:sz="4" w:color="D0D5DD"/>
-            </w:tcBorders>
-            <w:vAlign w:val="center"/>
-          </w:tcPr>
-          <w:p>
-            <w:pPr>
-              <w:spacing w:before="40" w:after="40"/>
-            </w:pPr>
-            <w:r>
-              <w:rPr>
-                <w:rFonts w:ascii="Arial" w:hAnsi="Arial"/>
-                <w:rFonts w:ascii="Arial" w:hAnsi="Arial" w:cs="Arial"/>
-                <w:b w:val="0"/>
-                <w:i w:val="0"/>
-                <w:color w:val="4A5568"/>
-                <w:sz w:val="18"/>
-              </w:rPr>
-              <w:t>01 Apr 2026 - 30 Apr 2026</w:t>
-            </w:r>
-          </w:p>
-        </w:tc>
-      </w:tr>
-      <w:tr>
-        <w:tc>
-          <w:tcPr>
-            <w:tcW w:type="dxa" w:w="3118"/>
-            <w:shd w:val="clear" w:color="auto" w:fill="F5F7FA"/>
-            <w:tcBorders>
-              <w:bottom w:val="single" w:sz="4" w:color="D0D5DD"/>
-            </w:tcBorders>
-            <w:vAlign w:val="center"/>
-          </w:tcPr>
-          <w:p>
-            <w:pPr>
-              <w:spacing w:before="40" w:after="40"/>
-            </w:pPr>
-            <w:r>
-              <w:rPr>
-                <w:rFonts w:ascii="Arial" w:hAnsi="Arial"/>
-                <w:rFonts w:ascii="Arial" w:hAnsi="Arial" w:cs="Arial"/>
-                <w:b/>
-                <w:i w:val="0"/>
-                <w:color w:val="0A2342"/>
-                <w:sz w:val="18"/>
-              </w:rPr>
-              <w:t>Reporting Currency</w:t>
-            </w:r>
-          </w:p>
-        </w:tc>
-        <w:tc>
-          <w:tcPr>
-            <w:tcW w:type="dxa" w:w="6746"/>
-            <w:shd w:val="clear" w:color="auto" w:fill="F5F7FA"/>
             <w:tcBorders>
               <w:bottom w:val="single" w:sz="4" w:color="D0D5DD"/>
             </w:tcBorders>

</xml_diff>

<commit_message>
Staking Position table: drop Δ Staked, add Opening Value (USD)
New layout: Asset / Network / Validator / Opening Staked / Opening
Value (USD) / Closing Staked / Closing Value (USD) / Unbonding.
Total row sums both Opening Value and Closing Value columns.

Co-Authored-By: Claude Opus 4.7 <noreply@anthropic.com>
</commit_message>
<xml_diff>
--- a/mockup/monthly_client_statement/sample-statements/Custody_Detailed_sample.docx
+++ b/mockup/monthly_client_statement/sample-statements/Custody_Detailed_sample.docx
@@ -4060,13 +4060,13 @@
       </w:tblPr>
       <w:tblGrid>
         <w:gridCol w:w="794"/>
-        <w:gridCol w:w="1077"/>
-        <w:gridCol w:w="1871"/>
-        <w:gridCol w:w="1304"/>
-        <w:gridCol w:w="1304"/>
-        <w:gridCol w:w="1191"/>
-        <w:gridCol w:w="1304"/>
+        <w:gridCol w:w="1134"/>
+        <w:gridCol w:w="1587"/>
         <w:gridCol w:w="1361"/>
+        <w:gridCol w:w="1474"/>
+        <w:gridCol w:w="1361"/>
+        <w:gridCol w:w="1474"/>
+        <w:gridCol w:w="1020"/>
       </w:tblGrid>
       <w:tr>
         <w:trPr>
@@ -4109,7 +4109,7 @@
         </w:tc>
         <w:tc>
           <w:tcPr>
-            <w:tcW w:type="dxa" w:w="1077"/>
+            <w:tcW w:type="dxa" w:w="1134"/>
             <w:shd w:val="clear" w:color="auto" w:fill="0A2342"/>
             <w:tcBorders>
               <w:top w:val="nil"/>
@@ -4144,7 +4144,7 @@
         </w:tc>
         <w:tc>
           <w:tcPr>
-            <w:tcW w:type="dxa" w:w="1871"/>
+            <w:tcW w:type="dxa" w:w="1587"/>
             <w:shd w:val="clear" w:color="auto" w:fill="0A2342"/>
             <w:tcBorders>
               <w:top w:val="nil"/>
@@ -4179,7 +4179,7 @@
         </w:tc>
         <w:tc>
           <w:tcPr>
-            <w:tcW w:type="dxa" w:w="1304"/>
+            <w:tcW w:type="dxa" w:w="1361"/>
             <w:shd w:val="clear" w:color="auto" w:fill="0A2342"/>
             <w:tcBorders>
               <w:top w:val="nil"/>
@@ -4215,7 +4215,7 @@
         </w:tc>
         <w:tc>
           <w:tcPr>
-            <w:tcW w:type="dxa" w:w="1304"/>
+            <w:tcW w:type="dxa" w:w="1474"/>
             <w:shd w:val="clear" w:color="auto" w:fill="0A2342"/>
             <w:tcBorders>
               <w:top w:val="nil"/>
@@ -4245,13 +4245,13 @@
                 <w:color w:val="FFFFFF"/>
                 <w:sz w:val="17"/>
               </w:rPr>
-              <w:t>Closing Staked</w:t>
-            </w:r>
-          </w:p>
-        </w:tc>
-        <w:tc>
-          <w:tcPr>
-            <w:tcW w:type="dxa" w:w="1191"/>
+              <w:t>Opening Value (USD)</w:t>
+            </w:r>
+          </w:p>
+        </w:tc>
+        <w:tc>
+          <w:tcPr>
+            <w:tcW w:type="dxa" w:w="1361"/>
             <w:shd w:val="clear" w:color="auto" w:fill="0A2342"/>
             <w:tcBorders>
               <w:top w:val="nil"/>
@@ -4281,13 +4281,13 @@
                 <w:color w:val="FFFFFF"/>
                 <w:sz w:val="17"/>
               </w:rPr>
-              <w:t>Δ Staked</w:t>
-            </w:r>
-          </w:p>
-        </w:tc>
-        <w:tc>
-          <w:tcPr>
-            <w:tcW w:type="dxa" w:w="1304"/>
+              <w:t>Closing Staked</w:t>
+            </w:r>
+          </w:p>
+        </w:tc>
+        <w:tc>
+          <w:tcPr>
+            <w:tcW w:type="dxa" w:w="1474"/>
             <w:shd w:val="clear" w:color="auto" w:fill="0A2342"/>
             <w:tcBorders>
               <w:top w:val="nil"/>
@@ -4317,13 +4317,13 @@
                 <w:color w:val="FFFFFF"/>
                 <w:sz w:val="17"/>
               </w:rPr>
-              <w:t>Unbonding</w:t>
-            </w:r>
-          </w:p>
-        </w:tc>
-        <w:tc>
-          <w:tcPr>
-            <w:tcW w:type="dxa" w:w="1361"/>
+              <w:t>Closing Value (USD)</w:t>
+            </w:r>
+          </w:p>
+        </w:tc>
+        <w:tc>
+          <w:tcPr>
+            <w:tcW w:type="dxa" w:w="1020"/>
             <w:shd w:val="clear" w:color="auto" w:fill="0A2342"/>
             <w:tcBorders>
               <w:top w:val="nil"/>
@@ -4353,7 +4353,7 @@
                 <w:color w:val="FFFFFF"/>
                 <w:sz w:val="17"/>
               </w:rPr>
-              <w:t>Closing Value (USD)</w:t>
+              <w:t>Unbonding</w:t>
             </w:r>
           </w:p>
         </w:tc>
@@ -4386,7 +4386,7 @@
         </w:tc>
         <w:tc>
           <w:tcPr>
-            <w:tcW w:type="dxa" w:w="1077"/>
+            <w:tcW w:type="dxa" w:w="1134"/>
             <w:tcBorders>
               <w:bottom w:val="single" w:sz="4" w:color="D0D5DD"/>
             </w:tcBorders>
@@ -4411,7 +4411,7 @@
         </w:tc>
         <w:tc>
           <w:tcPr>
-            <w:tcW w:type="dxa" w:w="1871"/>
+            <w:tcW w:type="dxa" w:w="1587"/>
             <w:tcBorders>
               <w:bottom w:val="single" w:sz="4" w:color="D0D5DD"/>
             </w:tcBorders>
@@ -4436,7 +4436,7 @@
         </w:tc>
         <w:tc>
           <w:tcPr>
-            <w:tcW w:type="dxa" w:w="1304"/>
+            <w:tcW w:type="dxa" w:w="1361"/>
             <w:tcBorders>
               <w:bottom w:val="single" w:sz="4" w:color="D0D5DD"/>
             </w:tcBorders>
@@ -4462,7 +4462,7 @@
         </w:tc>
         <w:tc>
           <w:tcPr>
-            <w:tcW w:type="dxa" w:w="1304"/>
+            <w:tcW w:type="dxa" w:w="1474"/>
             <w:tcBorders>
               <w:bottom w:val="single" w:sz="4" w:color="D0D5DD"/>
             </w:tcBorders>
@@ -4482,13 +4482,39 @@
                 <w:color w:val="4A5568"/>
                 <w:sz w:val="16"/>
               </w:rPr>
+              <w:t>$225,000.00</w:t>
+            </w:r>
+          </w:p>
+        </w:tc>
+        <w:tc>
+          <w:tcPr>
+            <w:tcW w:type="dxa" w:w="1361"/>
+            <w:tcBorders>
+              <w:bottom w:val="single" w:sz="4" w:color="D0D5DD"/>
+            </w:tcBorders>
+            <w:vAlign w:val="center"/>
+          </w:tcPr>
+          <w:p>
+            <w:pPr>
+              <w:spacing w:before="40" w:after="40"/>
+              <w:jc w:val="right"/>
+            </w:pPr>
+            <w:r>
+              <w:rPr>
+                <w:rFonts w:ascii="Arial" w:hAnsi="Arial"/>
+                <w:rFonts w:ascii="Arial" w:hAnsi="Arial" w:cs="Arial"/>
+                <w:b w:val="0"/>
+                <w:i w:val="0"/>
+                <w:color w:val="4A5568"/>
+                <w:sz w:val="16"/>
+              </w:rPr>
               <w:t>100.0000 ETH</w:t>
             </w:r>
           </w:p>
         </w:tc>
         <w:tc>
           <w:tcPr>
-            <w:tcW w:type="dxa" w:w="1191"/>
+            <w:tcW w:type="dxa" w:w="1474"/>
             <w:tcBorders>
               <w:bottom w:val="single" w:sz="4" w:color="D0D5DD"/>
             </w:tcBorders>
@@ -4503,18 +4529,18 @@
               <w:rPr>
                 <w:rFonts w:ascii="Arial" w:hAnsi="Arial"/>
                 <w:rFonts w:ascii="Arial" w:hAnsi="Arial" w:cs="Arial"/>
-                <w:b/>
+                <w:b w:val="0"/>
                 <w:i w:val="0"/>
                 <w:color w:val="4A5568"/>
                 <w:sz w:val="16"/>
               </w:rPr>
-              <w:t>0.0000 ETH</w:t>
-            </w:r>
-          </w:p>
-        </w:tc>
-        <w:tc>
-          <w:tcPr>
-            <w:tcW w:type="dxa" w:w="1304"/>
+              <w:t>$226,000.00</w:t>
+            </w:r>
+          </w:p>
+        </w:tc>
+        <w:tc>
+          <w:tcPr>
+            <w:tcW w:type="dxa" w:w="1020"/>
             <w:tcBorders>
               <w:bottom w:val="single" w:sz="4" w:color="D0D5DD"/>
             </w:tcBorders>
@@ -4535,32 +4561,6 @@
                 <w:sz w:val="16"/>
               </w:rPr>
               <w:t>—</w:t>
-            </w:r>
-          </w:p>
-        </w:tc>
-        <w:tc>
-          <w:tcPr>
-            <w:tcW w:type="dxa" w:w="1361"/>
-            <w:tcBorders>
-              <w:bottom w:val="single" w:sz="4" w:color="D0D5DD"/>
-            </w:tcBorders>
-            <w:vAlign w:val="center"/>
-          </w:tcPr>
-          <w:p>
-            <w:pPr>
-              <w:spacing w:before="40" w:after="40"/>
-              <w:jc w:val="right"/>
-            </w:pPr>
-            <w:r>
-              <w:rPr>
-                <w:rFonts w:ascii="Arial" w:hAnsi="Arial"/>
-                <w:rFonts w:ascii="Arial" w:hAnsi="Arial" w:cs="Arial"/>
-                <w:b w:val="0"/>
-                <w:i w:val="0"/>
-                <w:color w:val="4A5568"/>
-                <w:sz w:val="16"/>
-              </w:rPr>
-              <w:t>$226,000.00</w:t>
             </w:r>
           </w:p>
         </w:tc>
@@ -4594,7 +4594,7 @@
         </w:tc>
         <w:tc>
           <w:tcPr>
-            <w:tcW w:type="dxa" w:w="1077"/>
+            <w:tcW w:type="dxa" w:w="1134"/>
             <w:shd w:val="clear" w:color="auto" w:fill="E5EBF1"/>
             <w:tcBorders>
               <w:bottom w:val="single" w:sz="4" w:color="D0D5DD"/>
@@ -4619,7 +4619,7 @@
         </w:tc>
         <w:tc>
           <w:tcPr>
-            <w:tcW w:type="dxa" w:w="1871"/>
+            <w:tcW w:type="dxa" w:w="1587"/>
             <w:shd w:val="clear" w:color="auto" w:fill="E5EBF1"/>
             <w:tcBorders>
               <w:bottom w:val="single" w:sz="4" w:color="D0D5DD"/>
@@ -4644,7 +4644,7 @@
         </w:tc>
         <w:tc>
           <w:tcPr>
-            <w:tcW w:type="dxa" w:w="1304"/>
+            <w:tcW w:type="dxa" w:w="1361"/>
             <w:shd w:val="clear" w:color="auto" w:fill="E5EBF1"/>
             <w:tcBorders>
               <w:bottom w:val="single" w:sz="4" w:color="D0D5DD"/>
@@ -4670,7 +4670,7 @@
         </w:tc>
         <w:tc>
           <w:tcPr>
-            <w:tcW w:type="dxa" w:w="1304"/>
+            <w:tcW w:type="dxa" w:w="1474"/>
             <w:shd w:val="clear" w:color="auto" w:fill="E5EBF1"/>
             <w:tcBorders>
               <w:bottom w:val="single" w:sz="4" w:color="D0D5DD"/>
@@ -4691,12 +4691,13 @@
                 <w:color w:val="0A2342"/>
                 <w:sz w:val="16"/>
               </w:rPr>
-            </w:r>
-          </w:p>
-        </w:tc>
-        <w:tc>
-          <w:tcPr>
-            <w:tcW w:type="dxa" w:w="1191"/>
+              <w:t>$225,000.00</w:t>
+            </w:r>
+          </w:p>
+        </w:tc>
+        <w:tc>
+          <w:tcPr>
+            <w:tcW w:type="dxa" w:w="1361"/>
             <w:shd w:val="clear" w:color="auto" w:fill="E5EBF1"/>
             <w:tcBorders>
               <w:bottom w:val="single" w:sz="4" w:color="D0D5DD"/>
@@ -4722,7 +4723,7 @@
         </w:tc>
         <w:tc>
           <w:tcPr>
-            <w:tcW w:type="dxa" w:w="1304"/>
+            <w:tcW w:type="dxa" w:w="1474"/>
             <w:shd w:val="clear" w:color="auto" w:fill="E5EBF1"/>
             <w:tcBorders>
               <w:bottom w:val="single" w:sz="4" w:color="D0D5DD"/>
@@ -4743,12 +4744,13 @@
                 <w:color w:val="0A2342"/>
                 <w:sz w:val="16"/>
               </w:rPr>
-            </w:r>
-          </w:p>
-        </w:tc>
-        <w:tc>
-          <w:tcPr>
-            <w:tcW w:type="dxa" w:w="1361"/>
+              <w:t>$226,000.00</w:t>
+            </w:r>
+          </w:p>
+        </w:tc>
+        <w:tc>
+          <w:tcPr>
+            <w:tcW w:type="dxa" w:w="1020"/>
             <w:shd w:val="clear" w:color="auto" w:fill="E5EBF1"/>
             <w:tcBorders>
               <w:bottom w:val="single" w:sz="4" w:color="D0D5DD"/>
@@ -4769,7 +4771,6 @@
                 <w:color w:val="0A2342"/>
                 <w:sz w:val="16"/>
               </w:rPr>
-              <w:t>$226,000.00</w:t>
             </w:r>
           </w:p>
         </w:tc>
@@ -15881,13 +15882,13 @@
       </w:tblPr>
       <w:tblGrid>
         <w:gridCol w:w="794"/>
-        <w:gridCol w:w="1077"/>
-        <w:gridCol w:w="1871"/>
-        <w:gridCol w:w="1304"/>
-        <w:gridCol w:w="1304"/>
-        <w:gridCol w:w="1191"/>
-        <w:gridCol w:w="1304"/>
+        <w:gridCol w:w="1134"/>
+        <w:gridCol w:w="1587"/>
         <w:gridCol w:w="1361"/>
+        <w:gridCol w:w="1474"/>
+        <w:gridCol w:w="1361"/>
+        <w:gridCol w:w="1474"/>
+        <w:gridCol w:w="1020"/>
       </w:tblGrid>
       <w:tr>
         <w:trPr>
@@ -15930,7 +15931,7 @@
         </w:tc>
         <w:tc>
           <w:tcPr>
-            <w:tcW w:type="dxa" w:w="1077"/>
+            <w:tcW w:type="dxa" w:w="1134"/>
             <w:shd w:val="clear" w:color="auto" w:fill="0A2342"/>
             <w:tcBorders>
               <w:top w:val="nil"/>
@@ -15965,7 +15966,7 @@
         </w:tc>
         <w:tc>
           <w:tcPr>
-            <w:tcW w:type="dxa" w:w="1871"/>
+            <w:tcW w:type="dxa" w:w="1587"/>
             <w:shd w:val="clear" w:color="auto" w:fill="0A2342"/>
             <w:tcBorders>
               <w:top w:val="nil"/>
@@ -16000,7 +16001,7 @@
         </w:tc>
         <w:tc>
           <w:tcPr>
-            <w:tcW w:type="dxa" w:w="1304"/>
+            <w:tcW w:type="dxa" w:w="1361"/>
             <w:shd w:val="clear" w:color="auto" w:fill="0A2342"/>
             <w:tcBorders>
               <w:top w:val="nil"/>
@@ -16036,7 +16037,7 @@
         </w:tc>
         <w:tc>
           <w:tcPr>
-            <w:tcW w:type="dxa" w:w="1304"/>
+            <w:tcW w:type="dxa" w:w="1474"/>
             <w:shd w:val="clear" w:color="auto" w:fill="0A2342"/>
             <w:tcBorders>
               <w:top w:val="nil"/>
@@ -16066,13 +16067,13 @@
                 <w:color w:val="FFFFFF"/>
                 <w:sz w:val="17"/>
               </w:rPr>
-              <w:t>Closing Staked</w:t>
-            </w:r>
-          </w:p>
-        </w:tc>
-        <w:tc>
-          <w:tcPr>
-            <w:tcW w:type="dxa" w:w="1191"/>
+              <w:t>Opening Value (USD)</w:t>
+            </w:r>
+          </w:p>
+        </w:tc>
+        <w:tc>
+          <w:tcPr>
+            <w:tcW w:type="dxa" w:w="1361"/>
             <w:shd w:val="clear" w:color="auto" w:fill="0A2342"/>
             <w:tcBorders>
               <w:top w:val="nil"/>
@@ -16102,13 +16103,13 @@
                 <w:color w:val="FFFFFF"/>
                 <w:sz w:val="17"/>
               </w:rPr>
-              <w:t>Δ Staked</w:t>
-            </w:r>
-          </w:p>
-        </w:tc>
-        <w:tc>
-          <w:tcPr>
-            <w:tcW w:type="dxa" w:w="1304"/>
+              <w:t>Closing Staked</w:t>
+            </w:r>
+          </w:p>
+        </w:tc>
+        <w:tc>
+          <w:tcPr>
+            <w:tcW w:type="dxa" w:w="1474"/>
             <w:shd w:val="clear" w:color="auto" w:fill="0A2342"/>
             <w:tcBorders>
               <w:top w:val="nil"/>
@@ -16138,13 +16139,13 @@
                 <w:color w:val="FFFFFF"/>
                 <w:sz w:val="17"/>
               </w:rPr>
-              <w:t>Unbonding</w:t>
-            </w:r>
-          </w:p>
-        </w:tc>
-        <w:tc>
-          <w:tcPr>
-            <w:tcW w:type="dxa" w:w="1361"/>
+              <w:t>Closing Value (USD)</w:t>
+            </w:r>
+          </w:p>
+        </w:tc>
+        <w:tc>
+          <w:tcPr>
+            <w:tcW w:type="dxa" w:w="1020"/>
             <w:shd w:val="clear" w:color="auto" w:fill="0A2342"/>
             <w:tcBorders>
               <w:top w:val="nil"/>
@@ -16174,7 +16175,7 @@
                 <w:color w:val="FFFFFF"/>
                 <w:sz w:val="17"/>
               </w:rPr>
-              <w:t>Closing Value (USD)</w:t>
+              <w:t>Unbonding</w:t>
             </w:r>
           </w:p>
         </w:tc>
@@ -16207,7 +16208,7 @@
         </w:tc>
         <w:tc>
           <w:tcPr>
-            <w:tcW w:type="dxa" w:w="1077"/>
+            <w:tcW w:type="dxa" w:w="1134"/>
             <w:tcBorders>
               <w:bottom w:val="single" w:sz="4" w:color="D0D5DD"/>
             </w:tcBorders>
@@ -16232,7 +16233,7 @@
         </w:tc>
         <w:tc>
           <w:tcPr>
-            <w:tcW w:type="dxa" w:w="1871"/>
+            <w:tcW w:type="dxa" w:w="1587"/>
             <w:tcBorders>
               <w:bottom w:val="single" w:sz="4" w:color="D0D5DD"/>
             </w:tcBorders>
@@ -16257,7 +16258,7 @@
         </w:tc>
         <w:tc>
           <w:tcPr>
-            <w:tcW w:type="dxa" w:w="1304"/>
+            <w:tcW w:type="dxa" w:w="1361"/>
             <w:tcBorders>
               <w:bottom w:val="single" w:sz="4" w:color="D0D5DD"/>
             </w:tcBorders>
@@ -16283,7 +16284,7 @@
         </w:tc>
         <w:tc>
           <w:tcPr>
-            <w:tcW w:type="dxa" w:w="1304"/>
+            <w:tcW w:type="dxa" w:w="1474"/>
             <w:tcBorders>
               <w:bottom w:val="single" w:sz="4" w:color="D0D5DD"/>
             </w:tcBorders>
@@ -16303,13 +16304,39 @@
                 <w:color w:val="4A5568"/>
                 <w:sz w:val="16"/>
               </w:rPr>
+              <w:t>$225,000.00</w:t>
+            </w:r>
+          </w:p>
+        </w:tc>
+        <w:tc>
+          <w:tcPr>
+            <w:tcW w:type="dxa" w:w="1361"/>
+            <w:tcBorders>
+              <w:bottom w:val="single" w:sz="4" w:color="D0D5DD"/>
+            </w:tcBorders>
+            <w:vAlign w:val="center"/>
+          </w:tcPr>
+          <w:p>
+            <w:pPr>
+              <w:spacing w:before="40" w:after="40"/>
+              <w:jc w:val="right"/>
+            </w:pPr>
+            <w:r>
+              <w:rPr>
+                <w:rFonts w:ascii="Arial" w:hAnsi="Arial"/>
+                <w:rFonts w:ascii="Arial" w:hAnsi="Arial" w:cs="Arial"/>
+                <w:b w:val="0"/>
+                <w:i w:val="0"/>
+                <w:color w:val="4A5568"/>
+                <w:sz w:val="16"/>
+              </w:rPr>
               <w:t>100.0000 ETH</w:t>
             </w:r>
           </w:p>
         </w:tc>
         <w:tc>
           <w:tcPr>
-            <w:tcW w:type="dxa" w:w="1191"/>
+            <w:tcW w:type="dxa" w:w="1474"/>
             <w:tcBorders>
               <w:bottom w:val="single" w:sz="4" w:color="D0D5DD"/>
             </w:tcBorders>
@@ -16324,18 +16351,18 @@
               <w:rPr>
                 <w:rFonts w:ascii="Arial" w:hAnsi="Arial"/>
                 <w:rFonts w:ascii="Arial" w:hAnsi="Arial" w:cs="Arial"/>
-                <w:b/>
+                <w:b w:val="0"/>
                 <w:i w:val="0"/>
                 <w:color w:val="4A5568"/>
                 <w:sz w:val="16"/>
               </w:rPr>
-              <w:t>0.0000 ETH</w:t>
-            </w:r>
-          </w:p>
-        </w:tc>
-        <w:tc>
-          <w:tcPr>
-            <w:tcW w:type="dxa" w:w="1304"/>
+              <w:t>$226,000.00</w:t>
+            </w:r>
+          </w:p>
+        </w:tc>
+        <w:tc>
+          <w:tcPr>
+            <w:tcW w:type="dxa" w:w="1020"/>
             <w:tcBorders>
               <w:bottom w:val="single" w:sz="4" w:color="D0D5DD"/>
             </w:tcBorders>
@@ -16356,32 +16383,6 @@
                 <w:sz w:val="16"/>
               </w:rPr>
               <w:t>—</w:t>
-            </w:r>
-          </w:p>
-        </w:tc>
-        <w:tc>
-          <w:tcPr>
-            <w:tcW w:type="dxa" w:w="1361"/>
-            <w:tcBorders>
-              <w:bottom w:val="single" w:sz="4" w:color="D0D5DD"/>
-            </w:tcBorders>
-            <w:vAlign w:val="center"/>
-          </w:tcPr>
-          <w:p>
-            <w:pPr>
-              <w:spacing w:before="40" w:after="40"/>
-              <w:jc w:val="right"/>
-            </w:pPr>
-            <w:r>
-              <w:rPr>
-                <w:rFonts w:ascii="Arial" w:hAnsi="Arial"/>
-                <w:rFonts w:ascii="Arial" w:hAnsi="Arial" w:cs="Arial"/>
-                <w:b w:val="0"/>
-                <w:i w:val="0"/>
-                <w:color w:val="4A5568"/>
-                <w:sz w:val="16"/>
-              </w:rPr>
-              <w:t>$226,000.00</w:t>
             </w:r>
           </w:p>
         </w:tc>
@@ -16415,7 +16416,7 @@
         </w:tc>
         <w:tc>
           <w:tcPr>
-            <w:tcW w:type="dxa" w:w="1077"/>
+            <w:tcW w:type="dxa" w:w="1134"/>
             <w:shd w:val="clear" w:color="auto" w:fill="E5EBF1"/>
             <w:tcBorders>
               <w:bottom w:val="single" w:sz="4" w:color="D0D5DD"/>
@@ -16440,7 +16441,7 @@
         </w:tc>
         <w:tc>
           <w:tcPr>
-            <w:tcW w:type="dxa" w:w="1871"/>
+            <w:tcW w:type="dxa" w:w="1587"/>
             <w:shd w:val="clear" w:color="auto" w:fill="E5EBF1"/>
             <w:tcBorders>
               <w:bottom w:val="single" w:sz="4" w:color="D0D5DD"/>
@@ -16465,7 +16466,7 @@
         </w:tc>
         <w:tc>
           <w:tcPr>
-            <w:tcW w:type="dxa" w:w="1304"/>
+            <w:tcW w:type="dxa" w:w="1361"/>
             <w:shd w:val="clear" w:color="auto" w:fill="E5EBF1"/>
             <w:tcBorders>
               <w:bottom w:val="single" w:sz="4" w:color="D0D5DD"/>
@@ -16491,7 +16492,7 @@
         </w:tc>
         <w:tc>
           <w:tcPr>
-            <w:tcW w:type="dxa" w:w="1304"/>
+            <w:tcW w:type="dxa" w:w="1474"/>
             <w:shd w:val="clear" w:color="auto" w:fill="E5EBF1"/>
             <w:tcBorders>
               <w:bottom w:val="single" w:sz="4" w:color="D0D5DD"/>
@@ -16512,12 +16513,13 @@
                 <w:color w:val="0A2342"/>
                 <w:sz w:val="16"/>
               </w:rPr>
-            </w:r>
-          </w:p>
-        </w:tc>
-        <w:tc>
-          <w:tcPr>
-            <w:tcW w:type="dxa" w:w="1191"/>
+              <w:t>$225,000.00</w:t>
+            </w:r>
+          </w:p>
+        </w:tc>
+        <w:tc>
+          <w:tcPr>
+            <w:tcW w:type="dxa" w:w="1361"/>
             <w:shd w:val="clear" w:color="auto" w:fill="E5EBF1"/>
             <w:tcBorders>
               <w:bottom w:val="single" w:sz="4" w:color="D0D5DD"/>
@@ -16543,7 +16545,7 @@
         </w:tc>
         <w:tc>
           <w:tcPr>
-            <w:tcW w:type="dxa" w:w="1304"/>
+            <w:tcW w:type="dxa" w:w="1474"/>
             <w:shd w:val="clear" w:color="auto" w:fill="E5EBF1"/>
             <w:tcBorders>
               <w:bottom w:val="single" w:sz="4" w:color="D0D5DD"/>
@@ -16564,12 +16566,13 @@
                 <w:color w:val="0A2342"/>
                 <w:sz w:val="16"/>
               </w:rPr>
-            </w:r>
-          </w:p>
-        </w:tc>
-        <w:tc>
-          <w:tcPr>
-            <w:tcW w:type="dxa" w:w="1361"/>
+              <w:t>$226,000.00</w:t>
+            </w:r>
+          </w:p>
+        </w:tc>
+        <w:tc>
+          <w:tcPr>
+            <w:tcW w:type="dxa" w:w="1020"/>
             <w:shd w:val="clear" w:color="auto" w:fill="E5EBF1"/>
             <w:tcBorders>
               <w:bottom w:val="single" w:sz="4" w:color="D0D5DD"/>
@@ -16590,7 +16593,6 @@
                 <w:color w:val="0A2342"/>
                 <w:sz w:val="16"/>
               </w:rPr>
-              <w:t>$226,000.00</w:t>
             </w:r>
           </w:p>
         </w:tc>

</xml_diff>

<commit_message>
Per-vault balances: drop Δ Qty, add Opening Value (USD) + Total
Per-vault Opening/Closing balances tables now mirror the enterprise
Section 2.A layout: Asset / Network / Opening Qty / Opening Value
(USD) / Closing Qty / Closing Value (USD). Δ Qty column dropped.
Total row sums both Opening Value and Closing Value.

Opening fiat per vault is derived from the enterprise-level opening
price (ASSETS_AGG opening_fiat / opening_qty) — VAULT_BALS itself
keeps only qty + closing fiat.

Co-Authored-By: Claude Opus 4.7 <noreply@anthropic.com>
</commit_message>
<xml_diff>
--- a/mockup/monthly_client_statement/sample-statements/Custody_Detailed_sample.docx
+++ b/mockup/monthly_client_statement/sample-statements/Custody_Detailed_sample.docx
@@ -5398,12 +5398,12 @@
         <w:tblLook w:firstColumn="1" w:firstRow="1" w:lastColumn="0" w:lastRow="0" w:noHBand="0" w:noVBand="1" w:val="04A0"/>
       </w:tblPr>
       <w:tblGrid>
-        <w:gridCol w:w="964"/>
-        <w:gridCol w:w="1757"/>
-        <w:gridCol w:w="1871"/>
-        <w:gridCol w:w="1871"/>
-        <w:gridCol w:w="1644"/>
-        <w:gridCol w:w="2098"/>
+        <w:gridCol w:w="907"/>
+        <w:gridCol w:w="1587"/>
+        <w:gridCol w:w="1587"/>
+        <w:gridCol w:w="1928"/>
+        <w:gridCol w:w="1587"/>
+        <w:gridCol w:w="2608"/>
       </w:tblGrid>
       <w:tr>
         <w:trPr>
@@ -5411,7 +5411,7 @@
         </w:trPr>
         <w:tc>
           <w:tcPr>
-            <w:tcW w:type="dxa" w:w="964"/>
+            <w:tcW w:type="dxa" w:w="907"/>
             <w:shd w:val="clear" w:color="auto" w:fill="0A2342"/>
             <w:tcBorders>
               <w:top w:val="nil"/>
@@ -5446,7 +5446,7 @@
         </w:tc>
         <w:tc>
           <w:tcPr>
-            <w:tcW w:type="dxa" w:w="1757"/>
+            <w:tcW w:type="dxa" w:w="1587"/>
             <w:shd w:val="clear" w:color="auto" w:fill="0A2342"/>
             <w:tcBorders>
               <w:top w:val="nil"/>
@@ -5481,7 +5481,7 @@
         </w:tc>
         <w:tc>
           <w:tcPr>
-            <w:tcW w:type="dxa" w:w="1871"/>
+            <w:tcW w:type="dxa" w:w="1587"/>
             <w:shd w:val="clear" w:color="auto" w:fill="0A2342"/>
             <w:tcBorders>
               <w:top w:val="nil"/>
@@ -5517,7 +5517,7 @@
         </w:tc>
         <w:tc>
           <w:tcPr>
-            <w:tcW w:type="dxa" w:w="1871"/>
+            <w:tcW w:type="dxa" w:w="1928"/>
             <w:shd w:val="clear" w:color="auto" w:fill="0A2342"/>
             <w:tcBorders>
               <w:top w:val="nil"/>
@@ -5547,13 +5547,13 @@
                 <w:color w:val="FFFFFF"/>
                 <w:sz w:val="17"/>
               </w:rPr>
-              <w:t>Closing Qty</w:t>
-            </w:r>
-          </w:p>
-        </w:tc>
-        <w:tc>
-          <w:tcPr>
-            <w:tcW w:type="dxa" w:w="1644"/>
+              <w:t>Opening Value (USD)</w:t>
+            </w:r>
+          </w:p>
+        </w:tc>
+        <w:tc>
+          <w:tcPr>
+            <w:tcW w:type="dxa" w:w="1587"/>
             <w:shd w:val="clear" w:color="auto" w:fill="0A2342"/>
             <w:tcBorders>
               <w:top w:val="nil"/>
@@ -5583,13 +5583,13 @@
                 <w:color w:val="FFFFFF"/>
                 <w:sz w:val="17"/>
               </w:rPr>
-              <w:t>Δ Qty</w:t>
-            </w:r>
-          </w:p>
-        </w:tc>
-        <w:tc>
-          <w:tcPr>
-            <w:tcW w:type="dxa" w:w="2098"/>
+              <w:t>Closing Qty</w:t>
+            </w:r>
+          </w:p>
+        </w:tc>
+        <w:tc>
+          <w:tcPr>
+            <w:tcW w:type="dxa" w:w="2608"/>
             <w:shd w:val="clear" w:color="auto" w:fill="0A2342"/>
             <w:tcBorders>
               <w:top w:val="nil"/>
@@ -5627,7 +5627,7 @@
       <w:tr>
         <w:tc>
           <w:tcPr>
-            <w:tcW w:type="dxa" w:w="964"/>
+            <w:tcW w:type="dxa" w:w="907"/>
             <w:tcBorders>
               <w:bottom w:val="single" w:sz="4" w:color="D0D5DD"/>
             </w:tcBorders>
@@ -5652,7 +5652,7 @@
         </w:tc>
         <w:tc>
           <w:tcPr>
-            <w:tcW w:type="dxa" w:w="1757"/>
+            <w:tcW w:type="dxa" w:w="1587"/>
             <w:tcBorders>
               <w:bottom w:val="single" w:sz="4" w:color="D0D5DD"/>
             </w:tcBorders>
@@ -5677,7 +5677,7 @@
         </w:tc>
         <w:tc>
           <w:tcPr>
-            <w:tcW w:type="dxa" w:w="1871"/>
+            <w:tcW w:type="dxa" w:w="1587"/>
             <w:tcBorders>
               <w:bottom w:val="single" w:sz="4" w:color="D0D5DD"/>
             </w:tcBorders>
@@ -5697,13 +5697,13 @@
                 <w:color w:val="4A5568"/>
                 <w:sz w:val="16"/>
               </w:rPr>
-              <w:t>272,517.49868000</w:t>
-            </w:r>
-          </w:p>
-        </w:tc>
-        <w:tc>
-          <w:tcPr>
-            <w:tcW w:type="dxa" w:w="1871"/>
+              <w:t>272,517.50</w:t>
+            </w:r>
+          </w:p>
+        </w:tc>
+        <w:tc>
+          <w:tcPr>
+            <w:tcW w:type="dxa" w:w="1928"/>
             <w:tcBorders>
               <w:bottom w:val="single" w:sz="4" w:color="D0D5DD"/>
             </w:tcBorders>
@@ -5723,13 +5723,13 @@
                 <w:color w:val="4A5568"/>
                 <w:sz w:val="16"/>
               </w:rPr>
-              <w:t>320,033.61111000</w:t>
-            </w:r>
-          </w:p>
-        </w:tc>
-        <w:tc>
-          <w:tcPr>
-            <w:tcW w:type="dxa" w:w="1644"/>
+              <w:t>$272,244.98</w:t>
+            </w:r>
+          </w:p>
+        </w:tc>
+        <w:tc>
+          <w:tcPr>
+            <w:tcW w:type="dxa" w:w="1587"/>
             <w:tcBorders>
               <w:bottom w:val="single" w:sz="4" w:color="D0D5DD"/>
             </w:tcBorders>
@@ -5749,13 +5749,13 @@
                 <w:color w:val="4A5568"/>
                 <w:sz w:val="16"/>
               </w:rPr>
-              <w:t>47,516.11243000</w:t>
-            </w:r>
-          </w:p>
-        </w:tc>
-        <w:tc>
-          <w:tcPr>
-            <w:tcW w:type="dxa" w:w="2098"/>
+              <w:t>320,033.61</w:t>
+            </w:r>
+          </w:p>
+        </w:tc>
+        <w:tc>
+          <w:tcPr>
+            <w:tcW w:type="dxa" w:w="2608"/>
             <w:tcBorders>
               <w:bottom w:val="single" w:sz="4" w:color="D0D5DD"/>
             </w:tcBorders>
@@ -5783,7 +5783,7 @@
       <w:tr>
         <w:tc>
           <w:tcPr>
-            <w:tcW w:type="dxa" w:w="964"/>
+            <w:tcW w:type="dxa" w:w="907"/>
             <w:shd w:val="clear" w:color="auto" w:fill="F5F7FA"/>
             <w:tcBorders>
               <w:bottom w:val="single" w:sz="4" w:color="D0D5DD"/>
@@ -5809,7 +5809,7 @@
         </w:tc>
         <w:tc>
           <w:tcPr>
-            <w:tcW w:type="dxa" w:w="1757"/>
+            <w:tcW w:type="dxa" w:w="1587"/>
             <w:shd w:val="clear" w:color="auto" w:fill="F5F7FA"/>
             <w:tcBorders>
               <w:bottom w:val="single" w:sz="4" w:color="D0D5DD"/>
@@ -5835,7 +5835,7 @@
         </w:tc>
         <w:tc>
           <w:tcPr>
-            <w:tcW w:type="dxa" w:w="1871"/>
+            <w:tcW w:type="dxa" w:w="1587"/>
             <w:shd w:val="clear" w:color="auto" w:fill="F5F7FA"/>
             <w:tcBorders>
               <w:bottom w:val="single" w:sz="4" w:color="D0D5DD"/>
@@ -5856,13 +5856,13 @@
                 <w:color w:val="4A5568"/>
                 <w:sz w:val="16"/>
               </w:rPr>
-              <w:t>23,550.66962000</w:t>
-            </w:r>
-          </w:p>
-        </w:tc>
-        <w:tc>
-          <w:tcPr>
-            <w:tcW w:type="dxa" w:w="1871"/>
+              <w:t>23,550.67</w:t>
+            </w:r>
+          </w:p>
+        </w:tc>
+        <w:tc>
+          <w:tcPr>
+            <w:tcW w:type="dxa" w:w="1928"/>
             <w:shd w:val="clear" w:color="auto" w:fill="F5F7FA"/>
             <w:tcBorders>
               <w:bottom w:val="single" w:sz="4" w:color="D0D5DD"/>
@@ -5883,13 +5883,13 @@
                 <w:color w:val="4A5568"/>
                 <w:sz w:val="16"/>
               </w:rPr>
-              <w:t>71,951.34527000</w:t>
-            </w:r>
-          </w:p>
-        </w:tc>
-        <w:tc>
-          <w:tcPr>
-            <w:tcW w:type="dxa" w:w="1644"/>
+              <w:t>$23,527.12</w:t>
+            </w:r>
+          </w:p>
+        </w:tc>
+        <w:tc>
+          <w:tcPr>
+            <w:tcW w:type="dxa" w:w="1587"/>
             <w:shd w:val="clear" w:color="auto" w:fill="F5F7FA"/>
             <w:tcBorders>
               <w:bottom w:val="single" w:sz="4" w:color="D0D5DD"/>
@@ -5910,13 +5910,13 @@
                 <w:color w:val="4A5568"/>
                 <w:sz w:val="16"/>
               </w:rPr>
-              <w:t>48,400.67565000</w:t>
-            </w:r>
-          </w:p>
-        </w:tc>
-        <w:tc>
-          <w:tcPr>
-            <w:tcW w:type="dxa" w:w="2098"/>
+              <w:t>71,951.35</w:t>
+            </w:r>
+          </w:p>
+        </w:tc>
+        <w:tc>
+          <w:tcPr>
+            <w:tcW w:type="dxa" w:w="2608"/>
             <w:shd w:val="clear" w:color="auto" w:fill="F5F7FA"/>
             <w:tcBorders>
               <w:bottom w:val="single" w:sz="4" w:color="D0D5DD"/>
@@ -5945,7 +5945,7 @@
       <w:tr>
         <w:tc>
           <w:tcPr>
-            <w:tcW w:type="dxa" w:w="964"/>
+            <w:tcW w:type="dxa" w:w="907"/>
             <w:tcBorders>
               <w:bottom w:val="single" w:sz="4" w:color="D0D5DD"/>
             </w:tcBorders>
@@ -5970,7 +5970,7 @@
         </w:tc>
         <w:tc>
           <w:tcPr>
-            <w:tcW w:type="dxa" w:w="1757"/>
+            <w:tcW w:type="dxa" w:w="1587"/>
             <w:tcBorders>
               <w:bottom w:val="single" w:sz="4" w:color="D0D5DD"/>
             </w:tcBorders>
@@ -5995,7 +5995,7 @@
         </w:tc>
         <w:tc>
           <w:tcPr>
-            <w:tcW w:type="dxa" w:w="1871"/>
+            <w:tcW w:type="dxa" w:w="1587"/>
             <w:tcBorders>
               <w:bottom w:val="single" w:sz="4" w:color="D0D5DD"/>
             </w:tcBorders>
@@ -6021,7 +6021,7 @@
         </w:tc>
         <w:tc>
           <w:tcPr>
-            <w:tcW w:type="dxa" w:w="1871"/>
+            <w:tcW w:type="dxa" w:w="1928"/>
             <w:tcBorders>
               <w:bottom w:val="single" w:sz="4" w:color="D0D5DD"/>
             </w:tcBorders>
@@ -6041,39 +6041,39 @@
                 <w:color w:val="4A5568"/>
                 <w:sz w:val="16"/>
               </w:rPr>
+              <w:t>$272.99</w:t>
+            </w:r>
+          </w:p>
+        </w:tc>
+        <w:tc>
+          <w:tcPr>
+            <w:tcW w:type="dxa" w:w="1587"/>
+            <w:tcBorders>
+              <w:bottom w:val="single" w:sz="4" w:color="D0D5DD"/>
+            </w:tcBorders>
+            <w:vAlign w:val="center"/>
+          </w:tcPr>
+          <w:p>
+            <w:pPr>
+              <w:spacing w:before="40" w:after="40"/>
+              <w:jc w:val="right"/>
+            </w:pPr>
+            <w:r>
+              <w:rPr>
+                <w:rFonts w:ascii="Arial" w:hAnsi="Arial"/>
+                <w:rFonts w:ascii="Arial" w:hAnsi="Arial" w:cs="Arial"/>
+                <w:b w:val="0"/>
+                <w:i w:val="0"/>
+                <w:color w:val="4A5568"/>
+                <w:sz w:val="16"/>
+              </w:rPr>
               <w:t>0.89976342</w:t>
             </w:r>
           </w:p>
         </w:tc>
         <w:tc>
           <w:tcPr>
-            <w:tcW w:type="dxa" w:w="1644"/>
-            <w:tcBorders>
-              <w:bottom w:val="single" w:sz="4" w:color="D0D5DD"/>
-            </w:tcBorders>
-            <w:vAlign w:val="center"/>
-          </w:tcPr>
-          <w:p>
-            <w:pPr>
-              <w:spacing w:before="40" w:after="40"/>
-              <w:jc w:val="right"/>
-            </w:pPr>
-            <w:r>
-              <w:rPr>
-                <w:rFonts w:ascii="Arial" w:hAnsi="Arial"/>
-                <w:rFonts w:ascii="Arial" w:hAnsi="Arial" w:cs="Arial"/>
-                <w:b w:val="0"/>
-                <w:i w:val="0"/>
-                <w:color w:val="4A5568"/>
-                <w:sz w:val="16"/>
-              </w:rPr>
-              <w:t>0.89587748</w:t>
-            </w:r>
-          </w:p>
-        </w:tc>
-        <w:tc>
-          <w:tcPr>
-            <w:tcW w:type="dxa" w:w="2098"/>
+            <w:tcW w:type="dxa" w:w="2608"/>
             <w:tcBorders>
               <w:bottom w:val="single" w:sz="4" w:color="D0D5DD"/>
             </w:tcBorders>
@@ -6101,7 +6101,7 @@
       <w:tr>
         <w:tc>
           <w:tcPr>
-            <w:tcW w:type="dxa" w:w="964"/>
+            <w:tcW w:type="dxa" w:w="907"/>
             <w:shd w:val="clear" w:color="auto" w:fill="F5F7FA"/>
             <w:tcBorders>
               <w:bottom w:val="single" w:sz="4" w:color="D0D5DD"/>
@@ -6127,7 +6127,7 @@
         </w:tc>
         <w:tc>
           <w:tcPr>
-            <w:tcW w:type="dxa" w:w="1757"/>
+            <w:tcW w:type="dxa" w:w="1587"/>
             <w:shd w:val="clear" w:color="auto" w:fill="F5F7FA"/>
             <w:tcBorders>
               <w:bottom w:val="single" w:sz="4" w:color="D0D5DD"/>
@@ -6153,7 +6153,7 @@
         </w:tc>
         <w:tc>
           <w:tcPr>
-            <w:tcW w:type="dxa" w:w="1871"/>
+            <w:tcW w:type="dxa" w:w="1587"/>
             <w:shd w:val="clear" w:color="auto" w:fill="F5F7FA"/>
             <w:tcBorders>
               <w:bottom w:val="single" w:sz="4" w:color="D0D5DD"/>
@@ -6174,13 +6174,13 @@
                 <w:color w:val="4A5568"/>
                 <w:sz w:val="16"/>
               </w:rPr>
-              <w:t>0.04075862</w:t>
-            </w:r>
-          </w:p>
-        </w:tc>
-        <w:tc>
-          <w:tcPr>
-            <w:tcW w:type="dxa" w:w="1871"/>
+              <w:t>0.040759</w:t>
+            </w:r>
+          </w:p>
+        </w:tc>
+        <w:tc>
+          <w:tcPr>
+            <w:tcW w:type="dxa" w:w="1928"/>
             <w:shd w:val="clear" w:color="auto" w:fill="F5F7FA"/>
             <w:tcBorders>
               <w:bottom w:val="single" w:sz="4" w:color="D0D5DD"/>
@@ -6201,13 +6201,13 @@
                 <w:color w:val="4A5568"/>
                 <w:sz w:val="16"/>
               </w:rPr>
-              <w:t>0.04009069</w:t>
-            </w:r>
-          </w:p>
-        </w:tc>
-        <w:tc>
-          <w:tcPr>
-            <w:tcW w:type="dxa" w:w="1644"/>
+              <w:t>$89.67</w:t>
+            </w:r>
+          </w:p>
+        </w:tc>
+        <w:tc>
+          <w:tcPr>
+            <w:tcW w:type="dxa" w:w="1587"/>
             <w:shd w:val="clear" w:color="auto" w:fill="F5F7FA"/>
             <w:tcBorders>
               <w:bottom w:val="single" w:sz="4" w:color="D0D5DD"/>
@@ -6228,13 +6228,13 @@
                 <w:color w:val="4A5568"/>
                 <w:sz w:val="16"/>
               </w:rPr>
-              <w:t>-0.00066793</w:t>
-            </w:r>
-          </w:p>
-        </w:tc>
-        <w:tc>
-          <w:tcPr>
-            <w:tcW w:type="dxa" w:w="2098"/>
+              <w:t>0.040091</w:t>
+            </w:r>
+          </w:p>
+        </w:tc>
+        <w:tc>
+          <w:tcPr>
+            <w:tcW w:type="dxa" w:w="2608"/>
             <w:shd w:val="clear" w:color="auto" w:fill="F5F7FA"/>
             <w:tcBorders>
               <w:bottom w:val="single" w:sz="4" w:color="D0D5DD"/>
@@ -6263,7 +6263,7 @@
       <w:tr>
         <w:tc>
           <w:tcPr>
-            <w:tcW w:type="dxa" w:w="964"/>
+            <w:tcW w:type="dxa" w:w="907"/>
             <w:tcBorders>
               <w:bottom w:val="single" w:sz="4" w:color="D0D5DD"/>
             </w:tcBorders>
@@ -6288,7 +6288,7 @@
         </w:tc>
         <w:tc>
           <w:tcPr>
-            <w:tcW w:type="dxa" w:w="1757"/>
+            <w:tcW w:type="dxa" w:w="1587"/>
             <w:tcBorders>
               <w:bottom w:val="single" w:sz="4" w:color="D0D5DD"/>
             </w:tcBorders>
@@ -6313,7 +6313,7 @@
         </w:tc>
         <w:tc>
           <w:tcPr>
-            <w:tcW w:type="dxa" w:w="1871"/>
+            <w:tcW w:type="dxa" w:w="1587"/>
             <w:tcBorders>
               <w:bottom w:val="single" w:sz="4" w:color="D0D5DD"/>
             </w:tcBorders>
@@ -6333,13 +6333,13 @@
                 <w:color w:val="4A5568"/>
                 <w:sz w:val="16"/>
               </w:rPr>
-              <w:t>105.36293000</w:t>
-            </w:r>
-          </w:p>
-        </w:tc>
-        <w:tc>
-          <w:tcPr>
-            <w:tcW w:type="dxa" w:w="1871"/>
+              <w:t>105.36</w:t>
+            </w:r>
+          </w:p>
+        </w:tc>
+        <w:tc>
+          <w:tcPr>
+            <w:tcW w:type="dxa" w:w="1928"/>
             <w:tcBorders>
               <w:bottom w:val="single" w:sz="4" w:color="D0D5DD"/>
             </w:tcBorders>
@@ -6359,13 +6359,13 @@
                 <w:color w:val="4A5568"/>
                 <w:sz w:val="16"/>
               </w:rPr>
-              <w:t>3,024.94519000</w:t>
-            </w:r>
-          </w:p>
-        </w:tc>
-        <w:tc>
-          <w:tcPr>
-            <w:tcW w:type="dxa" w:w="1644"/>
+              <w:t>$105.36</w:t>
+            </w:r>
+          </w:p>
+        </w:tc>
+        <w:tc>
+          <w:tcPr>
+            <w:tcW w:type="dxa" w:w="1587"/>
             <w:tcBorders>
               <w:bottom w:val="single" w:sz="4" w:color="D0D5DD"/>
             </w:tcBorders>
@@ -6385,13 +6385,13 @@
                 <w:color w:val="4A5568"/>
                 <w:sz w:val="16"/>
               </w:rPr>
-              <w:t>2,919.58226000</w:t>
-            </w:r>
-          </w:p>
-        </w:tc>
-        <w:tc>
-          <w:tcPr>
-            <w:tcW w:type="dxa" w:w="2098"/>
+              <w:t>3,024.95</w:t>
+            </w:r>
+          </w:p>
+        </w:tc>
+        <w:tc>
+          <w:tcPr>
+            <w:tcW w:type="dxa" w:w="2608"/>
             <w:tcBorders>
               <w:bottom w:val="single" w:sz="4" w:color="D0D5DD"/>
             </w:tcBorders>
@@ -6419,7 +6419,7 @@
       <w:tr>
         <w:tc>
           <w:tcPr>
-            <w:tcW w:type="dxa" w:w="964"/>
+            <w:tcW w:type="dxa" w:w="907"/>
             <w:shd w:val="clear" w:color="auto" w:fill="F5F7FA"/>
             <w:tcBorders>
               <w:bottom w:val="single" w:sz="4" w:color="D0D5DD"/>
@@ -6445,7 +6445,7 @@
         </w:tc>
         <w:tc>
           <w:tcPr>
-            <w:tcW w:type="dxa" w:w="1757"/>
+            <w:tcW w:type="dxa" w:w="1587"/>
             <w:shd w:val="clear" w:color="auto" w:fill="F5F7FA"/>
             <w:tcBorders>
               <w:bottom w:val="single" w:sz="4" w:color="D0D5DD"/>
@@ -6471,7 +6471,7 @@
         </w:tc>
         <w:tc>
           <w:tcPr>
-            <w:tcW w:type="dxa" w:w="1871"/>
+            <w:tcW w:type="dxa" w:w="1587"/>
             <w:shd w:val="clear" w:color="auto" w:fill="F5F7FA"/>
             <w:tcBorders>
               <w:bottom w:val="single" w:sz="4" w:color="D0D5DD"/>
@@ -6492,13 +6492,13 @@
                 <w:color w:val="4A5568"/>
                 <w:sz w:val="16"/>
               </w:rPr>
-              <w:t>36.69408000</w:t>
-            </w:r>
-          </w:p>
-        </w:tc>
-        <w:tc>
-          <w:tcPr>
-            <w:tcW w:type="dxa" w:w="1871"/>
+              <w:t>36.6941</w:t>
+            </w:r>
+          </w:p>
+        </w:tc>
+        <w:tc>
+          <w:tcPr>
+            <w:tcW w:type="dxa" w:w="1928"/>
             <w:shd w:val="clear" w:color="auto" w:fill="F5F7FA"/>
             <w:tcBorders>
               <w:bottom w:val="single" w:sz="4" w:color="D0D5DD"/>
@@ -6519,13 +6519,13 @@
                 <w:color w:val="4A5568"/>
                 <w:sz w:val="16"/>
               </w:rPr>
-              <w:t>34.92115000</w:t>
-            </w:r>
-          </w:p>
-        </w:tc>
-        <w:tc>
-          <w:tcPr>
-            <w:tcW w:type="dxa" w:w="1644"/>
+              <w:t>$12.11</w:t>
+            </w:r>
+          </w:p>
+        </w:tc>
+        <w:tc>
+          <w:tcPr>
+            <w:tcW w:type="dxa" w:w="1587"/>
             <w:shd w:val="clear" w:color="auto" w:fill="F5F7FA"/>
             <w:tcBorders>
               <w:bottom w:val="single" w:sz="4" w:color="D0D5DD"/>
@@ -6546,13 +6546,13 @@
                 <w:color w:val="4A5568"/>
                 <w:sz w:val="16"/>
               </w:rPr>
-              <w:t>-1.77293000</w:t>
-            </w:r>
-          </w:p>
-        </w:tc>
-        <w:tc>
-          <w:tcPr>
-            <w:tcW w:type="dxa" w:w="2098"/>
+              <w:t>34.9211</w:t>
+            </w:r>
+          </w:p>
+        </w:tc>
+        <w:tc>
+          <w:tcPr>
+            <w:tcW w:type="dxa" w:w="2608"/>
             <w:shd w:val="clear" w:color="auto" w:fill="F5F7FA"/>
             <w:tcBorders>
               <w:bottom w:val="single" w:sz="4" w:color="D0D5DD"/>
@@ -6581,7 +6581,7 @@
       <w:tr>
         <w:tc>
           <w:tcPr>
-            <w:tcW w:type="dxa" w:w="964"/>
+            <w:tcW w:type="dxa" w:w="907"/>
             <w:tcBorders>
               <w:bottom w:val="single" w:sz="4" w:color="D0D5DD"/>
             </w:tcBorders>
@@ -6606,7 +6606,7 @@
         </w:tc>
         <w:tc>
           <w:tcPr>
-            <w:tcW w:type="dxa" w:w="1757"/>
+            <w:tcW w:type="dxa" w:w="1587"/>
             <w:tcBorders>
               <w:bottom w:val="single" w:sz="4" w:color="D0D5DD"/>
             </w:tcBorders>
@@ -6631,7 +6631,7 @@
         </w:tc>
         <w:tc>
           <w:tcPr>
-            <w:tcW w:type="dxa" w:w="1871"/>
+            <w:tcW w:type="dxa" w:w="1587"/>
             <w:tcBorders>
               <w:bottom w:val="single" w:sz="4" w:color="D0D5DD"/>
             </w:tcBorders>
@@ -6651,13 +6651,13 @@
                 <w:color w:val="4A5568"/>
                 <w:sz w:val="16"/>
               </w:rPr>
-              <w:t>0.05754000</w:t>
-            </w:r>
-          </w:p>
-        </w:tc>
-        <w:tc>
-          <w:tcPr>
-            <w:tcW w:type="dxa" w:w="1871"/>
+              <w:t>0.0575</w:t>
+            </w:r>
+          </w:p>
+        </w:tc>
+        <w:tc>
+          <w:tcPr>
+            <w:tcW w:type="dxa" w:w="1928"/>
             <w:tcBorders>
               <w:bottom w:val="single" w:sz="4" w:color="D0D5DD"/>
             </w:tcBorders>
@@ -6677,13 +6677,13 @@
                 <w:color w:val="4A5568"/>
                 <w:sz w:val="16"/>
               </w:rPr>
-              <w:t>0.05755000</w:t>
-            </w:r>
-          </w:p>
-        </w:tc>
-        <w:tc>
-          <w:tcPr>
-            <w:tcW w:type="dxa" w:w="1644"/>
+              <w:t>$4.79</w:t>
+            </w:r>
+          </w:p>
+        </w:tc>
+        <w:tc>
+          <w:tcPr>
+            <w:tcW w:type="dxa" w:w="1587"/>
             <w:tcBorders>
               <w:bottom w:val="single" w:sz="4" w:color="D0D5DD"/>
             </w:tcBorders>
@@ -6703,13 +6703,13 @@
                 <w:color w:val="4A5568"/>
                 <w:sz w:val="16"/>
               </w:rPr>
-              <w:t>0.00001000</w:t>
-            </w:r>
-          </w:p>
-        </w:tc>
-        <w:tc>
-          <w:tcPr>
-            <w:tcW w:type="dxa" w:w="2098"/>
+              <w:t>0.0575</w:t>
+            </w:r>
+          </w:p>
+        </w:tc>
+        <w:tc>
+          <w:tcPr>
+            <w:tcW w:type="dxa" w:w="2608"/>
             <w:tcBorders>
               <w:bottom w:val="single" w:sz="4" w:color="D0D5DD"/>
             </w:tcBorders>
@@ -6737,7 +6737,7 @@
       <w:tr>
         <w:tc>
           <w:tcPr>
-            <w:tcW w:type="dxa" w:w="964"/>
+            <w:tcW w:type="dxa" w:w="907"/>
             <w:shd w:val="clear" w:color="auto" w:fill="F5F7FA"/>
             <w:tcBorders>
               <w:bottom w:val="single" w:sz="4" w:color="D0D5DD"/>
@@ -6763,7 +6763,7 @@
         </w:tc>
         <w:tc>
           <w:tcPr>
-            <w:tcW w:type="dxa" w:w="1757"/>
+            <w:tcW w:type="dxa" w:w="1587"/>
             <w:shd w:val="clear" w:color="auto" w:fill="F5F7FA"/>
             <w:tcBorders>
               <w:bottom w:val="single" w:sz="4" w:color="D0D5DD"/>
@@ -6789,7 +6789,7 @@
         </w:tc>
         <w:tc>
           <w:tcPr>
-            <w:tcW w:type="dxa" w:w="1871"/>
+            <w:tcW w:type="dxa" w:w="1587"/>
             <w:shd w:val="clear" w:color="auto" w:fill="F5F7FA"/>
             <w:tcBorders>
               <w:bottom w:val="single" w:sz="4" w:color="D0D5DD"/>
@@ -6810,13 +6810,13 @@
                 <w:color w:val="4A5568"/>
                 <w:sz w:val="16"/>
               </w:rPr>
-              <w:t>34,753.20481000</w:t>
-            </w:r>
-          </w:p>
-        </w:tc>
-        <w:tc>
-          <w:tcPr>
-            <w:tcW w:type="dxa" w:w="1871"/>
+              <w:t>34,753.20</w:t>
+            </w:r>
+          </w:p>
+        </w:tc>
+        <w:tc>
+          <w:tcPr>
+            <w:tcW w:type="dxa" w:w="1928"/>
             <w:shd w:val="clear" w:color="auto" w:fill="F5F7FA"/>
             <w:tcBorders>
               <w:bottom w:val="single" w:sz="4" w:color="D0D5DD"/>
@@ -6837,13 +6837,13 @@
                 <w:color w:val="4A5568"/>
                 <w:sz w:val="16"/>
               </w:rPr>
-              <w:t>0.00000000</w:t>
-            </w:r>
-          </w:p>
-        </w:tc>
-        <w:tc>
-          <w:tcPr>
-            <w:tcW w:type="dxa" w:w="1644"/>
+              <w:t>$34,718.45</w:t>
+            </w:r>
+          </w:p>
+        </w:tc>
+        <w:tc>
+          <w:tcPr>
+            <w:tcW w:type="dxa" w:w="1587"/>
             <w:shd w:val="clear" w:color="auto" w:fill="F5F7FA"/>
             <w:tcBorders>
               <w:bottom w:val="single" w:sz="4" w:color="D0D5DD"/>
@@ -6864,13 +6864,13 @@
                 <w:color w:val="4A5568"/>
                 <w:sz w:val="16"/>
               </w:rPr>
-              <w:t>-34,753.20481000</w:t>
-            </w:r>
-          </w:p>
-        </w:tc>
-        <w:tc>
-          <w:tcPr>
-            <w:tcW w:type="dxa" w:w="2098"/>
+              <w:t>0.00</w:t>
+            </w:r>
+          </w:p>
+        </w:tc>
+        <w:tc>
+          <w:tcPr>
+            <w:tcW w:type="dxa" w:w="2608"/>
             <w:shd w:val="clear" w:color="auto" w:fill="F5F7FA"/>
             <w:tcBorders>
               <w:bottom w:val="single" w:sz="4" w:color="D0D5DD"/>
@@ -6899,7 +6899,7 @@
       <w:tr>
         <w:tc>
           <w:tcPr>
-            <w:tcW w:type="dxa" w:w="964"/>
+            <w:tcW w:type="dxa" w:w="907"/>
             <w:shd w:val="clear" w:color="auto" w:fill="E5EBF1"/>
             <w:tcBorders>
               <w:bottom w:val="single" w:sz="4" w:color="D0D5DD"/>
@@ -6925,7 +6925,7 @@
         </w:tc>
         <w:tc>
           <w:tcPr>
-            <w:tcW w:type="dxa" w:w="1757"/>
+            <w:tcW w:type="dxa" w:w="1587"/>
             <w:shd w:val="clear" w:color="auto" w:fill="E5EBF1"/>
             <w:tcBorders>
               <w:bottom w:val="single" w:sz="4" w:color="D0D5DD"/>
@@ -6950,7 +6950,7 @@
         </w:tc>
         <w:tc>
           <w:tcPr>
-            <w:tcW w:type="dxa" w:w="1871"/>
+            <w:tcW w:type="dxa" w:w="1587"/>
             <w:shd w:val="clear" w:color="auto" w:fill="E5EBF1"/>
             <w:tcBorders>
               <w:bottom w:val="single" w:sz="4" w:color="D0D5DD"/>
@@ -6976,7 +6976,7 @@
         </w:tc>
         <w:tc>
           <w:tcPr>
-            <w:tcW w:type="dxa" w:w="1871"/>
+            <w:tcW w:type="dxa" w:w="1928"/>
             <w:shd w:val="clear" w:color="auto" w:fill="E5EBF1"/>
             <w:tcBorders>
               <w:bottom w:val="single" w:sz="4" w:color="D0D5DD"/>
@@ -6997,12 +6997,13 @@
                 <w:color w:val="0A2342"/>
                 <w:sz w:val="16"/>
               </w:rPr>
-            </w:r>
-          </w:p>
-        </w:tc>
-        <w:tc>
-          <w:tcPr>
-            <w:tcW w:type="dxa" w:w="1644"/>
+              <w:t>$330,975.47</w:t>
+            </w:r>
+          </w:p>
+        </w:tc>
+        <w:tc>
+          <w:tcPr>
+            <w:tcW w:type="dxa" w:w="1587"/>
             <w:shd w:val="clear" w:color="auto" w:fill="E5EBF1"/>
             <w:tcBorders>
               <w:bottom w:val="single" w:sz="4" w:color="D0D5DD"/>
@@ -7028,7 +7029,7 @@
         </w:tc>
         <w:tc>
           <w:tcPr>
-            <w:tcW w:type="dxa" w:w="2098"/>
+            <w:tcW w:type="dxa" w:w="2608"/>
             <w:shd w:val="clear" w:color="auto" w:fill="E5EBF1"/>
             <w:tcBorders>
               <w:bottom w:val="single" w:sz="4" w:color="D0D5DD"/>
@@ -9555,12 +9556,12 @@
         <w:tblLook w:firstColumn="1" w:firstRow="1" w:lastColumn="0" w:lastRow="0" w:noHBand="0" w:noVBand="1" w:val="04A0"/>
       </w:tblPr>
       <w:tblGrid>
-        <w:gridCol w:w="964"/>
-        <w:gridCol w:w="1757"/>
-        <w:gridCol w:w="1871"/>
-        <w:gridCol w:w="1871"/>
-        <w:gridCol w:w="1644"/>
-        <w:gridCol w:w="2098"/>
+        <w:gridCol w:w="907"/>
+        <w:gridCol w:w="1587"/>
+        <w:gridCol w:w="1587"/>
+        <w:gridCol w:w="1928"/>
+        <w:gridCol w:w="1587"/>
+        <w:gridCol w:w="2608"/>
       </w:tblGrid>
       <w:tr>
         <w:trPr>
@@ -9568,7 +9569,7 @@
         </w:trPr>
         <w:tc>
           <w:tcPr>
-            <w:tcW w:type="dxa" w:w="964"/>
+            <w:tcW w:type="dxa" w:w="907"/>
             <w:shd w:val="clear" w:color="auto" w:fill="0A2342"/>
             <w:tcBorders>
               <w:top w:val="nil"/>
@@ -9603,7 +9604,7 @@
         </w:tc>
         <w:tc>
           <w:tcPr>
-            <w:tcW w:type="dxa" w:w="1757"/>
+            <w:tcW w:type="dxa" w:w="1587"/>
             <w:shd w:val="clear" w:color="auto" w:fill="0A2342"/>
             <w:tcBorders>
               <w:top w:val="nil"/>
@@ -9638,7 +9639,7 @@
         </w:tc>
         <w:tc>
           <w:tcPr>
-            <w:tcW w:type="dxa" w:w="1871"/>
+            <w:tcW w:type="dxa" w:w="1587"/>
             <w:shd w:val="clear" w:color="auto" w:fill="0A2342"/>
             <w:tcBorders>
               <w:top w:val="nil"/>
@@ -9674,7 +9675,7 @@
         </w:tc>
         <w:tc>
           <w:tcPr>
-            <w:tcW w:type="dxa" w:w="1871"/>
+            <w:tcW w:type="dxa" w:w="1928"/>
             <w:shd w:val="clear" w:color="auto" w:fill="0A2342"/>
             <w:tcBorders>
               <w:top w:val="nil"/>
@@ -9704,13 +9705,13 @@
                 <w:color w:val="FFFFFF"/>
                 <w:sz w:val="17"/>
               </w:rPr>
-              <w:t>Closing Qty</w:t>
-            </w:r>
-          </w:p>
-        </w:tc>
-        <w:tc>
-          <w:tcPr>
-            <w:tcW w:type="dxa" w:w="1644"/>
+              <w:t>Opening Value (USD)</w:t>
+            </w:r>
+          </w:p>
+        </w:tc>
+        <w:tc>
+          <w:tcPr>
+            <w:tcW w:type="dxa" w:w="1587"/>
             <w:shd w:val="clear" w:color="auto" w:fill="0A2342"/>
             <w:tcBorders>
               <w:top w:val="nil"/>
@@ -9740,13 +9741,13 @@
                 <w:color w:val="FFFFFF"/>
                 <w:sz w:val="17"/>
               </w:rPr>
-              <w:t>Δ Qty</w:t>
-            </w:r>
-          </w:p>
-        </w:tc>
-        <w:tc>
-          <w:tcPr>
-            <w:tcW w:type="dxa" w:w="2098"/>
+              <w:t>Closing Qty</w:t>
+            </w:r>
+          </w:p>
+        </w:tc>
+        <w:tc>
+          <w:tcPr>
+            <w:tcW w:type="dxa" w:w="2608"/>
             <w:shd w:val="clear" w:color="auto" w:fill="0A2342"/>
             <w:tcBorders>
               <w:top w:val="nil"/>
@@ -9784,7 +9785,7 @@
       <w:tr>
         <w:tc>
           <w:tcPr>
-            <w:tcW w:type="dxa" w:w="964"/>
+            <w:tcW w:type="dxa" w:w="907"/>
             <w:tcBorders>
               <w:bottom w:val="single" w:sz="4" w:color="D0D5DD"/>
             </w:tcBorders>
@@ -9809,7 +9810,7 @@
         </w:tc>
         <w:tc>
           <w:tcPr>
-            <w:tcW w:type="dxa" w:w="1757"/>
+            <w:tcW w:type="dxa" w:w="1587"/>
             <w:tcBorders>
               <w:bottom w:val="single" w:sz="4" w:color="D0D5DD"/>
             </w:tcBorders>
@@ -9834,7 +9835,7 @@
         </w:tc>
         <w:tc>
           <w:tcPr>
-            <w:tcW w:type="dxa" w:w="1871"/>
+            <w:tcW w:type="dxa" w:w="1587"/>
             <w:tcBorders>
               <w:bottom w:val="single" w:sz="4" w:color="D0D5DD"/>
             </w:tcBorders>
@@ -9854,13 +9855,13 @@
                 <w:color w:val="4A5568"/>
                 <w:sz w:val="16"/>
               </w:rPr>
-              <w:t>0.00227378</w:t>
-            </w:r>
-          </w:p>
-        </w:tc>
-        <w:tc>
-          <w:tcPr>
-            <w:tcW w:type="dxa" w:w="1871"/>
+              <w:t>0.002274</w:t>
+            </w:r>
+          </w:p>
+        </w:tc>
+        <w:tc>
+          <w:tcPr>
+            <w:tcW w:type="dxa" w:w="1928"/>
             <w:tcBorders>
               <w:bottom w:val="single" w:sz="4" w:color="D0D5DD"/>
             </w:tcBorders>
@@ -9880,13 +9881,13 @@
                 <w:color w:val="4A5568"/>
                 <w:sz w:val="16"/>
               </w:rPr>
-              <w:t>0.00227378</w:t>
-            </w:r>
-          </w:p>
-        </w:tc>
-        <w:tc>
-          <w:tcPr>
-            <w:tcW w:type="dxa" w:w="1644"/>
+              <w:t>$5.00</w:t>
+            </w:r>
+          </w:p>
+        </w:tc>
+        <w:tc>
+          <w:tcPr>
+            <w:tcW w:type="dxa" w:w="1587"/>
             <w:tcBorders>
               <w:bottom w:val="single" w:sz="4" w:color="D0D5DD"/>
             </w:tcBorders>
@@ -9906,13 +9907,13 @@
                 <w:color w:val="4A5568"/>
                 <w:sz w:val="16"/>
               </w:rPr>
-              <w:t>0.00000000</w:t>
-            </w:r>
-          </w:p>
-        </w:tc>
-        <w:tc>
-          <w:tcPr>
-            <w:tcW w:type="dxa" w:w="2098"/>
+              <w:t>0.002274</w:t>
+            </w:r>
+          </w:p>
+        </w:tc>
+        <w:tc>
+          <w:tcPr>
+            <w:tcW w:type="dxa" w:w="2608"/>
             <w:tcBorders>
               <w:bottom w:val="single" w:sz="4" w:color="D0D5DD"/>
             </w:tcBorders>
@@ -9940,7 +9941,7 @@
       <w:tr>
         <w:tc>
           <w:tcPr>
-            <w:tcW w:type="dxa" w:w="964"/>
+            <w:tcW w:type="dxa" w:w="907"/>
             <w:shd w:val="clear" w:color="auto" w:fill="F5F7FA"/>
             <w:tcBorders>
               <w:bottom w:val="single" w:sz="4" w:color="D0D5DD"/>
@@ -9966,7 +9967,7 @@
         </w:tc>
         <w:tc>
           <w:tcPr>
-            <w:tcW w:type="dxa" w:w="1757"/>
+            <w:tcW w:type="dxa" w:w="1587"/>
             <w:shd w:val="clear" w:color="auto" w:fill="F5F7FA"/>
             <w:tcBorders>
               <w:bottom w:val="single" w:sz="4" w:color="D0D5DD"/>
@@ -9992,7 +9993,7 @@
         </w:tc>
         <w:tc>
           <w:tcPr>
-            <w:tcW w:type="dxa" w:w="1871"/>
+            <w:tcW w:type="dxa" w:w="1587"/>
             <w:shd w:val="clear" w:color="auto" w:fill="F5F7FA"/>
             <w:tcBorders>
               <w:bottom w:val="single" w:sz="4" w:color="D0D5DD"/>
@@ -10013,13 +10014,13 @@
                 <w:color w:val="4A5568"/>
                 <w:sz w:val="16"/>
               </w:rPr>
-              <w:t>0.00200700</w:t>
-            </w:r>
-          </w:p>
-        </w:tc>
-        <w:tc>
-          <w:tcPr>
-            <w:tcW w:type="dxa" w:w="1871"/>
+              <w:t>0.002007</w:t>
+            </w:r>
+          </w:p>
+        </w:tc>
+        <w:tc>
+          <w:tcPr>
+            <w:tcW w:type="dxa" w:w="1928"/>
             <w:shd w:val="clear" w:color="auto" w:fill="F5F7FA"/>
             <w:tcBorders>
               <w:bottom w:val="single" w:sz="4" w:color="D0D5DD"/>
@@ -10040,13 +10041,13 @@
                 <w:color w:val="4A5568"/>
                 <w:sz w:val="16"/>
               </w:rPr>
-              <w:t>0.00200700</w:t>
-            </w:r>
-          </w:p>
-        </w:tc>
-        <w:tc>
-          <w:tcPr>
-            <w:tcW w:type="dxa" w:w="1644"/>
+              <w:t>—</w:t>
+            </w:r>
+          </w:p>
+        </w:tc>
+        <w:tc>
+          <w:tcPr>
+            <w:tcW w:type="dxa" w:w="1587"/>
             <w:shd w:val="clear" w:color="auto" w:fill="F5F7FA"/>
             <w:tcBorders>
               <w:bottom w:val="single" w:sz="4" w:color="D0D5DD"/>
@@ -10067,13 +10068,13 @@
                 <w:color w:val="4A5568"/>
                 <w:sz w:val="16"/>
               </w:rPr>
-              <w:t>0.00000000</w:t>
-            </w:r>
-          </w:p>
-        </w:tc>
-        <w:tc>
-          <w:tcPr>
-            <w:tcW w:type="dxa" w:w="2098"/>
+              <w:t>0.002007</w:t>
+            </w:r>
+          </w:p>
+        </w:tc>
+        <w:tc>
+          <w:tcPr>
+            <w:tcW w:type="dxa" w:w="2608"/>
             <w:shd w:val="clear" w:color="auto" w:fill="F5F7FA"/>
             <w:tcBorders>
               <w:bottom w:val="single" w:sz="4" w:color="D0D5DD"/>
@@ -10102,7 +10103,7 @@
       <w:tr>
         <w:tc>
           <w:tcPr>
-            <w:tcW w:type="dxa" w:w="964"/>
+            <w:tcW w:type="dxa" w:w="907"/>
             <w:shd w:val="clear" w:color="auto" w:fill="E5EBF1"/>
             <w:tcBorders>
               <w:bottom w:val="single" w:sz="4" w:color="D0D5DD"/>
@@ -10128,7 +10129,7 @@
         </w:tc>
         <w:tc>
           <w:tcPr>
-            <w:tcW w:type="dxa" w:w="1757"/>
+            <w:tcW w:type="dxa" w:w="1587"/>
             <w:shd w:val="clear" w:color="auto" w:fill="E5EBF1"/>
             <w:tcBorders>
               <w:bottom w:val="single" w:sz="4" w:color="D0D5DD"/>
@@ -10153,7 +10154,7 @@
         </w:tc>
         <w:tc>
           <w:tcPr>
-            <w:tcW w:type="dxa" w:w="1871"/>
+            <w:tcW w:type="dxa" w:w="1587"/>
             <w:shd w:val="clear" w:color="auto" w:fill="E5EBF1"/>
             <w:tcBorders>
               <w:bottom w:val="single" w:sz="4" w:color="D0D5DD"/>
@@ -10179,7 +10180,7 @@
         </w:tc>
         <w:tc>
           <w:tcPr>
-            <w:tcW w:type="dxa" w:w="1871"/>
+            <w:tcW w:type="dxa" w:w="1928"/>
             <w:shd w:val="clear" w:color="auto" w:fill="E5EBF1"/>
             <w:tcBorders>
               <w:bottom w:val="single" w:sz="4" w:color="D0D5DD"/>
@@ -10200,12 +10201,13 @@
                 <w:color w:val="0A2342"/>
                 <w:sz w:val="16"/>
               </w:rPr>
-            </w:r>
-          </w:p>
-        </w:tc>
-        <w:tc>
-          <w:tcPr>
-            <w:tcW w:type="dxa" w:w="1644"/>
+              <w:t>$5.00</w:t>
+            </w:r>
+          </w:p>
+        </w:tc>
+        <w:tc>
+          <w:tcPr>
+            <w:tcW w:type="dxa" w:w="1587"/>
             <w:shd w:val="clear" w:color="auto" w:fill="E5EBF1"/>
             <w:tcBorders>
               <w:bottom w:val="single" w:sz="4" w:color="D0D5DD"/>
@@ -10231,7 +10233,7 @@
         </w:tc>
         <w:tc>
           <w:tcPr>
-            <w:tcW w:type="dxa" w:w="2098"/>
+            <w:tcW w:type="dxa" w:w="2608"/>
             <w:shd w:val="clear" w:color="auto" w:fill="E5EBF1"/>
             <w:tcBorders>
               <w:bottom w:val="single" w:sz="4" w:color="D0D5DD"/>
@@ -10827,12 +10829,12 @@
         <w:tblLook w:firstColumn="1" w:firstRow="1" w:lastColumn="0" w:lastRow="0" w:noHBand="0" w:noVBand="1" w:val="04A0"/>
       </w:tblPr>
       <w:tblGrid>
-        <w:gridCol w:w="964"/>
-        <w:gridCol w:w="1757"/>
-        <w:gridCol w:w="1871"/>
-        <w:gridCol w:w="1871"/>
-        <w:gridCol w:w="1644"/>
-        <w:gridCol w:w="2098"/>
+        <w:gridCol w:w="907"/>
+        <w:gridCol w:w="1587"/>
+        <w:gridCol w:w="1587"/>
+        <w:gridCol w:w="1928"/>
+        <w:gridCol w:w="1587"/>
+        <w:gridCol w:w="2608"/>
       </w:tblGrid>
       <w:tr>
         <w:trPr>
@@ -10840,7 +10842,7 @@
         </w:trPr>
         <w:tc>
           <w:tcPr>
-            <w:tcW w:type="dxa" w:w="964"/>
+            <w:tcW w:type="dxa" w:w="907"/>
             <w:shd w:val="clear" w:color="auto" w:fill="0A2342"/>
             <w:tcBorders>
               <w:top w:val="nil"/>
@@ -10875,7 +10877,7 @@
         </w:tc>
         <w:tc>
           <w:tcPr>
-            <w:tcW w:type="dxa" w:w="1757"/>
+            <w:tcW w:type="dxa" w:w="1587"/>
             <w:shd w:val="clear" w:color="auto" w:fill="0A2342"/>
             <w:tcBorders>
               <w:top w:val="nil"/>
@@ -10910,7 +10912,7 @@
         </w:tc>
         <w:tc>
           <w:tcPr>
-            <w:tcW w:type="dxa" w:w="1871"/>
+            <w:tcW w:type="dxa" w:w="1587"/>
             <w:shd w:val="clear" w:color="auto" w:fill="0A2342"/>
             <w:tcBorders>
               <w:top w:val="nil"/>
@@ -10946,7 +10948,7 @@
         </w:tc>
         <w:tc>
           <w:tcPr>
-            <w:tcW w:type="dxa" w:w="1871"/>
+            <w:tcW w:type="dxa" w:w="1928"/>
             <w:shd w:val="clear" w:color="auto" w:fill="0A2342"/>
             <w:tcBorders>
               <w:top w:val="nil"/>
@@ -10976,13 +10978,13 @@
                 <w:color w:val="FFFFFF"/>
                 <w:sz w:val="17"/>
               </w:rPr>
-              <w:t>Closing Qty</w:t>
-            </w:r>
-          </w:p>
-        </w:tc>
-        <w:tc>
-          <w:tcPr>
-            <w:tcW w:type="dxa" w:w="1644"/>
+              <w:t>Opening Value (USD)</w:t>
+            </w:r>
+          </w:p>
+        </w:tc>
+        <w:tc>
+          <w:tcPr>
+            <w:tcW w:type="dxa" w:w="1587"/>
             <w:shd w:val="clear" w:color="auto" w:fill="0A2342"/>
             <w:tcBorders>
               <w:top w:val="nil"/>
@@ -11012,13 +11014,13 @@
                 <w:color w:val="FFFFFF"/>
                 <w:sz w:val="17"/>
               </w:rPr>
-              <w:t>Δ Qty</w:t>
-            </w:r>
-          </w:p>
-        </w:tc>
-        <w:tc>
-          <w:tcPr>
-            <w:tcW w:type="dxa" w:w="2098"/>
+              <w:t>Closing Qty</w:t>
+            </w:r>
+          </w:p>
+        </w:tc>
+        <w:tc>
+          <w:tcPr>
+            <w:tcW w:type="dxa" w:w="2608"/>
             <w:shd w:val="clear" w:color="auto" w:fill="0A2342"/>
             <w:tcBorders>
               <w:top w:val="nil"/>
@@ -11056,7 +11058,7 @@
       <w:tr>
         <w:tc>
           <w:tcPr>
-            <w:tcW w:type="dxa" w:w="964"/>
+            <w:tcW w:type="dxa" w:w="907"/>
             <w:tcBorders>
               <w:bottom w:val="single" w:sz="4" w:color="D0D5DD"/>
             </w:tcBorders>
@@ -11081,7 +11083,7 @@
         </w:tc>
         <w:tc>
           <w:tcPr>
-            <w:tcW w:type="dxa" w:w="1757"/>
+            <w:tcW w:type="dxa" w:w="1587"/>
             <w:tcBorders>
               <w:bottom w:val="single" w:sz="4" w:color="D0D5DD"/>
             </w:tcBorders>
@@ -11106,7 +11108,7 @@
         </w:tc>
         <w:tc>
           <w:tcPr>
-            <w:tcW w:type="dxa" w:w="1871"/>
+            <w:tcW w:type="dxa" w:w="1587"/>
             <w:tcBorders>
               <w:bottom w:val="single" w:sz="4" w:color="D0D5DD"/>
             </w:tcBorders>
@@ -11126,13 +11128,13 @@
                 <w:color w:val="4A5568"/>
                 <w:sz w:val="16"/>
               </w:rPr>
-              <w:t>272,517.49868000</w:t>
-            </w:r>
-          </w:p>
-        </w:tc>
-        <w:tc>
-          <w:tcPr>
-            <w:tcW w:type="dxa" w:w="1871"/>
+              <w:t>272,517.50</w:t>
+            </w:r>
+          </w:p>
+        </w:tc>
+        <w:tc>
+          <w:tcPr>
+            <w:tcW w:type="dxa" w:w="1928"/>
             <w:tcBorders>
               <w:bottom w:val="single" w:sz="4" w:color="D0D5DD"/>
             </w:tcBorders>
@@ -11152,13 +11154,13 @@
                 <w:color w:val="4A5568"/>
                 <w:sz w:val="16"/>
               </w:rPr>
-              <w:t>169,879.72865000</w:t>
-            </w:r>
-          </w:p>
-        </w:tc>
-        <w:tc>
-          <w:tcPr>
-            <w:tcW w:type="dxa" w:w="1644"/>
+              <w:t>$272,244.98</w:t>
+            </w:r>
+          </w:p>
+        </w:tc>
+        <w:tc>
+          <w:tcPr>
+            <w:tcW w:type="dxa" w:w="1587"/>
             <w:tcBorders>
               <w:bottom w:val="single" w:sz="4" w:color="D0D5DD"/>
             </w:tcBorders>
@@ -11178,13 +11180,13 @@
                 <w:color w:val="4A5568"/>
                 <w:sz w:val="16"/>
               </w:rPr>
-              <w:t>-102,637.77003000</w:t>
-            </w:r>
-          </w:p>
-        </w:tc>
-        <w:tc>
-          <w:tcPr>
-            <w:tcW w:type="dxa" w:w="2098"/>
+              <w:t>169,879.73</w:t>
+            </w:r>
+          </w:p>
+        </w:tc>
+        <w:tc>
+          <w:tcPr>
+            <w:tcW w:type="dxa" w:w="2608"/>
             <w:tcBorders>
               <w:bottom w:val="single" w:sz="4" w:color="D0D5DD"/>
             </w:tcBorders>
@@ -11212,7 +11214,7 @@
       <w:tr>
         <w:tc>
           <w:tcPr>
-            <w:tcW w:type="dxa" w:w="964"/>
+            <w:tcW w:type="dxa" w:w="907"/>
             <w:shd w:val="clear" w:color="auto" w:fill="F5F7FA"/>
             <w:tcBorders>
               <w:bottom w:val="single" w:sz="4" w:color="D0D5DD"/>
@@ -11238,7 +11240,7 @@
         </w:tc>
         <w:tc>
           <w:tcPr>
-            <w:tcW w:type="dxa" w:w="1757"/>
+            <w:tcW w:type="dxa" w:w="1587"/>
             <w:shd w:val="clear" w:color="auto" w:fill="F5F7FA"/>
             <w:tcBorders>
               <w:bottom w:val="single" w:sz="4" w:color="D0D5DD"/>
@@ -11264,7 +11266,7 @@
         </w:tc>
         <w:tc>
           <w:tcPr>
-            <w:tcW w:type="dxa" w:w="1871"/>
+            <w:tcW w:type="dxa" w:w="1587"/>
             <w:shd w:val="clear" w:color="auto" w:fill="F5F7FA"/>
             <w:tcBorders>
               <w:bottom w:val="single" w:sz="4" w:color="D0D5DD"/>
@@ -11285,13 +11287,13 @@
                 <w:color w:val="4A5568"/>
                 <w:sz w:val="16"/>
               </w:rPr>
-              <w:t>105,308.87335000</w:t>
-            </w:r>
-          </w:p>
-        </w:tc>
-        <w:tc>
-          <w:tcPr>
-            <w:tcW w:type="dxa" w:w="1871"/>
+              <w:t>105,308.87</w:t>
+            </w:r>
+          </w:p>
+        </w:tc>
+        <w:tc>
+          <w:tcPr>
+            <w:tcW w:type="dxa" w:w="1928"/>
             <w:shd w:val="clear" w:color="auto" w:fill="F5F7FA"/>
             <w:tcBorders>
               <w:bottom w:val="single" w:sz="4" w:color="D0D5DD"/>
@@ -11312,13 +11314,13 @@
                 <w:color w:val="4A5568"/>
                 <w:sz w:val="16"/>
               </w:rPr>
-              <w:t>102,389.29438000</w:t>
-            </w:r>
-          </w:p>
-        </w:tc>
-        <w:tc>
-          <w:tcPr>
-            <w:tcW w:type="dxa" w:w="1644"/>
+              <w:t>$105,203.56</w:t>
+            </w:r>
+          </w:p>
+        </w:tc>
+        <w:tc>
+          <w:tcPr>
+            <w:tcW w:type="dxa" w:w="1587"/>
             <w:shd w:val="clear" w:color="auto" w:fill="F5F7FA"/>
             <w:tcBorders>
               <w:bottom w:val="single" w:sz="4" w:color="D0D5DD"/>
@@ -11339,13 +11341,13 @@
                 <w:color w:val="4A5568"/>
                 <w:sz w:val="16"/>
               </w:rPr>
-              <w:t>-2,919.57897000</w:t>
-            </w:r>
-          </w:p>
-        </w:tc>
-        <w:tc>
-          <w:tcPr>
-            <w:tcW w:type="dxa" w:w="2098"/>
+              <w:t>102,389.29</w:t>
+            </w:r>
+          </w:p>
+        </w:tc>
+        <w:tc>
+          <w:tcPr>
+            <w:tcW w:type="dxa" w:w="2608"/>
             <w:shd w:val="clear" w:color="auto" w:fill="F5F7FA"/>
             <w:tcBorders>
               <w:bottom w:val="single" w:sz="4" w:color="D0D5DD"/>
@@ -11374,7 +11376,7 @@
       <w:tr>
         <w:tc>
           <w:tcPr>
-            <w:tcW w:type="dxa" w:w="964"/>
+            <w:tcW w:type="dxa" w:w="907"/>
             <w:tcBorders>
               <w:bottom w:val="single" w:sz="4" w:color="D0D5DD"/>
             </w:tcBorders>
@@ -11399,7 +11401,7 @@
         </w:tc>
         <w:tc>
           <w:tcPr>
-            <w:tcW w:type="dxa" w:w="1757"/>
+            <w:tcW w:type="dxa" w:w="1587"/>
             <w:tcBorders>
               <w:bottom w:val="single" w:sz="4" w:color="D0D5DD"/>
             </w:tcBorders>
@@ -11424,7 +11426,7 @@
         </w:tc>
         <w:tc>
           <w:tcPr>
-            <w:tcW w:type="dxa" w:w="1871"/>
+            <w:tcW w:type="dxa" w:w="1587"/>
             <w:tcBorders>
               <w:bottom w:val="single" w:sz="4" w:color="D0D5DD"/>
             </w:tcBorders>
@@ -11444,13 +11446,13 @@
                 <w:color w:val="4A5568"/>
                 <w:sz w:val="16"/>
               </w:rPr>
-              <w:t>149,682.95699000</w:t>
-            </w:r>
-          </w:p>
-        </w:tc>
-        <w:tc>
-          <w:tcPr>
-            <w:tcW w:type="dxa" w:w="1871"/>
+              <w:t>149,682.96</w:t>
+            </w:r>
+          </w:p>
+        </w:tc>
+        <w:tc>
+          <w:tcPr>
+            <w:tcW w:type="dxa" w:w="1928"/>
             <w:tcBorders>
               <w:bottom w:val="single" w:sz="4" w:color="D0D5DD"/>
             </w:tcBorders>
@@ -11470,13 +11472,13 @@
                 <w:color w:val="4A5568"/>
                 <w:sz w:val="16"/>
               </w:rPr>
-              <w:t>21,136.69899000</w:t>
-            </w:r>
-          </w:p>
-        </w:tc>
-        <w:tc>
-          <w:tcPr>
-            <w:tcW w:type="dxa" w:w="1644"/>
+              <w:t>$149,533.27</w:t>
+            </w:r>
+          </w:p>
+        </w:tc>
+        <w:tc>
+          <w:tcPr>
+            <w:tcW w:type="dxa" w:w="1587"/>
             <w:tcBorders>
               <w:bottom w:val="single" w:sz="4" w:color="D0D5DD"/>
             </w:tcBorders>
@@ -11496,13 +11498,13 @@
                 <w:color w:val="4A5568"/>
                 <w:sz w:val="16"/>
               </w:rPr>
-              <w:t>-128,546.25800000</w:t>
-            </w:r>
-          </w:p>
-        </w:tc>
-        <w:tc>
-          <w:tcPr>
-            <w:tcW w:type="dxa" w:w="2098"/>
+              <w:t>21,136.70</w:t>
+            </w:r>
+          </w:p>
+        </w:tc>
+        <w:tc>
+          <w:tcPr>
+            <w:tcW w:type="dxa" w:w="2608"/>
             <w:tcBorders>
               <w:bottom w:val="single" w:sz="4" w:color="D0D5DD"/>
             </w:tcBorders>
@@ -11530,7 +11532,7 @@
       <w:tr>
         <w:tc>
           <w:tcPr>
-            <w:tcW w:type="dxa" w:w="964"/>
+            <w:tcW w:type="dxa" w:w="907"/>
             <w:shd w:val="clear" w:color="auto" w:fill="F5F7FA"/>
             <w:tcBorders>
               <w:bottom w:val="single" w:sz="4" w:color="D0D5DD"/>
@@ -11556,7 +11558,7 @@
         </w:tc>
         <w:tc>
           <w:tcPr>
-            <w:tcW w:type="dxa" w:w="1757"/>
+            <w:tcW w:type="dxa" w:w="1587"/>
             <w:shd w:val="clear" w:color="auto" w:fill="F5F7FA"/>
             <w:tcBorders>
               <w:bottom w:val="single" w:sz="4" w:color="D0D5DD"/>
@@ -11582,7 +11584,7 @@
         </w:tc>
         <w:tc>
           <w:tcPr>
-            <w:tcW w:type="dxa" w:w="1871"/>
+            <w:tcW w:type="dxa" w:w="1587"/>
             <w:shd w:val="clear" w:color="auto" w:fill="F5F7FA"/>
             <w:tcBorders>
               <w:bottom w:val="single" w:sz="4" w:color="D0D5DD"/>
@@ -11603,13 +11605,13 @@
                 <w:color w:val="4A5568"/>
                 <w:sz w:val="16"/>
               </w:rPr>
-              <w:t>0.00000000</w:t>
-            </w:r>
-          </w:p>
-        </w:tc>
-        <w:tc>
-          <w:tcPr>
-            <w:tcW w:type="dxa" w:w="1871"/>
+              <w:t>0.00</w:t>
+            </w:r>
+          </w:p>
+        </w:tc>
+        <w:tc>
+          <w:tcPr>
+            <w:tcW w:type="dxa" w:w="1928"/>
             <w:shd w:val="clear" w:color="auto" w:fill="F5F7FA"/>
             <w:tcBorders>
               <w:bottom w:val="single" w:sz="4" w:color="D0D5DD"/>
@@ -11630,13 +11632,13 @@
                 <w:color w:val="4A5568"/>
                 <w:sz w:val="16"/>
               </w:rPr>
-              <w:t>870.00000000</w:t>
-            </w:r>
-          </w:p>
-        </w:tc>
-        <w:tc>
-          <w:tcPr>
-            <w:tcW w:type="dxa" w:w="1644"/>
+              <w:t>—</w:t>
+            </w:r>
+          </w:p>
+        </w:tc>
+        <w:tc>
+          <w:tcPr>
+            <w:tcW w:type="dxa" w:w="1587"/>
             <w:shd w:val="clear" w:color="auto" w:fill="F5F7FA"/>
             <w:tcBorders>
               <w:bottom w:val="single" w:sz="4" w:color="D0D5DD"/>
@@ -11657,13 +11659,13 @@
                 <w:color w:val="4A5568"/>
                 <w:sz w:val="16"/>
               </w:rPr>
-              <w:t>870.00000000</w:t>
-            </w:r>
-          </w:p>
-        </w:tc>
-        <w:tc>
-          <w:tcPr>
-            <w:tcW w:type="dxa" w:w="2098"/>
+              <w:t>870.00</w:t>
+            </w:r>
+          </w:p>
+        </w:tc>
+        <w:tc>
+          <w:tcPr>
+            <w:tcW w:type="dxa" w:w="2608"/>
             <w:shd w:val="clear" w:color="auto" w:fill="F5F7FA"/>
             <w:tcBorders>
               <w:bottom w:val="single" w:sz="4" w:color="D0D5DD"/>
@@ -11692,7 +11694,7 @@
       <w:tr>
         <w:tc>
           <w:tcPr>
-            <w:tcW w:type="dxa" w:w="964"/>
+            <w:tcW w:type="dxa" w:w="907"/>
             <w:tcBorders>
               <w:bottom w:val="single" w:sz="4" w:color="D0D5DD"/>
             </w:tcBorders>
@@ -11717,7 +11719,7 @@
         </w:tc>
         <w:tc>
           <w:tcPr>
-            <w:tcW w:type="dxa" w:w="1757"/>
+            <w:tcW w:type="dxa" w:w="1587"/>
             <w:tcBorders>
               <w:bottom w:val="single" w:sz="4" w:color="D0D5DD"/>
             </w:tcBorders>
@@ -11742,7 +11744,7 @@
         </w:tc>
         <w:tc>
           <w:tcPr>
-            <w:tcW w:type="dxa" w:w="1871"/>
+            <w:tcW w:type="dxa" w:w="1587"/>
             <w:tcBorders>
               <w:bottom w:val="single" w:sz="4" w:color="D0D5DD"/>
             </w:tcBorders>
@@ -11768,7 +11770,7 @@
         </w:tc>
         <w:tc>
           <w:tcPr>
-            <w:tcW w:type="dxa" w:w="1871"/>
+            <w:tcW w:type="dxa" w:w="1928"/>
             <w:tcBorders>
               <w:bottom w:val="single" w:sz="4" w:color="D0D5DD"/>
             </w:tcBorders>
@@ -11788,13 +11790,13 @@
                 <w:color w:val="4A5568"/>
                 <w:sz w:val="16"/>
               </w:rPr>
-              <w:t>0.00106860</w:t>
-            </w:r>
-          </w:p>
-        </w:tc>
-        <w:tc>
-          <w:tcPr>
-            <w:tcW w:type="dxa" w:w="1644"/>
+              <w:t>$77.88</w:t>
+            </w:r>
+          </w:p>
+        </w:tc>
+        <w:tc>
+          <w:tcPr>
+            <w:tcW w:type="dxa" w:w="1587"/>
             <w:tcBorders>
               <w:bottom w:val="single" w:sz="4" w:color="D0D5DD"/>
             </w:tcBorders>
@@ -11814,13 +11816,13 @@
                 <w:color w:val="4A5568"/>
                 <w:sz w:val="16"/>
               </w:rPr>
-              <w:t>-0.00003995</w:t>
-            </w:r>
-          </w:p>
-        </w:tc>
-        <w:tc>
-          <w:tcPr>
-            <w:tcW w:type="dxa" w:w="2098"/>
+              <w:t>0.0010686</w:t>
+            </w:r>
+          </w:p>
+        </w:tc>
+        <w:tc>
+          <w:tcPr>
+            <w:tcW w:type="dxa" w:w="2608"/>
             <w:tcBorders>
               <w:bottom w:val="single" w:sz="4" w:color="D0D5DD"/>
             </w:tcBorders>
@@ -11848,7 +11850,7 @@
       <w:tr>
         <w:tc>
           <w:tcPr>
-            <w:tcW w:type="dxa" w:w="964"/>
+            <w:tcW w:type="dxa" w:w="907"/>
             <w:shd w:val="clear" w:color="auto" w:fill="F5F7FA"/>
             <w:tcBorders>
               <w:bottom w:val="single" w:sz="4" w:color="D0D5DD"/>
@@ -11874,7 +11876,7 @@
         </w:tc>
         <w:tc>
           <w:tcPr>
-            <w:tcW w:type="dxa" w:w="1757"/>
+            <w:tcW w:type="dxa" w:w="1587"/>
             <w:shd w:val="clear" w:color="auto" w:fill="F5F7FA"/>
             <w:tcBorders>
               <w:bottom w:val="single" w:sz="4" w:color="D0D5DD"/>
@@ -11900,7 +11902,7 @@
         </w:tc>
         <w:tc>
           <w:tcPr>
-            <w:tcW w:type="dxa" w:w="1871"/>
+            <w:tcW w:type="dxa" w:w="1587"/>
             <w:shd w:val="clear" w:color="auto" w:fill="F5F7FA"/>
             <w:tcBorders>
               <w:bottom w:val="single" w:sz="4" w:color="D0D5DD"/>
@@ -11921,13 +11923,13 @@
                 <w:color w:val="4A5568"/>
                 <w:sz w:val="16"/>
               </w:rPr>
-              <w:t>0.08953215</w:t>
-            </w:r>
-          </w:p>
-        </w:tc>
-        <w:tc>
-          <w:tcPr>
-            <w:tcW w:type="dxa" w:w="1871"/>
+              <w:t>0.089532</w:t>
+            </w:r>
+          </w:p>
+        </w:tc>
+        <w:tc>
+          <w:tcPr>
+            <w:tcW w:type="dxa" w:w="1928"/>
             <w:shd w:val="clear" w:color="auto" w:fill="F5F7FA"/>
             <w:tcBorders>
               <w:bottom w:val="single" w:sz="4" w:color="D0D5DD"/>
@@ -11948,13 +11950,13 @@
                 <w:color w:val="4A5568"/>
                 <w:sz w:val="16"/>
               </w:rPr>
-              <w:t>0.08858655</w:t>
-            </w:r>
-          </w:p>
-        </w:tc>
-        <w:tc>
-          <w:tcPr>
-            <w:tcW w:type="dxa" w:w="1644"/>
+              <w:t>$196.97</w:t>
+            </w:r>
+          </w:p>
+        </w:tc>
+        <w:tc>
+          <w:tcPr>
+            <w:tcW w:type="dxa" w:w="1587"/>
             <w:shd w:val="clear" w:color="auto" w:fill="F5F7FA"/>
             <w:tcBorders>
               <w:bottom w:val="single" w:sz="4" w:color="D0D5DD"/>
@@ -11975,13 +11977,13 @@
                 <w:color w:val="4A5568"/>
                 <w:sz w:val="16"/>
               </w:rPr>
-              <w:t>-0.00094560</w:t>
-            </w:r>
-          </w:p>
-        </w:tc>
-        <w:tc>
-          <w:tcPr>
-            <w:tcW w:type="dxa" w:w="2098"/>
+              <w:t>0.088587</w:t>
+            </w:r>
+          </w:p>
+        </w:tc>
+        <w:tc>
+          <w:tcPr>
+            <w:tcW w:type="dxa" w:w="2608"/>
             <w:shd w:val="clear" w:color="auto" w:fill="F5F7FA"/>
             <w:tcBorders>
               <w:bottom w:val="single" w:sz="4" w:color="D0D5DD"/>
@@ -12010,7 +12012,7 @@
       <w:tr>
         <w:tc>
           <w:tcPr>
-            <w:tcW w:type="dxa" w:w="964"/>
+            <w:tcW w:type="dxa" w:w="907"/>
             <w:tcBorders>
               <w:bottom w:val="single" w:sz="4" w:color="D0D5DD"/>
             </w:tcBorders>
@@ -12035,7 +12037,7 @@
         </w:tc>
         <w:tc>
           <w:tcPr>
-            <w:tcW w:type="dxa" w:w="1757"/>
+            <w:tcW w:type="dxa" w:w="1587"/>
             <w:tcBorders>
               <w:bottom w:val="single" w:sz="4" w:color="D0D5DD"/>
             </w:tcBorders>
@@ -12060,7 +12062,7 @@
         </w:tc>
         <w:tc>
           <w:tcPr>
-            <w:tcW w:type="dxa" w:w="1871"/>
+            <w:tcW w:type="dxa" w:w="1587"/>
             <w:tcBorders>
               <w:bottom w:val="single" w:sz="4" w:color="D0D5DD"/>
             </w:tcBorders>
@@ -12080,13 +12082,13 @@
                 <w:color w:val="4A5568"/>
                 <w:sz w:val="16"/>
               </w:rPr>
-              <w:t>282.82180000</w:t>
-            </w:r>
-          </w:p>
-        </w:tc>
-        <w:tc>
-          <w:tcPr>
-            <w:tcW w:type="dxa" w:w="1871"/>
+              <w:t>282.8218</w:t>
+            </w:r>
+          </w:p>
+        </w:tc>
+        <w:tc>
+          <w:tcPr>
+            <w:tcW w:type="dxa" w:w="1928"/>
             <w:tcBorders>
               <w:bottom w:val="single" w:sz="4" w:color="D0D5DD"/>
             </w:tcBorders>
@@ -12106,13 +12108,13 @@
                 <w:color w:val="4A5568"/>
                 <w:sz w:val="16"/>
               </w:rPr>
-              <w:t>171.44890000</w:t>
-            </w:r>
-          </w:p>
-        </w:tc>
-        <w:tc>
-          <w:tcPr>
-            <w:tcW w:type="dxa" w:w="1644"/>
+              <w:t>$93.33</w:t>
+            </w:r>
+          </w:p>
+        </w:tc>
+        <w:tc>
+          <w:tcPr>
+            <w:tcW w:type="dxa" w:w="1587"/>
             <w:tcBorders>
               <w:bottom w:val="single" w:sz="4" w:color="D0D5DD"/>
             </w:tcBorders>
@@ -12132,13 +12134,13 @@
                 <w:color w:val="4A5568"/>
                 <w:sz w:val="16"/>
               </w:rPr>
-              <w:t>-111.37290000</w:t>
-            </w:r>
-          </w:p>
-        </w:tc>
-        <w:tc>
-          <w:tcPr>
-            <w:tcW w:type="dxa" w:w="2098"/>
+              <w:t>171.4489</w:t>
+            </w:r>
+          </w:p>
+        </w:tc>
+        <w:tc>
+          <w:tcPr>
+            <w:tcW w:type="dxa" w:w="2608"/>
             <w:tcBorders>
               <w:bottom w:val="single" w:sz="4" w:color="D0D5DD"/>
             </w:tcBorders>
@@ -12166,7 +12168,7 @@
       <w:tr>
         <w:tc>
           <w:tcPr>
-            <w:tcW w:type="dxa" w:w="964"/>
+            <w:tcW w:type="dxa" w:w="907"/>
             <w:shd w:val="clear" w:color="auto" w:fill="F5F7FA"/>
             <w:tcBorders>
               <w:bottom w:val="single" w:sz="4" w:color="D0D5DD"/>
@@ -12192,7 +12194,7 @@
         </w:tc>
         <w:tc>
           <w:tcPr>
-            <w:tcW w:type="dxa" w:w="1757"/>
+            <w:tcW w:type="dxa" w:w="1587"/>
             <w:shd w:val="clear" w:color="auto" w:fill="F5F7FA"/>
             <w:tcBorders>
               <w:bottom w:val="single" w:sz="4" w:color="D0D5DD"/>
@@ -12218,7 +12220,7 @@
         </w:tc>
         <w:tc>
           <w:tcPr>
-            <w:tcW w:type="dxa" w:w="1871"/>
+            <w:tcW w:type="dxa" w:w="1587"/>
             <w:shd w:val="clear" w:color="auto" w:fill="F5F7FA"/>
             <w:tcBorders>
               <w:bottom w:val="single" w:sz="4" w:color="D0D5DD"/>
@@ -12239,13 +12241,13 @@
                 <w:color w:val="4A5568"/>
                 <w:sz w:val="16"/>
               </w:rPr>
-              <w:t>0.00000000</w:t>
-            </w:r>
-          </w:p>
-        </w:tc>
-        <w:tc>
-          <w:tcPr>
-            <w:tcW w:type="dxa" w:w="1871"/>
+              <w:t>0</w:t>
+            </w:r>
+          </w:p>
+        </w:tc>
+        <w:tc>
+          <w:tcPr>
+            <w:tcW w:type="dxa" w:w="1928"/>
             <w:shd w:val="clear" w:color="auto" w:fill="F5F7FA"/>
             <w:tcBorders>
               <w:bottom w:val="single" w:sz="4" w:color="D0D5DD"/>
@@ -12266,13 +12268,13 @@
                 <w:color w:val="4A5568"/>
                 <w:sz w:val="16"/>
               </w:rPr>
-              <w:t>0.09988000</w:t>
-            </w:r>
-          </w:p>
-        </w:tc>
-        <w:tc>
-          <w:tcPr>
-            <w:tcW w:type="dxa" w:w="1644"/>
+              <w:t>—</w:t>
+            </w:r>
+          </w:p>
+        </w:tc>
+        <w:tc>
+          <w:tcPr>
+            <w:tcW w:type="dxa" w:w="1587"/>
             <w:shd w:val="clear" w:color="auto" w:fill="F5F7FA"/>
             <w:tcBorders>
               <w:bottom w:val="single" w:sz="4" w:color="D0D5DD"/>
@@ -12293,13 +12295,13 @@
                 <w:color w:val="4A5568"/>
                 <w:sz w:val="16"/>
               </w:rPr>
-              <w:t>0.09988000</w:t>
-            </w:r>
-          </w:p>
-        </w:tc>
-        <w:tc>
-          <w:tcPr>
-            <w:tcW w:type="dxa" w:w="2098"/>
+              <w:t>0.0999</w:t>
+            </w:r>
+          </w:p>
+        </w:tc>
+        <w:tc>
+          <w:tcPr>
+            <w:tcW w:type="dxa" w:w="2608"/>
             <w:shd w:val="clear" w:color="auto" w:fill="F5F7FA"/>
             <w:tcBorders>
               <w:bottom w:val="single" w:sz="4" w:color="D0D5DD"/>
@@ -12328,7 +12330,7 @@
       <w:tr>
         <w:tc>
           <w:tcPr>
-            <w:tcW w:type="dxa" w:w="964"/>
+            <w:tcW w:type="dxa" w:w="907"/>
             <w:tcBorders>
               <w:bottom w:val="single" w:sz="4" w:color="D0D5DD"/>
             </w:tcBorders>
@@ -12353,7 +12355,7 @@
         </w:tc>
         <w:tc>
           <w:tcPr>
-            <w:tcW w:type="dxa" w:w="1757"/>
+            <w:tcW w:type="dxa" w:w="1587"/>
             <w:tcBorders>
               <w:bottom w:val="single" w:sz="4" w:color="D0D5DD"/>
             </w:tcBorders>
@@ -12378,7 +12380,7 @@
         </w:tc>
         <w:tc>
           <w:tcPr>
-            <w:tcW w:type="dxa" w:w="1871"/>
+            <w:tcW w:type="dxa" w:w="1587"/>
             <w:tcBorders>
               <w:bottom w:val="single" w:sz="4" w:color="D0D5DD"/>
             </w:tcBorders>
@@ -12398,13 +12400,13 @@
                 <w:color w:val="4A5568"/>
                 <w:sz w:val="16"/>
               </w:rPr>
-              <w:t>0.00000000</w:t>
-            </w:r>
-          </w:p>
-        </w:tc>
-        <w:tc>
-          <w:tcPr>
-            <w:tcW w:type="dxa" w:w="1871"/>
+              <w:t>0</w:t>
+            </w:r>
+          </w:p>
+        </w:tc>
+        <w:tc>
+          <w:tcPr>
+            <w:tcW w:type="dxa" w:w="1928"/>
             <w:tcBorders>
               <w:bottom w:val="single" w:sz="4" w:color="D0D5DD"/>
             </w:tcBorders>
@@ -12424,13 +12426,13 @@
                 <w:color w:val="4A5568"/>
                 <w:sz w:val="16"/>
               </w:rPr>
-              <w:t>0.23420000</w:t>
-            </w:r>
-          </w:p>
-        </w:tc>
-        <w:tc>
-          <w:tcPr>
-            <w:tcW w:type="dxa" w:w="1644"/>
+              <w:t>—</w:t>
+            </w:r>
+          </w:p>
+        </w:tc>
+        <w:tc>
+          <w:tcPr>
+            <w:tcW w:type="dxa" w:w="1587"/>
             <w:tcBorders>
               <w:bottom w:val="single" w:sz="4" w:color="D0D5DD"/>
             </w:tcBorders>
@@ -12450,13 +12452,13 @@
                 <w:color w:val="4A5568"/>
                 <w:sz w:val="16"/>
               </w:rPr>
-              <w:t>0.23420000</w:t>
-            </w:r>
-          </w:p>
-        </w:tc>
-        <w:tc>
-          <w:tcPr>
-            <w:tcW w:type="dxa" w:w="2098"/>
+              <w:t>0.2342</w:t>
+            </w:r>
+          </w:p>
+        </w:tc>
+        <w:tc>
+          <w:tcPr>
+            <w:tcW w:type="dxa" w:w="2608"/>
             <w:tcBorders>
               <w:bottom w:val="single" w:sz="4" w:color="D0D5DD"/>
             </w:tcBorders>
@@ -12484,7 +12486,7 @@
       <w:tr>
         <w:tc>
           <w:tcPr>
-            <w:tcW w:type="dxa" w:w="964"/>
+            <w:tcW w:type="dxa" w:w="907"/>
             <w:shd w:val="clear" w:color="auto" w:fill="F5F7FA"/>
             <w:tcBorders>
               <w:bottom w:val="single" w:sz="4" w:color="D0D5DD"/>
@@ -12510,7 +12512,7 @@
         </w:tc>
         <w:tc>
           <w:tcPr>
-            <w:tcW w:type="dxa" w:w="1757"/>
+            <w:tcW w:type="dxa" w:w="1587"/>
             <w:shd w:val="clear" w:color="auto" w:fill="F5F7FA"/>
             <w:tcBorders>
               <w:bottom w:val="single" w:sz="4" w:color="D0D5DD"/>
@@ -12536,7 +12538,7 @@
         </w:tc>
         <w:tc>
           <w:tcPr>
-            <w:tcW w:type="dxa" w:w="1871"/>
+            <w:tcW w:type="dxa" w:w="1587"/>
             <w:shd w:val="clear" w:color="auto" w:fill="F5F7FA"/>
             <w:tcBorders>
               <w:bottom w:val="single" w:sz="4" w:color="D0D5DD"/>
@@ -12557,13 +12559,13 @@
                 <w:color w:val="4A5568"/>
                 <w:sz w:val="16"/>
               </w:rPr>
-              <w:t>0.00000000</w:t>
-            </w:r>
-          </w:p>
-        </w:tc>
-        <w:tc>
-          <w:tcPr>
-            <w:tcW w:type="dxa" w:w="1871"/>
+              <w:t>0.00</w:t>
+            </w:r>
+          </w:p>
+        </w:tc>
+        <w:tc>
+          <w:tcPr>
+            <w:tcW w:type="dxa" w:w="1928"/>
             <w:shd w:val="clear" w:color="auto" w:fill="F5F7FA"/>
             <w:tcBorders>
               <w:bottom w:val="single" w:sz="4" w:color="D0D5DD"/>
@@ -12584,13 +12586,13 @@
                 <w:color w:val="4A5568"/>
                 <w:sz w:val="16"/>
               </w:rPr>
-              <w:t>557.77069000</w:t>
-            </w:r>
-          </w:p>
-        </w:tc>
-        <w:tc>
-          <w:tcPr>
-            <w:tcW w:type="dxa" w:w="1644"/>
+              <w:t>—</w:t>
+            </w:r>
+          </w:p>
+        </w:tc>
+        <w:tc>
+          <w:tcPr>
+            <w:tcW w:type="dxa" w:w="1587"/>
             <w:shd w:val="clear" w:color="auto" w:fill="F5F7FA"/>
             <w:tcBorders>
               <w:bottom w:val="single" w:sz="4" w:color="D0D5DD"/>
@@ -12611,13 +12613,13 @@
                 <w:color w:val="4A5568"/>
                 <w:sz w:val="16"/>
               </w:rPr>
-              <w:t>557.77069000</w:t>
-            </w:r>
-          </w:p>
-        </w:tc>
-        <w:tc>
-          <w:tcPr>
-            <w:tcW w:type="dxa" w:w="2098"/>
+              <w:t>557.77</w:t>
+            </w:r>
+          </w:p>
+        </w:tc>
+        <w:tc>
+          <w:tcPr>
+            <w:tcW w:type="dxa" w:w="2608"/>
             <w:shd w:val="clear" w:color="auto" w:fill="F5F7FA"/>
             <w:tcBorders>
               <w:bottom w:val="single" w:sz="4" w:color="D0D5DD"/>
@@ -12646,7 +12648,7 @@
       <w:tr>
         <w:tc>
           <w:tcPr>
-            <w:tcW w:type="dxa" w:w="964"/>
+            <w:tcW w:type="dxa" w:w="907"/>
             <w:shd w:val="clear" w:color="auto" w:fill="E5EBF1"/>
             <w:tcBorders>
               <w:bottom w:val="single" w:sz="4" w:color="D0D5DD"/>
@@ -12672,7 +12674,7 @@
         </w:tc>
         <w:tc>
           <w:tcPr>
-            <w:tcW w:type="dxa" w:w="1757"/>
+            <w:tcW w:type="dxa" w:w="1587"/>
             <w:shd w:val="clear" w:color="auto" w:fill="E5EBF1"/>
             <w:tcBorders>
               <w:bottom w:val="single" w:sz="4" w:color="D0D5DD"/>
@@ -12697,7 +12699,7 @@
         </w:tc>
         <w:tc>
           <w:tcPr>
-            <w:tcW w:type="dxa" w:w="1871"/>
+            <w:tcW w:type="dxa" w:w="1587"/>
             <w:shd w:val="clear" w:color="auto" w:fill="E5EBF1"/>
             <w:tcBorders>
               <w:bottom w:val="single" w:sz="4" w:color="D0D5DD"/>
@@ -12723,7 +12725,7 @@
         </w:tc>
         <w:tc>
           <w:tcPr>
-            <w:tcW w:type="dxa" w:w="1871"/>
+            <w:tcW w:type="dxa" w:w="1928"/>
             <w:shd w:val="clear" w:color="auto" w:fill="E5EBF1"/>
             <w:tcBorders>
               <w:bottom w:val="single" w:sz="4" w:color="D0D5DD"/>
@@ -12744,12 +12746,13 @@
                 <w:color w:val="0A2342"/>
                 <w:sz w:val="16"/>
               </w:rPr>
-            </w:r>
-          </w:p>
-        </w:tc>
-        <w:tc>
-          <w:tcPr>
-            <w:tcW w:type="dxa" w:w="1644"/>
+              <w:t>$527,349.99</w:t>
+            </w:r>
+          </w:p>
+        </w:tc>
+        <w:tc>
+          <w:tcPr>
+            <w:tcW w:type="dxa" w:w="1587"/>
             <w:shd w:val="clear" w:color="auto" w:fill="E5EBF1"/>
             <w:tcBorders>
               <w:bottom w:val="single" w:sz="4" w:color="D0D5DD"/>
@@ -12775,7 +12778,7 @@
         </w:tc>
         <w:tc>
           <w:tcPr>
-            <w:tcW w:type="dxa" w:w="2098"/>
+            <w:tcW w:type="dxa" w:w="2608"/>
             <w:shd w:val="clear" w:color="auto" w:fill="E5EBF1"/>
             <w:tcBorders>
               <w:bottom w:val="single" w:sz="4" w:color="D0D5DD"/>

</xml_diff>

<commit_message>
Staking transactions: drop Net summary row
Co-Authored-By: Claude Opus 4.7 <noreply@anthropic.com>
</commit_message>
<xml_diff>
--- a/mockup/monthly_client_statement/sample-statements/Custody_Detailed_sample.docx
+++ b/mockup/monthly_client_statement/sample-statements/Custody_Detailed_sample.docx
@@ -18745,215 +18745,6 @@
                 <w:sz w:val="16"/>
               </w:rPr>
               <w:t>W20260428-5LP9</w:t>
-            </w:r>
-          </w:p>
-        </w:tc>
-      </w:tr>
-      <w:tr>
-        <w:tc>
-          <w:tcPr>
-            <w:tcW w:type="dxa" w:w="1417"/>
-            <w:shd w:val="clear" w:color="auto" w:fill="E5EBF1"/>
-            <w:tcBorders>
-              <w:bottom w:val="single" w:sz="4" w:color="D0D5DD"/>
-            </w:tcBorders>
-            <w:vAlign w:val="center"/>
-          </w:tcPr>
-          <w:p>
-            <w:pPr>
-              <w:spacing w:before="40" w:after="40"/>
-            </w:pPr>
-            <w:r>
-              <w:rPr>
-                <w:rFonts w:ascii="Arial" w:hAnsi="Arial"/>
-                <w:rFonts w:ascii="Arial" w:hAnsi="Arial" w:cs="Arial"/>
-                <w:b/>
-                <w:i w:val="0"/>
-                <w:color w:val="0A2342"/>
-                <w:sz w:val="16"/>
-              </w:rPr>
-              <w:t>Net (6 txns)</w:t>
-            </w:r>
-          </w:p>
-        </w:tc>
-        <w:tc>
-          <w:tcPr>
-            <w:tcW w:type="dxa" w:w="1644"/>
-            <w:shd w:val="clear" w:color="auto" w:fill="E5EBF1"/>
-            <w:tcBorders>
-              <w:bottom w:val="single" w:sz="4" w:color="D0D5DD"/>
-            </w:tcBorders>
-            <w:vAlign w:val="center"/>
-          </w:tcPr>
-          <w:p>
-            <w:pPr>
-              <w:spacing w:before="40" w:after="40"/>
-            </w:pPr>
-            <w:r>
-              <w:rPr>
-                <w:rFonts w:ascii="Arial" w:hAnsi="Arial"/>
-                <w:rFonts w:ascii="Arial" w:hAnsi="Arial" w:cs="Arial"/>
-                <w:b/>
-                <w:i w:val="0"/>
-                <w:color w:val="0A2342"/>
-                <w:sz w:val="16"/>
-              </w:rPr>
-            </w:r>
-          </w:p>
-        </w:tc>
-        <w:tc>
-          <w:tcPr>
-            <w:tcW w:type="dxa" w:w="680"/>
-            <w:shd w:val="clear" w:color="auto" w:fill="E5EBF1"/>
-            <w:tcBorders>
-              <w:bottom w:val="single" w:sz="4" w:color="D0D5DD"/>
-            </w:tcBorders>
-            <w:vAlign w:val="center"/>
-          </w:tcPr>
-          <w:p>
-            <w:pPr>
-              <w:spacing w:before="40" w:after="40"/>
-            </w:pPr>
-            <w:r>
-              <w:rPr>
-                <w:rFonts w:ascii="Arial" w:hAnsi="Arial"/>
-                <w:rFonts w:ascii="Arial" w:hAnsi="Arial" w:cs="Arial"/>
-                <w:b/>
-                <w:i w:val="0"/>
-                <w:color w:val="0A2342"/>
-                <w:sz w:val="16"/>
-              </w:rPr>
-            </w:r>
-          </w:p>
-        </w:tc>
-        <w:tc>
-          <w:tcPr>
-            <w:tcW w:type="dxa" w:w="1020"/>
-            <w:shd w:val="clear" w:color="auto" w:fill="E5EBF1"/>
-            <w:tcBorders>
-              <w:bottom w:val="single" w:sz="4" w:color="D0D5DD"/>
-            </w:tcBorders>
-            <w:vAlign w:val="center"/>
-          </w:tcPr>
-          <w:p>
-            <w:pPr>
-              <w:spacing w:before="40" w:after="40"/>
-            </w:pPr>
-            <w:r>
-              <w:rPr>
-                <w:rFonts w:ascii="Arial" w:hAnsi="Arial"/>
-                <w:rFonts w:ascii="Arial" w:hAnsi="Arial" w:cs="Arial"/>
-                <w:b/>
-                <w:i w:val="0"/>
-                <w:color w:val="0A2342"/>
-                <w:sz w:val="16"/>
-              </w:rPr>
-            </w:r>
-          </w:p>
-        </w:tc>
-        <w:tc>
-          <w:tcPr>
-            <w:tcW w:type="dxa" w:w="1247"/>
-            <w:shd w:val="clear" w:color="auto" w:fill="E5EBF1"/>
-            <w:tcBorders>
-              <w:bottom w:val="single" w:sz="4" w:color="D0D5DD"/>
-            </w:tcBorders>
-            <w:vAlign w:val="center"/>
-          </w:tcPr>
-          <w:p>
-            <w:pPr>
-              <w:spacing w:before="40" w:after="40"/>
-              <w:jc w:val="right"/>
-            </w:pPr>
-            <w:r>
-              <w:rPr>
-                <w:rFonts w:ascii="Arial" w:hAnsi="Arial"/>
-                <w:rFonts w:ascii="Arial" w:hAnsi="Arial" w:cs="Arial"/>
-                <w:b/>
-                <w:i w:val="0"/>
-                <w:color w:val="0A2342"/>
-                <w:sz w:val="16"/>
-              </w:rPr>
-              <w:t>0.8420</w:t>
-            </w:r>
-          </w:p>
-        </w:tc>
-        <w:tc>
-          <w:tcPr>
-            <w:tcW w:type="dxa" w:w="1247"/>
-            <w:shd w:val="clear" w:color="auto" w:fill="E5EBF1"/>
-            <w:tcBorders>
-              <w:bottom w:val="single" w:sz="4" w:color="D0D5DD"/>
-            </w:tcBorders>
-            <w:vAlign w:val="center"/>
-          </w:tcPr>
-          <w:p>
-            <w:pPr>
-              <w:spacing w:before="40" w:after="40"/>
-              <w:jc w:val="right"/>
-            </w:pPr>
-            <w:r>
-              <w:rPr>
-                <w:rFonts w:ascii="Arial" w:hAnsi="Arial"/>
-                <w:rFonts w:ascii="Arial" w:hAnsi="Arial" w:cs="Arial"/>
-                <w:b/>
-                <w:i w:val="0"/>
-                <w:color w:val="0A2342"/>
-                <w:sz w:val="16"/>
-              </w:rPr>
-              <w:t>$1,902.92</w:t>
-            </w:r>
-          </w:p>
-        </w:tc>
-        <w:tc>
-          <w:tcPr>
-            <w:tcW w:type="dxa" w:w="1644"/>
-            <w:shd w:val="clear" w:color="auto" w:fill="E5EBF1"/>
-            <w:tcBorders>
-              <w:bottom w:val="single" w:sz="4" w:color="D0D5DD"/>
-            </w:tcBorders>
-            <w:vAlign w:val="center"/>
-          </w:tcPr>
-          <w:p>
-            <w:pPr>
-              <w:spacing w:before="40" w:after="40"/>
-              <w:jc w:val="right"/>
-            </w:pPr>
-            <w:r>
-              <w:rPr>
-                <w:rFonts w:ascii="Arial" w:hAnsi="Arial"/>
-                <w:rFonts w:ascii="Arial" w:hAnsi="Arial" w:cs="Arial"/>
-                <w:b/>
-                <w:i w:val="0"/>
-                <w:color w:val="0A2342"/>
-                <w:sz w:val="16"/>
-              </w:rPr>
-            </w:r>
-          </w:p>
-        </w:tc>
-        <w:tc>
-          <w:tcPr>
-            <w:tcW w:type="dxa" w:w="1304"/>
-            <w:shd w:val="clear" w:color="auto" w:fill="E5EBF1"/>
-            <w:tcBorders>
-              <w:bottom w:val="single" w:sz="4" w:color="D0D5DD"/>
-            </w:tcBorders>
-            <w:vAlign w:val="center"/>
-          </w:tcPr>
-          <w:p>
-            <w:pPr>
-              <w:spacing w:before="40" w:after="40"/>
-              <w:jc w:val="right"/>
-            </w:pPr>
-            <w:r>
-              <w:rPr>
-                <w:rFonts w:ascii="Arial" w:hAnsi="Arial"/>
-                <w:rFonts w:ascii="Arial" w:hAnsi="Arial" w:cs="Arial"/>
-                <w:b/>
-                <w:i w:val="0"/>
-                <w:color w:val="0A2342"/>
-                <w:sz w:val="16"/>
-              </w:rPr>
             </w:r>
           </w:p>
         </w:tc>

</xml_diff>

<commit_message>
Pending Transactions: rename column + simplify status labels
- Column 'Pending Reason' → 'Pending Status'
- Drop the '(M of N signed)' suffix from 'Quorum approval pending'
- Drop the descriptive '(currently: Travel Rule declaration) or internal
  approval' phrase from the section intro

Co-Authored-By: Claude Opus 4.7 <noreply@anthropic.com>
</commit_message>
<xml_diff>
--- a/mockup/monthly_client_statement/sample-statements/Custody_Detailed_sample.docx
+++ b/mockup/monthly_client_statement/sample-statements/Custody_Detailed_sample.docx
@@ -19119,7 +19119,7 @@
                 <w:color w:val="FFFFFF"/>
                 <w:sz w:val="17"/>
               </w:rPr>
-              <w:t>Pending Reason</w:t>
+              <w:t>Pending Status</w:t>
             </w:r>
           </w:p>
         </w:tc>
@@ -20079,7 +20079,7 @@
                 <w:color w:val="B45309"/>
                 <w:sz w:val="15"/>
               </w:rPr>
-              <w:t>Quorum approval pending (1 of 2 signed)</w:t>
+              <w:t>Quorum approval pending</w:t>
             </w:r>
           </w:p>
         </w:tc>
@@ -20319,7 +20319,7 @@
                 <w:color w:val="B45309"/>
                 <w:sz w:val="15"/>
               </w:rPr>
-              <w:t>Quorum approval pending (1 of 2 signed)</w:t>
+              <w:t>Quorum approval pending</w:t>
             </w:r>
           </w:p>
         </w:tc>
@@ -20559,7 +20559,7 @@
                 <w:color w:val="B45309"/>
                 <w:sz w:val="15"/>
               </w:rPr>
-              <w:t>Quorum approval pending (0 of 2 signed)</w:t>
+              <w:t>Quorum approval pending</w:t>
             </w:r>
           </w:p>
         </w:tc>

</xml_diff>

<commit_message>
Custody Detailed: move Pending Transactions under each vault
Drop standalone Section E. Per-vault breakdown now contains a 'Pending
transactions' sub-block (omitting the Vault column, since it's implied
by the parent vault). The treatment note about closing-balance impact
is kept once at the bottom so it covers all per-vault pending blocks.

Co-Authored-By: Claude Opus 4.7 <noreply@anthropic.com>
</commit_message>
<xml_diff>
--- a/mockup/monthly_client_statement/sample-statements/Custody_Detailed_sample.docx
+++ b/mockup/monthly_client_statement/sample-statements/Custody_Detailed_sample.docx
@@ -9518,6 +9518,965 @@
     </w:tbl>
     <w:p>
       <w:pPr>
+        <w:spacing w:before="160" w:after="60"/>
+      </w:pPr>
+      <w:r>
+        <w:rPr>
+          <w:rFonts w:ascii="Arial" w:hAnsi="Arial"/>
+          <w:rFonts w:ascii="Arial" w:hAnsi="Arial" w:cs="Arial"/>
+          <w:b/>
+          <w:i w:val="0"/>
+          <w:color w:val="0F2A4D"/>
+          <w:sz w:val="20"/>
+        </w:rPr>
+        <w:t>Pending transactions</w:t>
+      </w:r>
+    </w:p>
+    <w:tbl>
+      <w:tblPr>
+        <w:tblW w:type="auto" w:w="0"/>
+        <w:jc w:val="left"/>
+        <w:tblLayout w:type="fixed"/>
+        <w:tblLook w:firstColumn="1" w:firstRow="1" w:lastColumn="0" w:lastRow="0" w:noHBand="0" w:noVBand="1" w:val="04A0"/>
+      </w:tblPr>
+      <w:tblGrid>
+        <w:gridCol w:w="1474"/>
+        <w:gridCol w:w="1361"/>
+        <w:gridCol w:w="680"/>
+        <w:gridCol w:w="1134"/>
+        <w:gridCol w:w="1361"/>
+        <w:gridCol w:w="1361"/>
+        <w:gridCol w:w="1247"/>
+        <w:gridCol w:w="1587"/>
+      </w:tblGrid>
+      <w:tr>
+        <w:trPr>
+          <w:trHeight w:val="420" w:hRule="atLeast"/>
+        </w:trPr>
+        <w:tc>
+          <w:tcPr>
+            <w:tcW w:type="dxa" w:w="1474"/>
+            <w:shd w:val="clear" w:color="auto" w:fill="0A2342"/>
+            <w:tcBorders>
+              <w:top w:val="nil"/>
+            </w:tcBorders>
+            <w:tcBorders>
+              <w:bottom w:val="nil"/>
+            </w:tcBorders>
+            <w:tcBorders>
+              <w:left w:val="nil"/>
+            </w:tcBorders>
+            <w:tcBorders>
+              <w:right w:val="nil"/>
+            </w:tcBorders>
+            <w:vAlign w:val="center"/>
+          </w:tcPr>
+          <w:p>
+            <w:pPr>
+              <w:spacing w:before="0" w:after="0"/>
+            </w:pPr>
+            <w:r>
+              <w:rPr>
+                <w:rFonts w:ascii="Arial" w:hAnsi="Arial"/>
+                <w:rFonts w:ascii="Arial" w:hAnsi="Arial" w:cs="Arial"/>
+                <w:b/>
+                <w:i w:val="0"/>
+                <w:color w:val="FFFFFF"/>
+                <w:sz w:val="17"/>
+              </w:rPr>
+              <w:t>Date / Time (UTC)</w:t>
+            </w:r>
+          </w:p>
+        </w:tc>
+        <w:tc>
+          <w:tcPr>
+            <w:tcW w:type="dxa" w:w="1361"/>
+            <w:shd w:val="clear" w:color="auto" w:fill="0A2342"/>
+            <w:tcBorders>
+              <w:top w:val="nil"/>
+            </w:tcBorders>
+            <w:tcBorders>
+              <w:bottom w:val="nil"/>
+            </w:tcBorders>
+            <w:tcBorders>
+              <w:left w:val="nil"/>
+            </w:tcBorders>
+            <w:tcBorders>
+              <w:right w:val="nil"/>
+            </w:tcBorders>
+            <w:vAlign w:val="center"/>
+          </w:tcPr>
+          <w:p>
+            <w:pPr>
+              <w:spacing w:before="0" w:after="0"/>
+            </w:pPr>
+            <w:r>
+              <w:rPr>
+                <w:rFonts w:ascii="Arial" w:hAnsi="Arial"/>
+                <w:rFonts w:ascii="Arial" w:hAnsi="Arial" w:cs="Arial"/>
+                <w:b/>
+                <w:i w:val="0"/>
+                <w:color w:val="FFFFFF"/>
+                <w:sz w:val="17"/>
+              </w:rPr>
+              <w:t>Type</w:t>
+            </w:r>
+          </w:p>
+        </w:tc>
+        <w:tc>
+          <w:tcPr>
+            <w:tcW w:type="dxa" w:w="680"/>
+            <w:shd w:val="clear" w:color="auto" w:fill="0A2342"/>
+            <w:tcBorders>
+              <w:top w:val="nil"/>
+            </w:tcBorders>
+            <w:tcBorders>
+              <w:bottom w:val="nil"/>
+            </w:tcBorders>
+            <w:tcBorders>
+              <w:left w:val="nil"/>
+            </w:tcBorders>
+            <w:tcBorders>
+              <w:right w:val="nil"/>
+            </w:tcBorders>
+            <w:vAlign w:val="center"/>
+          </w:tcPr>
+          <w:p>
+            <w:pPr>
+              <w:spacing w:before="0" w:after="0"/>
+            </w:pPr>
+            <w:r>
+              <w:rPr>
+                <w:rFonts w:ascii="Arial" w:hAnsi="Arial"/>
+                <w:rFonts w:ascii="Arial" w:hAnsi="Arial" w:cs="Arial"/>
+                <w:b/>
+                <w:i w:val="0"/>
+                <w:color w:val="FFFFFF"/>
+                <w:sz w:val="17"/>
+              </w:rPr>
+              <w:t>Asset</w:t>
+            </w:r>
+          </w:p>
+        </w:tc>
+        <w:tc>
+          <w:tcPr>
+            <w:tcW w:type="dxa" w:w="1134"/>
+            <w:shd w:val="clear" w:color="auto" w:fill="0A2342"/>
+            <w:tcBorders>
+              <w:top w:val="nil"/>
+            </w:tcBorders>
+            <w:tcBorders>
+              <w:bottom w:val="nil"/>
+            </w:tcBorders>
+            <w:tcBorders>
+              <w:left w:val="nil"/>
+            </w:tcBorders>
+            <w:tcBorders>
+              <w:right w:val="nil"/>
+            </w:tcBorders>
+            <w:vAlign w:val="center"/>
+          </w:tcPr>
+          <w:p>
+            <w:pPr>
+              <w:spacing w:before="0" w:after="0"/>
+            </w:pPr>
+            <w:r>
+              <w:rPr>
+                <w:rFonts w:ascii="Arial" w:hAnsi="Arial"/>
+                <w:rFonts w:ascii="Arial" w:hAnsi="Arial" w:cs="Arial"/>
+                <w:b/>
+                <w:i w:val="0"/>
+                <w:color w:val="FFFFFF"/>
+                <w:sz w:val="17"/>
+              </w:rPr>
+              <w:t>Network</w:t>
+            </w:r>
+          </w:p>
+        </w:tc>
+        <w:tc>
+          <w:tcPr>
+            <w:tcW w:type="dxa" w:w="1361"/>
+            <w:shd w:val="clear" w:color="auto" w:fill="0A2342"/>
+            <w:tcBorders>
+              <w:top w:val="nil"/>
+            </w:tcBorders>
+            <w:tcBorders>
+              <w:bottom w:val="nil"/>
+            </w:tcBorders>
+            <w:tcBorders>
+              <w:left w:val="nil"/>
+            </w:tcBorders>
+            <w:tcBorders>
+              <w:right w:val="nil"/>
+            </w:tcBorders>
+            <w:vAlign w:val="center"/>
+          </w:tcPr>
+          <w:p>
+            <w:pPr>
+              <w:spacing w:before="0" w:after="0"/>
+              <w:jc w:val="right"/>
+            </w:pPr>
+            <w:r>
+              <w:rPr>
+                <w:rFonts w:ascii="Arial" w:hAnsi="Arial"/>
+                <w:rFonts w:ascii="Arial" w:hAnsi="Arial" w:cs="Arial"/>
+                <w:b/>
+                <w:i w:val="0"/>
+                <w:color w:val="FFFFFF"/>
+                <w:sz w:val="17"/>
+              </w:rPr>
+              <w:t>Quantity</w:t>
+            </w:r>
+          </w:p>
+        </w:tc>
+        <w:tc>
+          <w:tcPr>
+            <w:tcW w:type="dxa" w:w="1361"/>
+            <w:shd w:val="clear" w:color="auto" w:fill="0A2342"/>
+            <w:tcBorders>
+              <w:top w:val="nil"/>
+            </w:tcBorders>
+            <w:tcBorders>
+              <w:bottom w:val="nil"/>
+            </w:tcBorders>
+            <w:tcBorders>
+              <w:left w:val="nil"/>
+            </w:tcBorders>
+            <w:tcBorders>
+              <w:right w:val="nil"/>
+            </w:tcBorders>
+            <w:vAlign w:val="center"/>
+          </w:tcPr>
+          <w:p>
+            <w:pPr>
+              <w:spacing w:before="0" w:after="0"/>
+              <w:jc w:val="right"/>
+            </w:pPr>
+            <w:r>
+              <w:rPr>
+                <w:rFonts w:ascii="Arial" w:hAnsi="Arial"/>
+                <w:rFonts w:ascii="Arial" w:hAnsi="Arial" w:cs="Arial"/>
+                <w:b/>
+                <w:i w:val="0"/>
+                <w:color w:val="FFFFFF"/>
+                <w:sz w:val="17"/>
+              </w:rPr>
+              <w:t>Value (USD)</w:t>
+            </w:r>
+          </w:p>
+        </w:tc>
+        <w:tc>
+          <w:tcPr>
+            <w:tcW w:type="dxa" w:w="1247"/>
+            <w:shd w:val="clear" w:color="auto" w:fill="0A2342"/>
+            <w:tcBorders>
+              <w:top w:val="nil"/>
+            </w:tcBorders>
+            <w:tcBorders>
+              <w:bottom w:val="nil"/>
+            </w:tcBorders>
+            <w:tcBorders>
+              <w:left w:val="nil"/>
+            </w:tcBorders>
+            <w:tcBorders>
+              <w:right w:val="nil"/>
+            </w:tcBorders>
+            <w:vAlign w:val="center"/>
+          </w:tcPr>
+          <w:p>
+            <w:pPr>
+              <w:spacing w:before="0" w:after="0"/>
+              <w:jc w:val="right"/>
+            </w:pPr>
+            <w:r>
+              <w:rPr>
+                <w:rFonts w:ascii="Arial" w:hAnsi="Arial"/>
+                <w:rFonts w:ascii="Arial" w:hAnsi="Arial" w:cs="Arial"/>
+                <w:b/>
+                <w:i w:val="0"/>
+                <w:color w:val="FFFFFF"/>
+                <w:sz w:val="17"/>
+              </w:rPr>
+              <w:t>Transaction ID</w:t>
+            </w:r>
+          </w:p>
+        </w:tc>
+        <w:tc>
+          <w:tcPr>
+            <w:tcW w:type="dxa" w:w="1587"/>
+            <w:shd w:val="clear" w:color="auto" w:fill="0A2342"/>
+            <w:tcBorders>
+              <w:top w:val="nil"/>
+            </w:tcBorders>
+            <w:tcBorders>
+              <w:bottom w:val="nil"/>
+            </w:tcBorders>
+            <w:tcBorders>
+              <w:left w:val="nil"/>
+            </w:tcBorders>
+            <w:tcBorders>
+              <w:right w:val="nil"/>
+            </w:tcBorders>
+            <w:vAlign w:val="center"/>
+          </w:tcPr>
+          <w:p>
+            <w:pPr>
+              <w:spacing w:before="0" w:after="0"/>
+              <w:jc w:val="right"/>
+            </w:pPr>
+            <w:r>
+              <w:rPr>
+                <w:rFonts w:ascii="Arial" w:hAnsi="Arial"/>
+                <w:rFonts w:ascii="Arial" w:hAnsi="Arial" w:cs="Arial"/>
+                <w:b/>
+                <w:i w:val="0"/>
+                <w:color w:val="FFFFFF"/>
+                <w:sz w:val="17"/>
+              </w:rPr>
+              <w:t>Pending Status</w:t>
+            </w:r>
+          </w:p>
+        </w:tc>
+      </w:tr>
+      <w:tr>
+        <w:tc>
+          <w:tcPr>
+            <w:tcW w:type="dxa" w:w="1474"/>
+            <w:shd w:val="clear" w:color="auto" w:fill="FEF3C7"/>
+            <w:tcBorders>
+              <w:bottom w:val="single" w:sz="4" w:color="D0D5DD"/>
+            </w:tcBorders>
+            <w:vAlign w:val="center"/>
+          </w:tcPr>
+          <w:p>
+            <w:pPr>
+              <w:spacing w:before="40" w:after="40"/>
+            </w:pPr>
+            <w:r>
+              <w:rPr>
+                <w:rFonts w:ascii="Arial" w:hAnsi="Arial"/>
+                <w:rFonts w:ascii="Arial" w:hAnsi="Arial" w:cs="Arial"/>
+                <w:b w:val="0"/>
+                <w:i w:val="0"/>
+                <w:color w:val="4A5568"/>
+                <w:sz w:val="15"/>
+              </w:rPr>
+              <w:t>2026-04-22 09:55 UTC</w:t>
+            </w:r>
+          </w:p>
+        </w:tc>
+        <w:tc>
+          <w:tcPr>
+            <w:tcW w:type="dxa" w:w="1361"/>
+            <w:shd w:val="clear" w:color="auto" w:fill="FEF3C7"/>
+            <w:tcBorders>
+              <w:bottom w:val="single" w:sz="4" w:color="D0D5DD"/>
+            </w:tcBorders>
+            <w:vAlign w:val="center"/>
+          </w:tcPr>
+          <w:p>
+            <w:pPr>
+              <w:spacing w:before="40" w:after="40"/>
+            </w:pPr>
+            <w:r>
+              <w:rPr>
+                <w:rFonts w:ascii="Arial" w:hAnsi="Arial"/>
+                <w:rFonts w:ascii="Arial" w:hAnsi="Arial" w:cs="Arial"/>
+                <w:b w:val="0"/>
+                <w:i w:val="0"/>
+                <w:color w:val="4A5568"/>
+                <w:sz w:val="15"/>
+              </w:rPr>
+              <w:t>Transfer-In</w:t>
+            </w:r>
+          </w:p>
+        </w:tc>
+        <w:tc>
+          <w:tcPr>
+            <w:tcW w:type="dxa" w:w="680"/>
+            <w:shd w:val="clear" w:color="auto" w:fill="FEF3C7"/>
+            <w:tcBorders>
+              <w:bottom w:val="single" w:sz="4" w:color="D0D5DD"/>
+            </w:tcBorders>
+            <w:vAlign w:val="center"/>
+          </w:tcPr>
+          <w:p>
+            <w:pPr>
+              <w:spacing w:before="40" w:after="40"/>
+            </w:pPr>
+            <w:r>
+              <w:rPr>
+                <w:rFonts w:ascii="Arial" w:hAnsi="Arial"/>
+                <w:rFonts w:ascii="Arial" w:hAnsi="Arial" w:cs="Arial"/>
+                <w:b w:val="0"/>
+                <w:i w:val="0"/>
+                <w:color w:val="4A5568"/>
+                <w:sz w:val="15"/>
+              </w:rPr>
+              <w:t>BTC</w:t>
+            </w:r>
+          </w:p>
+        </w:tc>
+        <w:tc>
+          <w:tcPr>
+            <w:tcW w:type="dxa" w:w="1134"/>
+            <w:shd w:val="clear" w:color="auto" w:fill="FEF3C7"/>
+            <w:tcBorders>
+              <w:bottom w:val="single" w:sz="4" w:color="D0D5DD"/>
+            </w:tcBorders>
+            <w:vAlign w:val="center"/>
+          </w:tcPr>
+          <w:p>
+            <w:pPr>
+              <w:spacing w:before="40" w:after="40"/>
+            </w:pPr>
+            <w:r>
+              <w:rPr>
+                <w:rFonts w:ascii="Arial" w:hAnsi="Arial"/>
+                <w:rFonts w:ascii="Arial" w:hAnsi="Arial" w:cs="Arial"/>
+                <w:b w:val="0"/>
+                <w:i w:val="0"/>
+                <w:color w:val="4A5568"/>
+                <w:sz w:val="15"/>
+              </w:rPr>
+              <w:t>Bitcoin</w:t>
+            </w:r>
+          </w:p>
+        </w:tc>
+        <w:tc>
+          <w:tcPr>
+            <w:tcW w:type="dxa" w:w="1361"/>
+            <w:shd w:val="clear" w:color="auto" w:fill="FEF3C7"/>
+            <w:tcBorders>
+              <w:bottom w:val="single" w:sz="4" w:color="D0D5DD"/>
+            </w:tcBorders>
+            <w:vAlign w:val="center"/>
+          </w:tcPr>
+          <w:p>
+            <w:pPr>
+              <w:spacing w:before="40" w:after="40"/>
+              <w:jc w:val="right"/>
+            </w:pPr>
+            <w:r>
+              <w:rPr>
+                <w:rFonts w:ascii="Arial" w:hAnsi="Arial"/>
+                <w:rFonts w:ascii="Arial" w:hAnsi="Arial" w:cs="Arial"/>
+                <w:b w:val="0"/>
+                <w:i w:val="0"/>
+                <w:color w:val="4A5568"/>
+                <w:sz w:val="15"/>
+              </w:rPr>
+              <w:t>7.6800</w:t>
+            </w:r>
+          </w:p>
+        </w:tc>
+        <w:tc>
+          <w:tcPr>
+            <w:tcW w:type="dxa" w:w="1361"/>
+            <w:shd w:val="clear" w:color="auto" w:fill="FEF3C7"/>
+            <w:tcBorders>
+              <w:bottom w:val="single" w:sz="4" w:color="D0D5DD"/>
+            </w:tcBorders>
+            <w:vAlign w:val="center"/>
+          </w:tcPr>
+          <w:p>
+            <w:pPr>
+              <w:spacing w:before="40" w:after="40"/>
+              <w:jc w:val="right"/>
+            </w:pPr>
+            <w:r>
+              <w:rPr>
+                <w:rFonts w:ascii="Arial" w:hAnsi="Arial"/>
+                <w:rFonts w:ascii="Arial" w:hAnsi="Arial" w:cs="Arial"/>
+                <w:b w:val="0"/>
+                <w:i w:val="0"/>
+                <w:color w:val="4A5568"/>
+                <w:sz w:val="15"/>
+              </w:rPr>
+              <w:t>$586,310.40</w:t>
+            </w:r>
+          </w:p>
+        </w:tc>
+        <w:tc>
+          <w:tcPr>
+            <w:tcW w:type="dxa" w:w="1247"/>
+            <w:shd w:val="clear" w:color="auto" w:fill="FEF3C7"/>
+            <w:tcBorders>
+              <w:bottom w:val="single" w:sz="4" w:color="D0D5DD"/>
+            </w:tcBorders>
+            <w:vAlign w:val="center"/>
+          </w:tcPr>
+          <w:p>
+            <w:pPr>
+              <w:spacing w:before="40" w:after="40"/>
+              <w:jc w:val="right"/>
+            </w:pPr>
+            <w:r>
+              <w:rPr>
+                <w:rFonts w:ascii="Arial" w:hAnsi="Arial"/>
+                <w:rFonts w:ascii="Arial" w:hAnsi="Arial" w:cs="Arial"/>
+                <w:b w:val="0"/>
+                <w:i w:val="0"/>
+                <w:color w:val="4A5568"/>
+                <w:sz w:val="15"/>
+              </w:rPr>
+              <w:t>W20260422-3JT5</w:t>
+            </w:r>
+          </w:p>
+        </w:tc>
+        <w:tc>
+          <w:tcPr>
+            <w:tcW w:type="dxa" w:w="1587"/>
+            <w:shd w:val="clear" w:color="auto" w:fill="FEF3C7"/>
+            <w:tcBorders>
+              <w:bottom w:val="single" w:sz="4" w:color="D0D5DD"/>
+            </w:tcBorders>
+            <w:vAlign w:val="center"/>
+          </w:tcPr>
+          <w:p>
+            <w:pPr>
+              <w:spacing w:before="40" w:after="40"/>
+              <w:jc w:val="right"/>
+            </w:pPr>
+            <w:r>
+              <w:rPr>
+                <w:rFonts w:ascii="Arial" w:hAnsi="Arial"/>
+                <w:rFonts w:ascii="Arial" w:hAnsi="Arial" w:cs="Arial"/>
+                <w:b w:val="0"/>
+                <w:i w:val="0"/>
+                <w:color w:val="B45309"/>
+                <w:sz w:val="15"/>
+              </w:rPr>
+              <w:t>Travel Rule declaration pending</w:t>
+            </w:r>
+          </w:p>
+        </w:tc>
+      </w:tr>
+      <w:tr>
+        <w:tc>
+          <w:tcPr>
+            <w:tcW w:type="dxa" w:w="1474"/>
+            <w:shd w:val="clear" w:color="auto" w:fill="FEF3C7"/>
+            <w:tcBorders>
+              <w:bottom w:val="single" w:sz="4" w:color="D0D5DD"/>
+            </w:tcBorders>
+            <w:vAlign w:val="center"/>
+          </w:tcPr>
+          <w:p>
+            <w:pPr>
+              <w:spacing w:before="40" w:after="40"/>
+            </w:pPr>
+            <w:r>
+              <w:rPr>
+                <w:rFonts w:ascii="Arial" w:hAnsi="Arial"/>
+                <w:rFonts w:ascii="Arial" w:hAnsi="Arial" w:cs="Arial"/>
+                <w:b w:val="0"/>
+                <w:i w:val="0"/>
+                <w:color w:val="4A5568"/>
+                <w:sz w:val="15"/>
+              </w:rPr>
+              <w:t>2026-04-30 18:42 UTC</w:t>
+            </w:r>
+          </w:p>
+        </w:tc>
+        <w:tc>
+          <w:tcPr>
+            <w:tcW w:type="dxa" w:w="1361"/>
+            <w:shd w:val="clear" w:color="auto" w:fill="FEF3C7"/>
+            <w:tcBorders>
+              <w:bottom w:val="single" w:sz="4" w:color="D0D5DD"/>
+            </w:tcBorders>
+            <w:vAlign w:val="center"/>
+          </w:tcPr>
+          <w:p>
+            <w:pPr>
+              <w:spacing w:before="40" w:after="40"/>
+            </w:pPr>
+            <w:r>
+              <w:rPr>
+                <w:rFonts w:ascii="Arial" w:hAnsi="Arial"/>
+                <w:rFonts w:ascii="Arial" w:hAnsi="Arial" w:cs="Arial"/>
+                <w:b w:val="0"/>
+                <w:i w:val="0"/>
+                <w:color w:val="4A5568"/>
+                <w:sz w:val="15"/>
+              </w:rPr>
+              <w:t>Transfer-Out</w:t>
+            </w:r>
+          </w:p>
+        </w:tc>
+        <w:tc>
+          <w:tcPr>
+            <w:tcW w:type="dxa" w:w="680"/>
+            <w:shd w:val="clear" w:color="auto" w:fill="FEF3C7"/>
+            <w:tcBorders>
+              <w:bottom w:val="single" w:sz="4" w:color="D0D5DD"/>
+            </w:tcBorders>
+            <w:vAlign w:val="center"/>
+          </w:tcPr>
+          <w:p>
+            <w:pPr>
+              <w:spacing w:before="40" w:after="40"/>
+            </w:pPr>
+            <w:r>
+              <w:rPr>
+                <w:rFonts w:ascii="Arial" w:hAnsi="Arial"/>
+                <w:rFonts w:ascii="Arial" w:hAnsi="Arial" w:cs="Arial"/>
+                <w:b w:val="0"/>
+                <w:i w:val="0"/>
+                <w:color w:val="4A5568"/>
+                <w:sz w:val="15"/>
+              </w:rPr>
+              <w:t>USDC</w:t>
+            </w:r>
+          </w:p>
+        </w:tc>
+        <w:tc>
+          <w:tcPr>
+            <w:tcW w:type="dxa" w:w="1134"/>
+            <w:shd w:val="clear" w:color="auto" w:fill="FEF3C7"/>
+            <w:tcBorders>
+              <w:bottom w:val="single" w:sz="4" w:color="D0D5DD"/>
+            </w:tcBorders>
+            <w:vAlign w:val="center"/>
+          </w:tcPr>
+          <w:p>
+            <w:pPr>
+              <w:spacing w:before="40" w:after="40"/>
+            </w:pPr>
+            <w:r>
+              <w:rPr>
+                <w:rFonts w:ascii="Arial" w:hAnsi="Arial"/>
+                <w:rFonts w:ascii="Arial" w:hAnsi="Arial" w:cs="Arial"/>
+                <w:b w:val="0"/>
+                <w:i w:val="0"/>
+                <w:color w:val="4A5568"/>
+                <w:sz w:val="15"/>
+              </w:rPr>
+              <w:t>Ethereum</w:t>
+            </w:r>
+          </w:p>
+        </w:tc>
+        <w:tc>
+          <w:tcPr>
+            <w:tcW w:type="dxa" w:w="1361"/>
+            <w:shd w:val="clear" w:color="auto" w:fill="FEF3C7"/>
+            <w:tcBorders>
+              <w:bottom w:val="single" w:sz="4" w:color="D0D5DD"/>
+            </w:tcBorders>
+            <w:vAlign w:val="center"/>
+          </w:tcPr>
+          <w:p>
+            <w:pPr>
+              <w:spacing w:before="40" w:after="40"/>
+              <w:jc w:val="right"/>
+            </w:pPr>
+            <w:r>
+              <w:rPr>
+                <w:rFonts w:ascii="Arial" w:hAnsi="Arial"/>
+                <w:rFonts w:ascii="Arial" w:hAnsi="Arial" w:cs="Arial"/>
+                <w:b w:val="0"/>
+                <w:i w:val="0"/>
+                <w:color w:val="4A5568"/>
+                <w:sz w:val="15"/>
+              </w:rPr>
+              <w:t>-250,000.0000</w:t>
+            </w:r>
+          </w:p>
+        </w:tc>
+        <w:tc>
+          <w:tcPr>
+            <w:tcW w:type="dxa" w:w="1361"/>
+            <w:shd w:val="clear" w:color="auto" w:fill="FEF3C7"/>
+            <w:tcBorders>
+              <w:bottom w:val="single" w:sz="4" w:color="D0D5DD"/>
+            </w:tcBorders>
+            <w:vAlign w:val="center"/>
+          </w:tcPr>
+          <w:p>
+            <w:pPr>
+              <w:spacing w:before="40" w:after="40"/>
+              <w:jc w:val="right"/>
+            </w:pPr>
+            <w:r>
+              <w:rPr>
+                <w:rFonts w:ascii="Arial" w:hAnsi="Arial"/>
+                <w:rFonts w:ascii="Arial" w:hAnsi="Arial" w:cs="Arial"/>
+                <w:b w:val="0"/>
+                <w:i w:val="0"/>
+                <w:color w:val="4A5568"/>
+                <w:sz w:val="15"/>
+              </w:rPr>
+              <w:t>-$249,750.00</w:t>
+            </w:r>
+          </w:p>
+        </w:tc>
+        <w:tc>
+          <w:tcPr>
+            <w:tcW w:type="dxa" w:w="1247"/>
+            <w:shd w:val="clear" w:color="auto" w:fill="FEF3C7"/>
+            <w:tcBorders>
+              <w:bottom w:val="single" w:sz="4" w:color="D0D5DD"/>
+            </w:tcBorders>
+            <w:vAlign w:val="center"/>
+          </w:tcPr>
+          <w:p>
+            <w:pPr>
+              <w:spacing w:before="40" w:after="40"/>
+              <w:jc w:val="right"/>
+            </w:pPr>
+            <w:r>
+              <w:rPr>
+                <w:rFonts w:ascii="Arial" w:hAnsi="Arial"/>
+                <w:rFonts w:ascii="Arial" w:hAnsi="Arial" w:cs="Arial"/>
+                <w:b w:val="0"/>
+                <w:i w:val="0"/>
+                <w:color w:val="4A5568"/>
+                <w:sz w:val="15"/>
+              </w:rPr>
+              <w:t>W20260430-MK87</w:t>
+            </w:r>
+          </w:p>
+        </w:tc>
+        <w:tc>
+          <w:tcPr>
+            <w:tcW w:type="dxa" w:w="1587"/>
+            <w:shd w:val="clear" w:color="auto" w:fill="FEF3C7"/>
+            <w:tcBorders>
+              <w:bottom w:val="single" w:sz="4" w:color="D0D5DD"/>
+            </w:tcBorders>
+            <w:vAlign w:val="center"/>
+          </w:tcPr>
+          <w:p>
+            <w:pPr>
+              <w:spacing w:before="40" w:after="40"/>
+              <w:jc w:val="right"/>
+            </w:pPr>
+            <w:r>
+              <w:rPr>
+                <w:rFonts w:ascii="Arial" w:hAnsi="Arial"/>
+                <w:rFonts w:ascii="Arial" w:hAnsi="Arial" w:cs="Arial"/>
+                <w:b w:val="0"/>
+                <w:i w:val="0"/>
+                <w:color w:val="B45309"/>
+                <w:sz w:val="15"/>
+              </w:rPr>
+              <w:t>Quorum approval pending</w:t>
+            </w:r>
+          </w:p>
+        </w:tc>
+      </w:tr>
+      <w:tr>
+        <w:tc>
+          <w:tcPr>
+            <w:tcW w:type="dxa" w:w="1474"/>
+            <w:shd w:val="clear" w:color="auto" w:fill="E5EBF1"/>
+            <w:tcBorders>
+              <w:bottom w:val="single" w:sz="4" w:color="D0D5DD"/>
+            </w:tcBorders>
+            <w:vAlign w:val="center"/>
+          </w:tcPr>
+          <w:p>
+            <w:pPr>
+              <w:spacing w:before="40" w:after="40"/>
+            </w:pPr>
+            <w:r>
+              <w:rPr>
+                <w:rFonts w:ascii="Arial" w:hAnsi="Arial"/>
+                <w:rFonts w:ascii="Arial" w:hAnsi="Arial" w:cs="Arial"/>
+                <w:b/>
+                <w:i w:val="0"/>
+                <w:color w:val="0A2342"/>
+                <w:sz w:val="15"/>
+              </w:rPr>
+              <w:t>Total (2 pending)</w:t>
+            </w:r>
+          </w:p>
+        </w:tc>
+        <w:tc>
+          <w:tcPr>
+            <w:tcW w:type="dxa" w:w="1361"/>
+            <w:shd w:val="clear" w:color="auto" w:fill="E5EBF1"/>
+            <w:tcBorders>
+              <w:bottom w:val="single" w:sz="4" w:color="D0D5DD"/>
+            </w:tcBorders>
+            <w:vAlign w:val="center"/>
+          </w:tcPr>
+          <w:p>
+            <w:pPr>
+              <w:spacing w:before="40" w:after="40"/>
+            </w:pPr>
+            <w:r>
+              <w:rPr>
+                <w:rFonts w:ascii="Arial" w:hAnsi="Arial"/>
+                <w:rFonts w:ascii="Arial" w:hAnsi="Arial" w:cs="Arial"/>
+                <w:b/>
+                <w:i w:val="0"/>
+                <w:color w:val="0A2342"/>
+                <w:sz w:val="15"/>
+              </w:rPr>
+            </w:r>
+          </w:p>
+        </w:tc>
+        <w:tc>
+          <w:tcPr>
+            <w:tcW w:type="dxa" w:w="680"/>
+            <w:shd w:val="clear" w:color="auto" w:fill="E5EBF1"/>
+            <w:tcBorders>
+              <w:bottom w:val="single" w:sz="4" w:color="D0D5DD"/>
+            </w:tcBorders>
+            <w:vAlign w:val="center"/>
+          </w:tcPr>
+          <w:p>
+            <w:pPr>
+              <w:spacing w:before="40" w:after="40"/>
+            </w:pPr>
+            <w:r>
+              <w:rPr>
+                <w:rFonts w:ascii="Arial" w:hAnsi="Arial"/>
+                <w:rFonts w:ascii="Arial" w:hAnsi="Arial" w:cs="Arial"/>
+                <w:b/>
+                <w:i w:val="0"/>
+                <w:color w:val="0A2342"/>
+                <w:sz w:val="15"/>
+              </w:rPr>
+            </w:r>
+          </w:p>
+        </w:tc>
+        <w:tc>
+          <w:tcPr>
+            <w:tcW w:type="dxa" w:w="1134"/>
+            <w:shd w:val="clear" w:color="auto" w:fill="E5EBF1"/>
+            <w:tcBorders>
+              <w:bottom w:val="single" w:sz="4" w:color="D0D5DD"/>
+            </w:tcBorders>
+            <w:vAlign w:val="center"/>
+          </w:tcPr>
+          <w:p>
+            <w:pPr>
+              <w:spacing w:before="40" w:after="40"/>
+            </w:pPr>
+            <w:r>
+              <w:rPr>
+                <w:rFonts w:ascii="Arial" w:hAnsi="Arial"/>
+                <w:rFonts w:ascii="Arial" w:hAnsi="Arial" w:cs="Arial"/>
+                <w:b/>
+                <w:i w:val="0"/>
+                <w:color w:val="0A2342"/>
+                <w:sz w:val="15"/>
+              </w:rPr>
+            </w:r>
+          </w:p>
+        </w:tc>
+        <w:tc>
+          <w:tcPr>
+            <w:tcW w:type="dxa" w:w="1361"/>
+            <w:shd w:val="clear" w:color="auto" w:fill="E5EBF1"/>
+            <w:tcBorders>
+              <w:bottom w:val="single" w:sz="4" w:color="D0D5DD"/>
+            </w:tcBorders>
+            <w:vAlign w:val="center"/>
+          </w:tcPr>
+          <w:p>
+            <w:pPr>
+              <w:spacing w:before="40" w:after="40"/>
+              <w:jc w:val="right"/>
+            </w:pPr>
+            <w:r>
+              <w:rPr>
+                <w:rFonts w:ascii="Arial" w:hAnsi="Arial"/>
+                <w:rFonts w:ascii="Arial" w:hAnsi="Arial" w:cs="Arial"/>
+                <w:b/>
+                <w:i w:val="0"/>
+                <w:color w:val="0A2342"/>
+                <w:sz w:val="15"/>
+              </w:rPr>
+            </w:r>
+          </w:p>
+        </w:tc>
+        <w:tc>
+          <w:tcPr>
+            <w:tcW w:type="dxa" w:w="1361"/>
+            <w:shd w:val="clear" w:color="auto" w:fill="E5EBF1"/>
+            <w:tcBorders>
+              <w:bottom w:val="single" w:sz="4" w:color="D0D5DD"/>
+            </w:tcBorders>
+            <w:vAlign w:val="center"/>
+          </w:tcPr>
+          <w:p>
+            <w:pPr>
+              <w:spacing w:before="40" w:after="40"/>
+              <w:jc w:val="right"/>
+            </w:pPr>
+            <w:r>
+              <w:rPr>
+                <w:rFonts w:ascii="Arial" w:hAnsi="Arial"/>
+                <w:rFonts w:ascii="Arial" w:hAnsi="Arial" w:cs="Arial"/>
+                <w:b/>
+                <w:i w:val="0"/>
+                <w:color w:val="0A2342"/>
+                <w:sz w:val="15"/>
+              </w:rPr>
+              <w:t>$836,060.40</w:t>
+            </w:r>
+          </w:p>
+        </w:tc>
+        <w:tc>
+          <w:tcPr>
+            <w:tcW w:type="dxa" w:w="1247"/>
+            <w:shd w:val="clear" w:color="auto" w:fill="E5EBF1"/>
+            <w:tcBorders>
+              <w:bottom w:val="single" w:sz="4" w:color="D0D5DD"/>
+            </w:tcBorders>
+            <w:vAlign w:val="center"/>
+          </w:tcPr>
+          <w:p>
+            <w:pPr>
+              <w:spacing w:before="40" w:after="40"/>
+              <w:jc w:val="right"/>
+            </w:pPr>
+            <w:r>
+              <w:rPr>
+                <w:rFonts w:ascii="Arial" w:hAnsi="Arial"/>
+                <w:rFonts w:ascii="Arial" w:hAnsi="Arial" w:cs="Arial"/>
+                <w:b/>
+                <w:i w:val="0"/>
+                <w:color w:val="0A2342"/>
+                <w:sz w:val="15"/>
+              </w:rPr>
+            </w:r>
+          </w:p>
+        </w:tc>
+        <w:tc>
+          <w:tcPr>
+            <w:tcW w:type="dxa" w:w="1587"/>
+            <w:shd w:val="clear" w:color="auto" w:fill="E5EBF1"/>
+            <w:tcBorders>
+              <w:bottom w:val="single" w:sz="4" w:color="D0D5DD"/>
+            </w:tcBorders>
+            <w:vAlign w:val="center"/>
+          </w:tcPr>
+          <w:p>
+            <w:pPr>
+              <w:spacing w:before="40" w:after="40"/>
+              <w:jc w:val="right"/>
+            </w:pPr>
+            <w:r>
+              <w:rPr>
+                <w:rFonts w:ascii="Arial" w:hAnsi="Arial"/>
+                <w:rFonts w:ascii="Arial" w:hAnsi="Arial" w:cs="Arial"/>
+                <w:b/>
+                <w:i w:val="0"/>
+                <w:color w:val="0A2342"/>
+                <w:sz w:val="15"/>
+              </w:rPr>
+            </w:r>
+          </w:p>
+        </w:tc>
+      </w:tr>
+    </w:tbl>
+    <w:p>
+      <w:pPr>
         <w:spacing w:before="240" w:after="80"/>
       </w:pPr>
       <w:r>
@@ -18752,7 +19711,7 @@
     </w:tbl>
     <w:p>
       <w:pPr>
-        <w:spacing w:before="360" w:after="120"/>
+        <w:spacing w:before="160" w:after="60"/>
       </w:pPr>
       <w:r>
         <w:rPr>
@@ -18760,26 +19719,10 @@
           <w:rFonts w:ascii="Arial" w:hAnsi="Arial" w:cs="Arial"/>
           <w:b/>
           <w:i w:val="0"/>
-          <w:color w:val="0A2342"/>
-          <w:sz w:val="28"/>
+          <w:color w:val="0F2A4D"/>
+          <w:sz w:val="20"/>
         </w:rPr>
-        <w:t>E. Pending Transactions</w:t>
-      </w:r>
-    </w:p>
-    <w:p>
-      <w:pPr>
-        <w:spacing w:before="0" w:after="120"/>
-      </w:pPr>
-      <w:r>
-        <w:rPr>
-          <w:rFonts w:ascii="Arial" w:hAnsi="Arial"/>
-          <w:rFonts w:ascii="Arial" w:hAnsi="Arial" w:cs="Arial"/>
-          <w:b w:val="0"/>
-          <w:i w:val="0"/>
-          <w:color w:val="4A5568"/>
-          <w:sz w:val="18"/>
-        </w:rPr>
-        <w:t>Custody transactions awaiting client action (currently: Travel Rule declaration) or internal approval. Status shown is a snapshot at period end (2026-04-30 23:59:59 UTC) — items may have since been resolved.</w:t>
+        <w:t>Pending transactions</w:t>
       </w:r>
     </w:p>
     <w:tbl>
@@ -18790,15 +19733,14 @@
         <w:tblLook w:firstColumn="1" w:firstRow="1" w:lastColumn="0" w:lastRow="0" w:noHBand="0" w:noVBand="1" w:val="04A0"/>
       </w:tblPr>
       <w:tblGrid>
+        <w:gridCol w:w="1474"/>
+        <w:gridCol w:w="1361"/>
+        <w:gridCol w:w="680"/>
+        <w:gridCol w:w="1134"/>
+        <w:gridCol w:w="1361"/>
+        <w:gridCol w:w="1361"/>
         <w:gridCol w:w="1247"/>
-        <w:gridCol w:w="1417"/>
-        <w:gridCol w:w="1134"/>
-        <w:gridCol w:w="567"/>
-        <w:gridCol w:w="907"/>
-        <w:gridCol w:w="1134"/>
-        <w:gridCol w:w="1247"/>
-        <w:gridCol w:w="1020"/>
-        <w:gridCol w:w="1531"/>
+        <w:gridCol w:w="1587"/>
       </w:tblGrid>
       <w:tr>
         <w:trPr>
@@ -18806,6 +19748,218 @@
         </w:trPr>
         <w:tc>
           <w:tcPr>
+            <w:tcW w:type="dxa" w:w="1474"/>
+            <w:shd w:val="clear" w:color="auto" w:fill="0A2342"/>
+            <w:tcBorders>
+              <w:top w:val="nil"/>
+            </w:tcBorders>
+            <w:tcBorders>
+              <w:bottom w:val="nil"/>
+            </w:tcBorders>
+            <w:tcBorders>
+              <w:left w:val="nil"/>
+            </w:tcBorders>
+            <w:tcBorders>
+              <w:right w:val="nil"/>
+            </w:tcBorders>
+            <w:vAlign w:val="center"/>
+          </w:tcPr>
+          <w:p>
+            <w:pPr>
+              <w:spacing w:before="0" w:after="0"/>
+            </w:pPr>
+            <w:r>
+              <w:rPr>
+                <w:rFonts w:ascii="Arial" w:hAnsi="Arial"/>
+                <w:rFonts w:ascii="Arial" w:hAnsi="Arial" w:cs="Arial"/>
+                <w:b/>
+                <w:i w:val="0"/>
+                <w:color w:val="FFFFFF"/>
+                <w:sz w:val="17"/>
+              </w:rPr>
+              <w:t>Date / Time (UTC)</w:t>
+            </w:r>
+          </w:p>
+        </w:tc>
+        <w:tc>
+          <w:tcPr>
+            <w:tcW w:type="dxa" w:w="1361"/>
+            <w:shd w:val="clear" w:color="auto" w:fill="0A2342"/>
+            <w:tcBorders>
+              <w:top w:val="nil"/>
+            </w:tcBorders>
+            <w:tcBorders>
+              <w:bottom w:val="nil"/>
+            </w:tcBorders>
+            <w:tcBorders>
+              <w:left w:val="nil"/>
+            </w:tcBorders>
+            <w:tcBorders>
+              <w:right w:val="nil"/>
+            </w:tcBorders>
+            <w:vAlign w:val="center"/>
+          </w:tcPr>
+          <w:p>
+            <w:pPr>
+              <w:spacing w:before="0" w:after="0"/>
+            </w:pPr>
+            <w:r>
+              <w:rPr>
+                <w:rFonts w:ascii="Arial" w:hAnsi="Arial"/>
+                <w:rFonts w:ascii="Arial" w:hAnsi="Arial" w:cs="Arial"/>
+                <w:b/>
+                <w:i w:val="0"/>
+                <w:color w:val="FFFFFF"/>
+                <w:sz w:val="17"/>
+              </w:rPr>
+              <w:t>Type</w:t>
+            </w:r>
+          </w:p>
+        </w:tc>
+        <w:tc>
+          <w:tcPr>
+            <w:tcW w:type="dxa" w:w="680"/>
+            <w:shd w:val="clear" w:color="auto" w:fill="0A2342"/>
+            <w:tcBorders>
+              <w:top w:val="nil"/>
+            </w:tcBorders>
+            <w:tcBorders>
+              <w:bottom w:val="nil"/>
+            </w:tcBorders>
+            <w:tcBorders>
+              <w:left w:val="nil"/>
+            </w:tcBorders>
+            <w:tcBorders>
+              <w:right w:val="nil"/>
+            </w:tcBorders>
+            <w:vAlign w:val="center"/>
+          </w:tcPr>
+          <w:p>
+            <w:pPr>
+              <w:spacing w:before="0" w:after="0"/>
+            </w:pPr>
+            <w:r>
+              <w:rPr>
+                <w:rFonts w:ascii="Arial" w:hAnsi="Arial"/>
+                <w:rFonts w:ascii="Arial" w:hAnsi="Arial" w:cs="Arial"/>
+                <w:b/>
+                <w:i w:val="0"/>
+                <w:color w:val="FFFFFF"/>
+                <w:sz w:val="17"/>
+              </w:rPr>
+              <w:t>Asset</w:t>
+            </w:r>
+          </w:p>
+        </w:tc>
+        <w:tc>
+          <w:tcPr>
+            <w:tcW w:type="dxa" w:w="1134"/>
+            <w:shd w:val="clear" w:color="auto" w:fill="0A2342"/>
+            <w:tcBorders>
+              <w:top w:val="nil"/>
+            </w:tcBorders>
+            <w:tcBorders>
+              <w:bottom w:val="nil"/>
+            </w:tcBorders>
+            <w:tcBorders>
+              <w:left w:val="nil"/>
+            </w:tcBorders>
+            <w:tcBorders>
+              <w:right w:val="nil"/>
+            </w:tcBorders>
+            <w:vAlign w:val="center"/>
+          </w:tcPr>
+          <w:p>
+            <w:pPr>
+              <w:spacing w:before="0" w:after="0"/>
+            </w:pPr>
+            <w:r>
+              <w:rPr>
+                <w:rFonts w:ascii="Arial" w:hAnsi="Arial"/>
+                <w:rFonts w:ascii="Arial" w:hAnsi="Arial" w:cs="Arial"/>
+                <w:b/>
+                <w:i w:val="0"/>
+                <w:color w:val="FFFFFF"/>
+                <w:sz w:val="17"/>
+              </w:rPr>
+              <w:t>Network</w:t>
+            </w:r>
+          </w:p>
+        </w:tc>
+        <w:tc>
+          <w:tcPr>
+            <w:tcW w:type="dxa" w:w="1361"/>
+            <w:shd w:val="clear" w:color="auto" w:fill="0A2342"/>
+            <w:tcBorders>
+              <w:top w:val="nil"/>
+            </w:tcBorders>
+            <w:tcBorders>
+              <w:bottom w:val="nil"/>
+            </w:tcBorders>
+            <w:tcBorders>
+              <w:left w:val="nil"/>
+            </w:tcBorders>
+            <w:tcBorders>
+              <w:right w:val="nil"/>
+            </w:tcBorders>
+            <w:vAlign w:val="center"/>
+          </w:tcPr>
+          <w:p>
+            <w:pPr>
+              <w:spacing w:before="0" w:after="0"/>
+              <w:jc w:val="right"/>
+            </w:pPr>
+            <w:r>
+              <w:rPr>
+                <w:rFonts w:ascii="Arial" w:hAnsi="Arial"/>
+                <w:rFonts w:ascii="Arial" w:hAnsi="Arial" w:cs="Arial"/>
+                <w:b/>
+                <w:i w:val="0"/>
+                <w:color w:val="FFFFFF"/>
+                <w:sz w:val="17"/>
+              </w:rPr>
+              <w:t>Quantity</w:t>
+            </w:r>
+          </w:p>
+        </w:tc>
+        <w:tc>
+          <w:tcPr>
+            <w:tcW w:type="dxa" w:w="1361"/>
+            <w:shd w:val="clear" w:color="auto" w:fill="0A2342"/>
+            <w:tcBorders>
+              <w:top w:val="nil"/>
+            </w:tcBorders>
+            <w:tcBorders>
+              <w:bottom w:val="nil"/>
+            </w:tcBorders>
+            <w:tcBorders>
+              <w:left w:val="nil"/>
+            </w:tcBorders>
+            <w:tcBorders>
+              <w:right w:val="nil"/>
+            </w:tcBorders>
+            <w:vAlign w:val="center"/>
+          </w:tcPr>
+          <w:p>
+            <w:pPr>
+              <w:spacing w:before="0" w:after="0"/>
+              <w:jc w:val="right"/>
+            </w:pPr>
+            <w:r>
+              <w:rPr>
+                <w:rFonts w:ascii="Arial" w:hAnsi="Arial"/>
+                <w:rFonts w:ascii="Arial" w:hAnsi="Arial" w:cs="Arial"/>
+                <w:b/>
+                <w:i w:val="0"/>
+                <w:color w:val="FFFFFF"/>
+                <w:sz w:val="17"/>
+              </w:rPr>
+              <w:t>Value (USD)</w:t>
+            </w:r>
+          </w:p>
+        </w:tc>
+        <w:tc>
+          <w:tcPr>
             <w:tcW w:type="dxa" w:w="1247"/>
             <w:shd w:val="clear" w:color="auto" w:fill="0A2342"/>
             <w:tcBorders>
@@ -18825,6 +19979,7 @@
           <w:p>
             <w:pPr>
               <w:spacing w:before="0" w:after="0"/>
+              <w:jc w:val="right"/>
             </w:pPr>
             <w:r>
               <w:rPr>
@@ -18835,13 +19990,13 @@
                 <w:color w:val="FFFFFF"/>
                 <w:sz w:val="17"/>
               </w:rPr>
-              <w:t>Date / Time (UTC)</w:t>
-            </w:r>
-          </w:p>
-        </w:tc>
-        <w:tc>
-          <w:tcPr>
-            <w:tcW w:type="dxa" w:w="1417"/>
+              <w:t>Transaction ID</w:t>
+            </w:r>
+          </w:p>
+        </w:tc>
+        <w:tc>
+          <w:tcPr>
+            <w:tcW w:type="dxa" w:w="1587"/>
             <w:shd w:val="clear" w:color="auto" w:fill="0A2342"/>
             <w:tcBorders>
               <w:top w:val="nil"/>
@@ -18860,6 +20015,7 @@
           <w:p>
             <w:pPr>
               <w:spacing w:before="0" w:after="0"/>
+              <w:jc w:val="right"/>
             </w:pPr>
             <w:r>
               <w:rPr>
@@ -18870,255 +20026,6 @@
                 <w:color w:val="FFFFFF"/>
                 <w:sz w:val="17"/>
               </w:rPr>
-              <w:t>Vault</w:t>
-            </w:r>
-          </w:p>
-        </w:tc>
-        <w:tc>
-          <w:tcPr>
-            <w:tcW w:type="dxa" w:w="1134"/>
-            <w:shd w:val="clear" w:color="auto" w:fill="0A2342"/>
-            <w:tcBorders>
-              <w:top w:val="nil"/>
-            </w:tcBorders>
-            <w:tcBorders>
-              <w:bottom w:val="nil"/>
-            </w:tcBorders>
-            <w:tcBorders>
-              <w:left w:val="nil"/>
-            </w:tcBorders>
-            <w:tcBorders>
-              <w:right w:val="nil"/>
-            </w:tcBorders>
-            <w:vAlign w:val="center"/>
-          </w:tcPr>
-          <w:p>
-            <w:pPr>
-              <w:spacing w:before="0" w:after="0"/>
-            </w:pPr>
-            <w:r>
-              <w:rPr>
-                <w:rFonts w:ascii="Arial" w:hAnsi="Arial"/>
-                <w:rFonts w:ascii="Arial" w:hAnsi="Arial" w:cs="Arial"/>
-                <w:b/>
-                <w:i w:val="0"/>
-                <w:color w:val="FFFFFF"/>
-                <w:sz w:val="17"/>
-              </w:rPr>
-              <w:t>Type</w:t>
-            </w:r>
-          </w:p>
-        </w:tc>
-        <w:tc>
-          <w:tcPr>
-            <w:tcW w:type="dxa" w:w="567"/>
-            <w:shd w:val="clear" w:color="auto" w:fill="0A2342"/>
-            <w:tcBorders>
-              <w:top w:val="nil"/>
-            </w:tcBorders>
-            <w:tcBorders>
-              <w:bottom w:val="nil"/>
-            </w:tcBorders>
-            <w:tcBorders>
-              <w:left w:val="nil"/>
-            </w:tcBorders>
-            <w:tcBorders>
-              <w:right w:val="nil"/>
-            </w:tcBorders>
-            <w:vAlign w:val="center"/>
-          </w:tcPr>
-          <w:p>
-            <w:pPr>
-              <w:spacing w:before="0" w:after="0"/>
-            </w:pPr>
-            <w:r>
-              <w:rPr>
-                <w:rFonts w:ascii="Arial" w:hAnsi="Arial"/>
-                <w:rFonts w:ascii="Arial" w:hAnsi="Arial" w:cs="Arial"/>
-                <w:b/>
-                <w:i w:val="0"/>
-                <w:color w:val="FFFFFF"/>
-                <w:sz w:val="17"/>
-              </w:rPr>
-              <w:t>Asset</w:t>
-            </w:r>
-          </w:p>
-        </w:tc>
-        <w:tc>
-          <w:tcPr>
-            <w:tcW w:type="dxa" w:w="907"/>
-            <w:shd w:val="clear" w:color="auto" w:fill="0A2342"/>
-            <w:tcBorders>
-              <w:top w:val="nil"/>
-            </w:tcBorders>
-            <w:tcBorders>
-              <w:bottom w:val="nil"/>
-            </w:tcBorders>
-            <w:tcBorders>
-              <w:left w:val="nil"/>
-            </w:tcBorders>
-            <w:tcBorders>
-              <w:right w:val="nil"/>
-            </w:tcBorders>
-            <w:vAlign w:val="center"/>
-          </w:tcPr>
-          <w:p>
-            <w:pPr>
-              <w:spacing w:before="0" w:after="0"/>
-            </w:pPr>
-            <w:r>
-              <w:rPr>
-                <w:rFonts w:ascii="Arial" w:hAnsi="Arial"/>
-                <w:rFonts w:ascii="Arial" w:hAnsi="Arial" w:cs="Arial"/>
-                <w:b/>
-                <w:i w:val="0"/>
-                <w:color w:val="FFFFFF"/>
-                <w:sz w:val="17"/>
-              </w:rPr>
-              <w:t>Network</w:t>
-            </w:r>
-          </w:p>
-        </w:tc>
-        <w:tc>
-          <w:tcPr>
-            <w:tcW w:type="dxa" w:w="1134"/>
-            <w:shd w:val="clear" w:color="auto" w:fill="0A2342"/>
-            <w:tcBorders>
-              <w:top w:val="nil"/>
-            </w:tcBorders>
-            <w:tcBorders>
-              <w:bottom w:val="nil"/>
-            </w:tcBorders>
-            <w:tcBorders>
-              <w:left w:val="nil"/>
-            </w:tcBorders>
-            <w:tcBorders>
-              <w:right w:val="nil"/>
-            </w:tcBorders>
-            <w:vAlign w:val="center"/>
-          </w:tcPr>
-          <w:p>
-            <w:pPr>
-              <w:spacing w:before="0" w:after="0"/>
-              <w:jc w:val="right"/>
-            </w:pPr>
-            <w:r>
-              <w:rPr>
-                <w:rFonts w:ascii="Arial" w:hAnsi="Arial"/>
-                <w:rFonts w:ascii="Arial" w:hAnsi="Arial" w:cs="Arial"/>
-                <w:b/>
-                <w:i w:val="0"/>
-                <w:color w:val="FFFFFF"/>
-                <w:sz w:val="17"/>
-              </w:rPr>
-              <w:t>Quantity</w:t>
-            </w:r>
-          </w:p>
-        </w:tc>
-        <w:tc>
-          <w:tcPr>
-            <w:tcW w:type="dxa" w:w="1247"/>
-            <w:shd w:val="clear" w:color="auto" w:fill="0A2342"/>
-            <w:tcBorders>
-              <w:top w:val="nil"/>
-            </w:tcBorders>
-            <w:tcBorders>
-              <w:bottom w:val="nil"/>
-            </w:tcBorders>
-            <w:tcBorders>
-              <w:left w:val="nil"/>
-            </w:tcBorders>
-            <w:tcBorders>
-              <w:right w:val="nil"/>
-            </w:tcBorders>
-            <w:vAlign w:val="center"/>
-          </w:tcPr>
-          <w:p>
-            <w:pPr>
-              <w:spacing w:before="0" w:after="0"/>
-              <w:jc w:val="right"/>
-            </w:pPr>
-            <w:r>
-              <w:rPr>
-                <w:rFonts w:ascii="Arial" w:hAnsi="Arial"/>
-                <w:rFonts w:ascii="Arial" w:hAnsi="Arial" w:cs="Arial"/>
-                <w:b/>
-                <w:i w:val="0"/>
-                <w:color w:val="FFFFFF"/>
-                <w:sz w:val="17"/>
-              </w:rPr>
-              <w:t>Value (USD)</w:t>
-            </w:r>
-          </w:p>
-        </w:tc>
-        <w:tc>
-          <w:tcPr>
-            <w:tcW w:type="dxa" w:w="1020"/>
-            <w:shd w:val="clear" w:color="auto" w:fill="0A2342"/>
-            <w:tcBorders>
-              <w:top w:val="nil"/>
-            </w:tcBorders>
-            <w:tcBorders>
-              <w:bottom w:val="nil"/>
-            </w:tcBorders>
-            <w:tcBorders>
-              <w:left w:val="nil"/>
-            </w:tcBorders>
-            <w:tcBorders>
-              <w:right w:val="nil"/>
-            </w:tcBorders>
-            <w:vAlign w:val="center"/>
-          </w:tcPr>
-          <w:p>
-            <w:pPr>
-              <w:spacing w:before="0" w:after="0"/>
-              <w:jc w:val="right"/>
-            </w:pPr>
-            <w:r>
-              <w:rPr>
-                <w:rFonts w:ascii="Arial" w:hAnsi="Arial"/>
-                <w:rFonts w:ascii="Arial" w:hAnsi="Arial" w:cs="Arial"/>
-                <w:b/>
-                <w:i w:val="0"/>
-                <w:color w:val="FFFFFF"/>
-                <w:sz w:val="17"/>
-              </w:rPr>
-              <w:t>Transaction ID</w:t>
-            </w:r>
-          </w:p>
-        </w:tc>
-        <w:tc>
-          <w:tcPr>
-            <w:tcW w:type="dxa" w:w="1531"/>
-            <w:shd w:val="clear" w:color="auto" w:fill="0A2342"/>
-            <w:tcBorders>
-              <w:top w:val="nil"/>
-            </w:tcBorders>
-            <w:tcBorders>
-              <w:bottom w:val="nil"/>
-            </w:tcBorders>
-            <w:tcBorders>
-              <w:left w:val="nil"/>
-            </w:tcBorders>
-            <w:tcBorders>
-              <w:right w:val="nil"/>
-            </w:tcBorders>
-            <w:vAlign w:val="center"/>
-          </w:tcPr>
-          <w:p>
-            <w:pPr>
-              <w:spacing w:before="0" w:after="0"/>
-              <w:jc w:val="right"/>
-            </w:pPr>
-            <w:r>
-              <w:rPr>
-                <w:rFonts w:ascii="Arial" w:hAnsi="Arial"/>
-                <w:rFonts w:ascii="Arial" w:hAnsi="Arial" w:cs="Arial"/>
-                <w:b/>
-                <w:i w:val="0"/>
-                <w:color w:val="FFFFFF"/>
-                <w:sz w:val="17"/>
-              </w:rPr>
               <w:t>Pending Status</w:t>
             </w:r>
           </w:p>
@@ -19127,6 +20034,164 @@
       <w:tr>
         <w:tc>
           <w:tcPr>
+            <w:tcW w:type="dxa" w:w="1474"/>
+            <w:shd w:val="clear" w:color="auto" w:fill="FEF3C7"/>
+            <w:tcBorders>
+              <w:bottom w:val="single" w:sz="4" w:color="D0D5DD"/>
+            </w:tcBorders>
+            <w:vAlign w:val="center"/>
+          </w:tcPr>
+          <w:p>
+            <w:pPr>
+              <w:spacing w:before="40" w:after="40"/>
+            </w:pPr>
+            <w:r>
+              <w:rPr>
+                <w:rFonts w:ascii="Arial" w:hAnsi="Arial"/>
+                <w:rFonts w:ascii="Arial" w:hAnsi="Arial" w:cs="Arial"/>
+                <w:b w:val="0"/>
+                <w:i w:val="0"/>
+                <w:color w:val="4A5568"/>
+                <w:sz w:val="15"/>
+              </w:rPr>
+              <w:t>2026-04-13 14:12 UTC</w:t>
+            </w:r>
+          </w:p>
+        </w:tc>
+        <w:tc>
+          <w:tcPr>
+            <w:tcW w:type="dxa" w:w="1361"/>
+            <w:shd w:val="clear" w:color="auto" w:fill="FEF3C7"/>
+            <w:tcBorders>
+              <w:bottom w:val="single" w:sz="4" w:color="D0D5DD"/>
+            </w:tcBorders>
+            <w:vAlign w:val="center"/>
+          </w:tcPr>
+          <w:p>
+            <w:pPr>
+              <w:spacing w:before="40" w:after="40"/>
+            </w:pPr>
+            <w:r>
+              <w:rPr>
+                <w:rFonts w:ascii="Arial" w:hAnsi="Arial"/>
+                <w:rFonts w:ascii="Arial" w:hAnsi="Arial" w:cs="Arial"/>
+                <w:b w:val="0"/>
+                <w:i w:val="0"/>
+                <w:color w:val="4A5568"/>
+                <w:sz w:val="15"/>
+              </w:rPr>
+              <w:t>Transfer-In</w:t>
+            </w:r>
+          </w:p>
+        </w:tc>
+        <w:tc>
+          <w:tcPr>
+            <w:tcW w:type="dxa" w:w="680"/>
+            <w:shd w:val="clear" w:color="auto" w:fill="FEF3C7"/>
+            <w:tcBorders>
+              <w:bottom w:val="single" w:sz="4" w:color="D0D5DD"/>
+            </w:tcBorders>
+            <w:vAlign w:val="center"/>
+          </w:tcPr>
+          <w:p>
+            <w:pPr>
+              <w:spacing w:before="40" w:after="40"/>
+            </w:pPr>
+            <w:r>
+              <w:rPr>
+                <w:rFonts w:ascii="Arial" w:hAnsi="Arial"/>
+                <w:rFonts w:ascii="Arial" w:hAnsi="Arial" w:cs="Arial"/>
+                <w:b w:val="0"/>
+                <w:i w:val="0"/>
+                <w:color w:val="4A5568"/>
+                <w:sz w:val="15"/>
+              </w:rPr>
+              <w:t>USDC</w:t>
+            </w:r>
+          </w:p>
+        </w:tc>
+        <w:tc>
+          <w:tcPr>
+            <w:tcW w:type="dxa" w:w="1134"/>
+            <w:shd w:val="clear" w:color="auto" w:fill="FEF3C7"/>
+            <w:tcBorders>
+              <w:bottom w:val="single" w:sz="4" w:color="D0D5DD"/>
+            </w:tcBorders>
+            <w:vAlign w:val="center"/>
+          </w:tcPr>
+          <w:p>
+            <w:pPr>
+              <w:spacing w:before="40" w:after="40"/>
+            </w:pPr>
+            <w:r>
+              <w:rPr>
+                <w:rFonts w:ascii="Arial" w:hAnsi="Arial"/>
+                <w:rFonts w:ascii="Arial" w:hAnsi="Arial" w:cs="Arial"/>
+                <w:b w:val="0"/>
+                <w:i w:val="0"/>
+                <w:color w:val="4A5568"/>
+                <w:sz w:val="15"/>
+              </w:rPr>
+              <w:t>Ethereum</w:t>
+            </w:r>
+          </w:p>
+        </w:tc>
+        <w:tc>
+          <w:tcPr>
+            <w:tcW w:type="dxa" w:w="1361"/>
+            <w:shd w:val="clear" w:color="auto" w:fill="FEF3C7"/>
+            <w:tcBorders>
+              <w:bottom w:val="single" w:sz="4" w:color="D0D5DD"/>
+            </w:tcBorders>
+            <w:vAlign w:val="center"/>
+          </w:tcPr>
+          <w:p>
+            <w:pPr>
+              <w:spacing w:before="40" w:after="40"/>
+              <w:jc w:val="right"/>
+            </w:pPr>
+            <w:r>
+              <w:rPr>
+                <w:rFonts w:ascii="Arial" w:hAnsi="Arial"/>
+                <w:rFonts w:ascii="Arial" w:hAnsi="Arial" w:cs="Arial"/>
+                <w:b w:val="0"/>
+                <w:i w:val="0"/>
+                <w:color w:val="4A5568"/>
+                <w:sz w:val="15"/>
+              </w:rPr>
+              <w:t>600,000.0000</w:t>
+            </w:r>
+          </w:p>
+        </w:tc>
+        <w:tc>
+          <w:tcPr>
+            <w:tcW w:type="dxa" w:w="1361"/>
+            <w:shd w:val="clear" w:color="auto" w:fill="FEF3C7"/>
+            <w:tcBorders>
+              <w:bottom w:val="single" w:sz="4" w:color="D0D5DD"/>
+            </w:tcBorders>
+            <w:vAlign w:val="center"/>
+          </w:tcPr>
+          <w:p>
+            <w:pPr>
+              <w:spacing w:before="40" w:after="40"/>
+              <w:jc w:val="right"/>
+            </w:pPr>
+            <w:r>
+              <w:rPr>
+                <w:rFonts w:ascii="Arial" w:hAnsi="Arial"/>
+                <w:rFonts w:ascii="Arial" w:hAnsi="Arial" w:cs="Arial"/>
+                <w:b w:val="0"/>
+                <w:i w:val="0"/>
+                <w:color w:val="4A5568"/>
+                <w:sz w:val="15"/>
+              </w:rPr>
+              <w:t>$599,400.00</w:t>
+            </w:r>
+          </w:p>
+        </w:tc>
+        <w:tc>
+          <w:tcPr>
             <w:tcW w:type="dxa" w:w="1247"/>
             <w:shd w:val="clear" w:color="auto" w:fill="FEF3C7"/>
             <w:tcBorders>
@@ -19137,6 +20202,7 @@
           <w:p>
             <w:pPr>
               <w:spacing w:before="40" w:after="40"/>
+              <w:jc w:val="right"/>
             </w:pPr>
             <w:r>
               <w:rPr>
@@ -19147,13 +20213,13 @@
                 <w:color w:val="4A5568"/>
                 <w:sz w:val="15"/>
               </w:rPr>
-              <w:t>2026-04-13 14:12 UTC</w:t>
-            </w:r>
-          </w:p>
-        </w:tc>
-        <w:tc>
-          <w:tcPr>
-            <w:tcW w:type="dxa" w:w="1417"/>
+              <w:t>W20260413-6LQ8</w:t>
+            </w:r>
+          </w:p>
+        </w:tc>
+        <w:tc>
+          <w:tcPr>
+            <w:tcW w:type="dxa" w:w="1587"/>
             <w:shd w:val="clear" w:color="auto" w:fill="FEF3C7"/>
             <w:tcBorders>
               <w:bottom w:val="single" w:sz="4" w:color="D0D5DD"/>
@@ -19163,17 +20229,98 @@
           <w:p>
             <w:pPr>
               <w:spacing w:before="40" w:after="40"/>
-            </w:pPr>
-            <w:r>
-              <w:rPr>
-                <w:rFonts w:ascii="Arial" w:hAnsi="Arial"/>
-                <w:rFonts w:ascii="Arial" w:hAnsi="Arial" w:cs="Arial"/>
-                <w:b w:val="0"/>
-                <w:i w:val="0"/>
-                <w:color w:val="4A5568"/>
+              <w:jc w:val="right"/>
+            </w:pPr>
+            <w:r>
+              <w:rPr>
+                <w:rFonts w:ascii="Arial" w:hAnsi="Arial"/>
+                <w:rFonts w:ascii="Arial" w:hAnsi="Arial" w:cs="Arial"/>
+                <w:b w:val="0"/>
+                <w:i w:val="0"/>
+                <w:color w:val="B45309"/>
                 <w:sz w:val="15"/>
               </w:rPr>
-              <w:t>Markets Settlement Wallet</w:t>
+              <w:t>Travel Rule declaration pending</w:t>
+            </w:r>
+          </w:p>
+        </w:tc>
+      </w:tr>
+      <w:tr>
+        <w:tc>
+          <w:tcPr>
+            <w:tcW w:type="dxa" w:w="1474"/>
+            <w:shd w:val="clear" w:color="auto" w:fill="FEF3C7"/>
+            <w:tcBorders>
+              <w:bottom w:val="single" w:sz="4" w:color="D0D5DD"/>
+            </w:tcBorders>
+            <w:vAlign w:val="center"/>
+          </w:tcPr>
+          <w:p>
+            <w:pPr>
+              <w:spacing w:before="40" w:after="40"/>
+            </w:pPr>
+            <w:r>
+              <w:rPr>
+                <w:rFonts w:ascii="Arial" w:hAnsi="Arial"/>
+                <w:rFonts w:ascii="Arial" w:hAnsi="Arial" w:cs="Arial"/>
+                <w:b w:val="0"/>
+                <w:i w:val="0"/>
+                <w:color w:val="4A5568"/>
+                <w:sz w:val="15"/>
+              </w:rPr>
+              <w:t>2026-04-20 17:22 UTC</w:t>
+            </w:r>
+          </w:p>
+        </w:tc>
+        <w:tc>
+          <w:tcPr>
+            <w:tcW w:type="dxa" w:w="1361"/>
+            <w:shd w:val="clear" w:color="auto" w:fill="FEF3C7"/>
+            <w:tcBorders>
+              <w:bottom w:val="single" w:sz="4" w:color="D0D5DD"/>
+            </w:tcBorders>
+            <w:vAlign w:val="center"/>
+          </w:tcPr>
+          <w:p>
+            <w:pPr>
+              <w:spacing w:before="40" w:after="40"/>
+            </w:pPr>
+            <w:r>
+              <w:rPr>
+                <w:rFonts w:ascii="Arial" w:hAnsi="Arial"/>
+                <w:rFonts w:ascii="Arial" w:hAnsi="Arial" w:cs="Arial"/>
+                <w:b w:val="0"/>
+                <w:i w:val="0"/>
+                <w:color w:val="4A5568"/>
+                <w:sz w:val="15"/>
+              </w:rPr>
+              <w:t>Transfer-In</w:t>
+            </w:r>
+          </w:p>
+        </w:tc>
+        <w:tc>
+          <w:tcPr>
+            <w:tcW w:type="dxa" w:w="680"/>
+            <w:shd w:val="clear" w:color="auto" w:fill="FEF3C7"/>
+            <w:tcBorders>
+              <w:bottom w:val="single" w:sz="4" w:color="D0D5DD"/>
+            </w:tcBorders>
+            <w:vAlign w:val="center"/>
+          </w:tcPr>
+          <w:p>
+            <w:pPr>
+              <w:spacing w:before="40" w:after="40"/>
+            </w:pPr>
+            <w:r>
+              <w:rPr>
+                <w:rFonts w:ascii="Arial" w:hAnsi="Arial"/>
+                <w:rFonts w:ascii="Arial" w:hAnsi="Arial" w:cs="Arial"/>
+                <w:b w:val="0"/>
+                <w:i w:val="0"/>
+                <w:color w:val="4A5568"/>
+                <w:sz w:val="15"/>
+              </w:rPr>
+              <w:t>USDT</w:t>
             </w:r>
           </w:p>
         </w:tc>
@@ -19199,13 +20346,13 @@
                 <w:color w:val="4A5568"/>
                 <w:sz w:val="15"/>
               </w:rPr>
-              <w:t>Transfer-In</w:t>
-            </w:r>
-          </w:p>
-        </w:tc>
-        <w:tc>
-          <w:tcPr>
-            <w:tcW w:type="dxa" w:w="567"/>
+              <w:t>Ethereum</w:t>
+            </w:r>
+          </w:p>
+        </w:tc>
+        <w:tc>
+          <w:tcPr>
+            <w:tcW w:type="dxa" w:w="1361"/>
             <w:shd w:val="clear" w:color="auto" w:fill="FEF3C7"/>
             <w:tcBorders>
               <w:bottom w:val="single" w:sz="4" w:color="D0D5DD"/>
@@ -19215,6 +20362,7 @@
           <w:p>
             <w:pPr>
               <w:spacing w:before="40" w:after="40"/>
+              <w:jc w:val="right"/>
             </w:pPr>
             <w:r>
               <w:rPr>
@@ -19225,13 +20373,13 @@
                 <w:color w:val="4A5568"/>
                 <w:sz w:val="15"/>
               </w:rPr>
-              <w:t>USDC</w:t>
-            </w:r>
-          </w:p>
-        </w:tc>
-        <w:tc>
-          <w:tcPr>
-            <w:tcW w:type="dxa" w:w="907"/>
+              <w:t>753,430.0000</w:t>
+            </w:r>
+          </w:p>
+        </w:tc>
+        <w:tc>
+          <w:tcPr>
+            <w:tcW w:type="dxa" w:w="1361"/>
             <w:shd w:val="clear" w:color="auto" w:fill="FEF3C7"/>
             <w:tcBorders>
               <w:bottom w:val="single" w:sz="4" w:color="D0D5DD"/>
@@ -19241,6 +20389,7 @@
           <w:p>
             <w:pPr>
               <w:spacing w:before="40" w:after="40"/>
+              <w:jc w:val="right"/>
             </w:pPr>
             <w:r>
               <w:rPr>
@@ -19251,7 +20400,141 @@
                 <w:color w:val="4A5568"/>
                 <w:sz w:val="15"/>
               </w:rPr>
-              <w:t>Ethereum</w:t>
+              <w:t>$752,676.57</w:t>
+            </w:r>
+          </w:p>
+        </w:tc>
+        <w:tc>
+          <w:tcPr>
+            <w:tcW w:type="dxa" w:w="1247"/>
+            <w:shd w:val="clear" w:color="auto" w:fill="FEF3C7"/>
+            <w:tcBorders>
+              <w:bottom w:val="single" w:sz="4" w:color="D0D5DD"/>
+            </w:tcBorders>
+            <w:vAlign w:val="center"/>
+          </w:tcPr>
+          <w:p>
+            <w:pPr>
+              <w:spacing w:before="40" w:after="40"/>
+              <w:jc w:val="right"/>
+            </w:pPr>
+            <w:r>
+              <w:rPr>
+                <w:rFonts w:ascii="Arial" w:hAnsi="Arial"/>
+                <w:rFonts w:ascii="Arial" w:hAnsi="Arial" w:cs="Arial"/>
+                <w:b w:val="0"/>
+                <w:i w:val="0"/>
+                <w:color w:val="4A5568"/>
+                <w:sz w:val="15"/>
+              </w:rPr>
+              <w:t>W20260420-7HX4</w:t>
+            </w:r>
+          </w:p>
+        </w:tc>
+        <w:tc>
+          <w:tcPr>
+            <w:tcW w:type="dxa" w:w="1587"/>
+            <w:shd w:val="clear" w:color="auto" w:fill="FEF3C7"/>
+            <w:tcBorders>
+              <w:bottom w:val="single" w:sz="4" w:color="D0D5DD"/>
+            </w:tcBorders>
+            <w:vAlign w:val="center"/>
+          </w:tcPr>
+          <w:p>
+            <w:pPr>
+              <w:spacing w:before="40" w:after="40"/>
+              <w:jc w:val="right"/>
+            </w:pPr>
+            <w:r>
+              <w:rPr>
+                <w:rFonts w:ascii="Arial" w:hAnsi="Arial"/>
+                <w:rFonts w:ascii="Arial" w:hAnsi="Arial" w:cs="Arial"/>
+                <w:b w:val="0"/>
+                <w:i w:val="0"/>
+                <w:color w:val="B45309"/>
+                <w:sz w:val="15"/>
+              </w:rPr>
+              <w:t>Travel Rule declaration pending</w:t>
+            </w:r>
+          </w:p>
+        </w:tc>
+      </w:tr>
+      <w:tr>
+        <w:tc>
+          <w:tcPr>
+            <w:tcW w:type="dxa" w:w="1474"/>
+            <w:shd w:val="clear" w:color="auto" w:fill="FEF3C7"/>
+            <w:tcBorders>
+              <w:bottom w:val="single" w:sz="4" w:color="D0D5DD"/>
+            </w:tcBorders>
+            <w:vAlign w:val="center"/>
+          </w:tcPr>
+          <w:p>
+            <w:pPr>
+              <w:spacing w:before="40" w:after="40"/>
+            </w:pPr>
+            <w:r>
+              <w:rPr>
+                <w:rFonts w:ascii="Arial" w:hAnsi="Arial"/>
+                <w:rFonts w:ascii="Arial" w:hAnsi="Arial" w:cs="Arial"/>
+                <w:b w:val="0"/>
+                <w:i w:val="0"/>
+                <w:color w:val="4A5568"/>
+                <w:sz w:val="15"/>
+              </w:rPr>
+              <w:t>2026-04-29 09:55 UTC</w:t>
+            </w:r>
+          </w:p>
+        </w:tc>
+        <w:tc>
+          <w:tcPr>
+            <w:tcW w:type="dxa" w:w="1361"/>
+            <w:shd w:val="clear" w:color="auto" w:fill="FEF3C7"/>
+            <w:tcBorders>
+              <w:bottom w:val="single" w:sz="4" w:color="D0D5DD"/>
+            </w:tcBorders>
+            <w:vAlign w:val="center"/>
+          </w:tcPr>
+          <w:p>
+            <w:pPr>
+              <w:spacing w:before="40" w:after="40"/>
+            </w:pPr>
+            <w:r>
+              <w:rPr>
+                <w:rFonts w:ascii="Arial" w:hAnsi="Arial"/>
+                <w:rFonts w:ascii="Arial" w:hAnsi="Arial" w:cs="Arial"/>
+                <w:b w:val="0"/>
+                <w:i w:val="0"/>
+                <w:color w:val="4A5568"/>
+                <w:sz w:val="15"/>
+              </w:rPr>
+              <w:t>Transfer-Out</w:t>
+            </w:r>
+          </w:p>
+        </w:tc>
+        <w:tc>
+          <w:tcPr>
+            <w:tcW w:type="dxa" w:w="680"/>
+            <w:shd w:val="clear" w:color="auto" w:fill="FEF3C7"/>
+            <w:tcBorders>
+              <w:bottom w:val="single" w:sz="4" w:color="D0D5DD"/>
+            </w:tcBorders>
+            <w:vAlign w:val="center"/>
+          </w:tcPr>
+          <w:p>
+            <w:pPr>
+              <w:spacing w:before="40" w:after="40"/>
+            </w:pPr>
+            <w:r>
+              <w:rPr>
+                <w:rFonts w:ascii="Arial" w:hAnsi="Arial"/>
+                <w:rFonts w:ascii="Arial" w:hAnsi="Arial" w:cs="Arial"/>
+                <w:b w:val="0"/>
+                <w:i w:val="0"/>
+                <w:color w:val="4A5568"/>
+                <w:sz w:val="15"/>
+              </w:rPr>
+              <w:t>BTC</w:t>
             </w:r>
           </w:p>
         </w:tc>
@@ -19267,6 +20550,32 @@
           <w:p>
             <w:pPr>
               <w:spacing w:before="40" w:after="40"/>
+            </w:pPr>
+            <w:r>
+              <w:rPr>
+                <w:rFonts w:ascii="Arial" w:hAnsi="Arial"/>
+                <w:rFonts w:ascii="Arial" w:hAnsi="Arial" w:cs="Arial"/>
+                <w:b w:val="0"/>
+                <w:i w:val="0"/>
+                <w:color w:val="4A5568"/>
+                <w:sz w:val="15"/>
+              </w:rPr>
+              <w:t>Bitcoin</w:t>
+            </w:r>
+          </w:p>
+        </w:tc>
+        <w:tc>
+          <w:tcPr>
+            <w:tcW w:type="dxa" w:w="1361"/>
+            <w:shd w:val="clear" w:color="auto" w:fill="FEF3C7"/>
+            <w:tcBorders>
+              <w:bottom w:val="single" w:sz="4" w:color="D0D5DD"/>
+            </w:tcBorders>
+            <w:vAlign w:val="center"/>
+          </w:tcPr>
+          <w:p>
+            <w:pPr>
+              <w:spacing w:before="40" w:after="40"/>
               <w:jc w:val="right"/>
             </w:pPr>
             <w:r>
@@ -19278,7 +20587,34 @@
                 <w:color w:val="4A5568"/>
                 <w:sz w:val="15"/>
               </w:rPr>
-              <w:t>600,000.0000</w:t>
+              <w:t>-0.50000000</w:t>
+            </w:r>
+          </w:p>
+        </w:tc>
+        <w:tc>
+          <w:tcPr>
+            <w:tcW w:type="dxa" w:w="1361"/>
+            <w:shd w:val="clear" w:color="auto" w:fill="FEF3C7"/>
+            <w:tcBorders>
+              <w:bottom w:val="single" w:sz="4" w:color="D0D5DD"/>
+            </w:tcBorders>
+            <w:vAlign w:val="center"/>
+          </w:tcPr>
+          <w:p>
+            <w:pPr>
+              <w:spacing w:before="40" w:after="40"/>
+              <w:jc w:val="right"/>
+            </w:pPr>
+            <w:r>
+              <w:rPr>
+                <w:rFonts w:ascii="Arial" w:hAnsi="Arial"/>
+                <w:rFonts w:ascii="Arial" w:hAnsi="Arial" w:cs="Arial"/>
+                <w:b w:val="0"/>
+                <w:i w:val="0"/>
+                <w:color w:val="4A5568"/>
+                <w:sz w:val="15"/>
+              </w:rPr>
+              <w:t>-$38,212.50</w:t>
             </w:r>
           </w:p>
         </w:tc>
@@ -19305,40 +20641,13 @@
                 <w:color w:val="4A5568"/>
                 <w:sz w:val="15"/>
               </w:rPr>
-              <w:t>$599,400.00</w:t>
-            </w:r>
-          </w:p>
-        </w:tc>
-        <w:tc>
-          <w:tcPr>
-            <w:tcW w:type="dxa" w:w="1020"/>
-            <w:shd w:val="clear" w:color="auto" w:fill="FEF3C7"/>
-            <w:tcBorders>
-              <w:bottom w:val="single" w:sz="4" w:color="D0D5DD"/>
-            </w:tcBorders>
-            <w:vAlign w:val="center"/>
-          </w:tcPr>
-          <w:p>
-            <w:pPr>
-              <w:spacing w:before="40" w:after="40"/>
-              <w:jc w:val="right"/>
-            </w:pPr>
-            <w:r>
-              <w:rPr>
-                <w:rFonts w:ascii="Arial" w:hAnsi="Arial"/>
-                <w:rFonts w:ascii="Arial" w:hAnsi="Arial" w:cs="Arial"/>
-                <w:b w:val="0"/>
-                <w:i w:val="0"/>
-                <w:color w:val="4A5568"/>
-                <w:sz w:val="15"/>
-              </w:rPr>
-              <w:t>W20260413-6LQ8</w:t>
-            </w:r>
-          </w:p>
-        </w:tc>
-        <w:tc>
-          <w:tcPr>
-            <w:tcW w:type="dxa" w:w="1531"/>
+              <w:t>W20260429-QR03</w:t>
+            </w:r>
+          </w:p>
+        </w:tc>
+        <w:tc>
+          <w:tcPr>
+            <w:tcW w:type="dxa" w:w="1587"/>
             <w:shd w:val="clear" w:color="auto" w:fill="FEF3C7"/>
             <w:tcBorders>
               <w:bottom w:val="single" w:sz="4" w:color="D0D5DD"/>
@@ -19359,7 +20668,7 @@
                 <w:color w:val="B45309"/>
                 <w:sz w:val="15"/>
               </w:rPr>
-              <w:t>Travel Rule declaration pending</w:t>
+              <w:t>Quorum approval pending</w:t>
             </w:r>
           </w:p>
         </w:tc>
@@ -19367,6 +20676,164 @@
       <w:tr>
         <w:tc>
           <w:tcPr>
+            <w:tcW w:type="dxa" w:w="1474"/>
+            <w:shd w:val="clear" w:color="auto" w:fill="FEF3C7"/>
+            <w:tcBorders>
+              <w:bottom w:val="single" w:sz="4" w:color="D0D5DD"/>
+            </w:tcBorders>
+            <w:vAlign w:val="center"/>
+          </w:tcPr>
+          <w:p>
+            <w:pPr>
+              <w:spacing w:before="40" w:after="40"/>
+            </w:pPr>
+            <w:r>
+              <w:rPr>
+                <w:rFonts w:ascii="Arial" w:hAnsi="Arial"/>
+                <w:rFonts w:ascii="Arial" w:hAnsi="Arial" w:cs="Arial"/>
+                <w:b w:val="0"/>
+                <w:i w:val="0"/>
+                <w:color w:val="4A5568"/>
+                <w:sz w:val="15"/>
+              </w:rPr>
+              <w:t>2026-04-30 22:15 UTC</w:t>
+            </w:r>
+          </w:p>
+        </w:tc>
+        <w:tc>
+          <w:tcPr>
+            <w:tcW w:type="dxa" w:w="1361"/>
+            <w:shd w:val="clear" w:color="auto" w:fill="FEF3C7"/>
+            <w:tcBorders>
+              <w:bottom w:val="single" w:sz="4" w:color="D0D5DD"/>
+            </w:tcBorders>
+            <w:vAlign w:val="center"/>
+          </w:tcPr>
+          <w:p>
+            <w:pPr>
+              <w:spacing w:before="40" w:after="40"/>
+            </w:pPr>
+            <w:r>
+              <w:rPr>
+                <w:rFonts w:ascii="Arial" w:hAnsi="Arial"/>
+                <w:rFonts w:ascii="Arial" w:hAnsi="Arial" w:cs="Arial"/>
+                <w:b w:val="0"/>
+                <w:i w:val="0"/>
+                <w:color w:val="4A5568"/>
+                <w:sz w:val="15"/>
+              </w:rPr>
+              <w:t>Transfer-Out</w:t>
+            </w:r>
+          </w:p>
+        </w:tc>
+        <w:tc>
+          <w:tcPr>
+            <w:tcW w:type="dxa" w:w="680"/>
+            <w:shd w:val="clear" w:color="auto" w:fill="FEF3C7"/>
+            <w:tcBorders>
+              <w:bottom w:val="single" w:sz="4" w:color="D0D5DD"/>
+            </w:tcBorders>
+            <w:vAlign w:val="center"/>
+          </w:tcPr>
+          <w:p>
+            <w:pPr>
+              <w:spacing w:before="40" w:after="40"/>
+            </w:pPr>
+            <w:r>
+              <w:rPr>
+                <w:rFonts w:ascii="Arial" w:hAnsi="Arial"/>
+                <w:rFonts w:ascii="Arial" w:hAnsi="Arial" w:cs="Arial"/>
+                <w:b w:val="0"/>
+                <w:i w:val="0"/>
+                <w:color w:val="4A5568"/>
+                <w:sz w:val="15"/>
+              </w:rPr>
+              <w:t>USDT</w:t>
+            </w:r>
+          </w:p>
+        </w:tc>
+        <w:tc>
+          <w:tcPr>
+            <w:tcW w:type="dxa" w:w="1134"/>
+            <w:shd w:val="clear" w:color="auto" w:fill="FEF3C7"/>
+            <w:tcBorders>
+              <w:bottom w:val="single" w:sz="4" w:color="D0D5DD"/>
+            </w:tcBorders>
+            <w:vAlign w:val="center"/>
+          </w:tcPr>
+          <w:p>
+            <w:pPr>
+              <w:spacing w:before="40" w:after="40"/>
+            </w:pPr>
+            <w:r>
+              <w:rPr>
+                <w:rFonts w:ascii="Arial" w:hAnsi="Arial"/>
+                <w:rFonts w:ascii="Arial" w:hAnsi="Arial" w:cs="Arial"/>
+                <w:b w:val="0"/>
+                <w:i w:val="0"/>
+                <w:color w:val="4A5568"/>
+                <w:sz w:val="15"/>
+              </w:rPr>
+              <w:t>Tron</w:t>
+            </w:r>
+          </w:p>
+        </w:tc>
+        <w:tc>
+          <w:tcPr>
+            <w:tcW w:type="dxa" w:w="1361"/>
+            <w:shd w:val="clear" w:color="auto" w:fill="FEF3C7"/>
+            <w:tcBorders>
+              <w:bottom w:val="single" w:sz="4" w:color="D0D5DD"/>
+            </w:tcBorders>
+            <w:vAlign w:val="center"/>
+          </w:tcPr>
+          <w:p>
+            <w:pPr>
+              <w:spacing w:before="40" w:after="40"/>
+              <w:jc w:val="right"/>
+            </w:pPr>
+            <w:r>
+              <w:rPr>
+                <w:rFonts w:ascii="Arial" w:hAnsi="Arial"/>
+                <w:rFonts w:ascii="Arial" w:hAnsi="Arial" w:cs="Arial"/>
+                <w:b w:val="0"/>
+                <w:i w:val="0"/>
+                <w:color w:val="4A5568"/>
+                <w:sz w:val="15"/>
+              </w:rPr>
+              <w:t>-180,000.0000</w:t>
+            </w:r>
+          </w:p>
+        </w:tc>
+        <w:tc>
+          <w:tcPr>
+            <w:tcW w:type="dxa" w:w="1361"/>
+            <w:shd w:val="clear" w:color="auto" w:fill="FEF3C7"/>
+            <w:tcBorders>
+              <w:bottom w:val="single" w:sz="4" w:color="D0D5DD"/>
+            </w:tcBorders>
+            <w:vAlign w:val="center"/>
+          </w:tcPr>
+          <w:p>
+            <w:pPr>
+              <w:spacing w:before="40" w:after="40"/>
+              <w:jc w:val="right"/>
+            </w:pPr>
+            <w:r>
+              <w:rPr>
+                <w:rFonts w:ascii="Arial" w:hAnsi="Arial"/>
+                <w:rFonts w:ascii="Arial" w:hAnsi="Arial" w:cs="Arial"/>
+                <w:b w:val="0"/>
+                <w:i w:val="0"/>
+                <w:color w:val="4A5568"/>
+                <w:sz w:val="15"/>
+              </w:rPr>
+              <w:t>-$179,820.00</w:t>
+            </w:r>
+          </w:p>
+        </w:tc>
+        <w:tc>
+          <w:tcPr>
             <w:tcW w:type="dxa" w:w="1247"/>
             <w:shd w:val="clear" w:color="auto" w:fill="FEF3C7"/>
             <w:tcBorders>
@@ -19377,6 +20844,7 @@
           <w:p>
             <w:pPr>
               <w:spacing w:before="40" w:after="40"/>
+              <w:jc w:val="right"/>
             </w:pPr>
             <w:r>
               <w:rPr>
@@ -19387,198 +20855,13 @@
                 <w:color w:val="4A5568"/>
                 <w:sz w:val="15"/>
               </w:rPr>
-              <w:t>2026-04-20 17:22 UTC</w:t>
-            </w:r>
-          </w:p>
-        </w:tc>
-        <w:tc>
-          <w:tcPr>
-            <w:tcW w:type="dxa" w:w="1417"/>
-            <w:shd w:val="clear" w:color="auto" w:fill="FEF3C7"/>
-            <w:tcBorders>
-              <w:bottom w:val="single" w:sz="4" w:color="D0D5DD"/>
-            </w:tcBorders>
-            <w:vAlign w:val="center"/>
-          </w:tcPr>
-          <w:p>
-            <w:pPr>
-              <w:spacing w:before="40" w:after="40"/>
-            </w:pPr>
-            <w:r>
-              <w:rPr>
-                <w:rFonts w:ascii="Arial" w:hAnsi="Arial"/>
-                <w:rFonts w:ascii="Arial" w:hAnsi="Arial" w:cs="Arial"/>
-                <w:b w:val="0"/>
-                <w:i w:val="0"/>
-                <w:color w:val="4A5568"/>
-                <w:sz w:val="15"/>
-              </w:rPr>
-              <w:t>Markets Settlement Wallet</w:t>
-            </w:r>
-          </w:p>
-        </w:tc>
-        <w:tc>
-          <w:tcPr>
-            <w:tcW w:type="dxa" w:w="1134"/>
-            <w:shd w:val="clear" w:color="auto" w:fill="FEF3C7"/>
-            <w:tcBorders>
-              <w:bottom w:val="single" w:sz="4" w:color="D0D5DD"/>
-            </w:tcBorders>
-            <w:vAlign w:val="center"/>
-          </w:tcPr>
-          <w:p>
-            <w:pPr>
-              <w:spacing w:before="40" w:after="40"/>
-            </w:pPr>
-            <w:r>
-              <w:rPr>
-                <w:rFonts w:ascii="Arial" w:hAnsi="Arial"/>
-                <w:rFonts w:ascii="Arial" w:hAnsi="Arial" w:cs="Arial"/>
-                <w:b w:val="0"/>
-                <w:i w:val="0"/>
-                <w:color w:val="4A5568"/>
-                <w:sz w:val="15"/>
-              </w:rPr>
-              <w:t>Transfer-In</w:t>
-            </w:r>
-          </w:p>
-        </w:tc>
-        <w:tc>
-          <w:tcPr>
-            <w:tcW w:type="dxa" w:w="567"/>
-            <w:shd w:val="clear" w:color="auto" w:fill="FEF3C7"/>
-            <w:tcBorders>
-              <w:bottom w:val="single" w:sz="4" w:color="D0D5DD"/>
-            </w:tcBorders>
-            <w:vAlign w:val="center"/>
-          </w:tcPr>
-          <w:p>
-            <w:pPr>
-              <w:spacing w:before="40" w:after="40"/>
-            </w:pPr>
-            <w:r>
-              <w:rPr>
-                <w:rFonts w:ascii="Arial" w:hAnsi="Arial"/>
-                <w:rFonts w:ascii="Arial" w:hAnsi="Arial" w:cs="Arial"/>
-                <w:b w:val="0"/>
-                <w:i w:val="0"/>
-                <w:color w:val="4A5568"/>
-                <w:sz w:val="15"/>
-              </w:rPr>
-              <w:t>USDT</w:t>
-            </w:r>
-          </w:p>
-        </w:tc>
-        <w:tc>
-          <w:tcPr>
-            <w:tcW w:type="dxa" w:w="907"/>
-            <w:shd w:val="clear" w:color="auto" w:fill="FEF3C7"/>
-            <w:tcBorders>
-              <w:bottom w:val="single" w:sz="4" w:color="D0D5DD"/>
-            </w:tcBorders>
-            <w:vAlign w:val="center"/>
-          </w:tcPr>
-          <w:p>
-            <w:pPr>
-              <w:spacing w:before="40" w:after="40"/>
-            </w:pPr>
-            <w:r>
-              <w:rPr>
-                <w:rFonts w:ascii="Arial" w:hAnsi="Arial"/>
-                <w:rFonts w:ascii="Arial" w:hAnsi="Arial" w:cs="Arial"/>
-                <w:b w:val="0"/>
-                <w:i w:val="0"/>
-                <w:color w:val="4A5568"/>
-                <w:sz w:val="15"/>
-              </w:rPr>
-              <w:t>Ethereum</w:t>
-            </w:r>
-          </w:p>
-        </w:tc>
-        <w:tc>
-          <w:tcPr>
-            <w:tcW w:type="dxa" w:w="1134"/>
-            <w:shd w:val="clear" w:color="auto" w:fill="FEF3C7"/>
-            <w:tcBorders>
-              <w:bottom w:val="single" w:sz="4" w:color="D0D5DD"/>
-            </w:tcBorders>
-            <w:vAlign w:val="center"/>
-          </w:tcPr>
-          <w:p>
-            <w:pPr>
-              <w:spacing w:before="40" w:after="40"/>
-              <w:jc w:val="right"/>
-            </w:pPr>
-            <w:r>
-              <w:rPr>
-                <w:rFonts w:ascii="Arial" w:hAnsi="Arial"/>
-                <w:rFonts w:ascii="Arial" w:hAnsi="Arial" w:cs="Arial"/>
-                <w:b w:val="0"/>
-                <w:i w:val="0"/>
-                <w:color w:val="4A5568"/>
-                <w:sz w:val="15"/>
-              </w:rPr>
-              <w:t>753,430.0000</w:t>
-            </w:r>
-          </w:p>
-        </w:tc>
-        <w:tc>
-          <w:tcPr>
-            <w:tcW w:type="dxa" w:w="1247"/>
-            <w:shd w:val="clear" w:color="auto" w:fill="FEF3C7"/>
-            <w:tcBorders>
-              <w:bottom w:val="single" w:sz="4" w:color="D0D5DD"/>
-            </w:tcBorders>
-            <w:vAlign w:val="center"/>
-          </w:tcPr>
-          <w:p>
-            <w:pPr>
-              <w:spacing w:before="40" w:after="40"/>
-              <w:jc w:val="right"/>
-            </w:pPr>
-            <w:r>
-              <w:rPr>
-                <w:rFonts w:ascii="Arial" w:hAnsi="Arial"/>
-                <w:rFonts w:ascii="Arial" w:hAnsi="Arial" w:cs="Arial"/>
-                <w:b w:val="0"/>
-                <w:i w:val="0"/>
-                <w:color w:val="4A5568"/>
-                <w:sz w:val="15"/>
-              </w:rPr>
-              <w:t>$752,676.57</w:t>
-            </w:r>
-          </w:p>
-        </w:tc>
-        <w:tc>
-          <w:tcPr>
-            <w:tcW w:type="dxa" w:w="1020"/>
-            <w:shd w:val="clear" w:color="auto" w:fill="FEF3C7"/>
-            <w:tcBorders>
-              <w:bottom w:val="single" w:sz="4" w:color="D0D5DD"/>
-            </w:tcBorders>
-            <w:vAlign w:val="center"/>
-          </w:tcPr>
-          <w:p>
-            <w:pPr>
-              <w:spacing w:before="40" w:after="40"/>
-              <w:jc w:val="right"/>
-            </w:pPr>
-            <w:r>
-              <w:rPr>
-                <w:rFonts w:ascii="Arial" w:hAnsi="Arial"/>
-                <w:rFonts w:ascii="Arial" w:hAnsi="Arial" w:cs="Arial"/>
-                <w:b w:val="0"/>
-                <w:i w:val="0"/>
-                <w:color w:val="4A5568"/>
-                <w:sz w:val="15"/>
-              </w:rPr>
-              <w:t>W20260420-7HX4</w:t>
-            </w:r>
-          </w:p>
-        </w:tc>
-        <w:tc>
-          <w:tcPr>
-            <w:tcW w:type="dxa" w:w="1531"/>
+              <w:t>W20260430-CP12</w:t>
+            </w:r>
+          </w:p>
+        </w:tc>
+        <w:tc>
+          <w:tcPr>
+            <w:tcW w:type="dxa" w:w="1587"/>
             <w:shd w:val="clear" w:color="auto" w:fill="FEF3C7"/>
             <w:tcBorders>
               <w:bottom w:val="single" w:sz="4" w:color="D0D5DD"/>
@@ -19599,7 +20882,7 @@
                 <w:color w:val="B45309"/>
                 <w:sz w:val="15"/>
               </w:rPr>
-              <w:t>Travel Rule declaration pending</w:t>
+              <w:t>Quorum approval pending</w:t>
             </w:r>
           </w:p>
         </w:tc>
@@ -19607,964 +20890,158 @@
       <w:tr>
         <w:tc>
           <w:tcPr>
-            <w:tcW w:type="dxa" w:w="1247"/>
-            <w:shd w:val="clear" w:color="auto" w:fill="FEF3C7"/>
-            <w:tcBorders>
-              <w:bottom w:val="single" w:sz="4" w:color="D0D5DD"/>
-            </w:tcBorders>
-            <w:vAlign w:val="center"/>
-          </w:tcPr>
-          <w:p>
-            <w:pPr>
-              <w:spacing w:before="40" w:after="40"/>
-            </w:pPr>
-            <w:r>
-              <w:rPr>
-                <w:rFonts w:ascii="Arial" w:hAnsi="Arial"/>
-                <w:rFonts w:ascii="Arial" w:hAnsi="Arial" w:cs="Arial"/>
-                <w:b w:val="0"/>
-                <w:i w:val="0"/>
-                <w:color w:val="4A5568"/>
+            <w:tcW w:type="dxa" w:w="1474"/>
+            <w:shd w:val="clear" w:color="auto" w:fill="E5EBF1"/>
+            <w:tcBorders>
+              <w:bottom w:val="single" w:sz="4" w:color="D0D5DD"/>
+            </w:tcBorders>
+            <w:vAlign w:val="center"/>
+          </w:tcPr>
+          <w:p>
+            <w:pPr>
+              <w:spacing w:before="40" w:after="40"/>
+            </w:pPr>
+            <w:r>
+              <w:rPr>
+                <w:rFonts w:ascii="Arial" w:hAnsi="Arial"/>
+                <w:rFonts w:ascii="Arial" w:hAnsi="Arial" w:cs="Arial"/>
+                <w:b/>
+                <w:i w:val="0"/>
+                <w:color w:val="0A2342"/>
                 <w:sz w:val="15"/>
               </w:rPr>
-              <w:t>2026-04-22 09:55 UTC</w:t>
-            </w:r>
-          </w:p>
-        </w:tc>
-        <w:tc>
-          <w:tcPr>
-            <w:tcW w:type="dxa" w:w="1417"/>
-            <w:shd w:val="clear" w:color="auto" w:fill="FEF3C7"/>
-            <w:tcBorders>
-              <w:bottom w:val="single" w:sz="4" w:color="D0D5DD"/>
-            </w:tcBorders>
-            <w:vAlign w:val="center"/>
-          </w:tcPr>
-          <w:p>
-            <w:pPr>
-              <w:spacing w:before="40" w:after="40"/>
-            </w:pPr>
-            <w:r>
-              <w:rPr>
-                <w:rFonts w:ascii="Arial" w:hAnsi="Arial"/>
-                <w:rFonts w:ascii="Arial" w:hAnsi="Arial" w:cs="Arial"/>
-                <w:b w:val="0"/>
-                <w:i w:val="0"/>
-                <w:color w:val="4A5568"/>
+              <w:t>Total (4 pending)</w:t>
+            </w:r>
+          </w:p>
+        </w:tc>
+        <w:tc>
+          <w:tcPr>
+            <w:tcW w:type="dxa" w:w="1361"/>
+            <w:shd w:val="clear" w:color="auto" w:fill="E5EBF1"/>
+            <w:tcBorders>
+              <w:bottom w:val="single" w:sz="4" w:color="D0D5DD"/>
+            </w:tcBorders>
+            <w:vAlign w:val="center"/>
+          </w:tcPr>
+          <w:p>
+            <w:pPr>
+              <w:spacing w:before="40" w:after="40"/>
+            </w:pPr>
+            <w:r>
+              <w:rPr>
+                <w:rFonts w:ascii="Arial" w:hAnsi="Arial"/>
+                <w:rFonts w:ascii="Arial" w:hAnsi="Arial" w:cs="Arial"/>
+                <w:b/>
+                <w:i w:val="0"/>
+                <w:color w:val="0A2342"/>
                 <w:sz w:val="15"/>
               </w:rPr>
-              <w:t>Client Settlement Wallet</w:t>
+            </w:r>
+          </w:p>
+        </w:tc>
+        <w:tc>
+          <w:tcPr>
+            <w:tcW w:type="dxa" w:w="680"/>
+            <w:shd w:val="clear" w:color="auto" w:fill="E5EBF1"/>
+            <w:tcBorders>
+              <w:bottom w:val="single" w:sz="4" w:color="D0D5DD"/>
+            </w:tcBorders>
+            <w:vAlign w:val="center"/>
+          </w:tcPr>
+          <w:p>
+            <w:pPr>
+              <w:spacing w:before="40" w:after="40"/>
+            </w:pPr>
+            <w:r>
+              <w:rPr>
+                <w:rFonts w:ascii="Arial" w:hAnsi="Arial"/>
+                <w:rFonts w:ascii="Arial" w:hAnsi="Arial" w:cs="Arial"/>
+                <w:b/>
+                <w:i w:val="0"/>
+                <w:color w:val="0A2342"/>
+                <w:sz w:val="15"/>
+              </w:rPr>
             </w:r>
           </w:p>
         </w:tc>
         <w:tc>
           <w:tcPr>
             <w:tcW w:type="dxa" w:w="1134"/>
-            <w:shd w:val="clear" w:color="auto" w:fill="FEF3C7"/>
-            <w:tcBorders>
-              <w:bottom w:val="single" w:sz="4" w:color="D0D5DD"/>
-            </w:tcBorders>
-            <w:vAlign w:val="center"/>
-          </w:tcPr>
-          <w:p>
-            <w:pPr>
-              <w:spacing w:before="40" w:after="40"/>
-            </w:pPr>
-            <w:r>
-              <w:rPr>
-                <w:rFonts w:ascii="Arial" w:hAnsi="Arial"/>
-                <w:rFonts w:ascii="Arial" w:hAnsi="Arial" w:cs="Arial"/>
-                <w:b w:val="0"/>
-                <w:i w:val="0"/>
-                <w:color w:val="4A5568"/>
+            <w:shd w:val="clear" w:color="auto" w:fill="E5EBF1"/>
+            <w:tcBorders>
+              <w:bottom w:val="single" w:sz="4" w:color="D0D5DD"/>
+            </w:tcBorders>
+            <w:vAlign w:val="center"/>
+          </w:tcPr>
+          <w:p>
+            <w:pPr>
+              <w:spacing w:before="40" w:after="40"/>
+            </w:pPr>
+            <w:r>
+              <w:rPr>
+                <w:rFonts w:ascii="Arial" w:hAnsi="Arial"/>
+                <w:rFonts w:ascii="Arial" w:hAnsi="Arial" w:cs="Arial"/>
+                <w:b/>
+                <w:i w:val="0"/>
+                <w:color w:val="0A2342"/>
                 <w:sz w:val="15"/>
               </w:rPr>
-              <w:t>Transfer-In</w:t>
-            </w:r>
-          </w:p>
-        </w:tc>
-        <w:tc>
-          <w:tcPr>
-            <w:tcW w:type="dxa" w:w="567"/>
-            <w:shd w:val="clear" w:color="auto" w:fill="FEF3C7"/>
-            <w:tcBorders>
-              <w:bottom w:val="single" w:sz="4" w:color="D0D5DD"/>
-            </w:tcBorders>
-            <w:vAlign w:val="center"/>
-          </w:tcPr>
-          <w:p>
-            <w:pPr>
-              <w:spacing w:before="40" w:after="40"/>
-            </w:pPr>
-            <w:r>
-              <w:rPr>
-                <w:rFonts w:ascii="Arial" w:hAnsi="Arial"/>
-                <w:rFonts w:ascii="Arial" w:hAnsi="Arial" w:cs="Arial"/>
-                <w:b w:val="0"/>
-                <w:i w:val="0"/>
-                <w:color w:val="4A5568"/>
+            </w:r>
+          </w:p>
+        </w:tc>
+        <w:tc>
+          <w:tcPr>
+            <w:tcW w:type="dxa" w:w="1361"/>
+            <w:shd w:val="clear" w:color="auto" w:fill="E5EBF1"/>
+            <w:tcBorders>
+              <w:bottom w:val="single" w:sz="4" w:color="D0D5DD"/>
+            </w:tcBorders>
+            <w:vAlign w:val="center"/>
+          </w:tcPr>
+          <w:p>
+            <w:pPr>
+              <w:spacing w:before="40" w:after="40"/>
+              <w:jc w:val="right"/>
+            </w:pPr>
+            <w:r>
+              <w:rPr>
+                <w:rFonts w:ascii="Arial" w:hAnsi="Arial"/>
+                <w:rFonts w:ascii="Arial" w:hAnsi="Arial" w:cs="Arial"/>
+                <w:b/>
+                <w:i w:val="0"/>
+                <w:color w:val="0A2342"/>
                 <w:sz w:val="15"/>
               </w:rPr>
-              <w:t>BTC</w:t>
-            </w:r>
-          </w:p>
-        </w:tc>
-        <w:tc>
-          <w:tcPr>
-            <w:tcW w:type="dxa" w:w="907"/>
-            <w:shd w:val="clear" w:color="auto" w:fill="FEF3C7"/>
-            <w:tcBorders>
-              <w:bottom w:val="single" w:sz="4" w:color="D0D5DD"/>
-            </w:tcBorders>
-            <w:vAlign w:val="center"/>
-          </w:tcPr>
-          <w:p>
-            <w:pPr>
-              <w:spacing w:before="40" w:after="40"/>
-            </w:pPr>
-            <w:r>
-              <w:rPr>
-                <w:rFonts w:ascii="Arial" w:hAnsi="Arial"/>
-                <w:rFonts w:ascii="Arial" w:hAnsi="Arial" w:cs="Arial"/>
-                <w:b w:val="0"/>
-                <w:i w:val="0"/>
-                <w:color w:val="4A5568"/>
+            </w:r>
+          </w:p>
+        </w:tc>
+        <w:tc>
+          <w:tcPr>
+            <w:tcW w:type="dxa" w:w="1361"/>
+            <w:shd w:val="clear" w:color="auto" w:fill="E5EBF1"/>
+            <w:tcBorders>
+              <w:bottom w:val="single" w:sz="4" w:color="D0D5DD"/>
+            </w:tcBorders>
+            <w:vAlign w:val="center"/>
+          </w:tcPr>
+          <w:p>
+            <w:pPr>
+              <w:spacing w:before="40" w:after="40"/>
+              <w:jc w:val="right"/>
+            </w:pPr>
+            <w:r>
+              <w:rPr>
+                <w:rFonts w:ascii="Arial" w:hAnsi="Arial"/>
+                <w:rFonts w:ascii="Arial" w:hAnsi="Arial" w:cs="Arial"/>
+                <w:b/>
+                <w:i w:val="0"/>
+                <w:color w:val="0A2342"/>
                 <w:sz w:val="15"/>
               </w:rPr>
-              <w:t>Bitcoin</w:t>
-            </w:r>
-          </w:p>
-        </w:tc>
-        <w:tc>
-          <w:tcPr>
-            <w:tcW w:type="dxa" w:w="1134"/>
-            <w:shd w:val="clear" w:color="auto" w:fill="FEF3C7"/>
-            <w:tcBorders>
-              <w:bottom w:val="single" w:sz="4" w:color="D0D5DD"/>
-            </w:tcBorders>
-            <w:vAlign w:val="center"/>
-          </w:tcPr>
-          <w:p>
-            <w:pPr>
-              <w:spacing w:before="40" w:after="40"/>
-              <w:jc w:val="right"/>
-            </w:pPr>
-            <w:r>
-              <w:rPr>
-                <w:rFonts w:ascii="Arial" w:hAnsi="Arial"/>
-                <w:rFonts w:ascii="Arial" w:hAnsi="Arial" w:cs="Arial"/>
-                <w:b w:val="0"/>
-                <w:i w:val="0"/>
-                <w:color w:val="4A5568"/>
-                <w:sz w:val="15"/>
-              </w:rPr>
-              <w:t>7.6800</w:t>
-            </w:r>
-          </w:p>
-        </w:tc>
-        <w:tc>
-          <w:tcPr>
-            <w:tcW w:type="dxa" w:w="1247"/>
-            <w:shd w:val="clear" w:color="auto" w:fill="FEF3C7"/>
-            <w:tcBorders>
-              <w:bottom w:val="single" w:sz="4" w:color="D0D5DD"/>
-            </w:tcBorders>
-            <w:vAlign w:val="center"/>
-          </w:tcPr>
-          <w:p>
-            <w:pPr>
-              <w:spacing w:before="40" w:after="40"/>
-              <w:jc w:val="right"/>
-            </w:pPr>
-            <w:r>
-              <w:rPr>
-                <w:rFonts w:ascii="Arial" w:hAnsi="Arial"/>
-                <w:rFonts w:ascii="Arial" w:hAnsi="Arial" w:cs="Arial"/>
-                <w:b w:val="0"/>
-                <w:i w:val="0"/>
-                <w:color w:val="4A5568"/>
-                <w:sz w:val="15"/>
-              </w:rPr>
-              <w:t>$586,310.40</w:t>
-            </w:r>
-          </w:p>
-        </w:tc>
-        <w:tc>
-          <w:tcPr>
-            <w:tcW w:type="dxa" w:w="1020"/>
-            <w:shd w:val="clear" w:color="auto" w:fill="FEF3C7"/>
-            <w:tcBorders>
-              <w:bottom w:val="single" w:sz="4" w:color="D0D5DD"/>
-            </w:tcBorders>
-            <w:vAlign w:val="center"/>
-          </w:tcPr>
-          <w:p>
-            <w:pPr>
-              <w:spacing w:before="40" w:after="40"/>
-              <w:jc w:val="right"/>
-            </w:pPr>
-            <w:r>
-              <w:rPr>
-                <w:rFonts w:ascii="Arial" w:hAnsi="Arial"/>
-                <w:rFonts w:ascii="Arial" w:hAnsi="Arial" w:cs="Arial"/>
-                <w:b w:val="0"/>
-                <w:i w:val="0"/>
-                <w:color w:val="4A5568"/>
-                <w:sz w:val="15"/>
-              </w:rPr>
-              <w:t>W20260422-3JT5</w:t>
-            </w:r>
-          </w:p>
-        </w:tc>
-        <w:tc>
-          <w:tcPr>
-            <w:tcW w:type="dxa" w:w="1531"/>
-            <w:shd w:val="clear" w:color="auto" w:fill="FEF3C7"/>
-            <w:tcBorders>
-              <w:bottom w:val="single" w:sz="4" w:color="D0D5DD"/>
-            </w:tcBorders>
-            <w:vAlign w:val="center"/>
-          </w:tcPr>
-          <w:p>
-            <w:pPr>
-              <w:spacing w:before="40" w:after="40"/>
-              <w:jc w:val="right"/>
-            </w:pPr>
-            <w:r>
-              <w:rPr>
-                <w:rFonts w:ascii="Arial" w:hAnsi="Arial"/>
-                <w:rFonts w:ascii="Arial" w:hAnsi="Arial" w:cs="Arial"/>
-                <w:b w:val="0"/>
-                <w:i w:val="0"/>
-                <w:color w:val="B45309"/>
-                <w:sz w:val="15"/>
-              </w:rPr>
-              <w:t>Travel Rule declaration pending</w:t>
-            </w:r>
-          </w:p>
-        </w:tc>
-      </w:tr>
-      <w:tr>
-        <w:tc>
-          <w:tcPr>
-            <w:tcW w:type="dxa" w:w="1247"/>
-            <w:shd w:val="clear" w:color="auto" w:fill="FEF3C7"/>
-            <w:tcBorders>
-              <w:bottom w:val="single" w:sz="4" w:color="D0D5DD"/>
-            </w:tcBorders>
-            <w:vAlign w:val="center"/>
-          </w:tcPr>
-          <w:p>
-            <w:pPr>
-              <w:spacing w:before="40" w:after="40"/>
-            </w:pPr>
-            <w:r>
-              <w:rPr>
-                <w:rFonts w:ascii="Arial" w:hAnsi="Arial"/>
-                <w:rFonts w:ascii="Arial" w:hAnsi="Arial" w:cs="Arial"/>
-                <w:b w:val="0"/>
-                <w:i w:val="0"/>
-                <w:color w:val="4A5568"/>
-                <w:sz w:val="15"/>
-              </w:rPr>
-              <w:t>2026-04-29 09:55 UTC</w:t>
-            </w:r>
-          </w:p>
-        </w:tc>
-        <w:tc>
-          <w:tcPr>
-            <w:tcW w:type="dxa" w:w="1417"/>
-            <w:shd w:val="clear" w:color="auto" w:fill="FEF3C7"/>
-            <w:tcBorders>
-              <w:bottom w:val="single" w:sz="4" w:color="D0D5DD"/>
-            </w:tcBorders>
-            <w:vAlign w:val="center"/>
-          </w:tcPr>
-          <w:p>
-            <w:pPr>
-              <w:spacing w:before="40" w:after="40"/>
-            </w:pPr>
-            <w:r>
-              <w:rPr>
-                <w:rFonts w:ascii="Arial" w:hAnsi="Arial"/>
-                <w:rFonts w:ascii="Arial" w:hAnsi="Arial" w:cs="Arial"/>
-                <w:b w:val="0"/>
-                <w:i w:val="0"/>
-                <w:color w:val="4A5568"/>
-                <w:sz w:val="15"/>
-              </w:rPr>
-              <w:t>Markets Settlement Wallet</w:t>
-            </w:r>
-          </w:p>
-        </w:tc>
-        <w:tc>
-          <w:tcPr>
-            <w:tcW w:type="dxa" w:w="1134"/>
-            <w:shd w:val="clear" w:color="auto" w:fill="FEF3C7"/>
-            <w:tcBorders>
-              <w:bottom w:val="single" w:sz="4" w:color="D0D5DD"/>
-            </w:tcBorders>
-            <w:vAlign w:val="center"/>
-          </w:tcPr>
-          <w:p>
-            <w:pPr>
-              <w:spacing w:before="40" w:after="40"/>
-            </w:pPr>
-            <w:r>
-              <w:rPr>
-                <w:rFonts w:ascii="Arial" w:hAnsi="Arial"/>
-                <w:rFonts w:ascii="Arial" w:hAnsi="Arial" w:cs="Arial"/>
-                <w:b w:val="0"/>
-                <w:i w:val="0"/>
-                <w:color w:val="4A5568"/>
-                <w:sz w:val="15"/>
-              </w:rPr>
-              <w:t>Transfer-Out</w:t>
-            </w:r>
-          </w:p>
-        </w:tc>
-        <w:tc>
-          <w:tcPr>
-            <w:tcW w:type="dxa" w:w="567"/>
-            <w:shd w:val="clear" w:color="auto" w:fill="FEF3C7"/>
-            <w:tcBorders>
-              <w:bottom w:val="single" w:sz="4" w:color="D0D5DD"/>
-            </w:tcBorders>
-            <w:vAlign w:val="center"/>
-          </w:tcPr>
-          <w:p>
-            <w:pPr>
-              <w:spacing w:before="40" w:after="40"/>
-            </w:pPr>
-            <w:r>
-              <w:rPr>
-                <w:rFonts w:ascii="Arial" w:hAnsi="Arial"/>
-                <w:rFonts w:ascii="Arial" w:hAnsi="Arial" w:cs="Arial"/>
-                <w:b w:val="0"/>
-                <w:i w:val="0"/>
-                <w:color w:val="4A5568"/>
-                <w:sz w:val="15"/>
-              </w:rPr>
-              <w:t>BTC</w:t>
-            </w:r>
-          </w:p>
-        </w:tc>
-        <w:tc>
-          <w:tcPr>
-            <w:tcW w:type="dxa" w:w="907"/>
-            <w:shd w:val="clear" w:color="auto" w:fill="FEF3C7"/>
-            <w:tcBorders>
-              <w:bottom w:val="single" w:sz="4" w:color="D0D5DD"/>
-            </w:tcBorders>
-            <w:vAlign w:val="center"/>
-          </w:tcPr>
-          <w:p>
-            <w:pPr>
-              <w:spacing w:before="40" w:after="40"/>
-            </w:pPr>
-            <w:r>
-              <w:rPr>
-                <w:rFonts w:ascii="Arial" w:hAnsi="Arial"/>
-                <w:rFonts w:ascii="Arial" w:hAnsi="Arial" w:cs="Arial"/>
-                <w:b w:val="0"/>
-                <w:i w:val="0"/>
-                <w:color w:val="4A5568"/>
-                <w:sz w:val="15"/>
-              </w:rPr>
-              <w:t>Bitcoin</w:t>
-            </w:r>
-          </w:p>
-        </w:tc>
-        <w:tc>
-          <w:tcPr>
-            <w:tcW w:type="dxa" w:w="1134"/>
-            <w:shd w:val="clear" w:color="auto" w:fill="FEF3C7"/>
-            <w:tcBorders>
-              <w:bottom w:val="single" w:sz="4" w:color="D0D5DD"/>
-            </w:tcBorders>
-            <w:vAlign w:val="center"/>
-          </w:tcPr>
-          <w:p>
-            <w:pPr>
-              <w:spacing w:before="40" w:after="40"/>
-              <w:jc w:val="right"/>
-            </w:pPr>
-            <w:r>
-              <w:rPr>
-                <w:rFonts w:ascii="Arial" w:hAnsi="Arial"/>
-                <w:rFonts w:ascii="Arial" w:hAnsi="Arial" w:cs="Arial"/>
-                <w:b w:val="0"/>
-                <w:i w:val="0"/>
-                <w:color w:val="4A5568"/>
-                <w:sz w:val="15"/>
-              </w:rPr>
-              <w:t>-0.50000000</w:t>
-            </w:r>
-          </w:p>
-        </w:tc>
-        <w:tc>
-          <w:tcPr>
-            <w:tcW w:type="dxa" w:w="1247"/>
-            <w:shd w:val="clear" w:color="auto" w:fill="FEF3C7"/>
-            <w:tcBorders>
-              <w:bottom w:val="single" w:sz="4" w:color="D0D5DD"/>
-            </w:tcBorders>
-            <w:vAlign w:val="center"/>
-          </w:tcPr>
-          <w:p>
-            <w:pPr>
-              <w:spacing w:before="40" w:after="40"/>
-              <w:jc w:val="right"/>
-            </w:pPr>
-            <w:r>
-              <w:rPr>
-                <w:rFonts w:ascii="Arial" w:hAnsi="Arial"/>
-                <w:rFonts w:ascii="Arial" w:hAnsi="Arial" w:cs="Arial"/>
-                <w:b w:val="0"/>
-                <w:i w:val="0"/>
-                <w:color w:val="4A5568"/>
-                <w:sz w:val="15"/>
-              </w:rPr>
-              <w:t>-$38,212.50</w:t>
-            </w:r>
-          </w:p>
-        </w:tc>
-        <w:tc>
-          <w:tcPr>
-            <w:tcW w:type="dxa" w:w="1020"/>
-            <w:shd w:val="clear" w:color="auto" w:fill="FEF3C7"/>
-            <w:tcBorders>
-              <w:bottom w:val="single" w:sz="4" w:color="D0D5DD"/>
-            </w:tcBorders>
-            <w:vAlign w:val="center"/>
-          </w:tcPr>
-          <w:p>
-            <w:pPr>
-              <w:spacing w:before="40" w:after="40"/>
-              <w:jc w:val="right"/>
-            </w:pPr>
-            <w:r>
-              <w:rPr>
-                <w:rFonts w:ascii="Arial" w:hAnsi="Arial"/>
-                <w:rFonts w:ascii="Arial" w:hAnsi="Arial" w:cs="Arial"/>
-                <w:b w:val="0"/>
-                <w:i w:val="0"/>
-                <w:color w:val="4A5568"/>
-                <w:sz w:val="15"/>
-              </w:rPr>
-              <w:t>W20260429-QR03</w:t>
-            </w:r>
-          </w:p>
-        </w:tc>
-        <w:tc>
-          <w:tcPr>
-            <w:tcW w:type="dxa" w:w="1531"/>
-            <w:shd w:val="clear" w:color="auto" w:fill="FEF3C7"/>
-            <w:tcBorders>
-              <w:bottom w:val="single" w:sz="4" w:color="D0D5DD"/>
-            </w:tcBorders>
-            <w:vAlign w:val="center"/>
-          </w:tcPr>
-          <w:p>
-            <w:pPr>
-              <w:spacing w:before="40" w:after="40"/>
-              <w:jc w:val="right"/>
-            </w:pPr>
-            <w:r>
-              <w:rPr>
-                <w:rFonts w:ascii="Arial" w:hAnsi="Arial"/>
-                <w:rFonts w:ascii="Arial" w:hAnsi="Arial" w:cs="Arial"/>
-                <w:b w:val="0"/>
-                <w:i w:val="0"/>
-                <w:color w:val="B45309"/>
-                <w:sz w:val="15"/>
-              </w:rPr>
-              <w:t>Quorum approval pending</w:t>
-            </w:r>
-          </w:p>
-        </w:tc>
-      </w:tr>
-      <w:tr>
-        <w:tc>
-          <w:tcPr>
-            <w:tcW w:type="dxa" w:w="1247"/>
-            <w:shd w:val="clear" w:color="auto" w:fill="FEF3C7"/>
-            <w:tcBorders>
-              <w:bottom w:val="single" w:sz="4" w:color="D0D5DD"/>
-            </w:tcBorders>
-            <w:vAlign w:val="center"/>
-          </w:tcPr>
-          <w:p>
-            <w:pPr>
-              <w:spacing w:before="40" w:after="40"/>
-            </w:pPr>
-            <w:r>
-              <w:rPr>
-                <w:rFonts w:ascii="Arial" w:hAnsi="Arial"/>
-                <w:rFonts w:ascii="Arial" w:hAnsi="Arial" w:cs="Arial"/>
-                <w:b w:val="0"/>
-                <w:i w:val="0"/>
-                <w:color w:val="4A5568"/>
-                <w:sz w:val="15"/>
-              </w:rPr>
-              <w:t>2026-04-30 18:42 UTC</w:t>
-            </w:r>
-          </w:p>
-        </w:tc>
-        <w:tc>
-          <w:tcPr>
-            <w:tcW w:type="dxa" w:w="1417"/>
-            <w:shd w:val="clear" w:color="auto" w:fill="FEF3C7"/>
-            <w:tcBorders>
-              <w:bottom w:val="single" w:sz="4" w:color="D0D5DD"/>
-            </w:tcBorders>
-            <w:vAlign w:val="center"/>
-          </w:tcPr>
-          <w:p>
-            <w:pPr>
-              <w:spacing w:before="40" w:after="40"/>
-            </w:pPr>
-            <w:r>
-              <w:rPr>
-                <w:rFonts w:ascii="Arial" w:hAnsi="Arial"/>
-                <w:rFonts w:ascii="Arial" w:hAnsi="Arial" w:cs="Arial"/>
-                <w:b w:val="0"/>
-                <w:i w:val="0"/>
-                <w:color w:val="4A5568"/>
-                <w:sz w:val="15"/>
-              </w:rPr>
-              <w:t>Client Settlement Wallet</w:t>
-            </w:r>
-          </w:p>
-        </w:tc>
-        <w:tc>
-          <w:tcPr>
-            <w:tcW w:type="dxa" w:w="1134"/>
-            <w:shd w:val="clear" w:color="auto" w:fill="FEF3C7"/>
-            <w:tcBorders>
-              <w:bottom w:val="single" w:sz="4" w:color="D0D5DD"/>
-            </w:tcBorders>
-            <w:vAlign w:val="center"/>
-          </w:tcPr>
-          <w:p>
-            <w:pPr>
-              <w:spacing w:before="40" w:after="40"/>
-            </w:pPr>
-            <w:r>
-              <w:rPr>
-                <w:rFonts w:ascii="Arial" w:hAnsi="Arial"/>
-                <w:rFonts w:ascii="Arial" w:hAnsi="Arial" w:cs="Arial"/>
-                <w:b w:val="0"/>
-                <w:i w:val="0"/>
-                <w:color w:val="4A5568"/>
-                <w:sz w:val="15"/>
-              </w:rPr>
-              <w:t>Transfer-Out</w:t>
-            </w:r>
-          </w:p>
-        </w:tc>
-        <w:tc>
-          <w:tcPr>
-            <w:tcW w:type="dxa" w:w="567"/>
-            <w:shd w:val="clear" w:color="auto" w:fill="FEF3C7"/>
-            <w:tcBorders>
-              <w:bottom w:val="single" w:sz="4" w:color="D0D5DD"/>
-            </w:tcBorders>
-            <w:vAlign w:val="center"/>
-          </w:tcPr>
-          <w:p>
-            <w:pPr>
-              <w:spacing w:before="40" w:after="40"/>
-            </w:pPr>
-            <w:r>
-              <w:rPr>
-                <w:rFonts w:ascii="Arial" w:hAnsi="Arial"/>
-                <w:rFonts w:ascii="Arial" w:hAnsi="Arial" w:cs="Arial"/>
-                <w:b w:val="0"/>
-                <w:i w:val="0"/>
-                <w:color w:val="4A5568"/>
-                <w:sz w:val="15"/>
-              </w:rPr>
-              <w:t>USDC</w:t>
-            </w:r>
-          </w:p>
-        </w:tc>
-        <w:tc>
-          <w:tcPr>
-            <w:tcW w:type="dxa" w:w="907"/>
-            <w:shd w:val="clear" w:color="auto" w:fill="FEF3C7"/>
-            <w:tcBorders>
-              <w:bottom w:val="single" w:sz="4" w:color="D0D5DD"/>
-            </w:tcBorders>
-            <w:vAlign w:val="center"/>
-          </w:tcPr>
-          <w:p>
-            <w:pPr>
-              <w:spacing w:before="40" w:after="40"/>
-            </w:pPr>
-            <w:r>
-              <w:rPr>
-                <w:rFonts w:ascii="Arial" w:hAnsi="Arial"/>
-                <w:rFonts w:ascii="Arial" w:hAnsi="Arial" w:cs="Arial"/>
-                <w:b w:val="0"/>
-                <w:i w:val="0"/>
-                <w:color w:val="4A5568"/>
-                <w:sz w:val="15"/>
-              </w:rPr>
-              <w:t>Ethereum</w:t>
-            </w:r>
-          </w:p>
-        </w:tc>
-        <w:tc>
-          <w:tcPr>
-            <w:tcW w:type="dxa" w:w="1134"/>
-            <w:shd w:val="clear" w:color="auto" w:fill="FEF3C7"/>
-            <w:tcBorders>
-              <w:bottom w:val="single" w:sz="4" w:color="D0D5DD"/>
-            </w:tcBorders>
-            <w:vAlign w:val="center"/>
-          </w:tcPr>
-          <w:p>
-            <w:pPr>
-              <w:spacing w:before="40" w:after="40"/>
-              <w:jc w:val="right"/>
-            </w:pPr>
-            <w:r>
-              <w:rPr>
-                <w:rFonts w:ascii="Arial" w:hAnsi="Arial"/>
-                <w:rFonts w:ascii="Arial" w:hAnsi="Arial" w:cs="Arial"/>
-                <w:b w:val="0"/>
-                <w:i w:val="0"/>
-                <w:color w:val="4A5568"/>
-                <w:sz w:val="15"/>
-              </w:rPr>
-              <w:t>-250,000.0000</w:t>
-            </w:r>
-          </w:p>
-        </w:tc>
-        <w:tc>
-          <w:tcPr>
-            <w:tcW w:type="dxa" w:w="1247"/>
-            <w:shd w:val="clear" w:color="auto" w:fill="FEF3C7"/>
-            <w:tcBorders>
-              <w:bottom w:val="single" w:sz="4" w:color="D0D5DD"/>
-            </w:tcBorders>
-            <w:vAlign w:val="center"/>
-          </w:tcPr>
-          <w:p>
-            <w:pPr>
-              <w:spacing w:before="40" w:after="40"/>
-              <w:jc w:val="right"/>
-            </w:pPr>
-            <w:r>
-              <w:rPr>
-                <w:rFonts w:ascii="Arial" w:hAnsi="Arial"/>
-                <w:rFonts w:ascii="Arial" w:hAnsi="Arial" w:cs="Arial"/>
-                <w:b w:val="0"/>
-                <w:i w:val="0"/>
-                <w:color w:val="4A5568"/>
-                <w:sz w:val="15"/>
-              </w:rPr>
-              <w:t>-$249,750.00</w:t>
-            </w:r>
-          </w:p>
-        </w:tc>
-        <w:tc>
-          <w:tcPr>
-            <w:tcW w:type="dxa" w:w="1020"/>
-            <w:shd w:val="clear" w:color="auto" w:fill="FEF3C7"/>
-            <w:tcBorders>
-              <w:bottom w:val="single" w:sz="4" w:color="D0D5DD"/>
-            </w:tcBorders>
-            <w:vAlign w:val="center"/>
-          </w:tcPr>
-          <w:p>
-            <w:pPr>
-              <w:spacing w:before="40" w:after="40"/>
-              <w:jc w:val="right"/>
-            </w:pPr>
-            <w:r>
-              <w:rPr>
-                <w:rFonts w:ascii="Arial" w:hAnsi="Arial"/>
-                <w:rFonts w:ascii="Arial" w:hAnsi="Arial" w:cs="Arial"/>
-                <w:b w:val="0"/>
-                <w:i w:val="0"/>
-                <w:color w:val="4A5568"/>
-                <w:sz w:val="15"/>
-              </w:rPr>
-              <w:t>W20260430-MK87</w:t>
-            </w:r>
-          </w:p>
-        </w:tc>
-        <w:tc>
-          <w:tcPr>
-            <w:tcW w:type="dxa" w:w="1531"/>
-            <w:shd w:val="clear" w:color="auto" w:fill="FEF3C7"/>
-            <w:tcBorders>
-              <w:bottom w:val="single" w:sz="4" w:color="D0D5DD"/>
-            </w:tcBorders>
-            <w:vAlign w:val="center"/>
-          </w:tcPr>
-          <w:p>
-            <w:pPr>
-              <w:spacing w:before="40" w:after="40"/>
-              <w:jc w:val="right"/>
-            </w:pPr>
-            <w:r>
-              <w:rPr>
-                <w:rFonts w:ascii="Arial" w:hAnsi="Arial"/>
-                <w:rFonts w:ascii="Arial" w:hAnsi="Arial" w:cs="Arial"/>
-                <w:b w:val="0"/>
-                <w:i w:val="0"/>
-                <w:color w:val="B45309"/>
-                <w:sz w:val="15"/>
-              </w:rPr>
-              <w:t>Quorum approval pending</w:t>
-            </w:r>
-          </w:p>
-        </w:tc>
-      </w:tr>
-      <w:tr>
-        <w:tc>
-          <w:tcPr>
-            <w:tcW w:type="dxa" w:w="1247"/>
-            <w:shd w:val="clear" w:color="auto" w:fill="FEF3C7"/>
-            <w:tcBorders>
-              <w:bottom w:val="single" w:sz="4" w:color="D0D5DD"/>
-            </w:tcBorders>
-            <w:vAlign w:val="center"/>
-          </w:tcPr>
-          <w:p>
-            <w:pPr>
-              <w:spacing w:before="40" w:after="40"/>
-            </w:pPr>
-            <w:r>
-              <w:rPr>
-                <w:rFonts w:ascii="Arial" w:hAnsi="Arial"/>
-                <w:rFonts w:ascii="Arial" w:hAnsi="Arial" w:cs="Arial"/>
-                <w:b w:val="0"/>
-                <w:i w:val="0"/>
-                <w:color w:val="4A5568"/>
-                <w:sz w:val="15"/>
-              </w:rPr>
-              <w:t>2026-04-30 22:15 UTC</w:t>
-            </w:r>
-          </w:p>
-        </w:tc>
-        <w:tc>
-          <w:tcPr>
-            <w:tcW w:type="dxa" w:w="1417"/>
-            <w:shd w:val="clear" w:color="auto" w:fill="FEF3C7"/>
-            <w:tcBorders>
-              <w:bottom w:val="single" w:sz="4" w:color="D0D5DD"/>
-            </w:tcBorders>
-            <w:vAlign w:val="center"/>
-          </w:tcPr>
-          <w:p>
-            <w:pPr>
-              <w:spacing w:before="40" w:after="40"/>
-            </w:pPr>
-            <w:r>
-              <w:rPr>
-                <w:rFonts w:ascii="Arial" w:hAnsi="Arial"/>
-                <w:rFonts w:ascii="Arial" w:hAnsi="Arial" w:cs="Arial"/>
-                <w:b w:val="0"/>
-                <w:i w:val="0"/>
-                <w:color w:val="4A5568"/>
-                <w:sz w:val="15"/>
-              </w:rPr>
-              <w:t>Markets Settlement Wallet</w:t>
-            </w:r>
-          </w:p>
-        </w:tc>
-        <w:tc>
-          <w:tcPr>
-            <w:tcW w:type="dxa" w:w="1134"/>
-            <w:shd w:val="clear" w:color="auto" w:fill="FEF3C7"/>
-            <w:tcBorders>
-              <w:bottom w:val="single" w:sz="4" w:color="D0D5DD"/>
-            </w:tcBorders>
-            <w:vAlign w:val="center"/>
-          </w:tcPr>
-          <w:p>
-            <w:pPr>
-              <w:spacing w:before="40" w:after="40"/>
-            </w:pPr>
-            <w:r>
-              <w:rPr>
-                <w:rFonts w:ascii="Arial" w:hAnsi="Arial"/>
-                <w:rFonts w:ascii="Arial" w:hAnsi="Arial" w:cs="Arial"/>
-                <w:b w:val="0"/>
-                <w:i w:val="0"/>
-                <w:color w:val="4A5568"/>
-                <w:sz w:val="15"/>
-              </w:rPr>
-              <w:t>Transfer-Out</w:t>
-            </w:r>
-          </w:p>
-        </w:tc>
-        <w:tc>
-          <w:tcPr>
-            <w:tcW w:type="dxa" w:w="567"/>
-            <w:shd w:val="clear" w:color="auto" w:fill="FEF3C7"/>
-            <w:tcBorders>
-              <w:bottom w:val="single" w:sz="4" w:color="D0D5DD"/>
-            </w:tcBorders>
-            <w:vAlign w:val="center"/>
-          </w:tcPr>
-          <w:p>
-            <w:pPr>
-              <w:spacing w:before="40" w:after="40"/>
-            </w:pPr>
-            <w:r>
-              <w:rPr>
-                <w:rFonts w:ascii="Arial" w:hAnsi="Arial"/>
-                <w:rFonts w:ascii="Arial" w:hAnsi="Arial" w:cs="Arial"/>
-                <w:b w:val="0"/>
-                <w:i w:val="0"/>
-                <w:color w:val="4A5568"/>
-                <w:sz w:val="15"/>
-              </w:rPr>
-              <w:t>USDT</w:t>
-            </w:r>
-          </w:p>
-        </w:tc>
-        <w:tc>
-          <w:tcPr>
-            <w:tcW w:type="dxa" w:w="907"/>
-            <w:shd w:val="clear" w:color="auto" w:fill="FEF3C7"/>
-            <w:tcBorders>
-              <w:bottom w:val="single" w:sz="4" w:color="D0D5DD"/>
-            </w:tcBorders>
-            <w:vAlign w:val="center"/>
-          </w:tcPr>
-          <w:p>
-            <w:pPr>
-              <w:spacing w:before="40" w:after="40"/>
-            </w:pPr>
-            <w:r>
-              <w:rPr>
-                <w:rFonts w:ascii="Arial" w:hAnsi="Arial"/>
-                <w:rFonts w:ascii="Arial" w:hAnsi="Arial" w:cs="Arial"/>
-                <w:b w:val="0"/>
-                <w:i w:val="0"/>
-                <w:color w:val="4A5568"/>
-                <w:sz w:val="15"/>
-              </w:rPr>
-              <w:t>Tron</w:t>
-            </w:r>
-          </w:p>
-        </w:tc>
-        <w:tc>
-          <w:tcPr>
-            <w:tcW w:type="dxa" w:w="1134"/>
-            <w:shd w:val="clear" w:color="auto" w:fill="FEF3C7"/>
-            <w:tcBorders>
-              <w:bottom w:val="single" w:sz="4" w:color="D0D5DD"/>
-            </w:tcBorders>
-            <w:vAlign w:val="center"/>
-          </w:tcPr>
-          <w:p>
-            <w:pPr>
-              <w:spacing w:before="40" w:after="40"/>
-              <w:jc w:val="right"/>
-            </w:pPr>
-            <w:r>
-              <w:rPr>
-                <w:rFonts w:ascii="Arial" w:hAnsi="Arial"/>
-                <w:rFonts w:ascii="Arial" w:hAnsi="Arial" w:cs="Arial"/>
-                <w:b w:val="0"/>
-                <w:i w:val="0"/>
-                <w:color w:val="4A5568"/>
-                <w:sz w:val="15"/>
-              </w:rPr>
-              <w:t>-180,000.0000</w:t>
-            </w:r>
-          </w:p>
-        </w:tc>
-        <w:tc>
-          <w:tcPr>
-            <w:tcW w:type="dxa" w:w="1247"/>
-            <w:shd w:val="clear" w:color="auto" w:fill="FEF3C7"/>
-            <w:tcBorders>
-              <w:bottom w:val="single" w:sz="4" w:color="D0D5DD"/>
-            </w:tcBorders>
-            <w:vAlign w:val="center"/>
-          </w:tcPr>
-          <w:p>
-            <w:pPr>
-              <w:spacing w:before="40" w:after="40"/>
-              <w:jc w:val="right"/>
-            </w:pPr>
-            <w:r>
-              <w:rPr>
-                <w:rFonts w:ascii="Arial" w:hAnsi="Arial"/>
-                <w:rFonts w:ascii="Arial" w:hAnsi="Arial" w:cs="Arial"/>
-                <w:b w:val="0"/>
-                <w:i w:val="0"/>
-                <w:color w:val="4A5568"/>
-                <w:sz w:val="15"/>
-              </w:rPr>
-              <w:t>-$179,820.00</w:t>
-            </w:r>
-          </w:p>
-        </w:tc>
-        <w:tc>
-          <w:tcPr>
-            <w:tcW w:type="dxa" w:w="1020"/>
-            <w:shd w:val="clear" w:color="auto" w:fill="FEF3C7"/>
-            <w:tcBorders>
-              <w:bottom w:val="single" w:sz="4" w:color="D0D5DD"/>
-            </w:tcBorders>
-            <w:vAlign w:val="center"/>
-          </w:tcPr>
-          <w:p>
-            <w:pPr>
-              <w:spacing w:before="40" w:after="40"/>
-              <w:jc w:val="right"/>
-            </w:pPr>
-            <w:r>
-              <w:rPr>
-                <w:rFonts w:ascii="Arial" w:hAnsi="Arial"/>
-                <w:rFonts w:ascii="Arial" w:hAnsi="Arial" w:cs="Arial"/>
-                <w:b w:val="0"/>
-                <w:i w:val="0"/>
-                <w:color w:val="4A5568"/>
-                <w:sz w:val="15"/>
-              </w:rPr>
-              <w:t>W20260430-CP12</w:t>
-            </w:r>
-          </w:p>
-        </w:tc>
-        <w:tc>
-          <w:tcPr>
-            <w:tcW w:type="dxa" w:w="1531"/>
-            <w:shd w:val="clear" w:color="auto" w:fill="FEF3C7"/>
-            <w:tcBorders>
-              <w:bottom w:val="single" w:sz="4" w:color="D0D5DD"/>
-            </w:tcBorders>
-            <w:vAlign w:val="center"/>
-          </w:tcPr>
-          <w:p>
-            <w:pPr>
-              <w:spacing w:before="40" w:after="40"/>
-              <w:jc w:val="right"/>
-            </w:pPr>
-            <w:r>
-              <w:rPr>
-                <w:rFonts w:ascii="Arial" w:hAnsi="Arial"/>
-                <w:rFonts w:ascii="Arial" w:hAnsi="Arial" w:cs="Arial"/>
-                <w:b w:val="0"/>
-                <w:i w:val="0"/>
-                <w:color w:val="B45309"/>
-                <w:sz w:val="15"/>
-              </w:rPr>
-              <w:t>Quorum approval pending</w:t>
-            </w:r>
-          </w:p>
-        </w:tc>
-      </w:tr>
-      <w:tr>
+              <w:t>$1,570,109.07</w:t>
+            </w:r>
+          </w:p>
+        </w:tc>
         <w:tc>
           <w:tcPr>
             <w:tcW w:type="dxa" w:w="1247"/>
@@ -20577,6 +21054,7 @@
           <w:p>
             <w:pPr>
               <w:spacing w:before="40" w:after="40"/>
+              <w:jc w:val="right"/>
             </w:pPr>
             <w:r>
               <w:rPr>
@@ -20587,192 +21065,12 @@
                 <w:color w:val="0A2342"/>
                 <w:sz w:val="15"/>
               </w:rPr>
-              <w:t>Total (6 pending)</w:t>
-            </w:r>
-          </w:p>
-        </w:tc>
-        <w:tc>
-          <w:tcPr>
-            <w:tcW w:type="dxa" w:w="1417"/>
-            <w:shd w:val="clear" w:color="auto" w:fill="E5EBF1"/>
-            <w:tcBorders>
-              <w:bottom w:val="single" w:sz="4" w:color="D0D5DD"/>
-            </w:tcBorders>
-            <w:vAlign w:val="center"/>
-          </w:tcPr>
-          <w:p>
-            <w:pPr>
-              <w:spacing w:before="40" w:after="40"/>
-            </w:pPr>
-            <w:r>
-              <w:rPr>
-                <w:rFonts w:ascii="Arial" w:hAnsi="Arial"/>
-                <w:rFonts w:ascii="Arial" w:hAnsi="Arial" w:cs="Arial"/>
-                <w:b/>
-                <w:i w:val="0"/>
-                <w:color w:val="0A2342"/>
-                <w:sz w:val="15"/>
-              </w:rPr>
-            </w:r>
-          </w:p>
-        </w:tc>
-        <w:tc>
-          <w:tcPr>
-            <w:tcW w:type="dxa" w:w="1134"/>
-            <w:shd w:val="clear" w:color="auto" w:fill="E5EBF1"/>
-            <w:tcBorders>
-              <w:bottom w:val="single" w:sz="4" w:color="D0D5DD"/>
-            </w:tcBorders>
-            <w:vAlign w:val="center"/>
-          </w:tcPr>
-          <w:p>
-            <w:pPr>
-              <w:spacing w:before="40" w:after="40"/>
-            </w:pPr>
-            <w:r>
-              <w:rPr>
-                <w:rFonts w:ascii="Arial" w:hAnsi="Arial"/>
-                <w:rFonts w:ascii="Arial" w:hAnsi="Arial" w:cs="Arial"/>
-                <w:b/>
-                <w:i w:val="0"/>
-                <w:color w:val="0A2342"/>
-                <w:sz w:val="15"/>
-              </w:rPr>
-            </w:r>
-          </w:p>
-        </w:tc>
-        <w:tc>
-          <w:tcPr>
-            <w:tcW w:type="dxa" w:w="567"/>
-            <w:shd w:val="clear" w:color="auto" w:fill="E5EBF1"/>
-            <w:tcBorders>
-              <w:bottom w:val="single" w:sz="4" w:color="D0D5DD"/>
-            </w:tcBorders>
-            <w:vAlign w:val="center"/>
-          </w:tcPr>
-          <w:p>
-            <w:pPr>
-              <w:spacing w:before="40" w:after="40"/>
-            </w:pPr>
-            <w:r>
-              <w:rPr>
-                <w:rFonts w:ascii="Arial" w:hAnsi="Arial"/>
-                <w:rFonts w:ascii="Arial" w:hAnsi="Arial" w:cs="Arial"/>
-                <w:b/>
-                <w:i w:val="0"/>
-                <w:color w:val="0A2342"/>
-                <w:sz w:val="15"/>
-              </w:rPr>
-            </w:r>
-          </w:p>
-        </w:tc>
-        <w:tc>
-          <w:tcPr>
-            <w:tcW w:type="dxa" w:w="907"/>
-            <w:shd w:val="clear" w:color="auto" w:fill="E5EBF1"/>
-            <w:tcBorders>
-              <w:bottom w:val="single" w:sz="4" w:color="D0D5DD"/>
-            </w:tcBorders>
-            <w:vAlign w:val="center"/>
-          </w:tcPr>
-          <w:p>
-            <w:pPr>
-              <w:spacing w:before="40" w:after="40"/>
-            </w:pPr>
-            <w:r>
-              <w:rPr>
-                <w:rFonts w:ascii="Arial" w:hAnsi="Arial"/>
-                <w:rFonts w:ascii="Arial" w:hAnsi="Arial" w:cs="Arial"/>
-                <w:b/>
-                <w:i w:val="0"/>
-                <w:color w:val="0A2342"/>
-                <w:sz w:val="15"/>
-              </w:rPr>
-            </w:r>
-          </w:p>
-        </w:tc>
-        <w:tc>
-          <w:tcPr>
-            <w:tcW w:type="dxa" w:w="1134"/>
-            <w:shd w:val="clear" w:color="auto" w:fill="E5EBF1"/>
-            <w:tcBorders>
-              <w:bottom w:val="single" w:sz="4" w:color="D0D5DD"/>
-            </w:tcBorders>
-            <w:vAlign w:val="center"/>
-          </w:tcPr>
-          <w:p>
-            <w:pPr>
-              <w:spacing w:before="40" w:after="40"/>
-              <w:jc w:val="right"/>
-            </w:pPr>
-            <w:r>
-              <w:rPr>
-                <w:rFonts w:ascii="Arial" w:hAnsi="Arial"/>
-                <w:rFonts w:ascii="Arial" w:hAnsi="Arial" w:cs="Arial"/>
-                <w:b/>
-                <w:i w:val="0"/>
-                <w:color w:val="0A2342"/>
-                <w:sz w:val="15"/>
-              </w:rPr>
-            </w:r>
-          </w:p>
-        </w:tc>
-        <w:tc>
-          <w:tcPr>
-            <w:tcW w:type="dxa" w:w="1247"/>
-            <w:shd w:val="clear" w:color="auto" w:fill="E5EBF1"/>
-            <w:tcBorders>
-              <w:bottom w:val="single" w:sz="4" w:color="D0D5DD"/>
-            </w:tcBorders>
-            <w:vAlign w:val="center"/>
-          </w:tcPr>
-          <w:p>
-            <w:pPr>
-              <w:spacing w:before="40" w:after="40"/>
-              <w:jc w:val="right"/>
-            </w:pPr>
-            <w:r>
-              <w:rPr>
-                <w:rFonts w:ascii="Arial" w:hAnsi="Arial"/>
-                <w:rFonts w:ascii="Arial" w:hAnsi="Arial" w:cs="Arial"/>
-                <w:b/>
-                <w:i w:val="0"/>
-                <w:color w:val="0A2342"/>
-                <w:sz w:val="15"/>
-              </w:rPr>
-              <w:t>$2,406,169.47</w:t>
-            </w:r>
-          </w:p>
-        </w:tc>
-        <w:tc>
-          <w:tcPr>
-            <w:tcW w:type="dxa" w:w="1020"/>
-            <w:shd w:val="clear" w:color="auto" w:fill="E5EBF1"/>
-            <w:tcBorders>
-              <w:bottom w:val="single" w:sz="4" w:color="D0D5DD"/>
-            </w:tcBorders>
-            <w:vAlign w:val="center"/>
-          </w:tcPr>
-          <w:p>
-            <w:pPr>
-              <w:spacing w:before="40" w:after="40"/>
-              <w:jc w:val="right"/>
-            </w:pPr>
-            <w:r>
-              <w:rPr>
-                <w:rFonts w:ascii="Arial" w:hAnsi="Arial"/>
-                <w:rFonts w:ascii="Arial" w:hAnsi="Arial" w:cs="Arial"/>
-                <w:b/>
-                <w:i w:val="0"/>
-                <w:color w:val="0A2342"/>
-                <w:sz w:val="15"/>
-              </w:rPr>
-            </w:r>
-          </w:p>
-        </w:tc>
-        <w:tc>
-          <w:tcPr>
-            <w:tcW w:type="dxa" w:w="1531"/>
+            </w:r>
+          </w:p>
+        </w:tc>
+        <w:tc>
+          <w:tcPr>
+            <w:tcW w:type="dxa" w:w="1587"/>
             <w:shd w:val="clear" w:color="auto" w:fill="E5EBF1"/>
             <w:tcBorders>
               <w:bottom w:val="single" w:sz="4" w:color="D0D5DD"/>

</xml_diff>

<commit_message>
Per-vault Pending Transactions: place after Transactions, before NFT balance
Co-Authored-By: Claude Opus 4.7 <noreply@anthropic.com>
</commit_message>
<xml_diff>
--- a/mockup/monthly_client_statement/sample-statements/Custody_Detailed_sample.docx
+++ b/mockup/monthly_client_statement/sample-statements/Custody_Detailed_sample.docx
@@ -9072,463 +9072,6 @@
           <w:color w:val="0F2A4D"/>
           <w:sz w:val="20"/>
         </w:rPr>
-        <w:t>NFT balance</w:t>
-      </w:r>
-    </w:p>
-    <w:tbl>
-      <w:tblPr>
-        <w:tblW w:type="auto" w:w="0"/>
-        <w:jc w:val="left"/>
-        <w:tblLayout w:type="fixed"/>
-        <w:tblLook w:firstColumn="1" w:firstRow="1" w:lastColumn="0" w:lastRow="0" w:noHBand="0" w:noVBand="1" w:val="04A0"/>
-      </w:tblPr>
-      <w:tblGrid>
-        <w:gridCol w:w="5839"/>
-        <w:gridCol w:w="2324"/>
-        <w:gridCol w:w="2041"/>
-      </w:tblGrid>
-      <w:tr>
-        <w:trPr>
-          <w:trHeight w:val="420" w:hRule="atLeast"/>
-        </w:trPr>
-        <w:tc>
-          <w:tcPr>
-            <w:tcW w:type="dxa" w:w="5839"/>
-            <w:shd w:val="clear" w:color="auto" w:fill="0A2342"/>
-            <w:tcBorders>
-              <w:top w:val="nil"/>
-            </w:tcBorders>
-            <w:tcBorders>
-              <w:bottom w:val="nil"/>
-            </w:tcBorders>
-            <w:tcBorders>
-              <w:left w:val="nil"/>
-            </w:tcBorders>
-            <w:tcBorders>
-              <w:right w:val="nil"/>
-            </w:tcBorders>
-            <w:vAlign w:val="center"/>
-          </w:tcPr>
-          <w:p>
-            <w:pPr>
-              <w:spacing w:before="0" w:after="0"/>
-            </w:pPr>
-            <w:r>
-              <w:rPr>
-                <w:rFonts w:ascii="Arial" w:hAnsi="Arial"/>
-                <w:rFonts w:ascii="Arial" w:hAnsi="Arial" w:cs="Arial"/>
-                <w:b/>
-                <w:i w:val="0"/>
-                <w:color w:val="FFFFFF"/>
-                <w:sz w:val="17"/>
-              </w:rPr>
-              <w:t>Asset — NFT</w:t>
-            </w:r>
-          </w:p>
-        </w:tc>
-        <w:tc>
-          <w:tcPr>
-            <w:tcW w:type="dxa" w:w="2324"/>
-            <w:shd w:val="clear" w:color="auto" w:fill="0A2342"/>
-            <w:tcBorders>
-              <w:top w:val="nil"/>
-            </w:tcBorders>
-            <w:tcBorders>
-              <w:bottom w:val="nil"/>
-            </w:tcBorders>
-            <w:tcBorders>
-              <w:left w:val="nil"/>
-            </w:tcBorders>
-            <w:tcBorders>
-              <w:right w:val="nil"/>
-            </w:tcBorders>
-            <w:vAlign w:val="center"/>
-          </w:tcPr>
-          <w:p>
-            <w:pPr>
-              <w:spacing w:before="0" w:after="0"/>
-            </w:pPr>
-            <w:r>
-              <w:rPr>
-                <w:rFonts w:ascii="Arial" w:hAnsi="Arial"/>
-                <w:rFonts w:ascii="Arial" w:hAnsi="Arial" w:cs="Arial"/>
-                <w:b/>
-                <w:i w:val="0"/>
-                <w:color w:val="FFFFFF"/>
-                <w:sz w:val="17"/>
-              </w:rPr>
-              <w:t>Network</w:t>
-            </w:r>
-          </w:p>
-        </w:tc>
-        <w:tc>
-          <w:tcPr>
-            <w:tcW w:type="dxa" w:w="2041"/>
-            <w:shd w:val="clear" w:color="auto" w:fill="0A2342"/>
-            <w:tcBorders>
-              <w:top w:val="nil"/>
-            </w:tcBorders>
-            <w:tcBorders>
-              <w:bottom w:val="nil"/>
-            </w:tcBorders>
-            <w:tcBorders>
-              <w:left w:val="nil"/>
-            </w:tcBorders>
-            <w:tcBorders>
-              <w:right w:val="nil"/>
-            </w:tcBorders>
-            <w:vAlign w:val="center"/>
-          </w:tcPr>
-          <w:p>
-            <w:pPr>
-              <w:spacing w:before="0" w:after="0"/>
-              <w:jc w:val="right"/>
-            </w:pPr>
-            <w:r>
-              <w:rPr>
-                <w:rFonts w:ascii="Arial" w:hAnsi="Arial"/>
-                <w:rFonts w:ascii="Arial" w:hAnsi="Arial" w:cs="Arial"/>
-                <w:b/>
-                <w:i w:val="0"/>
-                <w:color w:val="FFFFFF"/>
-                <w:sz w:val="17"/>
-              </w:rPr>
-              <w:t>Balance / Qty.</w:t>
-            </w:r>
-          </w:p>
-        </w:tc>
-      </w:tr>
-      <w:tr>
-        <w:tc>
-          <w:tcPr>
-            <w:tcW w:type="dxa" w:w="5839"/>
-            <w:tcBorders>
-              <w:bottom w:val="single" w:sz="4" w:color="D0D5DD"/>
-            </w:tcBorders>
-            <w:vAlign w:val="center"/>
-          </w:tcPr>
-          <w:p>
-            <w:pPr>
-              <w:spacing w:before="40" w:after="40"/>
-            </w:pPr>
-            <w:r>
-              <w:rPr>
-                <w:rFonts w:ascii="Arial" w:hAnsi="Arial"/>
-                <w:rFonts w:ascii="Arial" w:hAnsi="Arial" w:cs="Arial"/>
-                <w:b w:val="0"/>
-                <w:i w:val="0"/>
-                <w:color w:val="4A5568"/>
-                <w:sz w:val="17"/>
-              </w:rPr>
-              <w:t>BNB Chain Official Exchange Voucher</w:t>
-            </w:r>
-          </w:p>
-        </w:tc>
-        <w:tc>
-          <w:tcPr>
-            <w:tcW w:type="dxa" w:w="2324"/>
-            <w:tcBorders>
-              <w:bottom w:val="single" w:sz="4" w:color="D0D5DD"/>
-            </w:tcBorders>
-            <w:vAlign w:val="center"/>
-          </w:tcPr>
-          <w:p>
-            <w:pPr>
-              <w:spacing w:before="40" w:after="40"/>
-            </w:pPr>
-            <w:r>
-              <w:rPr>
-                <w:rFonts w:ascii="Arial" w:hAnsi="Arial"/>
-                <w:rFonts w:ascii="Arial" w:hAnsi="Arial" w:cs="Arial"/>
-                <w:b w:val="0"/>
-                <w:i w:val="0"/>
-                <w:color w:val="4A5568"/>
-                <w:sz w:val="17"/>
-              </w:rPr>
-              <w:t>BSC</w:t>
-            </w:r>
-          </w:p>
-        </w:tc>
-        <w:tc>
-          <w:tcPr>
-            <w:tcW w:type="dxa" w:w="2041"/>
-            <w:tcBorders>
-              <w:bottom w:val="single" w:sz="4" w:color="D0D5DD"/>
-            </w:tcBorders>
-            <w:vAlign w:val="center"/>
-          </w:tcPr>
-          <w:p>
-            <w:pPr>
-              <w:spacing w:before="40" w:after="40"/>
-              <w:jc w:val="right"/>
-            </w:pPr>
-            <w:r>
-              <w:rPr>
-                <w:rFonts w:ascii="Arial" w:hAnsi="Arial"/>
-                <w:rFonts w:ascii="Arial" w:hAnsi="Arial" w:cs="Arial"/>
-                <w:b w:val="0"/>
-                <w:i w:val="0"/>
-                <w:color w:val="4A5568"/>
-                <w:sz w:val="17"/>
-              </w:rPr>
-              <w:t>1</w:t>
-            </w:r>
-          </w:p>
-        </w:tc>
-      </w:tr>
-      <w:tr>
-        <w:tc>
-          <w:tcPr>
-            <w:tcW w:type="dxa" w:w="5839"/>
-            <w:shd w:val="clear" w:color="auto" w:fill="F5F7FA"/>
-            <w:tcBorders>
-              <w:bottom w:val="single" w:sz="4" w:color="D0D5DD"/>
-            </w:tcBorders>
-            <w:vAlign w:val="center"/>
-          </w:tcPr>
-          <w:p>
-            <w:pPr>
-              <w:spacing w:before="40" w:after="40"/>
-            </w:pPr>
-            <w:r>
-              <w:rPr>
-                <w:rFonts w:ascii="Arial" w:hAnsi="Arial"/>
-                <w:rFonts w:ascii="Arial" w:hAnsi="Arial" w:cs="Arial"/>
-                <w:b w:val="0"/>
-                <w:i w:val="0"/>
-                <w:color w:val="4A5568"/>
-                <w:sz w:val="17"/>
-              </w:rPr>
-              <w:t>Genesis Supporter Badge</w:t>
-            </w:r>
-          </w:p>
-        </w:tc>
-        <w:tc>
-          <w:tcPr>
-            <w:tcW w:type="dxa" w:w="2324"/>
-            <w:shd w:val="clear" w:color="auto" w:fill="F5F7FA"/>
-            <w:tcBorders>
-              <w:bottom w:val="single" w:sz="4" w:color="D0D5DD"/>
-            </w:tcBorders>
-            <w:vAlign w:val="center"/>
-          </w:tcPr>
-          <w:p>
-            <w:pPr>
-              <w:spacing w:before="40" w:after="40"/>
-            </w:pPr>
-            <w:r>
-              <w:rPr>
-                <w:rFonts w:ascii="Arial" w:hAnsi="Arial"/>
-                <w:rFonts w:ascii="Arial" w:hAnsi="Arial" w:cs="Arial"/>
-                <w:b w:val="0"/>
-                <w:i w:val="0"/>
-                <w:color w:val="4A5568"/>
-                <w:sz w:val="17"/>
-              </w:rPr>
-              <w:t>Ethereum</w:t>
-            </w:r>
-          </w:p>
-        </w:tc>
-        <w:tc>
-          <w:tcPr>
-            <w:tcW w:type="dxa" w:w="2041"/>
-            <w:shd w:val="clear" w:color="auto" w:fill="F5F7FA"/>
-            <w:tcBorders>
-              <w:bottom w:val="single" w:sz="4" w:color="D0D5DD"/>
-            </w:tcBorders>
-            <w:vAlign w:val="center"/>
-          </w:tcPr>
-          <w:p>
-            <w:pPr>
-              <w:spacing w:before="40" w:after="40"/>
-              <w:jc w:val="right"/>
-            </w:pPr>
-            <w:r>
-              <w:rPr>
-                <w:rFonts w:ascii="Arial" w:hAnsi="Arial"/>
-                <w:rFonts w:ascii="Arial" w:hAnsi="Arial" w:cs="Arial"/>
-                <w:b w:val="0"/>
-                <w:i w:val="0"/>
-                <w:color w:val="4A5568"/>
-                <w:sz w:val="17"/>
-              </w:rPr>
-              <w:t>1</w:t>
-            </w:r>
-          </w:p>
-        </w:tc>
-      </w:tr>
-      <w:tr>
-        <w:tc>
-          <w:tcPr>
-            <w:tcW w:type="dxa" w:w="5839"/>
-            <w:tcBorders>
-              <w:bottom w:val="single" w:sz="4" w:color="D0D5DD"/>
-            </w:tcBorders>
-            <w:vAlign w:val="center"/>
-          </w:tcPr>
-          <w:p>
-            <w:pPr>
-              <w:spacing w:before="40" w:after="40"/>
-            </w:pPr>
-            <w:r>
-              <w:rPr>
-                <w:rFonts w:ascii="Arial" w:hAnsi="Arial"/>
-                <w:rFonts w:ascii="Arial" w:hAnsi="Arial" w:cs="Arial"/>
-                <w:b w:val="0"/>
-                <w:i w:val="0"/>
-                <w:color w:val="4A5568"/>
-                <w:sz w:val="17"/>
-              </w:rPr>
-              <w:t>JUP Voucher</w:t>
-            </w:r>
-          </w:p>
-        </w:tc>
-        <w:tc>
-          <w:tcPr>
-            <w:tcW w:type="dxa" w:w="2324"/>
-            <w:tcBorders>
-              <w:bottom w:val="single" w:sz="4" w:color="D0D5DD"/>
-            </w:tcBorders>
-            <w:vAlign w:val="center"/>
-          </w:tcPr>
-          <w:p>
-            <w:pPr>
-              <w:spacing w:before="40" w:after="40"/>
-            </w:pPr>
-            <w:r>
-              <w:rPr>
-                <w:rFonts w:ascii="Arial" w:hAnsi="Arial"/>
-                <w:rFonts w:ascii="Arial" w:hAnsi="Arial" w:cs="Arial"/>
-                <w:b w:val="0"/>
-                <w:i w:val="0"/>
-                <w:color w:val="4A5568"/>
-                <w:sz w:val="17"/>
-              </w:rPr>
-              <w:t>Solana Mainnet</w:t>
-            </w:r>
-          </w:p>
-        </w:tc>
-        <w:tc>
-          <w:tcPr>
-            <w:tcW w:type="dxa" w:w="2041"/>
-            <w:tcBorders>
-              <w:bottom w:val="single" w:sz="4" w:color="D0D5DD"/>
-            </w:tcBorders>
-            <w:vAlign w:val="center"/>
-          </w:tcPr>
-          <w:p>
-            <w:pPr>
-              <w:spacing w:before="40" w:after="40"/>
-              <w:jc w:val="right"/>
-            </w:pPr>
-            <w:r>
-              <w:rPr>
-                <w:rFonts w:ascii="Arial" w:hAnsi="Arial"/>
-                <w:rFonts w:ascii="Arial" w:hAnsi="Arial" w:cs="Arial"/>
-                <w:b w:val="0"/>
-                <w:i w:val="0"/>
-                <w:color w:val="4A5568"/>
-                <w:sz w:val="17"/>
-              </w:rPr>
-              <w:t>1</w:t>
-            </w:r>
-          </w:p>
-        </w:tc>
-      </w:tr>
-      <w:tr>
-        <w:tc>
-          <w:tcPr>
-            <w:tcW w:type="dxa" w:w="5839"/>
-            <w:shd w:val="clear" w:color="auto" w:fill="E5EBF1"/>
-            <w:tcBorders>
-              <w:bottom w:val="single" w:sz="4" w:color="D0D5DD"/>
-            </w:tcBorders>
-            <w:vAlign w:val="center"/>
-          </w:tcPr>
-          <w:p>
-            <w:pPr>
-              <w:spacing w:before="40" w:after="40"/>
-            </w:pPr>
-            <w:r>
-              <w:rPr>
-                <w:rFonts w:ascii="Arial" w:hAnsi="Arial"/>
-                <w:rFonts w:ascii="Arial" w:hAnsi="Arial" w:cs="Arial"/>
-                <w:b/>
-                <w:i w:val="0"/>
-                <w:color w:val="0A2342"/>
-                <w:sz w:val="17"/>
-              </w:rPr>
-              <w:t>Total (3 NFT collections)</w:t>
-            </w:r>
-          </w:p>
-        </w:tc>
-        <w:tc>
-          <w:tcPr>
-            <w:tcW w:type="dxa" w:w="2324"/>
-            <w:shd w:val="clear" w:color="auto" w:fill="E5EBF1"/>
-            <w:tcBorders>
-              <w:bottom w:val="single" w:sz="4" w:color="D0D5DD"/>
-            </w:tcBorders>
-            <w:vAlign w:val="center"/>
-          </w:tcPr>
-          <w:p>
-            <w:pPr>
-              <w:spacing w:before="40" w:after="40"/>
-            </w:pPr>
-            <w:r>
-              <w:rPr>
-                <w:rFonts w:ascii="Arial" w:hAnsi="Arial"/>
-                <w:rFonts w:ascii="Arial" w:hAnsi="Arial" w:cs="Arial"/>
-                <w:b/>
-                <w:i w:val="0"/>
-                <w:color w:val="0A2342"/>
-                <w:sz w:val="17"/>
-              </w:rPr>
-            </w:r>
-          </w:p>
-        </w:tc>
-        <w:tc>
-          <w:tcPr>
-            <w:tcW w:type="dxa" w:w="2041"/>
-            <w:shd w:val="clear" w:color="auto" w:fill="E5EBF1"/>
-            <w:tcBorders>
-              <w:bottom w:val="single" w:sz="4" w:color="D0D5DD"/>
-            </w:tcBorders>
-            <w:vAlign w:val="center"/>
-          </w:tcPr>
-          <w:p>
-            <w:pPr>
-              <w:spacing w:before="40" w:after="40"/>
-              <w:jc w:val="right"/>
-            </w:pPr>
-            <w:r>
-              <w:rPr>
-                <w:rFonts w:ascii="Arial" w:hAnsi="Arial"/>
-                <w:rFonts w:ascii="Arial" w:hAnsi="Arial" w:cs="Arial"/>
-                <w:b/>
-                <w:i w:val="0"/>
-                <w:color w:val="0A2342"/>
-                <w:sz w:val="17"/>
-              </w:rPr>
-              <w:t>3</w:t>
-            </w:r>
-          </w:p>
-        </w:tc>
-      </w:tr>
-    </w:tbl>
-    <w:p>
-      <w:pPr>
-        <w:spacing w:before="160" w:after="60"/>
-      </w:pPr>
-      <w:r>
-        <w:rPr>
-          <w:rFonts w:ascii="Arial" w:hAnsi="Arial"/>
-          <w:rFonts w:ascii="Arial" w:hAnsi="Arial" w:cs="Arial"/>
-          <w:b/>
-          <w:i w:val="0"/>
-          <w:color w:val="0F2A4D"/>
-          <w:sz w:val="20"/>
-        </w:rPr>
         <w:t>Pending transactions</w:t>
       </w:r>
     </w:p>
@@ -10470,6 +10013,463 @@
                 <w:color w:val="0A2342"/>
                 <w:sz w:val="15"/>
               </w:rPr>
+            </w:r>
+          </w:p>
+        </w:tc>
+      </w:tr>
+    </w:tbl>
+    <w:p>
+      <w:pPr>
+        <w:spacing w:before="160" w:after="60"/>
+      </w:pPr>
+      <w:r>
+        <w:rPr>
+          <w:rFonts w:ascii="Arial" w:hAnsi="Arial"/>
+          <w:rFonts w:ascii="Arial" w:hAnsi="Arial" w:cs="Arial"/>
+          <w:b/>
+          <w:i w:val="0"/>
+          <w:color w:val="0F2A4D"/>
+          <w:sz w:val="20"/>
+        </w:rPr>
+        <w:t>NFT balance</w:t>
+      </w:r>
+    </w:p>
+    <w:tbl>
+      <w:tblPr>
+        <w:tblW w:type="auto" w:w="0"/>
+        <w:jc w:val="left"/>
+        <w:tblLayout w:type="fixed"/>
+        <w:tblLook w:firstColumn="1" w:firstRow="1" w:lastColumn="0" w:lastRow="0" w:noHBand="0" w:noVBand="1" w:val="04A0"/>
+      </w:tblPr>
+      <w:tblGrid>
+        <w:gridCol w:w="5839"/>
+        <w:gridCol w:w="2324"/>
+        <w:gridCol w:w="2041"/>
+      </w:tblGrid>
+      <w:tr>
+        <w:trPr>
+          <w:trHeight w:val="420" w:hRule="atLeast"/>
+        </w:trPr>
+        <w:tc>
+          <w:tcPr>
+            <w:tcW w:type="dxa" w:w="5839"/>
+            <w:shd w:val="clear" w:color="auto" w:fill="0A2342"/>
+            <w:tcBorders>
+              <w:top w:val="nil"/>
+            </w:tcBorders>
+            <w:tcBorders>
+              <w:bottom w:val="nil"/>
+            </w:tcBorders>
+            <w:tcBorders>
+              <w:left w:val="nil"/>
+            </w:tcBorders>
+            <w:tcBorders>
+              <w:right w:val="nil"/>
+            </w:tcBorders>
+            <w:vAlign w:val="center"/>
+          </w:tcPr>
+          <w:p>
+            <w:pPr>
+              <w:spacing w:before="0" w:after="0"/>
+            </w:pPr>
+            <w:r>
+              <w:rPr>
+                <w:rFonts w:ascii="Arial" w:hAnsi="Arial"/>
+                <w:rFonts w:ascii="Arial" w:hAnsi="Arial" w:cs="Arial"/>
+                <w:b/>
+                <w:i w:val="0"/>
+                <w:color w:val="FFFFFF"/>
+                <w:sz w:val="17"/>
+              </w:rPr>
+              <w:t>Asset — NFT</w:t>
+            </w:r>
+          </w:p>
+        </w:tc>
+        <w:tc>
+          <w:tcPr>
+            <w:tcW w:type="dxa" w:w="2324"/>
+            <w:shd w:val="clear" w:color="auto" w:fill="0A2342"/>
+            <w:tcBorders>
+              <w:top w:val="nil"/>
+            </w:tcBorders>
+            <w:tcBorders>
+              <w:bottom w:val="nil"/>
+            </w:tcBorders>
+            <w:tcBorders>
+              <w:left w:val="nil"/>
+            </w:tcBorders>
+            <w:tcBorders>
+              <w:right w:val="nil"/>
+            </w:tcBorders>
+            <w:vAlign w:val="center"/>
+          </w:tcPr>
+          <w:p>
+            <w:pPr>
+              <w:spacing w:before="0" w:after="0"/>
+            </w:pPr>
+            <w:r>
+              <w:rPr>
+                <w:rFonts w:ascii="Arial" w:hAnsi="Arial"/>
+                <w:rFonts w:ascii="Arial" w:hAnsi="Arial" w:cs="Arial"/>
+                <w:b/>
+                <w:i w:val="0"/>
+                <w:color w:val="FFFFFF"/>
+                <w:sz w:val="17"/>
+              </w:rPr>
+              <w:t>Network</w:t>
+            </w:r>
+          </w:p>
+        </w:tc>
+        <w:tc>
+          <w:tcPr>
+            <w:tcW w:type="dxa" w:w="2041"/>
+            <w:shd w:val="clear" w:color="auto" w:fill="0A2342"/>
+            <w:tcBorders>
+              <w:top w:val="nil"/>
+            </w:tcBorders>
+            <w:tcBorders>
+              <w:bottom w:val="nil"/>
+            </w:tcBorders>
+            <w:tcBorders>
+              <w:left w:val="nil"/>
+            </w:tcBorders>
+            <w:tcBorders>
+              <w:right w:val="nil"/>
+            </w:tcBorders>
+            <w:vAlign w:val="center"/>
+          </w:tcPr>
+          <w:p>
+            <w:pPr>
+              <w:spacing w:before="0" w:after="0"/>
+              <w:jc w:val="right"/>
+            </w:pPr>
+            <w:r>
+              <w:rPr>
+                <w:rFonts w:ascii="Arial" w:hAnsi="Arial"/>
+                <w:rFonts w:ascii="Arial" w:hAnsi="Arial" w:cs="Arial"/>
+                <w:b/>
+                <w:i w:val="0"/>
+                <w:color w:val="FFFFFF"/>
+                <w:sz w:val="17"/>
+              </w:rPr>
+              <w:t>Balance / Qty.</w:t>
+            </w:r>
+          </w:p>
+        </w:tc>
+      </w:tr>
+      <w:tr>
+        <w:tc>
+          <w:tcPr>
+            <w:tcW w:type="dxa" w:w="5839"/>
+            <w:tcBorders>
+              <w:bottom w:val="single" w:sz="4" w:color="D0D5DD"/>
+            </w:tcBorders>
+            <w:vAlign w:val="center"/>
+          </w:tcPr>
+          <w:p>
+            <w:pPr>
+              <w:spacing w:before="40" w:after="40"/>
+            </w:pPr>
+            <w:r>
+              <w:rPr>
+                <w:rFonts w:ascii="Arial" w:hAnsi="Arial"/>
+                <w:rFonts w:ascii="Arial" w:hAnsi="Arial" w:cs="Arial"/>
+                <w:b w:val="0"/>
+                <w:i w:val="0"/>
+                <w:color w:val="4A5568"/>
+                <w:sz w:val="17"/>
+              </w:rPr>
+              <w:t>BNB Chain Official Exchange Voucher</w:t>
+            </w:r>
+          </w:p>
+        </w:tc>
+        <w:tc>
+          <w:tcPr>
+            <w:tcW w:type="dxa" w:w="2324"/>
+            <w:tcBorders>
+              <w:bottom w:val="single" w:sz="4" w:color="D0D5DD"/>
+            </w:tcBorders>
+            <w:vAlign w:val="center"/>
+          </w:tcPr>
+          <w:p>
+            <w:pPr>
+              <w:spacing w:before="40" w:after="40"/>
+            </w:pPr>
+            <w:r>
+              <w:rPr>
+                <w:rFonts w:ascii="Arial" w:hAnsi="Arial"/>
+                <w:rFonts w:ascii="Arial" w:hAnsi="Arial" w:cs="Arial"/>
+                <w:b w:val="0"/>
+                <w:i w:val="0"/>
+                <w:color w:val="4A5568"/>
+                <w:sz w:val="17"/>
+              </w:rPr>
+              <w:t>BSC</w:t>
+            </w:r>
+          </w:p>
+        </w:tc>
+        <w:tc>
+          <w:tcPr>
+            <w:tcW w:type="dxa" w:w="2041"/>
+            <w:tcBorders>
+              <w:bottom w:val="single" w:sz="4" w:color="D0D5DD"/>
+            </w:tcBorders>
+            <w:vAlign w:val="center"/>
+          </w:tcPr>
+          <w:p>
+            <w:pPr>
+              <w:spacing w:before="40" w:after="40"/>
+              <w:jc w:val="right"/>
+            </w:pPr>
+            <w:r>
+              <w:rPr>
+                <w:rFonts w:ascii="Arial" w:hAnsi="Arial"/>
+                <w:rFonts w:ascii="Arial" w:hAnsi="Arial" w:cs="Arial"/>
+                <w:b w:val="0"/>
+                <w:i w:val="0"/>
+                <w:color w:val="4A5568"/>
+                <w:sz w:val="17"/>
+              </w:rPr>
+              <w:t>1</w:t>
+            </w:r>
+          </w:p>
+        </w:tc>
+      </w:tr>
+      <w:tr>
+        <w:tc>
+          <w:tcPr>
+            <w:tcW w:type="dxa" w:w="5839"/>
+            <w:shd w:val="clear" w:color="auto" w:fill="F5F7FA"/>
+            <w:tcBorders>
+              <w:bottom w:val="single" w:sz="4" w:color="D0D5DD"/>
+            </w:tcBorders>
+            <w:vAlign w:val="center"/>
+          </w:tcPr>
+          <w:p>
+            <w:pPr>
+              <w:spacing w:before="40" w:after="40"/>
+            </w:pPr>
+            <w:r>
+              <w:rPr>
+                <w:rFonts w:ascii="Arial" w:hAnsi="Arial"/>
+                <w:rFonts w:ascii="Arial" w:hAnsi="Arial" w:cs="Arial"/>
+                <w:b w:val="0"/>
+                <w:i w:val="0"/>
+                <w:color w:val="4A5568"/>
+                <w:sz w:val="17"/>
+              </w:rPr>
+              <w:t>Genesis Supporter Badge</w:t>
+            </w:r>
+          </w:p>
+        </w:tc>
+        <w:tc>
+          <w:tcPr>
+            <w:tcW w:type="dxa" w:w="2324"/>
+            <w:shd w:val="clear" w:color="auto" w:fill="F5F7FA"/>
+            <w:tcBorders>
+              <w:bottom w:val="single" w:sz="4" w:color="D0D5DD"/>
+            </w:tcBorders>
+            <w:vAlign w:val="center"/>
+          </w:tcPr>
+          <w:p>
+            <w:pPr>
+              <w:spacing w:before="40" w:after="40"/>
+            </w:pPr>
+            <w:r>
+              <w:rPr>
+                <w:rFonts w:ascii="Arial" w:hAnsi="Arial"/>
+                <w:rFonts w:ascii="Arial" w:hAnsi="Arial" w:cs="Arial"/>
+                <w:b w:val="0"/>
+                <w:i w:val="0"/>
+                <w:color w:val="4A5568"/>
+                <w:sz w:val="17"/>
+              </w:rPr>
+              <w:t>Ethereum</w:t>
+            </w:r>
+          </w:p>
+        </w:tc>
+        <w:tc>
+          <w:tcPr>
+            <w:tcW w:type="dxa" w:w="2041"/>
+            <w:shd w:val="clear" w:color="auto" w:fill="F5F7FA"/>
+            <w:tcBorders>
+              <w:bottom w:val="single" w:sz="4" w:color="D0D5DD"/>
+            </w:tcBorders>
+            <w:vAlign w:val="center"/>
+          </w:tcPr>
+          <w:p>
+            <w:pPr>
+              <w:spacing w:before="40" w:after="40"/>
+              <w:jc w:val="right"/>
+            </w:pPr>
+            <w:r>
+              <w:rPr>
+                <w:rFonts w:ascii="Arial" w:hAnsi="Arial"/>
+                <w:rFonts w:ascii="Arial" w:hAnsi="Arial" w:cs="Arial"/>
+                <w:b w:val="0"/>
+                <w:i w:val="0"/>
+                <w:color w:val="4A5568"/>
+                <w:sz w:val="17"/>
+              </w:rPr>
+              <w:t>1</w:t>
+            </w:r>
+          </w:p>
+        </w:tc>
+      </w:tr>
+      <w:tr>
+        <w:tc>
+          <w:tcPr>
+            <w:tcW w:type="dxa" w:w="5839"/>
+            <w:tcBorders>
+              <w:bottom w:val="single" w:sz="4" w:color="D0D5DD"/>
+            </w:tcBorders>
+            <w:vAlign w:val="center"/>
+          </w:tcPr>
+          <w:p>
+            <w:pPr>
+              <w:spacing w:before="40" w:after="40"/>
+            </w:pPr>
+            <w:r>
+              <w:rPr>
+                <w:rFonts w:ascii="Arial" w:hAnsi="Arial"/>
+                <w:rFonts w:ascii="Arial" w:hAnsi="Arial" w:cs="Arial"/>
+                <w:b w:val="0"/>
+                <w:i w:val="0"/>
+                <w:color w:val="4A5568"/>
+                <w:sz w:val="17"/>
+              </w:rPr>
+              <w:t>JUP Voucher</w:t>
+            </w:r>
+          </w:p>
+        </w:tc>
+        <w:tc>
+          <w:tcPr>
+            <w:tcW w:type="dxa" w:w="2324"/>
+            <w:tcBorders>
+              <w:bottom w:val="single" w:sz="4" w:color="D0D5DD"/>
+            </w:tcBorders>
+            <w:vAlign w:val="center"/>
+          </w:tcPr>
+          <w:p>
+            <w:pPr>
+              <w:spacing w:before="40" w:after="40"/>
+            </w:pPr>
+            <w:r>
+              <w:rPr>
+                <w:rFonts w:ascii="Arial" w:hAnsi="Arial"/>
+                <w:rFonts w:ascii="Arial" w:hAnsi="Arial" w:cs="Arial"/>
+                <w:b w:val="0"/>
+                <w:i w:val="0"/>
+                <w:color w:val="4A5568"/>
+                <w:sz w:val="17"/>
+              </w:rPr>
+              <w:t>Solana Mainnet</w:t>
+            </w:r>
+          </w:p>
+        </w:tc>
+        <w:tc>
+          <w:tcPr>
+            <w:tcW w:type="dxa" w:w="2041"/>
+            <w:tcBorders>
+              <w:bottom w:val="single" w:sz="4" w:color="D0D5DD"/>
+            </w:tcBorders>
+            <w:vAlign w:val="center"/>
+          </w:tcPr>
+          <w:p>
+            <w:pPr>
+              <w:spacing w:before="40" w:after="40"/>
+              <w:jc w:val="right"/>
+            </w:pPr>
+            <w:r>
+              <w:rPr>
+                <w:rFonts w:ascii="Arial" w:hAnsi="Arial"/>
+                <w:rFonts w:ascii="Arial" w:hAnsi="Arial" w:cs="Arial"/>
+                <w:b w:val="0"/>
+                <w:i w:val="0"/>
+                <w:color w:val="4A5568"/>
+                <w:sz w:val="17"/>
+              </w:rPr>
+              <w:t>1</w:t>
+            </w:r>
+          </w:p>
+        </w:tc>
+      </w:tr>
+      <w:tr>
+        <w:tc>
+          <w:tcPr>
+            <w:tcW w:type="dxa" w:w="5839"/>
+            <w:shd w:val="clear" w:color="auto" w:fill="E5EBF1"/>
+            <w:tcBorders>
+              <w:bottom w:val="single" w:sz="4" w:color="D0D5DD"/>
+            </w:tcBorders>
+            <w:vAlign w:val="center"/>
+          </w:tcPr>
+          <w:p>
+            <w:pPr>
+              <w:spacing w:before="40" w:after="40"/>
+            </w:pPr>
+            <w:r>
+              <w:rPr>
+                <w:rFonts w:ascii="Arial" w:hAnsi="Arial"/>
+                <w:rFonts w:ascii="Arial" w:hAnsi="Arial" w:cs="Arial"/>
+                <w:b/>
+                <w:i w:val="0"/>
+                <w:color w:val="0A2342"/>
+                <w:sz w:val="17"/>
+              </w:rPr>
+              <w:t>Total (3 NFT collections)</w:t>
+            </w:r>
+          </w:p>
+        </w:tc>
+        <w:tc>
+          <w:tcPr>
+            <w:tcW w:type="dxa" w:w="2324"/>
+            <w:shd w:val="clear" w:color="auto" w:fill="E5EBF1"/>
+            <w:tcBorders>
+              <w:bottom w:val="single" w:sz="4" w:color="D0D5DD"/>
+            </w:tcBorders>
+            <w:vAlign w:val="center"/>
+          </w:tcPr>
+          <w:p>
+            <w:pPr>
+              <w:spacing w:before="40" w:after="40"/>
+            </w:pPr>
+            <w:r>
+              <w:rPr>
+                <w:rFonts w:ascii="Arial" w:hAnsi="Arial"/>
+                <w:rFonts w:ascii="Arial" w:hAnsi="Arial" w:cs="Arial"/>
+                <w:b/>
+                <w:i w:val="0"/>
+                <w:color w:val="0A2342"/>
+                <w:sz w:val="17"/>
+              </w:rPr>
+            </w:r>
+          </w:p>
+        </w:tc>
+        <w:tc>
+          <w:tcPr>
+            <w:tcW w:type="dxa" w:w="2041"/>
+            <w:shd w:val="clear" w:color="auto" w:fill="E5EBF1"/>
+            <w:tcBorders>
+              <w:bottom w:val="single" w:sz="4" w:color="D0D5DD"/>
+            </w:tcBorders>
+            <w:vAlign w:val="center"/>
+          </w:tcPr>
+          <w:p>
+            <w:pPr>
+              <w:spacing w:before="40" w:after="40"/>
+              <w:jc w:val="right"/>
+            </w:pPr>
+            <w:r>
+              <w:rPr>
+                <w:rFonts w:ascii="Arial" w:hAnsi="Arial"/>
+                <w:rFonts w:ascii="Arial" w:hAnsi="Arial" w:cs="Arial"/>
+                <w:b/>
+                <w:i w:val="0"/>
+                <w:color w:val="0A2342"/>
+                <w:sz w:val="17"/>
+              </w:rPr>
+              <w:t>3</w:t>
             </w:r>
           </w:p>
         </w:tc>
@@ -16182,6 +16182,1393 @@
                 <w:sz w:val="15"/>
               </w:rPr>
               <w:t>W20260428-3RM7</w:t>
+            </w:r>
+          </w:p>
+        </w:tc>
+      </w:tr>
+    </w:tbl>
+    <w:p>
+      <w:pPr>
+        <w:spacing w:before="160" w:after="60"/>
+      </w:pPr>
+      <w:r>
+        <w:rPr>
+          <w:rFonts w:ascii="Arial" w:hAnsi="Arial"/>
+          <w:rFonts w:ascii="Arial" w:hAnsi="Arial" w:cs="Arial"/>
+          <w:b/>
+          <w:i w:val="0"/>
+          <w:color w:val="0F2A4D"/>
+          <w:sz w:val="20"/>
+        </w:rPr>
+        <w:t>Pending transactions</w:t>
+      </w:r>
+    </w:p>
+    <w:tbl>
+      <w:tblPr>
+        <w:tblW w:type="auto" w:w="0"/>
+        <w:jc w:val="left"/>
+        <w:tblLayout w:type="fixed"/>
+        <w:tblLook w:firstColumn="1" w:firstRow="1" w:lastColumn="0" w:lastRow="0" w:noHBand="0" w:noVBand="1" w:val="04A0"/>
+      </w:tblPr>
+      <w:tblGrid>
+        <w:gridCol w:w="1474"/>
+        <w:gridCol w:w="1361"/>
+        <w:gridCol w:w="680"/>
+        <w:gridCol w:w="1134"/>
+        <w:gridCol w:w="1361"/>
+        <w:gridCol w:w="1361"/>
+        <w:gridCol w:w="1247"/>
+        <w:gridCol w:w="1587"/>
+      </w:tblGrid>
+      <w:tr>
+        <w:trPr>
+          <w:trHeight w:val="420" w:hRule="atLeast"/>
+        </w:trPr>
+        <w:tc>
+          <w:tcPr>
+            <w:tcW w:type="dxa" w:w="1474"/>
+            <w:shd w:val="clear" w:color="auto" w:fill="0A2342"/>
+            <w:tcBorders>
+              <w:top w:val="nil"/>
+            </w:tcBorders>
+            <w:tcBorders>
+              <w:bottom w:val="nil"/>
+            </w:tcBorders>
+            <w:tcBorders>
+              <w:left w:val="nil"/>
+            </w:tcBorders>
+            <w:tcBorders>
+              <w:right w:val="nil"/>
+            </w:tcBorders>
+            <w:vAlign w:val="center"/>
+          </w:tcPr>
+          <w:p>
+            <w:pPr>
+              <w:spacing w:before="0" w:after="0"/>
+            </w:pPr>
+            <w:r>
+              <w:rPr>
+                <w:rFonts w:ascii="Arial" w:hAnsi="Arial"/>
+                <w:rFonts w:ascii="Arial" w:hAnsi="Arial" w:cs="Arial"/>
+                <w:b/>
+                <w:i w:val="0"/>
+                <w:color w:val="FFFFFF"/>
+                <w:sz w:val="17"/>
+              </w:rPr>
+              <w:t>Date / Time (UTC)</w:t>
+            </w:r>
+          </w:p>
+        </w:tc>
+        <w:tc>
+          <w:tcPr>
+            <w:tcW w:type="dxa" w:w="1361"/>
+            <w:shd w:val="clear" w:color="auto" w:fill="0A2342"/>
+            <w:tcBorders>
+              <w:top w:val="nil"/>
+            </w:tcBorders>
+            <w:tcBorders>
+              <w:bottom w:val="nil"/>
+            </w:tcBorders>
+            <w:tcBorders>
+              <w:left w:val="nil"/>
+            </w:tcBorders>
+            <w:tcBorders>
+              <w:right w:val="nil"/>
+            </w:tcBorders>
+            <w:vAlign w:val="center"/>
+          </w:tcPr>
+          <w:p>
+            <w:pPr>
+              <w:spacing w:before="0" w:after="0"/>
+            </w:pPr>
+            <w:r>
+              <w:rPr>
+                <w:rFonts w:ascii="Arial" w:hAnsi="Arial"/>
+                <w:rFonts w:ascii="Arial" w:hAnsi="Arial" w:cs="Arial"/>
+                <w:b/>
+                <w:i w:val="0"/>
+                <w:color w:val="FFFFFF"/>
+                <w:sz w:val="17"/>
+              </w:rPr>
+              <w:t>Type</w:t>
+            </w:r>
+          </w:p>
+        </w:tc>
+        <w:tc>
+          <w:tcPr>
+            <w:tcW w:type="dxa" w:w="680"/>
+            <w:shd w:val="clear" w:color="auto" w:fill="0A2342"/>
+            <w:tcBorders>
+              <w:top w:val="nil"/>
+            </w:tcBorders>
+            <w:tcBorders>
+              <w:bottom w:val="nil"/>
+            </w:tcBorders>
+            <w:tcBorders>
+              <w:left w:val="nil"/>
+            </w:tcBorders>
+            <w:tcBorders>
+              <w:right w:val="nil"/>
+            </w:tcBorders>
+            <w:vAlign w:val="center"/>
+          </w:tcPr>
+          <w:p>
+            <w:pPr>
+              <w:spacing w:before="0" w:after="0"/>
+            </w:pPr>
+            <w:r>
+              <w:rPr>
+                <w:rFonts w:ascii="Arial" w:hAnsi="Arial"/>
+                <w:rFonts w:ascii="Arial" w:hAnsi="Arial" w:cs="Arial"/>
+                <w:b/>
+                <w:i w:val="0"/>
+                <w:color w:val="FFFFFF"/>
+                <w:sz w:val="17"/>
+              </w:rPr>
+              <w:t>Asset</w:t>
+            </w:r>
+          </w:p>
+        </w:tc>
+        <w:tc>
+          <w:tcPr>
+            <w:tcW w:type="dxa" w:w="1134"/>
+            <w:shd w:val="clear" w:color="auto" w:fill="0A2342"/>
+            <w:tcBorders>
+              <w:top w:val="nil"/>
+            </w:tcBorders>
+            <w:tcBorders>
+              <w:bottom w:val="nil"/>
+            </w:tcBorders>
+            <w:tcBorders>
+              <w:left w:val="nil"/>
+            </w:tcBorders>
+            <w:tcBorders>
+              <w:right w:val="nil"/>
+            </w:tcBorders>
+            <w:vAlign w:val="center"/>
+          </w:tcPr>
+          <w:p>
+            <w:pPr>
+              <w:spacing w:before="0" w:after="0"/>
+            </w:pPr>
+            <w:r>
+              <w:rPr>
+                <w:rFonts w:ascii="Arial" w:hAnsi="Arial"/>
+                <w:rFonts w:ascii="Arial" w:hAnsi="Arial" w:cs="Arial"/>
+                <w:b/>
+                <w:i w:val="0"/>
+                <w:color w:val="FFFFFF"/>
+                <w:sz w:val="17"/>
+              </w:rPr>
+              <w:t>Network</w:t>
+            </w:r>
+          </w:p>
+        </w:tc>
+        <w:tc>
+          <w:tcPr>
+            <w:tcW w:type="dxa" w:w="1361"/>
+            <w:shd w:val="clear" w:color="auto" w:fill="0A2342"/>
+            <w:tcBorders>
+              <w:top w:val="nil"/>
+            </w:tcBorders>
+            <w:tcBorders>
+              <w:bottom w:val="nil"/>
+            </w:tcBorders>
+            <w:tcBorders>
+              <w:left w:val="nil"/>
+            </w:tcBorders>
+            <w:tcBorders>
+              <w:right w:val="nil"/>
+            </w:tcBorders>
+            <w:vAlign w:val="center"/>
+          </w:tcPr>
+          <w:p>
+            <w:pPr>
+              <w:spacing w:before="0" w:after="0"/>
+              <w:jc w:val="right"/>
+            </w:pPr>
+            <w:r>
+              <w:rPr>
+                <w:rFonts w:ascii="Arial" w:hAnsi="Arial"/>
+                <w:rFonts w:ascii="Arial" w:hAnsi="Arial" w:cs="Arial"/>
+                <w:b/>
+                <w:i w:val="0"/>
+                <w:color w:val="FFFFFF"/>
+                <w:sz w:val="17"/>
+              </w:rPr>
+              <w:t>Quantity</w:t>
+            </w:r>
+          </w:p>
+        </w:tc>
+        <w:tc>
+          <w:tcPr>
+            <w:tcW w:type="dxa" w:w="1361"/>
+            <w:shd w:val="clear" w:color="auto" w:fill="0A2342"/>
+            <w:tcBorders>
+              <w:top w:val="nil"/>
+            </w:tcBorders>
+            <w:tcBorders>
+              <w:bottom w:val="nil"/>
+            </w:tcBorders>
+            <w:tcBorders>
+              <w:left w:val="nil"/>
+            </w:tcBorders>
+            <w:tcBorders>
+              <w:right w:val="nil"/>
+            </w:tcBorders>
+            <w:vAlign w:val="center"/>
+          </w:tcPr>
+          <w:p>
+            <w:pPr>
+              <w:spacing w:before="0" w:after="0"/>
+              <w:jc w:val="right"/>
+            </w:pPr>
+            <w:r>
+              <w:rPr>
+                <w:rFonts w:ascii="Arial" w:hAnsi="Arial"/>
+                <w:rFonts w:ascii="Arial" w:hAnsi="Arial" w:cs="Arial"/>
+                <w:b/>
+                <w:i w:val="0"/>
+                <w:color w:val="FFFFFF"/>
+                <w:sz w:val="17"/>
+              </w:rPr>
+              <w:t>Value (USD)</w:t>
+            </w:r>
+          </w:p>
+        </w:tc>
+        <w:tc>
+          <w:tcPr>
+            <w:tcW w:type="dxa" w:w="1247"/>
+            <w:shd w:val="clear" w:color="auto" w:fill="0A2342"/>
+            <w:tcBorders>
+              <w:top w:val="nil"/>
+            </w:tcBorders>
+            <w:tcBorders>
+              <w:bottom w:val="nil"/>
+            </w:tcBorders>
+            <w:tcBorders>
+              <w:left w:val="nil"/>
+            </w:tcBorders>
+            <w:tcBorders>
+              <w:right w:val="nil"/>
+            </w:tcBorders>
+            <w:vAlign w:val="center"/>
+          </w:tcPr>
+          <w:p>
+            <w:pPr>
+              <w:spacing w:before="0" w:after="0"/>
+              <w:jc w:val="right"/>
+            </w:pPr>
+            <w:r>
+              <w:rPr>
+                <w:rFonts w:ascii="Arial" w:hAnsi="Arial"/>
+                <w:rFonts w:ascii="Arial" w:hAnsi="Arial" w:cs="Arial"/>
+                <w:b/>
+                <w:i w:val="0"/>
+                <w:color w:val="FFFFFF"/>
+                <w:sz w:val="17"/>
+              </w:rPr>
+              <w:t>Transaction ID</w:t>
+            </w:r>
+          </w:p>
+        </w:tc>
+        <w:tc>
+          <w:tcPr>
+            <w:tcW w:type="dxa" w:w="1587"/>
+            <w:shd w:val="clear" w:color="auto" w:fill="0A2342"/>
+            <w:tcBorders>
+              <w:top w:val="nil"/>
+            </w:tcBorders>
+            <w:tcBorders>
+              <w:bottom w:val="nil"/>
+            </w:tcBorders>
+            <w:tcBorders>
+              <w:left w:val="nil"/>
+            </w:tcBorders>
+            <w:tcBorders>
+              <w:right w:val="nil"/>
+            </w:tcBorders>
+            <w:vAlign w:val="center"/>
+          </w:tcPr>
+          <w:p>
+            <w:pPr>
+              <w:spacing w:before="0" w:after="0"/>
+              <w:jc w:val="right"/>
+            </w:pPr>
+            <w:r>
+              <w:rPr>
+                <w:rFonts w:ascii="Arial" w:hAnsi="Arial"/>
+                <w:rFonts w:ascii="Arial" w:hAnsi="Arial" w:cs="Arial"/>
+                <w:b/>
+                <w:i w:val="0"/>
+                <w:color w:val="FFFFFF"/>
+                <w:sz w:val="17"/>
+              </w:rPr>
+              <w:t>Pending Status</w:t>
+            </w:r>
+          </w:p>
+        </w:tc>
+      </w:tr>
+      <w:tr>
+        <w:tc>
+          <w:tcPr>
+            <w:tcW w:type="dxa" w:w="1474"/>
+            <w:shd w:val="clear" w:color="auto" w:fill="FEF3C7"/>
+            <w:tcBorders>
+              <w:bottom w:val="single" w:sz="4" w:color="D0D5DD"/>
+            </w:tcBorders>
+            <w:vAlign w:val="center"/>
+          </w:tcPr>
+          <w:p>
+            <w:pPr>
+              <w:spacing w:before="40" w:after="40"/>
+            </w:pPr>
+            <w:r>
+              <w:rPr>
+                <w:rFonts w:ascii="Arial" w:hAnsi="Arial"/>
+                <w:rFonts w:ascii="Arial" w:hAnsi="Arial" w:cs="Arial"/>
+                <w:b w:val="0"/>
+                <w:i w:val="0"/>
+                <w:color w:val="4A5568"/>
+                <w:sz w:val="15"/>
+              </w:rPr>
+              <w:t>2026-04-13 14:12 UTC</w:t>
+            </w:r>
+          </w:p>
+        </w:tc>
+        <w:tc>
+          <w:tcPr>
+            <w:tcW w:type="dxa" w:w="1361"/>
+            <w:shd w:val="clear" w:color="auto" w:fill="FEF3C7"/>
+            <w:tcBorders>
+              <w:bottom w:val="single" w:sz="4" w:color="D0D5DD"/>
+            </w:tcBorders>
+            <w:vAlign w:val="center"/>
+          </w:tcPr>
+          <w:p>
+            <w:pPr>
+              <w:spacing w:before="40" w:after="40"/>
+            </w:pPr>
+            <w:r>
+              <w:rPr>
+                <w:rFonts w:ascii="Arial" w:hAnsi="Arial"/>
+                <w:rFonts w:ascii="Arial" w:hAnsi="Arial" w:cs="Arial"/>
+                <w:b w:val="0"/>
+                <w:i w:val="0"/>
+                <w:color w:val="4A5568"/>
+                <w:sz w:val="15"/>
+              </w:rPr>
+              <w:t>Transfer-In</w:t>
+            </w:r>
+          </w:p>
+        </w:tc>
+        <w:tc>
+          <w:tcPr>
+            <w:tcW w:type="dxa" w:w="680"/>
+            <w:shd w:val="clear" w:color="auto" w:fill="FEF3C7"/>
+            <w:tcBorders>
+              <w:bottom w:val="single" w:sz="4" w:color="D0D5DD"/>
+            </w:tcBorders>
+            <w:vAlign w:val="center"/>
+          </w:tcPr>
+          <w:p>
+            <w:pPr>
+              <w:spacing w:before="40" w:after="40"/>
+            </w:pPr>
+            <w:r>
+              <w:rPr>
+                <w:rFonts w:ascii="Arial" w:hAnsi="Arial"/>
+                <w:rFonts w:ascii="Arial" w:hAnsi="Arial" w:cs="Arial"/>
+                <w:b w:val="0"/>
+                <w:i w:val="0"/>
+                <w:color w:val="4A5568"/>
+                <w:sz w:val="15"/>
+              </w:rPr>
+              <w:t>USDC</w:t>
+            </w:r>
+          </w:p>
+        </w:tc>
+        <w:tc>
+          <w:tcPr>
+            <w:tcW w:type="dxa" w:w="1134"/>
+            <w:shd w:val="clear" w:color="auto" w:fill="FEF3C7"/>
+            <w:tcBorders>
+              <w:bottom w:val="single" w:sz="4" w:color="D0D5DD"/>
+            </w:tcBorders>
+            <w:vAlign w:val="center"/>
+          </w:tcPr>
+          <w:p>
+            <w:pPr>
+              <w:spacing w:before="40" w:after="40"/>
+            </w:pPr>
+            <w:r>
+              <w:rPr>
+                <w:rFonts w:ascii="Arial" w:hAnsi="Arial"/>
+                <w:rFonts w:ascii="Arial" w:hAnsi="Arial" w:cs="Arial"/>
+                <w:b w:val="0"/>
+                <w:i w:val="0"/>
+                <w:color w:val="4A5568"/>
+                <w:sz w:val="15"/>
+              </w:rPr>
+              <w:t>Ethereum</w:t>
+            </w:r>
+          </w:p>
+        </w:tc>
+        <w:tc>
+          <w:tcPr>
+            <w:tcW w:type="dxa" w:w="1361"/>
+            <w:shd w:val="clear" w:color="auto" w:fill="FEF3C7"/>
+            <w:tcBorders>
+              <w:bottom w:val="single" w:sz="4" w:color="D0D5DD"/>
+            </w:tcBorders>
+            <w:vAlign w:val="center"/>
+          </w:tcPr>
+          <w:p>
+            <w:pPr>
+              <w:spacing w:before="40" w:after="40"/>
+              <w:jc w:val="right"/>
+            </w:pPr>
+            <w:r>
+              <w:rPr>
+                <w:rFonts w:ascii="Arial" w:hAnsi="Arial"/>
+                <w:rFonts w:ascii="Arial" w:hAnsi="Arial" w:cs="Arial"/>
+                <w:b w:val="0"/>
+                <w:i w:val="0"/>
+                <w:color w:val="4A5568"/>
+                <w:sz w:val="15"/>
+              </w:rPr>
+              <w:t>600,000.0000</w:t>
+            </w:r>
+          </w:p>
+        </w:tc>
+        <w:tc>
+          <w:tcPr>
+            <w:tcW w:type="dxa" w:w="1361"/>
+            <w:shd w:val="clear" w:color="auto" w:fill="FEF3C7"/>
+            <w:tcBorders>
+              <w:bottom w:val="single" w:sz="4" w:color="D0D5DD"/>
+            </w:tcBorders>
+            <w:vAlign w:val="center"/>
+          </w:tcPr>
+          <w:p>
+            <w:pPr>
+              <w:spacing w:before="40" w:after="40"/>
+              <w:jc w:val="right"/>
+            </w:pPr>
+            <w:r>
+              <w:rPr>
+                <w:rFonts w:ascii="Arial" w:hAnsi="Arial"/>
+                <w:rFonts w:ascii="Arial" w:hAnsi="Arial" w:cs="Arial"/>
+                <w:b w:val="0"/>
+                <w:i w:val="0"/>
+                <w:color w:val="4A5568"/>
+                <w:sz w:val="15"/>
+              </w:rPr>
+              <w:t>$599,400.00</w:t>
+            </w:r>
+          </w:p>
+        </w:tc>
+        <w:tc>
+          <w:tcPr>
+            <w:tcW w:type="dxa" w:w="1247"/>
+            <w:shd w:val="clear" w:color="auto" w:fill="FEF3C7"/>
+            <w:tcBorders>
+              <w:bottom w:val="single" w:sz="4" w:color="D0D5DD"/>
+            </w:tcBorders>
+            <w:vAlign w:val="center"/>
+          </w:tcPr>
+          <w:p>
+            <w:pPr>
+              <w:spacing w:before="40" w:after="40"/>
+              <w:jc w:val="right"/>
+            </w:pPr>
+            <w:r>
+              <w:rPr>
+                <w:rFonts w:ascii="Arial" w:hAnsi="Arial"/>
+                <w:rFonts w:ascii="Arial" w:hAnsi="Arial" w:cs="Arial"/>
+                <w:b w:val="0"/>
+                <w:i w:val="0"/>
+                <w:color w:val="4A5568"/>
+                <w:sz w:val="15"/>
+              </w:rPr>
+              <w:t>W20260413-6LQ8</w:t>
+            </w:r>
+          </w:p>
+        </w:tc>
+        <w:tc>
+          <w:tcPr>
+            <w:tcW w:type="dxa" w:w="1587"/>
+            <w:shd w:val="clear" w:color="auto" w:fill="FEF3C7"/>
+            <w:tcBorders>
+              <w:bottom w:val="single" w:sz="4" w:color="D0D5DD"/>
+            </w:tcBorders>
+            <w:vAlign w:val="center"/>
+          </w:tcPr>
+          <w:p>
+            <w:pPr>
+              <w:spacing w:before="40" w:after="40"/>
+              <w:jc w:val="right"/>
+            </w:pPr>
+            <w:r>
+              <w:rPr>
+                <w:rFonts w:ascii="Arial" w:hAnsi="Arial"/>
+                <w:rFonts w:ascii="Arial" w:hAnsi="Arial" w:cs="Arial"/>
+                <w:b w:val="0"/>
+                <w:i w:val="0"/>
+                <w:color w:val="B45309"/>
+                <w:sz w:val="15"/>
+              </w:rPr>
+              <w:t>Travel Rule declaration pending</w:t>
+            </w:r>
+          </w:p>
+        </w:tc>
+      </w:tr>
+      <w:tr>
+        <w:tc>
+          <w:tcPr>
+            <w:tcW w:type="dxa" w:w="1474"/>
+            <w:shd w:val="clear" w:color="auto" w:fill="FEF3C7"/>
+            <w:tcBorders>
+              <w:bottom w:val="single" w:sz="4" w:color="D0D5DD"/>
+            </w:tcBorders>
+            <w:vAlign w:val="center"/>
+          </w:tcPr>
+          <w:p>
+            <w:pPr>
+              <w:spacing w:before="40" w:after="40"/>
+            </w:pPr>
+            <w:r>
+              <w:rPr>
+                <w:rFonts w:ascii="Arial" w:hAnsi="Arial"/>
+                <w:rFonts w:ascii="Arial" w:hAnsi="Arial" w:cs="Arial"/>
+                <w:b w:val="0"/>
+                <w:i w:val="0"/>
+                <w:color w:val="4A5568"/>
+                <w:sz w:val="15"/>
+              </w:rPr>
+              <w:t>2026-04-20 17:22 UTC</w:t>
+            </w:r>
+          </w:p>
+        </w:tc>
+        <w:tc>
+          <w:tcPr>
+            <w:tcW w:type="dxa" w:w="1361"/>
+            <w:shd w:val="clear" w:color="auto" w:fill="FEF3C7"/>
+            <w:tcBorders>
+              <w:bottom w:val="single" w:sz="4" w:color="D0D5DD"/>
+            </w:tcBorders>
+            <w:vAlign w:val="center"/>
+          </w:tcPr>
+          <w:p>
+            <w:pPr>
+              <w:spacing w:before="40" w:after="40"/>
+            </w:pPr>
+            <w:r>
+              <w:rPr>
+                <w:rFonts w:ascii="Arial" w:hAnsi="Arial"/>
+                <w:rFonts w:ascii="Arial" w:hAnsi="Arial" w:cs="Arial"/>
+                <w:b w:val="0"/>
+                <w:i w:val="0"/>
+                <w:color w:val="4A5568"/>
+                <w:sz w:val="15"/>
+              </w:rPr>
+              <w:t>Transfer-In</w:t>
+            </w:r>
+          </w:p>
+        </w:tc>
+        <w:tc>
+          <w:tcPr>
+            <w:tcW w:type="dxa" w:w="680"/>
+            <w:shd w:val="clear" w:color="auto" w:fill="FEF3C7"/>
+            <w:tcBorders>
+              <w:bottom w:val="single" w:sz="4" w:color="D0D5DD"/>
+            </w:tcBorders>
+            <w:vAlign w:val="center"/>
+          </w:tcPr>
+          <w:p>
+            <w:pPr>
+              <w:spacing w:before="40" w:after="40"/>
+            </w:pPr>
+            <w:r>
+              <w:rPr>
+                <w:rFonts w:ascii="Arial" w:hAnsi="Arial"/>
+                <w:rFonts w:ascii="Arial" w:hAnsi="Arial" w:cs="Arial"/>
+                <w:b w:val="0"/>
+                <w:i w:val="0"/>
+                <w:color w:val="4A5568"/>
+                <w:sz w:val="15"/>
+              </w:rPr>
+              <w:t>USDT</w:t>
+            </w:r>
+          </w:p>
+        </w:tc>
+        <w:tc>
+          <w:tcPr>
+            <w:tcW w:type="dxa" w:w="1134"/>
+            <w:shd w:val="clear" w:color="auto" w:fill="FEF3C7"/>
+            <w:tcBorders>
+              <w:bottom w:val="single" w:sz="4" w:color="D0D5DD"/>
+            </w:tcBorders>
+            <w:vAlign w:val="center"/>
+          </w:tcPr>
+          <w:p>
+            <w:pPr>
+              <w:spacing w:before="40" w:after="40"/>
+            </w:pPr>
+            <w:r>
+              <w:rPr>
+                <w:rFonts w:ascii="Arial" w:hAnsi="Arial"/>
+                <w:rFonts w:ascii="Arial" w:hAnsi="Arial" w:cs="Arial"/>
+                <w:b w:val="0"/>
+                <w:i w:val="0"/>
+                <w:color w:val="4A5568"/>
+                <w:sz w:val="15"/>
+              </w:rPr>
+              <w:t>Ethereum</w:t>
+            </w:r>
+          </w:p>
+        </w:tc>
+        <w:tc>
+          <w:tcPr>
+            <w:tcW w:type="dxa" w:w="1361"/>
+            <w:shd w:val="clear" w:color="auto" w:fill="FEF3C7"/>
+            <w:tcBorders>
+              <w:bottom w:val="single" w:sz="4" w:color="D0D5DD"/>
+            </w:tcBorders>
+            <w:vAlign w:val="center"/>
+          </w:tcPr>
+          <w:p>
+            <w:pPr>
+              <w:spacing w:before="40" w:after="40"/>
+              <w:jc w:val="right"/>
+            </w:pPr>
+            <w:r>
+              <w:rPr>
+                <w:rFonts w:ascii="Arial" w:hAnsi="Arial"/>
+                <w:rFonts w:ascii="Arial" w:hAnsi="Arial" w:cs="Arial"/>
+                <w:b w:val="0"/>
+                <w:i w:val="0"/>
+                <w:color w:val="4A5568"/>
+                <w:sz w:val="15"/>
+              </w:rPr>
+              <w:t>753,430.0000</w:t>
+            </w:r>
+          </w:p>
+        </w:tc>
+        <w:tc>
+          <w:tcPr>
+            <w:tcW w:type="dxa" w:w="1361"/>
+            <w:shd w:val="clear" w:color="auto" w:fill="FEF3C7"/>
+            <w:tcBorders>
+              <w:bottom w:val="single" w:sz="4" w:color="D0D5DD"/>
+            </w:tcBorders>
+            <w:vAlign w:val="center"/>
+          </w:tcPr>
+          <w:p>
+            <w:pPr>
+              <w:spacing w:before="40" w:after="40"/>
+              <w:jc w:val="right"/>
+            </w:pPr>
+            <w:r>
+              <w:rPr>
+                <w:rFonts w:ascii="Arial" w:hAnsi="Arial"/>
+                <w:rFonts w:ascii="Arial" w:hAnsi="Arial" w:cs="Arial"/>
+                <w:b w:val="0"/>
+                <w:i w:val="0"/>
+                <w:color w:val="4A5568"/>
+                <w:sz w:val="15"/>
+              </w:rPr>
+              <w:t>$752,676.57</w:t>
+            </w:r>
+          </w:p>
+        </w:tc>
+        <w:tc>
+          <w:tcPr>
+            <w:tcW w:type="dxa" w:w="1247"/>
+            <w:shd w:val="clear" w:color="auto" w:fill="FEF3C7"/>
+            <w:tcBorders>
+              <w:bottom w:val="single" w:sz="4" w:color="D0D5DD"/>
+            </w:tcBorders>
+            <w:vAlign w:val="center"/>
+          </w:tcPr>
+          <w:p>
+            <w:pPr>
+              <w:spacing w:before="40" w:after="40"/>
+              <w:jc w:val="right"/>
+            </w:pPr>
+            <w:r>
+              <w:rPr>
+                <w:rFonts w:ascii="Arial" w:hAnsi="Arial"/>
+                <w:rFonts w:ascii="Arial" w:hAnsi="Arial" w:cs="Arial"/>
+                <w:b w:val="0"/>
+                <w:i w:val="0"/>
+                <w:color w:val="4A5568"/>
+                <w:sz w:val="15"/>
+              </w:rPr>
+              <w:t>W20260420-7HX4</w:t>
+            </w:r>
+          </w:p>
+        </w:tc>
+        <w:tc>
+          <w:tcPr>
+            <w:tcW w:type="dxa" w:w="1587"/>
+            <w:shd w:val="clear" w:color="auto" w:fill="FEF3C7"/>
+            <w:tcBorders>
+              <w:bottom w:val="single" w:sz="4" w:color="D0D5DD"/>
+            </w:tcBorders>
+            <w:vAlign w:val="center"/>
+          </w:tcPr>
+          <w:p>
+            <w:pPr>
+              <w:spacing w:before="40" w:after="40"/>
+              <w:jc w:val="right"/>
+            </w:pPr>
+            <w:r>
+              <w:rPr>
+                <w:rFonts w:ascii="Arial" w:hAnsi="Arial"/>
+                <w:rFonts w:ascii="Arial" w:hAnsi="Arial" w:cs="Arial"/>
+                <w:b w:val="0"/>
+                <w:i w:val="0"/>
+                <w:color w:val="B45309"/>
+                <w:sz w:val="15"/>
+              </w:rPr>
+              <w:t>Travel Rule declaration pending</w:t>
+            </w:r>
+          </w:p>
+        </w:tc>
+      </w:tr>
+      <w:tr>
+        <w:tc>
+          <w:tcPr>
+            <w:tcW w:type="dxa" w:w="1474"/>
+            <w:shd w:val="clear" w:color="auto" w:fill="FEF3C7"/>
+            <w:tcBorders>
+              <w:bottom w:val="single" w:sz="4" w:color="D0D5DD"/>
+            </w:tcBorders>
+            <w:vAlign w:val="center"/>
+          </w:tcPr>
+          <w:p>
+            <w:pPr>
+              <w:spacing w:before="40" w:after="40"/>
+            </w:pPr>
+            <w:r>
+              <w:rPr>
+                <w:rFonts w:ascii="Arial" w:hAnsi="Arial"/>
+                <w:rFonts w:ascii="Arial" w:hAnsi="Arial" w:cs="Arial"/>
+                <w:b w:val="0"/>
+                <w:i w:val="0"/>
+                <w:color w:val="4A5568"/>
+                <w:sz w:val="15"/>
+              </w:rPr>
+              <w:t>2026-04-29 09:55 UTC</w:t>
+            </w:r>
+          </w:p>
+        </w:tc>
+        <w:tc>
+          <w:tcPr>
+            <w:tcW w:type="dxa" w:w="1361"/>
+            <w:shd w:val="clear" w:color="auto" w:fill="FEF3C7"/>
+            <w:tcBorders>
+              <w:bottom w:val="single" w:sz="4" w:color="D0D5DD"/>
+            </w:tcBorders>
+            <w:vAlign w:val="center"/>
+          </w:tcPr>
+          <w:p>
+            <w:pPr>
+              <w:spacing w:before="40" w:after="40"/>
+            </w:pPr>
+            <w:r>
+              <w:rPr>
+                <w:rFonts w:ascii="Arial" w:hAnsi="Arial"/>
+                <w:rFonts w:ascii="Arial" w:hAnsi="Arial" w:cs="Arial"/>
+                <w:b w:val="0"/>
+                <w:i w:val="0"/>
+                <w:color w:val="4A5568"/>
+                <w:sz w:val="15"/>
+              </w:rPr>
+              <w:t>Transfer-Out</w:t>
+            </w:r>
+          </w:p>
+        </w:tc>
+        <w:tc>
+          <w:tcPr>
+            <w:tcW w:type="dxa" w:w="680"/>
+            <w:shd w:val="clear" w:color="auto" w:fill="FEF3C7"/>
+            <w:tcBorders>
+              <w:bottom w:val="single" w:sz="4" w:color="D0D5DD"/>
+            </w:tcBorders>
+            <w:vAlign w:val="center"/>
+          </w:tcPr>
+          <w:p>
+            <w:pPr>
+              <w:spacing w:before="40" w:after="40"/>
+            </w:pPr>
+            <w:r>
+              <w:rPr>
+                <w:rFonts w:ascii="Arial" w:hAnsi="Arial"/>
+                <w:rFonts w:ascii="Arial" w:hAnsi="Arial" w:cs="Arial"/>
+                <w:b w:val="0"/>
+                <w:i w:val="0"/>
+                <w:color w:val="4A5568"/>
+                <w:sz w:val="15"/>
+              </w:rPr>
+              <w:t>BTC</w:t>
+            </w:r>
+          </w:p>
+        </w:tc>
+        <w:tc>
+          <w:tcPr>
+            <w:tcW w:type="dxa" w:w="1134"/>
+            <w:shd w:val="clear" w:color="auto" w:fill="FEF3C7"/>
+            <w:tcBorders>
+              <w:bottom w:val="single" w:sz="4" w:color="D0D5DD"/>
+            </w:tcBorders>
+            <w:vAlign w:val="center"/>
+          </w:tcPr>
+          <w:p>
+            <w:pPr>
+              <w:spacing w:before="40" w:after="40"/>
+            </w:pPr>
+            <w:r>
+              <w:rPr>
+                <w:rFonts w:ascii="Arial" w:hAnsi="Arial"/>
+                <w:rFonts w:ascii="Arial" w:hAnsi="Arial" w:cs="Arial"/>
+                <w:b w:val="0"/>
+                <w:i w:val="0"/>
+                <w:color w:val="4A5568"/>
+                <w:sz w:val="15"/>
+              </w:rPr>
+              <w:t>Bitcoin</w:t>
+            </w:r>
+          </w:p>
+        </w:tc>
+        <w:tc>
+          <w:tcPr>
+            <w:tcW w:type="dxa" w:w="1361"/>
+            <w:shd w:val="clear" w:color="auto" w:fill="FEF3C7"/>
+            <w:tcBorders>
+              <w:bottom w:val="single" w:sz="4" w:color="D0D5DD"/>
+            </w:tcBorders>
+            <w:vAlign w:val="center"/>
+          </w:tcPr>
+          <w:p>
+            <w:pPr>
+              <w:spacing w:before="40" w:after="40"/>
+              <w:jc w:val="right"/>
+            </w:pPr>
+            <w:r>
+              <w:rPr>
+                <w:rFonts w:ascii="Arial" w:hAnsi="Arial"/>
+                <w:rFonts w:ascii="Arial" w:hAnsi="Arial" w:cs="Arial"/>
+                <w:b w:val="0"/>
+                <w:i w:val="0"/>
+                <w:color w:val="4A5568"/>
+                <w:sz w:val="15"/>
+              </w:rPr>
+              <w:t>-0.50000000</w:t>
+            </w:r>
+          </w:p>
+        </w:tc>
+        <w:tc>
+          <w:tcPr>
+            <w:tcW w:type="dxa" w:w="1361"/>
+            <w:shd w:val="clear" w:color="auto" w:fill="FEF3C7"/>
+            <w:tcBorders>
+              <w:bottom w:val="single" w:sz="4" w:color="D0D5DD"/>
+            </w:tcBorders>
+            <w:vAlign w:val="center"/>
+          </w:tcPr>
+          <w:p>
+            <w:pPr>
+              <w:spacing w:before="40" w:after="40"/>
+              <w:jc w:val="right"/>
+            </w:pPr>
+            <w:r>
+              <w:rPr>
+                <w:rFonts w:ascii="Arial" w:hAnsi="Arial"/>
+                <w:rFonts w:ascii="Arial" w:hAnsi="Arial" w:cs="Arial"/>
+                <w:b w:val="0"/>
+                <w:i w:val="0"/>
+                <w:color w:val="4A5568"/>
+                <w:sz w:val="15"/>
+              </w:rPr>
+              <w:t>-$38,212.50</w:t>
+            </w:r>
+          </w:p>
+        </w:tc>
+        <w:tc>
+          <w:tcPr>
+            <w:tcW w:type="dxa" w:w="1247"/>
+            <w:shd w:val="clear" w:color="auto" w:fill="FEF3C7"/>
+            <w:tcBorders>
+              <w:bottom w:val="single" w:sz="4" w:color="D0D5DD"/>
+            </w:tcBorders>
+            <w:vAlign w:val="center"/>
+          </w:tcPr>
+          <w:p>
+            <w:pPr>
+              <w:spacing w:before="40" w:after="40"/>
+              <w:jc w:val="right"/>
+            </w:pPr>
+            <w:r>
+              <w:rPr>
+                <w:rFonts w:ascii="Arial" w:hAnsi="Arial"/>
+                <w:rFonts w:ascii="Arial" w:hAnsi="Arial" w:cs="Arial"/>
+                <w:b w:val="0"/>
+                <w:i w:val="0"/>
+                <w:color w:val="4A5568"/>
+                <w:sz w:val="15"/>
+              </w:rPr>
+              <w:t>W20260429-QR03</w:t>
+            </w:r>
+          </w:p>
+        </w:tc>
+        <w:tc>
+          <w:tcPr>
+            <w:tcW w:type="dxa" w:w="1587"/>
+            <w:shd w:val="clear" w:color="auto" w:fill="FEF3C7"/>
+            <w:tcBorders>
+              <w:bottom w:val="single" w:sz="4" w:color="D0D5DD"/>
+            </w:tcBorders>
+            <w:vAlign w:val="center"/>
+          </w:tcPr>
+          <w:p>
+            <w:pPr>
+              <w:spacing w:before="40" w:after="40"/>
+              <w:jc w:val="right"/>
+            </w:pPr>
+            <w:r>
+              <w:rPr>
+                <w:rFonts w:ascii="Arial" w:hAnsi="Arial"/>
+                <w:rFonts w:ascii="Arial" w:hAnsi="Arial" w:cs="Arial"/>
+                <w:b w:val="0"/>
+                <w:i w:val="0"/>
+                <w:color w:val="B45309"/>
+                <w:sz w:val="15"/>
+              </w:rPr>
+              <w:t>Quorum approval pending</w:t>
+            </w:r>
+          </w:p>
+        </w:tc>
+      </w:tr>
+      <w:tr>
+        <w:tc>
+          <w:tcPr>
+            <w:tcW w:type="dxa" w:w="1474"/>
+            <w:shd w:val="clear" w:color="auto" w:fill="FEF3C7"/>
+            <w:tcBorders>
+              <w:bottom w:val="single" w:sz="4" w:color="D0D5DD"/>
+            </w:tcBorders>
+            <w:vAlign w:val="center"/>
+          </w:tcPr>
+          <w:p>
+            <w:pPr>
+              <w:spacing w:before="40" w:after="40"/>
+            </w:pPr>
+            <w:r>
+              <w:rPr>
+                <w:rFonts w:ascii="Arial" w:hAnsi="Arial"/>
+                <w:rFonts w:ascii="Arial" w:hAnsi="Arial" w:cs="Arial"/>
+                <w:b w:val="0"/>
+                <w:i w:val="0"/>
+                <w:color w:val="4A5568"/>
+                <w:sz w:val="15"/>
+              </w:rPr>
+              <w:t>2026-04-30 22:15 UTC</w:t>
+            </w:r>
+          </w:p>
+        </w:tc>
+        <w:tc>
+          <w:tcPr>
+            <w:tcW w:type="dxa" w:w="1361"/>
+            <w:shd w:val="clear" w:color="auto" w:fill="FEF3C7"/>
+            <w:tcBorders>
+              <w:bottom w:val="single" w:sz="4" w:color="D0D5DD"/>
+            </w:tcBorders>
+            <w:vAlign w:val="center"/>
+          </w:tcPr>
+          <w:p>
+            <w:pPr>
+              <w:spacing w:before="40" w:after="40"/>
+            </w:pPr>
+            <w:r>
+              <w:rPr>
+                <w:rFonts w:ascii="Arial" w:hAnsi="Arial"/>
+                <w:rFonts w:ascii="Arial" w:hAnsi="Arial" w:cs="Arial"/>
+                <w:b w:val="0"/>
+                <w:i w:val="0"/>
+                <w:color w:val="4A5568"/>
+                <w:sz w:val="15"/>
+              </w:rPr>
+              <w:t>Transfer-Out</w:t>
+            </w:r>
+          </w:p>
+        </w:tc>
+        <w:tc>
+          <w:tcPr>
+            <w:tcW w:type="dxa" w:w="680"/>
+            <w:shd w:val="clear" w:color="auto" w:fill="FEF3C7"/>
+            <w:tcBorders>
+              <w:bottom w:val="single" w:sz="4" w:color="D0D5DD"/>
+            </w:tcBorders>
+            <w:vAlign w:val="center"/>
+          </w:tcPr>
+          <w:p>
+            <w:pPr>
+              <w:spacing w:before="40" w:after="40"/>
+            </w:pPr>
+            <w:r>
+              <w:rPr>
+                <w:rFonts w:ascii="Arial" w:hAnsi="Arial"/>
+                <w:rFonts w:ascii="Arial" w:hAnsi="Arial" w:cs="Arial"/>
+                <w:b w:val="0"/>
+                <w:i w:val="0"/>
+                <w:color w:val="4A5568"/>
+                <w:sz w:val="15"/>
+              </w:rPr>
+              <w:t>USDT</w:t>
+            </w:r>
+          </w:p>
+        </w:tc>
+        <w:tc>
+          <w:tcPr>
+            <w:tcW w:type="dxa" w:w="1134"/>
+            <w:shd w:val="clear" w:color="auto" w:fill="FEF3C7"/>
+            <w:tcBorders>
+              <w:bottom w:val="single" w:sz="4" w:color="D0D5DD"/>
+            </w:tcBorders>
+            <w:vAlign w:val="center"/>
+          </w:tcPr>
+          <w:p>
+            <w:pPr>
+              <w:spacing w:before="40" w:after="40"/>
+            </w:pPr>
+            <w:r>
+              <w:rPr>
+                <w:rFonts w:ascii="Arial" w:hAnsi="Arial"/>
+                <w:rFonts w:ascii="Arial" w:hAnsi="Arial" w:cs="Arial"/>
+                <w:b w:val="0"/>
+                <w:i w:val="0"/>
+                <w:color w:val="4A5568"/>
+                <w:sz w:val="15"/>
+              </w:rPr>
+              <w:t>Tron</w:t>
+            </w:r>
+          </w:p>
+        </w:tc>
+        <w:tc>
+          <w:tcPr>
+            <w:tcW w:type="dxa" w:w="1361"/>
+            <w:shd w:val="clear" w:color="auto" w:fill="FEF3C7"/>
+            <w:tcBorders>
+              <w:bottom w:val="single" w:sz="4" w:color="D0D5DD"/>
+            </w:tcBorders>
+            <w:vAlign w:val="center"/>
+          </w:tcPr>
+          <w:p>
+            <w:pPr>
+              <w:spacing w:before="40" w:after="40"/>
+              <w:jc w:val="right"/>
+            </w:pPr>
+            <w:r>
+              <w:rPr>
+                <w:rFonts w:ascii="Arial" w:hAnsi="Arial"/>
+                <w:rFonts w:ascii="Arial" w:hAnsi="Arial" w:cs="Arial"/>
+                <w:b w:val="0"/>
+                <w:i w:val="0"/>
+                <w:color w:val="4A5568"/>
+                <w:sz w:val="15"/>
+              </w:rPr>
+              <w:t>-180,000.0000</w:t>
+            </w:r>
+          </w:p>
+        </w:tc>
+        <w:tc>
+          <w:tcPr>
+            <w:tcW w:type="dxa" w:w="1361"/>
+            <w:shd w:val="clear" w:color="auto" w:fill="FEF3C7"/>
+            <w:tcBorders>
+              <w:bottom w:val="single" w:sz="4" w:color="D0D5DD"/>
+            </w:tcBorders>
+            <w:vAlign w:val="center"/>
+          </w:tcPr>
+          <w:p>
+            <w:pPr>
+              <w:spacing w:before="40" w:after="40"/>
+              <w:jc w:val="right"/>
+            </w:pPr>
+            <w:r>
+              <w:rPr>
+                <w:rFonts w:ascii="Arial" w:hAnsi="Arial"/>
+                <w:rFonts w:ascii="Arial" w:hAnsi="Arial" w:cs="Arial"/>
+                <w:b w:val="0"/>
+                <w:i w:val="0"/>
+                <w:color w:val="4A5568"/>
+                <w:sz w:val="15"/>
+              </w:rPr>
+              <w:t>-$179,820.00</w:t>
+            </w:r>
+          </w:p>
+        </w:tc>
+        <w:tc>
+          <w:tcPr>
+            <w:tcW w:type="dxa" w:w="1247"/>
+            <w:shd w:val="clear" w:color="auto" w:fill="FEF3C7"/>
+            <w:tcBorders>
+              <w:bottom w:val="single" w:sz="4" w:color="D0D5DD"/>
+            </w:tcBorders>
+            <w:vAlign w:val="center"/>
+          </w:tcPr>
+          <w:p>
+            <w:pPr>
+              <w:spacing w:before="40" w:after="40"/>
+              <w:jc w:val="right"/>
+            </w:pPr>
+            <w:r>
+              <w:rPr>
+                <w:rFonts w:ascii="Arial" w:hAnsi="Arial"/>
+                <w:rFonts w:ascii="Arial" w:hAnsi="Arial" w:cs="Arial"/>
+                <w:b w:val="0"/>
+                <w:i w:val="0"/>
+                <w:color w:val="4A5568"/>
+                <w:sz w:val="15"/>
+              </w:rPr>
+              <w:t>W20260430-CP12</w:t>
+            </w:r>
+          </w:p>
+        </w:tc>
+        <w:tc>
+          <w:tcPr>
+            <w:tcW w:type="dxa" w:w="1587"/>
+            <w:shd w:val="clear" w:color="auto" w:fill="FEF3C7"/>
+            <w:tcBorders>
+              <w:bottom w:val="single" w:sz="4" w:color="D0D5DD"/>
+            </w:tcBorders>
+            <w:vAlign w:val="center"/>
+          </w:tcPr>
+          <w:p>
+            <w:pPr>
+              <w:spacing w:before="40" w:after="40"/>
+              <w:jc w:val="right"/>
+            </w:pPr>
+            <w:r>
+              <w:rPr>
+                <w:rFonts w:ascii="Arial" w:hAnsi="Arial"/>
+                <w:rFonts w:ascii="Arial" w:hAnsi="Arial" w:cs="Arial"/>
+                <w:b w:val="0"/>
+                <w:i w:val="0"/>
+                <w:color w:val="B45309"/>
+                <w:sz w:val="15"/>
+              </w:rPr>
+              <w:t>Quorum approval pending</w:t>
+            </w:r>
+          </w:p>
+        </w:tc>
+      </w:tr>
+      <w:tr>
+        <w:tc>
+          <w:tcPr>
+            <w:tcW w:type="dxa" w:w="1474"/>
+            <w:shd w:val="clear" w:color="auto" w:fill="E5EBF1"/>
+            <w:tcBorders>
+              <w:bottom w:val="single" w:sz="4" w:color="D0D5DD"/>
+            </w:tcBorders>
+            <w:vAlign w:val="center"/>
+          </w:tcPr>
+          <w:p>
+            <w:pPr>
+              <w:spacing w:before="40" w:after="40"/>
+            </w:pPr>
+            <w:r>
+              <w:rPr>
+                <w:rFonts w:ascii="Arial" w:hAnsi="Arial"/>
+                <w:rFonts w:ascii="Arial" w:hAnsi="Arial" w:cs="Arial"/>
+                <w:b/>
+                <w:i w:val="0"/>
+                <w:color w:val="0A2342"/>
+                <w:sz w:val="15"/>
+              </w:rPr>
+              <w:t>Total (4 pending)</w:t>
+            </w:r>
+          </w:p>
+        </w:tc>
+        <w:tc>
+          <w:tcPr>
+            <w:tcW w:type="dxa" w:w="1361"/>
+            <w:shd w:val="clear" w:color="auto" w:fill="E5EBF1"/>
+            <w:tcBorders>
+              <w:bottom w:val="single" w:sz="4" w:color="D0D5DD"/>
+            </w:tcBorders>
+            <w:vAlign w:val="center"/>
+          </w:tcPr>
+          <w:p>
+            <w:pPr>
+              <w:spacing w:before="40" w:after="40"/>
+            </w:pPr>
+            <w:r>
+              <w:rPr>
+                <w:rFonts w:ascii="Arial" w:hAnsi="Arial"/>
+                <w:rFonts w:ascii="Arial" w:hAnsi="Arial" w:cs="Arial"/>
+                <w:b/>
+                <w:i w:val="0"/>
+                <w:color w:val="0A2342"/>
+                <w:sz w:val="15"/>
+              </w:rPr>
+            </w:r>
+          </w:p>
+        </w:tc>
+        <w:tc>
+          <w:tcPr>
+            <w:tcW w:type="dxa" w:w="680"/>
+            <w:shd w:val="clear" w:color="auto" w:fill="E5EBF1"/>
+            <w:tcBorders>
+              <w:bottom w:val="single" w:sz="4" w:color="D0D5DD"/>
+            </w:tcBorders>
+            <w:vAlign w:val="center"/>
+          </w:tcPr>
+          <w:p>
+            <w:pPr>
+              <w:spacing w:before="40" w:after="40"/>
+            </w:pPr>
+            <w:r>
+              <w:rPr>
+                <w:rFonts w:ascii="Arial" w:hAnsi="Arial"/>
+                <w:rFonts w:ascii="Arial" w:hAnsi="Arial" w:cs="Arial"/>
+                <w:b/>
+                <w:i w:val="0"/>
+                <w:color w:val="0A2342"/>
+                <w:sz w:val="15"/>
+              </w:rPr>
+            </w:r>
+          </w:p>
+        </w:tc>
+        <w:tc>
+          <w:tcPr>
+            <w:tcW w:type="dxa" w:w="1134"/>
+            <w:shd w:val="clear" w:color="auto" w:fill="E5EBF1"/>
+            <w:tcBorders>
+              <w:bottom w:val="single" w:sz="4" w:color="D0D5DD"/>
+            </w:tcBorders>
+            <w:vAlign w:val="center"/>
+          </w:tcPr>
+          <w:p>
+            <w:pPr>
+              <w:spacing w:before="40" w:after="40"/>
+            </w:pPr>
+            <w:r>
+              <w:rPr>
+                <w:rFonts w:ascii="Arial" w:hAnsi="Arial"/>
+                <w:rFonts w:ascii="Arial" w:hAnsi="Arial" w:cs="Arial"/>
+                <w:b/>
+                <w:i w:val="0"/>
+                <w:color w:val="0A2342"/>
+                <w:sz w:val="15"/>
+              </w:rPr>
+            </w:r>
+          </w:p>
+        </w:tc>
+        <w:tc>
+          <w:tcPr>
+            <w:tcW w:type="dxa" w:w="1361"/>
+            <w:shd w:val="clear" w:color="auto" w:fill="E5EBF1"/>
+            <w:tcBorders>
+              <w:bottom w:val="single" w:sz="4" w:color="D0D5DD"/>
+            </w:tcBorders>
+            <w:vAlign w:val="center"/>
+          </w:tcPr>
+          <w:p>
+            <w:pPr>
+              <w:spacing w:before="40" w:after="40"/>
+              <w:jc w:val="right"/>
+            </w:pPr>
+            <w:r>
+              <w:rPr>
+                <w:rFonts w:ascii="Arial" w:hAnsi="Arial"/>
+                <w:rFonts w:ascii="Arial" w:hAnsi="Arial" w:cs="Arial"/>
+                <w:b/>
+                <w:i w:val="0"/>
+                <w:color w:val="0A2342"/>
+                <w:sz w:val="15"/>
+              </w:rPr>
+            </w:r>
+          </w:p>
+        </w:tc>
+        <w:tc>
+          <w:tcPr>
+            <w:tcW w:type="dxa" w:w="1361"/>
+            <w:shd w:val="clear" w:color="auto" w:fill="E5EBF1"/>
+            <w:tcBorders>
+              <w:bottom w:val="single" w:sz="4" w:color="D0D5DD"/>
+            </w:tcBorders>
+            <w:vAlign w:val="center"/>
+          </w:tcPr>
+          <w:p>
+            <w:pPr>
+              <w:spacing w:before="40" w:after="40"/>
+              <w:jc w:val="right"/>
+            </w:pPr>
+            <w:r>
+              <w:rPr>
+                <w:rFonts w:ascii="Arial" w:hAnsi="Arial"/>
+                <w:rFonts w:ascii="Arial" w:hAnsi="Arial" w:cs="Arial"/>
+                <w:b/>
+                <w:i w:val="0"/>
+                <w:color w:val="0A2342"/>
+                <w:sz w:val="15"/>
+              </w:rPr>
+              <w:t>$1,570,109.07</w:t>
+            </w:r>
+          </w:p>
+        </w:tc>
+        <w:tc>
+          <w:tcPr>
+            <w:tcW w:type="dxa" w:w="1247"/>
+            <w:shd w:val="clear" w:color="auto" w:fill="E5EBF1"/>
+            <w:tcBorders>
+              <w:bottom w:val="single" w:sz="4" w:color="D0D5DD"/>
+            </w:tcBorders>
+            <w:vAlign w:val="center"/>
+          </w:tcPr>
+          <w:p>
+            <w:pPr>
+              <w:spacing w:before="40" w:after="40"/>
+              <w:jc w:val="right"/>
+            </w:pPr>
+            <w:r>
+              <w:rPr>
+                <w:rFonts w:ascii="Arial" w:hAnsi="Arial"/>
+                <w:rFonts w:ascii="Arial" w:hAnsi="Arial" w:cs="Arial"/>
+                <w:b/>
+                <w:i w:val="0"/>
+                <w:color w:val="0A2342"/>
+                <w:sz w:val="15"/>
+              </w:rPr>
+            </w:r>
+          </w:p>
+        </w:tc>
+        <w:tc>
+          <w:tcPr>
+            <w:tcW w:type="dxa" w:w="1587"/>
+            <w:shd w:val="clear" w:color="auto" w:fill="E5EBF1"/>
+            <w:tcBorders>
+              <w:bottom w:val="single" w:sz="4" w:color="D0D5DD"/>
+            </w:tcBorders>
+            <w:vAlign w:val="center"/>
+          </w:tcPr>
+          <w:p>
+            <w:pPr>
+              <w:spacing w:before="40" w:after="40"/>
+              <w:jc w:val="right"/>
+            </w:pPr>
+            <w:r>
+              <w:rPr>
+                <w:rFonts w:ascii="Arial" w:hAnsi="Arial"/>
+                <w:rFonts w:ascii="Arial" w:hAnsi="Arial" w:cs="Arial"/>
+                <w:b/>
+                <w:i w:val="0"/>
+                <w:color w:val="0A2342"/>
+                <w:sz w:val="15"/>
+              </w:rPr>
             </w:r>
           </w:p>
         </w:tc>
@@ -19704,1393 +21091,6 @@
                 <w:sz w:val="16"/>
               </w:rPr>
               <w:t>W20260428-5LP9</w:t>
-            </w:r>
-          </w:p>
-        </w:tc>
-      </w:tr>
-    </w:tbl>
-    <w:p>
-      <w:pPr>
-        <w:spacing w:before="160" w:after="60"/>
-      </w:pPr>
-      <w:r>
-        <w:rPr>
-          <w:rFonts w:ascii="Arial" w:hAnsi="Arial"/>
-          <w:rFonts w:ascii="Arial" w:hAnsi="Arial" w:cs="Arial"/>
-          <w:b/>
-          <w:i w:val="0"/>
-          <w:color w:val="0F2A4D"/>
-          <w:sz w:val="20"/>
-        </w:rPr>
-        <w:t>Pending transactions</w:t>
-      </w:r>
-    </w:p>
-    <w:tbl>
-      <w:tblPr>
-        <w:tblW w:type="auto" w:w="0"/>
-        <w:jc w:val="left"/>
-        <w:tblLayout w:type="fixed"/>
-        <w:tblLook w:firstColumn="1" w:firstRow="1" w:lastColumn="0" w:lastRow="0" w:noHBand="0" w:noVBand="1" w:val="04A0"/>
-      </w:tblPr>
-      <w:tblGrid>
-        <w:gridCol w:w="1474"/>
-        <w:gridCol w:w="1361"/>
-        <w:gridCol w:w="680"/>
-        <w:gridCol w:w="1134"/>
-        <w:gridCol w:w="1361"/>
-        <w:gridCol w:w="1361"/>
-        <w:gridCol w:w="1247"/>
-        <w:gridCol w:w="1587"/>
-      </w:tblGrid>
-      <w:tr>
-        <w:trPr>
-          <w:trHeight w:val="420" w:hRule="atLeast"/>
-        </w:trPr>
-        <w:tc>
-          <w:tcPr>
-            <w:tcW w:type="dxa" w:w="1474"/>
-            <w:shd w:val="clear" w:color="auto" w:fill="0A2342"/>
-            <w:tcBorders>
-              <w:top w:val="nil"/>
-            </w:tcBorders>
-            <w:tcBorders>
-              <w:bottom w:val="nil"/>
-            </w:tcBorders>
-            <w:tcBorders>
-              <w:left w:val="nil"/>
-            </w:tcBorders>
-            <w:tcBorders>
-              <w:right w:val="nil"/>
-            </w:tcBorders>
-            <w:vAlign w:val="center"/>
-          </w:tcPr>
-          <w:p>
-            <w:pPr>
-              <w:spacing w:before="0" w:after="0"/>
-            </w:pPr>
-            <w:r>
-              <w:rPr>
-                <w:rFonts w:ascii="Arial" w:hAnsi="Arial"/>
-                <w:rFonts w:ascii="Arial" w:hAnsi="Arial" w:cs="Arial"/>
-                <w:b/>
-                <w:i w:val="0"/>
-                <w:color w:val="FFFFFF"/>
-                <w:sz w:val="17"/>
-              </w:rPr>
-              <w:t>Date / Time (UTC)</w:t>
-            </w:r>
-          </w:p>
-        </w:tc>
-        <w:tc>
-          <w:tcPr>
-            <w:tcW w:type="dxa" w:w="1361"/>
-            <w:shd w:val="clear" w:color="auto" w:fill="0A2342"/>
-            <w:tcBorders>
-              <w:top w:val="nil"/>
-            </w:tcBorders>
-            <w:tcBorders>
-              <w:bottom w:val="nil"/>
-            </w:tcBorders>
-            <w:tcBorders>
-              <w:left w:val="nil"/>
-            </w:tcBorders>
-            <w:tcBorders>
-              <w:right w:val="nil"/>
-            </w:tcBorders>
-            <w:vAlign w:val="center"/>
-          </w:tcPr>
-          <w:p>
-            <w:pPr>
-              <w:spacing w:before="0" w:after="0"/>
-            </w:pPr>
-            <w:r>
-              <w:rPr>
-                <w:rFonts w:ascii="Arial" w:hAnsi="Arial"/>
-                <w:rFonts w:ascii="Arial" w:hAnsi="Arial" w:cs="Arial"/>
-                <w:b/>
-                <w:i w:val="0"/>
-                <w:color w:val="FFFFFF"/>
-                <w:sz w:val="17"/>
-              </w:rPr>
-              <w:t>Type</w:t>
-            </w:r>
-          </w:p>
-        </w:tc>
-        <w:tc>
-          <w:tcPr>
-            <w:tcW w:type="dxa" w:w="680"/>
-            <w:shd w:val="clear" w:color="auto" w:fill="0A2342"/>
-            <w:tcBorders>
-              <w:top w:val="nil"/>
-            </w:tcBorders>
-            <w:tcBorders>
-              <w:bottom w:val="nil"/>
-            </w:tcBorders>
-            <w:tcBorders>
-              <w:left w:val="nil"/>
-            </w:tcBorders>
-            <w:tcBorders>
-              <w:right w:val="nil"/>
-            </w:tcBorders>
-            <w:vAlign w:val="center"/>
-          </w:tcPr>
-          <w:p>
-            <w:pPr>
-              <w:spacing w:before="0" w:after="0"/>
-            </w:pPr>
-            <w:r>
-              <w:rPr>
-                <w:rFonts w:ascii="Arial" w:hAnsi="Arial"/>
-                <w:rFonts w:ascii="Arial" w:hAnsi="Arial" w:cs="Arial"/>
-                <w:b/>
-                <w:i w:val="0"/>
-                <w:color w:val="FFFFFF"/>
-                <w:sz w:val="17"/>
-              </w:rPr>
-              <w:t>Asset</w:t>
-            </w:r>
-          </w:p>
-        </w:tc>
-        <w:tc>
-          <w:tcPr>
-            <w:tcW w:type="dxa" w:w="1134"/>
-            <w:shd w:val="clear" w:color="auto" w:fill="0A2342"/>
-            <w:tcBorders>
-              <w:top w:val="nil"/>
-            </w:tcBorders>
-            <w:tcBorders>
-              <w:bottom w:val="nil"/>
-            </w:tcBorders>
-            <w:tcBorders>
-              <w:left w:val="nil"/>
-            </w:tcBorders>
-            <w:tcBorders>
-              <w:right w:val="nil"/>
-            </w:tcBorders>
-            <w:vAlign w:val="center"/>
-          </w:tcPr>
-          <w:p>
-            <w:pPr>
-              <w:spacing w:before="0" w:after="0"/>
-            </w:pPr>
-            <w:r>
-              <w:rPr>
-                <w:rFonts w:ascii="Arial" w:hAnsi="Arial"/>
-                <w:rFonts w:ascii="Arial" w:hAnsi="Arial" w:cs="Arial"/>
-                <w:b/>
-                <w:i w:val="0"/>
-                <w:color w:val="FFFFFF"/>
-                <w:sz w:val="17"/>
-              </w:rPr>
-              <w:t>Network</w:t>
-            </w:r>
-          </w:p>
-        </w:tc>
-        <w:tc>
-          <w:tcPr>
-            <w:tcW w:type="dxa" w:w="1361"/>
-            <w:shd w:val="clear" w:color="auto" w:fill="0A2342"/>
-            <w:tcBorders>
-              <w:top w:val="nil"/>
-            </w:tcBorders>
-            <w:tcBorders>
-              <w:bottom w:val="nil"/>
-            </w:tcBorders>
-            <w:tcBorders>
-              <w:left w:val="nil"/>
-            </w:tcBorders>
-            <w:tcBorders>
-              <w:right w:val="nil"/>
-            </w:tcBorders>
-            <w:vAlign w:val="center"/>
-          </w:tcPr>
-          <w:p>
-            <w:pPr>
-              <w:spacing w:before="0" w:after="0"/>
-              <w:jc w:val="right"/>
-            </w:pPr>
-            <w:r>
-              <w:rPr>
-                <w:rFonts w:ascii="Arial" w:hAnsi="Arial"/>
-                <w:rFonts w:ascii="Arial" w:hAnsi="Arial" w:cs="Arial"/>
-                <w:b/>
-                <w:i w:val="0"/>
-                <w:color w:val="FFFFFF"/>
-                <w:sz w:val="17"/>
-              </w:rPr>
-              <w:t>Quantity</w:t>
-            </w:r>
-          </w:p>
-        </w:tc>
-        <w:tc>
-          <w:tcPr>
-            <w:tcW w:type="dxa" w:w="1361"/>
-            <w:shd w:val="clear" w:color="auto" w:fill="0A2342"/>
-            <w:tcBorders>
-              <w:top w:val="nil"/>
-            </w:tcBorders>
-            <w:tcBorders>
-              <w:bottom w:val="nil"/>
-            </w:tcBorders>
-            <w:tcBorders>
-              <w:left w:val="nil"/>
-            </w:tcBorders>
-            <w:tcBorders>
-              <w:right w:val="nil"/>
-            </w:tcBorders>
-            <w:vAlign w:val="center"/>
-          </w:tcPr>
-          <w:p>
-            <w:pPr>
-              <w:spacing w:before="0" w:after="0"/>
-              <w:jc w:val="right"/>
-            </w:pPr>
-            <w:r>
-              <w:rPr>
-                <w:rFonts w:ascii="Arial" w:hAnsi="Arial"/>
-                <w:rFonts w:ascii="Arial" w:hAnsi="Arial" w:cs="Arial"/>
-                <w:b/>
-                <w:i w:val="0"/>
-                <w:color w:val="FFFFFF"/>
-                <w:sz w:val="17"/>
-              </w:rPr>
-              <w:t>Value (USD)</w:t>
-            </w:r>
-          </w:p>
-        </w:tc>
-        <w:tc>
-          <w:tcPr>
-            <w:tcW w:type="dxa" w:w="1247"/>
-            <w:shd w:val="clear" w:color="auto" w:fill="0A2342"/>
-            <w:tcBorders>
-              <w:top w:val="nil"/>
-            </w:tcBorders>
-            <w:tcBorders>
-              <w:bottom w:val="nil"/>
-            </w:tcBorders>
-            <w:tcBorders>
-              <w:left w:val="nil"/>
-            </w:tcBorders>
-            <w:tcBorders>
-              <w:right w:val="nil"/>
-            </w:tcBorders>
-            <w:vAlign w:val="center"/>
-          </w:tcPr>
-          <w:p>
-            <w:pPr>
-              <w:spacing w:before="0" w:after="0"/>
-              <w:jc w:val="right"/>
-            </w:pPr>
-            <w:r>
-              <w:rPr>
-                <w:rFonts w:ascii="Arial" w:hAnsi="Arial"/>
-                <w:rFonts w:ascii="Arial" w:hAnsi="Arial" w:cs="Arial"/>
-                <w:b/>
-                <w:i w:val="0"/>
-                <w:color w:val="FFFFFF"/>
-                <w:sz w:val="17"/>
-              </w:rPr>
-              <w:t>Transaction ID</w:t>
-            </w:r>
-          </w:p>
-        </w:tc>
-        <w:tc>
-          <w:tcPr>
-            <w:tcW w:type="dxa" w:w="1587"/>
-            <w:shd w:val="clear" w:color="auto" w:fill="0A2342"/>
-            <w:tcBorders>
-              <w:top w:val="nil"/>
-            </w:tcBorders>
-            <w:tcBorders>
-              <w:bottom w:val="nil"/>
-            </w:tcBorders>
-            <w:tcBorders>
-              <w:left w:val="nil"/>
-            </w:tcBorders>
-            <w:tcBorders>
-              <w:right w:val="nil"/>
-            </w:tcBorders>
-            <w:vAlign w:val="center"/>
-          </w:tcPr>
-          <w:p>
-            <w:pPr>
-              <w:spacing w:before="0" w:after="0"/>
-              <w:jc w:val="right"/>
-            </w:pPr>
-            <w:r>
-              <w:rPr>
-                <w:rFonts w:ascii="Arial" w:hAnsi="Arial"/>
-                <w:rFonts w:ascii="Arial" w:hAnsi="Arial" w:cs="Arial"/>
-                <w:b/>
-                <w:i w:val="0"/>
-                <w:color w:val="FFFFFF"/>
-                <w:sz w:val="17"/>
-              </w:rPr>
-              <w:t>Pending Status</w:t>
-            </w:r>
-          </w:p>
-        </w:tc>
-      </w:tr>
-      <w:tr>
-        <w:tc>
-          <w:tcPr>
-            <w:tcW w:type="dxa" w:w="1474"/>
-            <w:shd w:val="clear" w:color="auto" w:fill="FEF3C7"/>
-            <w:tcBorders>
-              <w:bottom w:val="single" w:sz="4" w:color="D0D5DD"/>
-            </w:tcBorders>
-            <w:vAlign w:val="center"/>
-          </w:tcPr>
-          <w:p>
-            <w:pPr>
-              <w:spacing w:before="40" w:after="40"/>
-            </w:pPr>
-            <w:r>
-              <w:rPr>
-                <w:rFonts w:ascii="Arial" w:hAnsi="Arial"/>
-                <w:rFonts w:ascii="Arial" w:hAnsi="Arial" w:cs="Arial"/>
-                <w:b w:val="0"/>
-                <w:i w:val="0"/>
-                <w:color w:val="4A5568"/>
-                <w:sz w:val="15"/>
-              </w:rPr>
-              <w:t>2026-04-13 14:12 UTC</w:t>
-            </w:r>
-          </w:p>
-        </w:tc>
-        <w:tc>
-          <w:tcPr>
-            <w:tcW w:type="dxa" w:w="1361"/>
-            <w:shd w:val="clear" w:color="auto" w:fill="FEF3C7"/>
-            <w:tcBorders>
-              <w:bottom w:val="single" w:sz="4" w:color="D0D5DD"/>
-            </w:tcBorders>
-            <w:vAlign w:val="center"/>
-          </w:tcPr>
-          <w:p>
-            <w:pPr>
-              <w:spacing w:before="40" w:after="40"/>
-            </w:pPr>
-            <w:r>
-              <w:rPr>
-                <w:rFonts w:ascii="Arial" w:hAnsi="Arial"/>
-                <w:rFonts w:ascii="Arial" w:hAnsi="Arial" w:cs="Arial"/>
-                <w:b w:val="0"/>
-                <w:i w:val="0"/>
-                <w:color w:val="4A5568"/>
-                <w:sz w:val="15"/>
-              </w:rPr>
-              <w:t>Transfer-In</w:t>
-            </w:r>
-          </w:p>
-        </w:tc>
-        <w:tc>
-          <w:tcPr>
-            <w:tcW w:type="dxa" w:w="680"/>
-            <w:shd w:val="clear" w:color="auto" w:fill="FEF3C7"/>
-            <w:tcBorders>
-              <w:bottom w:val="single" w:sz="4" w:color="D0D5DD"/>
-            </w:tcBorders>
-            <w:vAlign w:val="center"/>
-          </w:tcPr>
-          <w:p>
-            <w:pPr>
-              <w:spacing w:before="40" w:after="40"/>
-            </w:pPr>
-            <w:r>
-              <w:rPr>
-                <w:rFonts w:ascii="Arial" w:hAnsi="Arial"/>
-                <w:rFonts w:ascii="Arial" w:hAnsi="Arial" w:cs="Arial"/>
-                <w:b w:val="0"/>
-                <w:i w:val="0"/>
-                <w:color w:val="4A5568"/>
-                <w:sz w:val="15"/>
-              </w:rPr>
-              <w:t>USDC</w:t>
-            </w:r>
-          </w:p>
-        </w:tc>
-        <w:tc>
-          <w:tcPr>
-            <w:tcW w:type="dxa" w:w="1134"/>
-            <w:shd w:val="clear" w:color="auto" w:fill="FEF3C7"/>
-            <w:tcBorders>
-              <w:bottom w:val="single" w:sz="4" w:color="D0D5DD"/>
-            </w:tcBorders>
-            <w:vAlign w:val="center"/>
-          </w:tcPr>
-          <w:p>
-            <w:pPr>
-              <w:spacing w:before="40" w:after="40"/>
-            </w:pPr>
-            <w:r>
-              <w:rPr>
-                <w:rFonts w:ascii="Arial" w:hAnsi="Arial"/>
-                <w:rFonts w:ascii="Arial" w:hAnsi="Arial" w:cs="Arial"/>
-                <w:b w:val="0"/>
-                <w:i w:val="0"/>
-                <w:color w:val="4A5568"/>
-                <w:sz w:val="15"/>
-              </w:rPr>
-              <w:t>Ethereum</w:t>
-            </w:r>
-          </w:p>
-        </w:tc>
-        <w:tc>
-          <w:tcPr>
-            <w:tcW w:type="dxa" w:w="1361"/>
-            <w:shd w:val="clear" w:color="auto" w:fill="FEF3C7"/>
-            <w:tcBorders>
-              <w:bottom w:val="single" w:sz="4" w:color="D0D5DD"/>
-            </w:tcBorders>
-            <w:vAlign w:val="center"/>
-          </w:tcPr>
-          <w:p>
-            <w:pPr>
-              <w:spacing w:before="40" w:after="40"/>
-              <w:jc w:val="right"/>
-            </w:pPr>
-            <w:r>
-              <w:rPr>
-                <w:rFonts w:ascii="Arial" w:hAnsi="Arial"/>
-                <w:rFonts w:ascii="Arial" w:hAnsi="Arial" w:cs="Arial"/>
-                <w:b w:val="0"/>
-                <w:i w:val="0"/>
-                <w:color w:val="4A5568"/>
-                <w:sz w:val="15"/>
-              </w:rPr>
-              <w:t>600,000.0000</w:t>
-            </w:r>
-          </w:p>
-        </w:tc>
-        <w:tc>
-          <w:tcPr>
-            <w:tcW w:type="dxa" w:w="1361"/>
-            <w:shd w:val="clear" w:color="auto" w:fill="FEF3C7"/>
-            <w:tcBorders>
-              <w:bottom w:val="single" w:sz="4" w:color="D0D5DD"/>
-            </w:tcBorders>
-            <w:vAlign w:val="center"/>
-          </w:tcPr>
-          <w:p>
-            <w:pPr>
-              <w:spacing w:before="40" w:after="40"/>
-              <w:jc w:val="right"/>
-            </w:pPr>
-            <w:r>
-              <w:rPr>
-                <w:rFonts w:ascii="Arial" w:hAnsi="Arial"/>
-                <w:rFonts w:ascii="Arial" w:hAnsi="Arial" w:cs="Arial"/>
-                <w:b w:val="0"/>
-                <w:i w:val="0"/>
-                <w:color w:val="4A5568"/>
-                <w:sz w:val="15"/>
-              </w:rPr>
-              <w:t>$599,400.00</w:t>
-            </w:r>
-          </w:p>
-        </w:tc>
-        <w:tc>
-          <w:tcPr>
-            <w:tcW w:type="dxa" w:w="1247"/>
-            <w:shd w:val="clear" w:color="auto" w:fill="FEF3C7"/>
-            <w:tcBorders>
-              <w:bottom w:val="single" w:sz="4" w:color="D0D5DD"/>
-            </w:tcBorders>
-            <w:vAlign w:val="center"/>
-          </w:tcPr>
-          <w:p>
-            <w:pPr>
-              <w:spacing w:before="40" w:after="40"/>
-              <w:jc w:val="right"/>
-            </w:pPr>
-            <w:r>
-              <w:rPr>
-                <w:rFonts w:ascii="Arial" w:hAnsi="Arial"/>
-                <w:rFonts w:ascii="Arial" w:hAnsi="Arial" w:cs="Arial"/>
-                <w:b w:val="0"/>
-                <w:i w:val="0"/>
-                <w:color w:val="4A5568"/>
-                <w:sz w:val="15"/>
-              </w:rPr>
-              <w:t>W20260413-6LQ8</w:t>
-            </w:r>
-          </w:p>
-        </w:tc>
-        <w:tc>
-          <w:tcPr>
-            <w:tcW w:type="dxa" w:w="1587"/>
-            <w:shd w:val="clear" w:color="auto" w:fill="FEF3C7"/>
-            <w:tcBorders>
-              <w:bottom w:val="single" w:sz="4" w:color="D0D5DD"/>
-            </w:tcBorders>
-            <w:vAlign w:val="center"/>
-          </w:tcPr>
-          <w:p>
-            <w:pPr>
-              <w:spacing w:before="40" w:after="40"/>
-              <w:jc w:val="right"/>
-            </w:pPr>
-            <w:r>
-              <w:rPr>
-                <w:rFonts w:ascii="Arial" w:hAnsi="Arial"/>
-                <w:rFonts w:ascii="Arial" w:hAnsi="Arial" w:cs="Arial"/>
-                <w:b w:val="0"/>
-                <w:i w:val="0"/>
-                <w:color w:val="B45309"/>
-                <w:sz w:val="15"/>
-              </w:rPr>
-              <w:t>Travel Rule declaration pending</w:t>
-            </w:r>
-          </w:p>
-        </w:tc>
-      </w:tr>
-      <w:tr>
-        <w:tc>
-          <w:tcPr>
-            <w:tcW w:type="dxa" w:w="1474"/>
-            <w:shd w:val="clear" w:color="auto" w:fill="FEF3C7"/>
-            <w:tcBorders>
-              <w:bottom w:val="single" w:sz="4" w:color="D0D5DD"/>
-            </w:tcBorders>
-            <w:vAlign w:val="center"/>
-          </w:tcPr>
-          <w:p>
-            <w:pPr>
-              <w:spacing w:before="40" w:after="40"/>
-            </w:pPr>
-            <w:r>
-              <w:rPr>
-                <w:rFonts w:ascii="Arial" w:hAnsi="Arial"/>
-                <w:rFonts w:ascii="Arial" w:hAnsi="Arial" w:cs="Arial"/>
-                <w:b w:val="0"/>
-                <w:i w:val="0"/>
-                <w:color w:val="4A5568"/>
-                <w:sz w:val="15"/>
-              </w:rPr>
-              <w:t>2026-04-20 17:22 UTC</w:t>
-            </w:r>
-          </w:p>
-        </w:tc>
-        <w:tc>
-          <w:tcPr>
-            <w:tcW w:type="dxa" w:w="1361"/>
-            <w:shd w:val="clear" w:color="auto" w:fill="FEF3C7"/>
-            <w:tcBorders>
-              <w:bottom w:val="single" w:sz="4" w:color="D0D5DD"/>
-            </w:tcBorders>
-            <w:vAlign w:val="center"/>
-          </w:tcPr>
-          <w:p>
-            <w:pPr>
-              <w:spacing w:before="40" w:after="40"/>
-            </w:pPr>
-            <w:r>
-              <w:rPr>
-                <w:rFonts w:ascii="Arial" w:hAnsi="Arial"/>
-                <w:rFonts w:ascii="Arial" w:hAnsi="Arial" w:cs="Arial"/>
-                <w:b w:val="0"/>
-                <w:i w:val="0"/>
-                <w:color w:val="4A5568"/>
-                <w:sz w:val="15"/>
-              </w:rPr>
-              <w:t>Transfer-In</w:t>
-            </w:r>
-          </w:p>
-        </w:tc>
-        <w:tc>
-          <w:tcPr>
-            <w:tcW w:type="dxa" w:w="680"/>
-            <w:shd w:val="clear" w:color="auto" w:fill="FEF3C7"/>
-            <w:tcBorders>
-              <w:bottom w:val="single" w:sz="4" w:color="D0D5DD"/>
-            </w:tcBorders>
-            <w:vAlign w:val="center"/>
-          </w:tcPr>
-          <w:p>
-            <w:pPr>
-              <w:spacing w:before="40" w:after="40"/>
-            </w:pPr>
-            <w:r>
-              <w:rPr>
-                <w:rFonts w:ascii="Arial" w:hAnsi="Arial"/>
-                <w:rFonts w:ascii="Arial" w:hAnsi="Arial" w:cs="Arial"/>
-                <w:b w:val="0"/>
-                <w:i w:val="0"/>
-                <w:color w:val="4A5568"/>
-                <w:sz w:val="15"/>
-              </w:rPr>
-              <w:t>USDT</w:t>
-            </w:r>
-          </w:p>
-        </w:tc>
-        <w:tc>
-          <w:tcPr>
-            <w:tcW w:type="dxa" w:w="1134"/>
-            <w:shd w:val="clear" w:color="auto" w:fill="FEF3C7"/>
-            <w:tcBorders>
-              <w:bottom w:val="single" w:sz="4" w:color="D0D5DD"/>
-            </w:tcBorders>
-            <w:vAlign w:val="center"/>
-          </w:tcPr>
-          <w:p>
-            <w:pPr>
-              <w:spacing w:before="40" w:after="40"/>
-            </w:pPr>
-            <w:r>
-              <w:rPr>
-                <w:rFonts w:ascii="Arial" w:hAnsi="Arial"/>
-                <w:rFonts w:ascii="Arial" w:hAnsi="Arial" w:cs="Arial"/>
-                <w:b w:val="0"/>
-                <w:i w:val="0"/>
-                <w:color w:val="4A5568"/>
-                <w:sz w:val="15"/>
-              </w:rPr>
-              <w:t>Ethereum</w:t>
-            </w:r>
-          </w:p>
-        </w:tc>
-        <w:tc>
-          <w:tcPr>
-            <w:tcW w:type="dxa" w:w="1361"/>
-            <w:shd w:val="clear" w:color="auto" w:fill="FEF3C7"/>
-            <w:tcBorders>
-              <w:bottom w:val="single" w:sz="4" w:color="D0D5DD"/>
-            </w:tcBorders>
-            <w:vAlign w:val="center"/>
-          </w:tcPr>
-          <w:p>
-            <w:pPr>
-              <w:spacing w:before="40" w:after="40"/>
-              <w:jc w:val="right"/>
-            </w:pPr>
-            <w:r>
-              <w:rPr>
-                <w:rFonts w:ascii="Arial" w:hAnsi="Arial"/>
-                <w:rFonts w:ascii="Arial" w:hAnsi="Arial" w:cs="Arial"/>
-                <w:b w:val="0"/>
-                <w:i w:val="0"/>
-                <w:color w:val="4A5568"/>
-                <w:sz w:val="15"/>
-              </w:rPr>
-              <w:t>753,430.0000</w:t>
-            </w:r>
-          </w:p>
-        </w:tc>
-        <w:tc>
-          <w:tcPr>
-            <w:tcW w:type="dxa" w:w="1361"/>
-            <w:shd w:val="clear" w:color="auto" w:fill="FEF3C7"/>
-            <w:tcBorders>
-              <w:bottom w:val="single" w:sz="4" w:color="D0D5DD"/>
-            </w:tcBorders>
-            <w:vAlign w:val="center"/>
-          </w:tcPr>
-          <w:p>
-            <w:pPr>
-              <w:spacing w:before="40" w:after="40"/>
-              <w:jc w:val="right"/>
-            </w:pPr>
-            <w:r>
-              <w:rPr>
-                <w:rFonts w:ascii="Arial" w:hAnsi="Arial"/>
-                <w:rFonts w:ascii="Arial" w:hAnsi="Arial" w:cs="Arial"/>
-                <w:b w:val="0"/>
-                <w:i w:val="0"/>
-                <w:color w:val="4A5568"/>
-                <w:sz w:val="15"/>
-              </w:rPr>
-              <w:t>$752,676.57</w:t>
-            </w:r>
-          </w:p>
-        </w:tc>
-        <w:tc>
-          <w:tcPr>
-            <w:tcW w:type="dxa" w:w="1247"/>
-            <w:shd w:val="clear" w:color="auto" w:fill="FEF3C7"/>
-            <w:tcBorders>
-              <w:bottom w:val="single" w:sz="4" w:color="D0D5DD"/>
-            </w:tcBorders>
-            <w:vAlign w:val="center"/>
-          </w:tcPr>
-          <w:p>
-            <w:pPr>
-              <w:spacing w:before="40" w:after="40"/>
-              <w:jc w:val="right"/>
-            </w:pPr>
-            <w:r>
-              <w:rPr>
-                <w:rFonts w:ascii="Arial" w:hAnsi="Arial"/>
-                <w:rFonts w:ascii="Arial" w:hAnsi="Arial" w:cs="Arial"/>
-                <w:b w:val="0"/>
-                <w:i w:val="0"/>
-                <w:color w:val="4A5568"/>
-                <w:sz w:val="15"/>
-              </w:rPr>
-              <w:t>W20260420-7HX4</w:t>
-            </w:r>
-          </w:p>
-        </w:tc>
-        <w:tc>
-          <w:tcPr>
-            <w:tcW w:type="dxa" w:w="1587"/>
-            <w:shd w:val="clear" w:color="auto" w:fill="FEF3C7"/>
-            <w:tcBorders>
-              <w:bottom w:val="single" w:sz="4" w:color="D0D5DD"/>
-            </w:tcBorders>
-            <w:vAlign w:val="center"/>
-          </w:tcPr>
-          <w:p>
-            <w:pPr>
-              <w:spacing w:before="40" w:after="40"/>
-              <w:jc w:val="right"/>
-            </w:pPr>
-            <w:r>
-              <w:rPr>
-                <w:rFonts w:ascii="Arial" w:hAnsi="Arial"/>
-                <w:rFonts w:ascii="Arial" w:hAnsi="Arial" w:cs="Arial"/>
-                <w:b w:val="0"/>
-                <w:i w:val="0"/>
-                <w:color w:val="B45309"/>
-                <w:sz w:val="15"/>
-              </w:rPr>
-              <w:t>Travel Rule declaration pending</w:t>
-            </w:r>
-          </w:p>
-        </w:tc>
-      </w:tr>
-      <w:tr>
-        <w:tc>
-          <w:tcPr>
-            <w:tcW w:type="dxa" w:w="1474"/>
-            <w:shd w:val="clear" w:color="auto" w:fill="FEF3C7"/>
-            <w:tcBorders>
-              <w:bottom w:val="single" w:sz="4" w:color="D0D5DD"/>
-            </w:tcBorders>
-            <w:vAlign w:val="center"/>
-          </w:tcPr>
-          <w:p>
-            <w:pPr>
-              <w:spacing w:before="40" w:after="40"/>
-            </w:pPr>
-            <w:r>
-              <w:rPr>
-                <w:rFonts w:ascii="Arial" w:hAnsi="Arial"/>
-                <w:rFonts w:ascii="Arial" w:hAnsi="Arial" w:cs="Arial"/>
-                <w:b w:val="0"/>
-                <w:i w:val="0"/>
-                <w:color w:val="4A5568"/>
-                <w:sz w:val="15"/>
-              </w:rPr>
-              <w:t>2026-04-29 09:55 UTC</w:t>
-            </w:r>
-          </w:p>
-        </w:tc>
-        <w:tc>
-          <w:tcPr>
-            <w:tcW w:type="dxa" w:w="1361"/>
-            <w:shd w:val="clear" w:color="auto" w:fill="FEF3C7"/>
-            <w:tcBorders>
-              <w:bottom w:val="single" w:sz="4" w:color="D0D5DD"/>
-            </w:tcBorders>
-            <w:vAlign w:val="center"/>
-          </w:tcPr>
-          <w:p>
-            <w:pPr>
-              <w:spacing w:before="40" w:after="40"/>
-            </w:pPr>
-            <w:r>
-              <w:rPr>
-                <w:rFonts w:ascii="Arial" w:hAnsi="Arial"/>
-                <w:rFonts w:ascii="Arial" w:hAnsi="Arial" w:cs="Arial"/>
-                <w:b w:val="0"/>
-                <w:i w:val="0"/>
-                <w:color w:val="4A5568"/>
-                <w:sz w:val="15"/>
-              </w:rPr>
-              <w:t>Transfer-Out</w:t>
-            </w:r>
-          </w:p>
-        </w:tc>
-        <w:tc>
-          <w:tcPr>
-            <w:tcW w:type="dxa" w:w="680"/>
-            <w:shd w:val="clear" w:color="auto" w:fill="FEF3C7"/>
-            <w:tcBorders>
-              <w:bottom w:val="single" w:sz="4" w:color="D0D5DD"/>
-            </w:tcBorders>
-            <w:vAlign w:val="center"/>
-          </w:tcPr>
-          <w:p>
-            <w:pPr>
-              <w:spacing w:before="40" w:after="40"/>
-            </w:pPr>
-            <w:r>
-              <w:rPr>
-                <w:rFonts w:ascii="Arial" w:hAnsi="Arial"/>
-                <w:rFonts w:ascii="Arial" w:hAnsi="Arial" w:cs="Arial"/>
-                <w:b w:val="0"/>
-                <w:i w:val="0"/>
-                <w:color w:val="4A5568"/>
-                <w:sz w:val="15"/>
-              </w:rPr>
-              <w:t>BTC</w:t>
-            </w:r>
-          </w:p>
-        </w:tc>
-        <w:tc>
-          <w:tcPr>
-            <w:tcW w:type="dxa" w:w="1134"/>
-            <w:shd w:val="clear" w:color="auto" w:fill="FEF3C7"/>
-            <w:tcBorders>
-              <w:bottom w:val="single" w:sz="4" w:color="D0D5DD"/>
-            </w:tcBorders>
-            <w:vAlign w:val="center"/>
-          </w:tcPr>
-          <w:p>
-            <w:pPr>
-              <w:spacing w:before="40" w:after="40"/>
-            </w:pPr>
-            <w:r>
-              <w:rPr>
-                <w:rFonts w:ascii="Arial" w:hAnsi="Arial"/>
-                <w:rFonts w:ascii="Arial" w:hAnsi="Arial" w:cs="Arial"/>
-                <w:b w:val="0"/>
-                <w:i w:val="0"/>
-                <w:color w:val="4A5568"/>
-                <w:sz w:val="15"/>
-              </w:rPr>
-              <w:t>Bitcoin</w:t>
-            </w:r>
-          </w:p>
-        </w:tc>
-        <w:tc>
-          <w:tcPr>
-            <w:tcW w:type="dxa" w:w="1361"/>
-            <w:shd w:val="clear" w:color="auto" w:fill="FEF3C7"/>
-            <w:tcBorders>
-              <w:bottom w:val="single" w:sz="4" w:color="D0D5DD"/>
-            </w:tcBorders>
-            <w:vAlign w:val="center"/>
-          </w:tcPr>
-          <w:p>
-            <w:pPr>
-              <w:spacing w:before="40" w:after="40"/>
-              <w:jc w:val="right"/>
-            </w:pPr>
-            <w:r>
-              <w:rPr>
-                <w:rFonts w:ascii="Arial" w:hAnsi="Arial"/>
-                <w:rFonts w:ascii="Arial" w:hAnsi="Arial" w:cs="Arial"/>
-                <w:b w:val="0"/>
-                <w:i w:val="0"/>
-                <w:color w:val="4A5568"/>
-                <w:sz w:val="15"/>
-              </w:rPr>
-              <w:t>-0.50000000</w:t>
-            </w:r>
-          </w:p>
-        </w:tc>
-        <w:tc>
-          <w:tcPr>
-            <w:tcW w:type="dxa" w:w="1361"/>
-            <w:shd w:val="clear" w:color="auto" w:fill="FEF3C7"/>
-            <w:tcBorders>
-              <w:bottom w:val="single" w:sz="4" w:color="D0D5DD"/>
-            </w:tcBorders>
-            <w:vAlign w:val="center"/>
-          </w:tcPr>
-          <w:p>
-            <w:pPr>
-              <w:spacing w:before="40" w:after="40"/>
-              <w:jc w:val="right"/>
-            </w:pPr>
-            <w:r>
-              <w:rPr>
-                <w:rFonts w:ascii="Arial" w:hAnsi="Arial"/>
-                <w:rFonts w:ascii="Arial" w:hAnsi="Arial" w:cs="Arial"/>
-                <w:b w:val="0"/>
-                <w:i w:val="0"/>
-                <w:color w:val="4A5568"/>
-                <w:sz w:val="15"/>
-              </w:rPr>
-              <w:t>-$38,212.50</w:t>
-            </w:r>
-          </w:p>
-        </w:tc>
-        <w:tc>
-          <w:tcPr>
-            <w:tcW w:type="dxa" w:w="1247"/>
-            <w:shd w:val="clear" w:color="auto" w:fill="FEF3C7"/>
-            <w:tcBorders>
-              <w:bottom w:val="single" w:sz="4" w:color="D0D5DD"/>
-            </w:tcBorders>
-            <w:vAlign w:val="center"/>
-          </w:tcPr>
-          <w:p>
-            <w:pPr>
-              <w:spacing w:before="40" w:after="40"/>
-              <w:jc w:val="right"/>
-            </w:pPr>
-            <w:r>
-              <w:rPr>
-                <w:rFonts w:ascii="Arial" w:hAnsi="Arial"/>
-                <w:rFonts w:ascii="Arial" w:hAnsi="Arial" w:cs="Arial"/>
-                <w:b w:val="0"/>
-                <w:i w:val="0"/>
-                <w:color w:val="4A5568"/>
-                <w:sz w:val="15"/>
-              </w:rPr>
-              <w:t>W20260429-QR03</w:t>
-            </w:r>
-          </w:p>
-        </w:tc>
-        <w:tc>
-          <w:tcPr>
-            <w:tcW w:type="dxa" w:w="1587"/>
-            <w:shd w:val="clear" w:color="auto" w:fill="FEF3C7"/>
-            <w:tcBorders>
-              <w:bottom w:val="single" w:sz="4" w:color="D0D5DD"/>
-            </w:tcBorders>
-            <w:vAlign w:val="center"/>
-          </w:tcPr>
-          <w:p>
-            <w:pPr>
-              <w:spacing w:before="40" w:after="40"/>
-              <w:jc w:val="right"/>
-            </w:pPr>
-            <w:r>
-              <w:rPr>
-                <w:rFonts w:ascii="Arial" w:hAnsi="Arial"/>
-                <w:rFonts w:ascii="Arial" w:hAnsi="Arial" w:cs="Arial"/>
-                <w:b w:val="0"/>
-                <w:i w:val="0"/>
-                <w:color w:val="B45309"/>
-                <w:sz w:val="15"/>
-              </w:rPr>
-              <w:t>Quorum approval pending</w:t>
-            </w:r>
-          </w:p>
-        </w:tc>
-      </w:tr>
-      <w:tr>
-        <w:tc>
-          <w:tcPr>
-            <w:tcW w:type="dxa" w:w="1474"/>
-            <w:shd w:val="clear" w:color="auto" w:fill="FEF3C7"/>
-            <w:tcBorders>
-              <w:bottom w:val="single" w:sz="4" w:color="D0D5DD"/>
-            </w:tcBorders>
-            <w:vAlign w:val="center"/>
-          </w:tcPr>
-          <w:p>
-            <w:pPr>
-              <w:spacing w:before="40" w:after="40"/>
-            </w:pPr>
-            <w:r>
-              <w:rPr>
-                <w:rFonts w:ascii="Arial" w:hAnsi="Arial"/>
-                <w:rFonts w:ascii="Arial" w:hAnsi="Arial" w:cs="Arial"/>
-                <w:b w:val="0"/>
-                <w:i w:val="0"/>
-                <w:color w:val="4A5568"/>
-                <w:sz w:val="15"/>
-              </w:rPr>
-              <w:t>2026-04-30 22:15 UTC</w:t>
-            </w:r>
-          </w:p>
-        </w:tc>
-        <w:tc>
-          <w:tcPr>
-            <w:tcW w:type="dxa" w:w="1361"/>
-            <w:shd w:val="clear" w:color="auto" w:fill="FEF3C7"/>
-            <w:tcBorders>
-              <w:bottom w:val="single" w:sz="4" w:color="D0D5DD"/>
-            </w:tcBorders>
-            <w:vAlign w:val="center"/>
-          </w:tcPr>
-          <w:p>
-            <w:pPr>
-              <w:spacing w:before="40" w:after="40"/>
-            </w:pPr>
-            <w:r>
-              <w:rPr>
-                <w:rFonts w:ascii="Arial" w:hAnsi="Arial"/>
-                <w:rFonts w:ascii="Arial" w:hAnsi="Arial" w:cs="Arial"/>
-                <w:b w:val="0"/>
-                <w:i w:val="0"/>
-                <w:color w:val="4A5568"/>
-                <w:sz w:val="15"/>
-              </w:rPr>
-              <w:t>Transfer-Out</w:t>
-            </w:r>
-          </w:p>
-        </w:tc>
-        <w:tc>
-          <w:tcPr>
-            <w:tcW w:type="dxa" w:w="680"/>
-            <w:shd w:val="clear" w:color="auto" w:fill="FEF3C7"/>
-            <w:tcBorders>
-              <w:bottom w:val="single" w:sz="4" w:color="D0D5DD"/>
-            </w:tcBorders>
-            <w:vAlign w:val="center"/>
-          </w:tcPr>
-          <w:p>
-            <w:pPr>
-              <w:spacing w:before="40" w:after="40"/>
-            </w:pPr>
-            <w:r>
-              <w:rPr>
-                <w:rFonts w:ascii="Arial" w:hAnsi="Arial"/>
-                <w:rFonts w:ascii="Arial" w:hAnsi="Arial" w:cs="Arial"/>
-                <w:b w:val="0"/>
-                <w:i w:val="0"/>
-                <w:color w:val="4A5568"/>
-                <w:sz w:val="15"/>
-              </w:rPr>
-              <w:t>USDT</w:t>
-            </w:r>
-          </w:p>
-        </w:tc>
-        <w:tc>
-          <w:tcPr>
-            <w:tcW w:type="dxa" w:w="1134"/>
-            <w:shd w:val="clear" w:color="auto" w:fill="FEF3C7"/>
-            <w:tcBorders>
-              <w:bottom w:val="single" w:sz="4" w:color="D0D5DD"/>
-            </w:tcBorders>
-            <w:vAlign w:val="center"/>
-          </w:tcPr>
-          <w:p>
-            <w:pPr>
-              <w:spacing w:before="40" w:after="40"/>
-            </w:pPr>
-            <w:r>
-              <w:rPr>
-                <w:rFonts w:ascii="Arial" w:hAnsi="Arial"/>
-                <w:rFonts w:ascii="Arial" w:hAnsi="Arial" w:cs="Arial"/>
-                <w:b w:val="0"/>
-                <w:i w:val="0"/>
-                <w:color w:val="4A5568"/>
-                <w:sz w:val="15"/>
-              </w:rPr>
-              <w:t>Tron</w:t>
-            </w:r>
-          </w:p>
-        </w:tc>
-        <w:tc>
-          <w:tcPr>
-            <w:tcW w:type="dxa" w:w="1361"/>
-            <w:shd w:val="clear" w:color="auto" w:fill="FEF3C7"/>
-            <w:tcBorders>
-              <w:bottom w:val="single" w:sz="4" w:color="D0D5DD"/>
-            </w:tcBorders>
-            <w:vAlign w:val="center"/>
-          </w:tcPr>
-          <w:p>
-            <w:pPr>
-              <w:spacing w:before="40" w:after="40"/>
-              <w:jc w:val="right"/>
-            </w:pPr>
-            <w:r>
-              <w:rPr>
-                <w:rFonts w:ascii="Arial" w:hAnsi="Arial"/>
-                <w:rFonts w:ascii="Arial" w:hAnsi="Arial" w:cs="Arial"/>
-                <w:b w:val="0"/>
-                <w:i w:val="0"/>
-                <w:color w:val="4A5568"/>
-                <w:sz w:val="15"/>
-              </w:rPr>
-              <w:t>-180,000.0000</w:t>
-            </w:r>
-          </w:p>
-        </w:tc>
-        <w:tc>
-          <w:tcPr>
-            <w:tcW w:type="dxa" w:w="1361"/>
-            <w:shd w:val="clear" w:color="auto" w:fill="FEF3C7"/>
-            <w:tcBorders>
-              <w:bottom w:val="single" w:sz="4" w:color="D0D5DD"/>
-            </w:tcBorders>
-            <w:vAlign w:val="center"/>
-          </w:tcPr>
-          <w:p>
-            <w:pPr>
-              <w:spacing w:before="40" w:after="40"/>
-              <w:jc w:val="right"/>
-            </w:pPr>
-            <w:r>
-              <w:rPr>
-                <w:rFonts w:ascii="Arial" w:hAnsi="Arial"/>
-                <w:rFonts w:ascii="Arial" w:hAnsi="Arial" w:cs="Arial"/>
-                <w:b w:val="0"/>
-                <w:i w:val="0"/>
-                <w:color w:val="4A5568"/>
-                <w:sz w:val="15"/>
-              </w:rPr>
-              <w:t>-$179,820.00</w:t>
-            </w:r>
-          </w:p>
-        </w:tc>
-        <w:tc>
-          <w:tcPr>
-            <w:tcW w:type="dxa" w:w="1247"/>
-            <w:shd w:val="clear" w:color="auto" w:fill="FEF3C7"/>
-            <w:tcBorders>
-              <w:bottom w:val="single" w:sz="4" w:color="D0D5DD"/>
-            </w:tcBorders>
-            <w:vAlign w:val="center"/>
-          </w:tcPr>
-          <w:p>
-            <w:pPr>
-              <w:spacing w:before="40" w:after="40"/>
-              <w:jc w:val="right"/>
-            </w:pPr>
-            <w:r>
-              <w:rPr>
-                <w:rFonts w:ascii="Arial" w:hAnsi="Arial"/>
-                <w:rFonts w:ascii="Arial" w:hAnsi="Arial" w:cs="Arial"/>
-                <w:b w:val="0"/>
-                <w:i w:val="0"/>
-                <w:color w:val="4A5568"/>
-                <w:sz w:val="15"/>
-              </w:rPr>
-              <w:t>W20260430-CP12</w:t>
-            </w:r>
-          </w:p>
-        </w:tc>
-        <w:tc>
-          <w:tcPr>
-            <w:tcW w:type="dxa" w:w="1587"/>
-            <w:shd w:val="clear" w:color="auto" w:fill="FEF3C7"/>
-            <w:tcBorders>
-              <w:bottom w:val="single" w:sz="4" w:color="D0D5DD"/>
-            </w:tcBorders>
-            <w:vAlign w:val="center"/>
-          </w:tcPr>
-          <w:p>
-            <w:pPr>
-              <w:spacing w:before="40" w:after="40"/>
-              <w:jc w:val="right"/>
-            </w:pPr>
-            <w:r>
-              <w:rPr>
-                <w:rFonts w:ascii="Arial" w:hAnsi="Arial"/>
-                <w:rFonts w:ascii="Arial" w:hAnsi="Arial" w:cs="Arial"/>
-                <w:b w:val="0"/>
-                <w:i w:val="0"/>
-                <w:color w:val="B45309"/>
-                <w:sz w:val="15"/>
-              </w:rPr>
-              <w:t>Quorum approval pending</w:t>
-            </w:r>
-          </w:p>
-        </w:tc>
-      </w:tr>
-      <w:tr>
-        <w:tc>
-          <w:tcPr>
-            <w:tcW w:type="dxa" w:w="1474"/>
-            <w:shd w:val="clear" w:color="auto" w:fill="E5EBF1"/>
-            <w:tcBorders>
-              <w:bottom w:val="single" w:sz="4" w:color="D0D5DD"/>
-            </w:tcBorders>
-            <w:vAlign w:val="center"/>
-          </w:tcPr>
-          <w:p>
-            <w:pPr>
-              <w:spacing w:before="40" w:after="40"/>
-            </w:pPr>
-            <w:r>
-              <w:rPr>
-                <w:rFonts w:ascii="Arial" w:hAnsi="Arial"/>
-                <w:rFonts w:ascii="Arial" w:hAnsi="Arial" w:cs="Arial"/>
-                <w:b/>
-                <w:i w:val="0"/>
-                <w:color w:val="0A2342"/>
-                <w:sz w:val="15"/>
-              </w:rPr>
-              <w:t>Total (4 pending)</w:t>
-            </w:r>
-          </w:p>
-        </w:tc>
-        <w:tc>
-          <w:tcPr>
-            <w:tcW w:type="dxa" w:w="1361"/>
-            <w:shd w:val="clear" w:color="auto" w:fill="E5EBF1"/>
-            <w:tcBorders>
-              <w:bottom w:val="single" w:sz="4" w:color="D0D5DD"/>
-            </w:tcBorders>
-            <w:vAlign w:val="center"/>
-          </w:tcPr>
-          <w:p>
-            <w:pPr>
-              <w:spacing w:before="40" w:after="40"/>
-            </w:pPr>
-            <w:r>
-              <w:rPr>
-                <w:rFonts w:ascii="Arial" w:hAnsi="Arial"/>
-                <w:rFonts w:ascii="Arial" w:hAnsi="Arial" w:cs="Arial"/>
-                <w:b/>
-                <w:i w:val="0"/>
-                <w:color w:val="0A2342"/>
-                <w:sz w:val="15"/>
-              </w:rPr>
-            </w:r>
-          </w:p>
-        </w:tc>
-        <w:tc>
-          <w:tcPr>
-            <w:tcW w:type="dxa" w:w="680"/>
-            <w:shd w:val="clear" w:color="auto" w:fill="E5EBF1"/>
-            <w:tcBorders>
-              <w:bottom w:val="single" w:sz="4" w:color="D0D5DD"/>
-            </w:tcBorders>
-            <w:vAlign w:val="center"/>
-          </w:tcPr>
-          <w:p>
-            <w:pPr>
-              <w:spacing w:before="40" w:after="40"/>
-            </w:pPr>
-            <w:r>
-              <w:rPr>
-                <w:rFonts w:ascii="Arial" w:hAnsi="Arial"/>
-                <w:rFonts w:ascii="Arial" w:hAnsi="Arial" w:cs="Arial"/>
-                <w:b/>
-                <w:i w:val="0"/>
-                <w:color w:val="0A2342"/>
-                <w:sz w:val="15"/>
-              </w:rPr>
-            </w:r>
-          </w:p>
-        </w:tc>
-        <w:tc>
-          <w:tcPr>
-            <w:tcW w:type="dxa" w:w="1134"/>
-            <w:shd w:val="clear" w:color="auto" w:fill="E5EBF1"/>
-            <w:tcBorders>
-              <w:bottom w:val="single" w:sz="4" w:color="D0D5DD"/>
-            </w:tcBorders>
-            <w:vAlign w:val="center"/>
-          </w:tcPr>
-          <w:p>
-            <w:pPr>
-              <w:spacing w:before="40" w:after="40"/>
-            </w:pPr>
-            <w:r>
-              <w:rPr>
-                <w:rFonts w:ascii="Arial" w:hAnsi="Arial"/>
-                <w:rFonts w:ascii="Arial" w:hAnsi="Arial" w:cs="Arial"/>
-                <w:b/>
-                <w:i w:val="0"/>
-                <w:color w:val="0A2342"/>
-                <w:sz w:val="15"/>
-              </w:rPr>
-            </w:r>
-          </w:p>
-        </w:tc>
-        <w:tc>
-          <w:tcPr>
-            <w:tcW w:type="dxa" w:w="1361"/>
-            <w:shd w:val="clear" w:color="auto" w:fill="E5EBF1"/>
-            <w:tcBorders>
-              <w:bottom w:val="single" w:sz="4" w:color="D0D5DD"/>
-            </w:tcBorders>
-            <w:vAlign w:val="center"/>
-          </w:tcPr>
-          <w:p>
-            <w:pPr>
-              <w:spacing w:before="40" w:after="40"/>
-              <w:jc w:val="right"/>
-            </w:pPr>
-            <w:r>
-              <w:rPr>
-                <w:rFonts w:ascii="Arial" w:hAnsi="Arial"/>
-                <w:rFonts w:ascii="Arial" w:hAnsi="Arial" w:cs="Arial"/>
-                <w:b/>
-                <w:i w:val="0"/>
-                <w:color w:val="0A2342"/>
-                <w:sz w:val="15"/>
-              </w:rPr>
-            </w:r>
-          </w:p>
-        </w:tc>
-        <w:tc>
-          <w:tcPr>
-            <w:tcW w:type="dxa" w:w="1361"/>
-            <w:shd w:val="clear" w:color="auto" w:fill="E5EBF1"/>
-            <w:tcBorders>
-              <w:bottom w:val="single" w:sz="4" w:color="D0D5DD"/>
-            </w:tcBorders>
-            <w:vAlign w:val="center"/>
-          </w:tcPr>
-          <w:p>
-            <w:pPr>
-              <w:spacing w:before="40" w:after="40"/>
-              <w:jc w:val="right"/>
-            </w:pPr>
-            <w:r>
-              <w:rPr>
-                <w:rFonts w:ascii="Arial" w:hAnsi="Arial"/>
-                <w:rFonts w:ascii="Arial" w:hAnsi="Arial" w:cs="Arial"/>
-                <w:b/>
-                <w:i w:val="0"/>
-                <w:color w:val="0A2342"/>
-                <w:sz w:val="15"/>
-              </w:rPr>
-              <w:t>$1,570,109.07</w:t>
-            </w:r>
-          </w:p>
-        </w:tc>
-        <w:tc>
-          <w:tcPr>
-            <w:tcW w:type="dxa" w:w="1247"/>
-            <w:shd w:val="clear" w:color="auto" w:fill="E5EBF1"/>
-            <w:tcBorders>
-              <w:bottom w:val="single" w:sz="4" w:color="D0D5DD"/>
-            </w:tcBorders>
-            <w:vAlign w:val="center"/>
-          </w:tcPr>
-          <w:p>
-            <w:pPr>
-              <w:spacing w:before="40" w:after="40"/>
-              <w:jc w:val="right"/>
-            </w:pPr>
-            <w:r>
-              <w:rPr>
-                <w:rFonts w:ascii="Arial" w:hAnsi="Arial"/>
-                <w:rFonts w:ascii="Arial" w:hAnsi="Arial" w:cs="Arial"/>
-                <w:b/>
-                <w:i w:val="0"/>
-                <w:color w:val="0A2342"/>
-                <w:sz w:val="15"/>
-              </w:rPr>
-            </w:r>
-          </w:p>
-        </w:tc>
-        <w:tc>
-          <w:tcPr>
-            <w:tcW w:type="dxa" w:w="1587"/>
-            <w:shd w:val="clear" w:color="auto" w:fill="E5EBF1"/>
-            <w:tcBorders>
-              <w:bottom w:val="single" w:sz="4" w:color="D0D5DD"/>
-            </w:tcBorders>
-            <w:vAlign w:val="center"/>
-          </w:tcPr>
-          <w:p>
-            <w:pPr>
-              <w:spacing w:before="40" w:after="40"/>
-              <w:jc w:val="right"/>
-            </w:pPr>
-            <w:r>
-              <w:rPr>
-                <w:rFonts w:ascii="Arial" w:hAnsi="Arial"/>
-                <w:rFonts w:ascii="Arial" w:hAnsi="Arial" w:cs="Arial"/>
-                <w:b/>
-                <w:i w:val="0"/>
-                <w:color w:val="0A2342"/>
-                <w:sz w:val="15"/>
-              </w:rPr>
             </w:r>
           </w:p>
         </w:tc>

</xml_diff>